<commit_message>
Generate updated Deployment_Bible.docx and fix output path
Updated output path from /home/claude/ to docs/ directory.
Regenerated the DOCX with all enriched transcript content.

https://claude.ai/code/session_01XjctkW2CQTMstagw4hxX9g
</commit_message>
<xml_diff>
--- a/docs/Deployment_Bible.docx
+++ b/docs/Deployment_Bible.docx
@@ -270,7 +270,7 @@
           <w:sz w:val="21"/>
           <w:szCs w:val="21"/>
         </w:rPr>
-        <w:t xml:space="preserve">The professional casino poker shuffle follows a strict sequence: Wash, Collect, Square, Riffle, Riffle, Box, Riffle, Cut, Place in Deal Position. Each step serves a specific randomization or security purpose.</w:t>
+        <w:t xml:space="preserve">The professional casino poker shuffle follows a strict sequence: Wash, Collect, Square, Riffle, Riffle, Box, Riffle, Cut, Place in Deal Position. Each step serves a specific randomization or security purpose. As demonstrated in the TruePokerDealer curriculum (Lessons 1-2), the shuffle is the single skill that requires the most repetition to master. Training involves doing each step slowly and correctly hundreds of times until the finger positions become automatic. Speed comes only after form is locked in; rushing the learning process creates bad habits that are extremely difficult to unlearn later.</w:t>
       </w:r>
     </w:p>
     <w:p>
@@ -300,7 +300,21 @@
           <w:sz w:val="21"/>
           <w:szCs w:val="21"/>
         </w:rPr>
-        <w:t xml:space="preserve">The wash (also called a scramble) is performed by spreading all 52 cards face-down across the felt and mixing them with both hands in a circular swirling motion. Every card face must touch the felt at least once. A standard wash lasts approximately 7 seconds. A mini-wash (used between hands when time is a factor) lasts 2 to 3 seconds. The wash is the primary randomization step. It ensures that cards which were grouped together from the previous hand are separated before the mechanical shuffle begins.</w:t>
+        <w:t xml:space="preserve">The wash (also called a scramble) is performed by spreading all 52 cards face-down across the felt and mixing them with both hands in a circular swirling motion. Every card face must touch the felt at least once. A standard wash lasts approximately 7 seconds. A mini-wash (used between hands when time is a factor) lasts 2 to 3 seconds. The wash is the primary randomization step. It ensures that cards which were grouped together from the previous hand are separated before the mechanical shuffle begins. A full wash is only required when the deck is 100% suited (all cards in sequential order, such as a brand new deck). Between hands, the mini-wash is standard.</w:t>
+      </w:r>
+    </w:p>
+    <w:p>
+      <w:pPr>
+        <w:spacing w:after="160" w:line="276"/>
+      </w:pPr>
+      <w:r>
+        <w:rPr>
+          <w:rFonts w:ascii="Arial" w:cs="Arial" w:eastAsia="Arial" w:hAnsi="Arial"/>
+          <w:color w:val="333333"/>
+          <w:sz w:val="21"/>
+          <w:szCs w:val="21"/>
+        </w:rPr>
+        <w:t xml:space="preserve">The wash is also the single most important anti-cheating step in the shuffle. As demonstrated by professional magicians in TruePokerDealer’s security analysis, if the wash were not mandatory, a skilled card manipulator could scoop up cards from a completed hand, go straight into the riffle sequence, and retain specific high-value cards in known positions throughout the entire shuffle. The wash is what defeats this. Without it, a dealer with card manipulation skills could stack the deck using only the riffle-box-riffle sequence. This is why casinos mandate the wash and why surveillance monitors its execution.</w:t>
       </w:r>
     </w:p>
     <w:p>
@@ -325,7 +339,7 @@
           <w:sz w:val="21"/>
           <w:szCs w:val="21"/>
         </w:rPr>
-        <w:t xml:space="preserve">System must be able to spread all 52 cards across a felt surface and execute a randomizing motion that contacts every card. Must verify (via vision or tactile sensing) that all cards have been moved from their starting positions. Duration must be controllable and consistent.</w:t>
+        <w:t xml:space="preserve">System must be able to spread all 52 cards across a felt surface and execute a randomizing motion that contacts every card. Must verify (via vision or tactile sensing) that all cards have been moved from their starting positions. Duration must be controllable and consistent. The wash is the primary defense against deck stacking and must not be skippable or abbreviated by the system.</w:t>
       </w:r>
     </w:p>
     <w:p>
@@ -355,7 +369,21 @@
           <w:sz w:val="21"/>
           <w:szCs w:val="21"/>
         </w:rPr>
-        <w:t xml:space="preserve">After the wash, the dealer scoops all cards together using both hands, pushing inward from the edges. Once gathered, they take one card from the top and place it on the bottom (this helps grip the full deck), then turn the deck away from themselves so no card faces are visible. The dealer then drops the deck to create a flat bottom edge and uses their thumb and fingers to square the deck into a neat rectangular block. The deck must face away from the dealer at all times to prevent any possibility of seeing card values.</w:t>
+        <w:t xml:space="preserve">After the wash, the dealer scoops all cards together using both hands, either pushing inward from the edges or closing the fingers on them to pull them in. Once gathered, they take one card from the top and place it on the bottom. This seemingly minor step serves a practical purpose: it helps establish a grip on the full 52-card stack. Then the dealer turns the deck away from themselves so no card faces are visible. This is a critical distinction from table games (blackjack, etc.) where the deck faces toward the dealer. In poker, the deck always faces away from the dealer so the dealer cannot see or manipulate card values.</w:t>
+      </w:r>
+    </w:p>
+    <w:p>
+      <w:pPr>
+        <w:spacing w:after="160" w:line="276"/>
+      </w:pPr>
+      <w:r>
+        <w:rPr>
+          <w:rFonts w:ascii="Arial" w:cs="Arial" w:eastAsia="Arial" w:hAnsi="Arial"/>
+          <w:color w:val="333333"/>
+          <w:sz w:val="21"/>
+          <w:szCs w:val="21"/>
+        </w:rPr>
+        <w:t xml:space="preserve">To square the deck, the dealer drops it onto the felt to create a flat bottom edge, then finds any horizontal cards on the left side, creates a small inlet with one hand, and uses the other hand to push the deck while the thumb spins and squares everything into a neat rectangular block. The squaring motion may need to be repeated a couple of times. After squaring, the dealer clears their hands (shows palms to camera) before proceeding to the riffle.</w:t>
       </w:r>
     </w:p>
     <w:p>
@@ -380,7 +408,7 @@
           <w:sz w:val="21"/>
           <w:szCs w:val="21"/>
         </w:rPr>
-        <w:t xml:space="preserve">Must gather 52 scattered cards into a single squared stack. Cards must never face toward any camera or sensor that could identify values during collection. Deck orientation must be consistently away from all observable angles.</w:t>
+        <w:t xml:space="preserve">Must gather 52 scattered cards into a single squared stack. Cards must never face toward any camera or sensor that could identify values during collection. Deck orientation must be consistently away from all observable angles. Must verify the deck is properly squared (no protruding cards) before proceeding to the riffle.</w:t>
       </w:r>
     </w:p>
     <w:p>
@@ -410,7 +438,91 @@
           <w:sz w:val="21"/>
           <w:szCs w:val="21"/>
         </w:rPr>
-        <w:t xml:space="preserve">The riffle is the core mechanical shuffle step. The dealer splits the deck approximately in half, holds each half in one hand, and interleaves the cards by releasing them from alternating thumbs so the two halves merge together. The standard sequence calls for two riffles before the box and one riffle after. The grip requires the thumb on the inside edge pulling cards, while the index, middle, and ring fingers support the outside. The cards should fall in a controlled cascade, not slapped together. A sloppy riffle leaves clumps of cards from the same half still grouped together, reducing randomization.</w:t>
+        <w:t xml:space="preserve">The riffle is the core mechanical shuffle step and the most physically demanding part of the shuffle to learn. The standard sequence calls for two riffles before the box and one riffle after (riffle-riffle-box-riffle). The detailed finger mechanics, as taught in the TruePokerDealer curriculum, are as follows:</w:t>
+      </w:r>
+    </w:p>
+    <w:p>
+      <w:pPr>
+        <w:spacing w:after="160" w:line="276"/>
+      </w:pPr>
+      <w:r>
+        <w:rPr>
+          <w:rFonts w:ascii="Arial" w:cs="Arial" w:eastAsia="Arial" w:hAnsi="Arial"/>
+          <w:color w:val="333333"/>
+          <w:sz w:val="21"/>
+          <w:szCs w:val="21"/>
+        </w:rPr>
+        <w:t xml:space="preserve">Grip: Both hands mirror each other. The middle finger and ring finger come toward the top edge of the deck, with the thumb opposite them on the inside edge. The forefinger floats free (it will be used later). The pinkies go toward the outside edges of the deck to prevent cards from sliding out sideways. From this grip, the dealer splits the deck approximately in half.</w:t>
+      </w:r>
+    </w:p>
+    <w:p>
+      <w:pPr>
+        <w:spacing w:after="160" w:line="276"/>
+      </w:pPr>
+      <w:r>
+        <w:rPr>
+          <w:rFonts w:ascii="Arial" w:cs="Arial" w:eastAsia="Arial" w:hAnsi="Arial"/>
+          <w:color w:val="333333"/>
+          <w:sz w:val="21"/>
+          <w:szCs w:val="21"/>
+        </w:rPr>
+        <w:t xml:space="preserve">Positioning: With fingers in position on each half, the forefingers go to the center (between the two halves). The deck halves are pushed together until the forefingers touch. The halves are angled slightly toward each other (not parallel). This angle is critical: it ensures the cards will interleave onto each other cleanly during the riffle.</w:t>
+      </w:r>
+    </w:p>
+    <w:p>
+      <w:pPr>
+        <w:spacing w:after="160" w:line="276"/>
+      </w:pPr>
+      <w:r>
+        <w:rPr>
+          <w:rFonts w:ascii="Arial" w:cs="Arial" w:eastAsia="Arial" w:hAnsi="Arial"/>
+          <w:color w:val="333333"/>
+          <w:sz w:val="21"/>
+          <w:szCs w:val="21"/>
+        </w:rPr>
+        <w:t xml:space="preserve">Thumb slide: The thumbs slide up toward the inner corners of each half, getting underneath the cards. The thumbs should be nearly touching at this point. The grip must be strong enough that the dealer could lift their thumbs without the cards falling. This grip strength is essential.</w:t>
+      </w:r>
+    </w:p>
+    <w:p>
+      <w:pPr>
+        <w:spacing w:after="160" w:line="276"/>
+      </w:pPr>
+      <w:r>
+        <w:rPr>
+          <w:rFonts w:ascii="Arial" w:cs="Arial" w:eastAsia="Arial" w:hAnsi="Arial"/>
+          <w:color w:val="333333"/>
+          <w:sz w:val="21"/>
+          <w:szCs w:val="21"/>
+        </w:rPr>
+        <w:t xml:space="preserve">The riffle itself: The dealer flattens all fingers on top of the cards and leaves only the thumbs underneath. The pinkies remain flat on the sides securing the cards. Then the dealer simply lets the cards fall from each thumb in alternating sequence. The cards should cascade quietly onto each other. A loud riffle means too much force is being applied, which damages the cards. The entire motion is controlled by releasing thumb pressure, not by forcing cards together.</w:t>
+      </w:r>
+    </w:p>
+    <w:p>
+      <w:pPr>
+        <w:spacing w:after="160" w:line="276"/>
+      </w:pPr>
+      <w:r>
+        <w:rPr>
+          <w:rFonts w:ascii="Arial" w:cs="Arial" w:eastAsia="Arial" w:hAnsi="Arial"/>
+          <w:color w:val="333333"/>
+          <w:sz w:val="21"/>
+          <w:szCs w:val="21"/>
+        </w:rPr>
+        <w:t xml:space="preserve">Reassembly: After the riffle, the dealer keeps the middle finger, ring finger, and thumb in the riffle position. The forefinger presses down to maintain pressure so the interlaced cards do not separate. The pinkies on the outside then push the two halves together. Less pressure from the top fingers makes this easier. If the dealer grips too tightly from the top during this push, the halves resist merging.</w:t>
+      </w:r>
+    </w:p>
+    <w:p>
+      <w:pPr>
+        <w:spacing w:after="160" w:line="276"/>
+      </w:pPr>
+      <w:r>
+        <w:rPr>
+          <w:rFonts w:ascii="Arial" w:cs="Arial" w:eastAsia="Arial" w:hAnsi="Arial"/>
+          <w:color w:val="333333"/>
+          <w:sz w:val="21"/>
+          <w:szCs w:val="21"/>
+        </w:rPr>
+        <w:t xml:space="preserve">Common riffle errors: Riffling too loudly (damages cards, indicates poor technique). Leaving clumps of 3 or more cards from the same half grouped together (reduces randomization). Lifting the deck halves instead of keeping them parallel to the table (exposes card faces to players at seats 1 and 9/10). Riffling from the back of the deck instead of near the corners (a technique that allows card manipulation, as demonstrated by professional magicians in security analysis sessions).</w:t>
       </w:r>
     </w:p>
     <w:p>
@@ -435,7 +547,7 @@
           <w:sz w:val="21"/>
           <w:szCs w:val="21"/>
         </w:rPr>
-        <w:t xml:space="preserve">Must split a 52-card deck into approximately equal halves and interleave them card-by-card. Must achieve true interleaving (no clumps of 3+ cards from the same half remaining together). Must complete three riffles per shuffle cycle. This is a high-dexterity manipulation task requiring precise force control on individual cards approximately 0.3mm thick.</w:t>
+        <w:t xml:space="preserve">Must split a 52-card deck into approximately equal halves and interleave them card-by-card. Must achieve true interleaving (no clumps of 3+ cards from the same half remaining together). Must complete three riffles per shuffle cycle. Cards must remain parallel to the table surface throughout (never angled where faces could be visible). This is a high-dexterity manipulation task requiring precise force control on individual cards approximately 0.3mm thick. The riffle motion should be quiet and controlled, not forceful.</w:t>
       </w:r>
     </w:p>
     <w:p>
@@ -451,46 +563,21 @@
           <w:sz w:val="22"/>
           <w:szCs w:val="22"/>
         </w:rPr>
-        <w:t xml:space="preserve">Box</w:t>
-      </w:r>
-    </w:p>
-    <w:p>
-      <w:pPr>
-        <w:spacing w:after="160" w:line="276"/>
-      </w:pPr>
-      <w:r>
-        <w:rPr>
-          <w:rFonts w:ascii="Arial" w:cs="Arial" w:eastAsia="Arial" w:hAnsi="Arial"/>
-          <w:color w:val="333333"/>
-          <w:sz w:val="21"/>
-          <w:szCs w:val="21"/>
-        </w:rPr>
-        <w:t xml:space="preserve">The box (also called a strip) is performed between the second and third riffles. The dealer takes the top quarter of the deck and places it on the table, then the next quarter on top, continuing until all four quarters have been restacked in reverse order. This breaks up any card sequences that survived the riffles. Some rooms use a three-cut box instead of four.</w:t>
-      </w:r>
-    </w:p>
-    <w:p>
-      <w:pPr>
-        <w:spacing w:after="160" w:line="276"/>
-      </w:pPr>
-      <w:r>
-        <w:rPr>
-          <w:rFonts w:ascii="Arial" w:cs="Arial" w:eastAsia="Arial" w:hAnsi="Arial"/>
-          <w:b/>
-          <w:bCs/>
-          <w:color w:val="2C3E50"/>
-          <w:sz w:val="21"/>
-          <w:szCs w:val="21"/>
-        </w:rPr>
-        <w:t xml:space="preserve">Robotic Requirement: </w:t>
-      </w:r>
-      <w:r>
-        <w:rPr>
-          <w:rFonts w:ascii="Arial" w:cs="Arial" w:eastAsia="Arial" w:hAnsi="Arial"/>
-          <w:color w:val="333333"/>
-          <w:sz w:val="21"/>
-          <w:szCs w:val="21"/>
-        </w:rPr>
-        <w:t xml:space="preserve">Must divide the deck into approximately equal quarters and restack them in reverse order. Portion sizes do not need to be exact but should be roughly equal. This adds a non-riffle randomization step that defeats card-tracking techniques.</w:t>
+        <w:t xml:space="preserve">Riffle Adaptation: Long Fingernails</w:t>
+      </w:r>
+    </w:p>
+    <w:p>
+      <w:pPr>
+        <w:spacing w:after="160" w:line="276"/>
+      </w:pPr>
+      <w:r>
+        <w:rPr>
+          <w:rFonts w:ascii="Arial" w:cs="Arial" w:eastAsia="Arial" w:hAnsi="Arial"/>
+          <w:color w:val="333333"/>
+          <w:sz w:val="21"/>
+          <w:szCs w:val="21"/>
+        </w:rPr>
+        <w:t xml:space="preserve">A practical consideration documented in the TruePokerDealer curriculum: dealers with long fingernails require one additional step at the beginning of each riffle. Because long nails prevent the standard finger grip from pulling the deck apart, the dealer must first get their thumb under the cards (the felt’s cushion allows the nail to slide underneath), lift the deck approximately a quarter to half inch, and then use the middle and ring fingers to establish a grip for splitting. Once the cards are elevated and gripped, the standard riffle procedure is identical. The nail itself is not used for any part of the grip; it is only used to get under the cards initially. This adaptation applies to chip cutting as well: the nail replaces the fingertip as the contact point when sliding across chip stacks. This is relevant for robotic design because it demonstrates that the riffle can be executed with different end-effector geometries, as long as the fundamental grip and force patterns are maintained.</w:t>
       </w:r>
     </w:p>
     <w:p>
@@ -506,6 +593,75 @@
           <w:sz w:val="22"/>
           <w:szCs w:val="22"/>
         </w:rPr>
+        <w:t xml:space="preserve">Box</w:t>
+      </w:r>
+    </w:p>
+    <w:p>
+      <w:pPr>
+        <w:spacing w:after="160" w:line="276"/>
+      </w:pPr>
+      <w:r>
+        <w:rPr>
+          <w:rFonts w:ascii="Arial" w:cs="Arial" w:eastAsia="Arial" w:hAnsi="Arial"/>
+          <w:color w:val="333333"/>
+          <w:sz w:val="21"/>
+          <w:szCs w:val="21"/>
+        </w:rPr>
+        <w:t xml:space="preserve">The box (also called a strip) is performed between the second and third riffles. Using the riffle grip in one hand, the dealer uses the thumb and middle finger of the other hand (with wrist flat on the table) to take the top quarter of the deck and place it on the felt. The next quarter goes on top, then the next, then the final quarter. The cards from the top end up on the bottom, reversing the order of the four sections. There are two methods: (1) lifting each quarter off with thumb and middle finger and placing it down, or (2) placing each quarter onto the table and then stacking the next one on top. Both achieve the same result.</w:t>
+      </w:r>
+    </w:p>
+    <w:p>
+      <w:pPr>
+        <w:spacing w:after="160" w:line="276"/>
+      </w:pPr>
+      <w:r>
+        <w:rPr>
+          <w:rFonts w:ascii="Arial" w:cs="Arial" w:eastAsia="Arial" w:hAnsi="Arial"/>
+          <w:color w:val="333333"/>
+          <w:sz w:val="21"/>
+          <w:szCs w:val="21"/>
+        </w:rPr>
+        <w:t xml:space="preserve">Critical detail: During the box, the dealer must keep the deck halves parallel to the table at all times. Lifting the deck at an angle during the strip could expose the bottom card to players. This is one of the operations where professional magicians have demonstrated the ability to perform a ‘fake box’: stripping from the bottom instead of the top, which leaves the card order unchanged while appearing legitimate. Surveillance and floor supervisors are trained to watch for this, and the correct top-to-bottom direction of the strip is important for game integrity.</w:t>
+      </w:r>
+    </w:p>
+    <w:p>
+      <w:pPr>
+        <w:spacing w:after="160" w:line="276"/>
+      </w:pPr>
+      <w:r>
+        <w:rPr>
+          <w:rFonts w:ascii="Arial" w:cs="Arial" w:eastAsia="Arial" w:hAnsi="Arial"/>
+          <w:b/>
+          <w:bCs/>
+          <w:color w:val="2C3E50"/>
+          <w:sz w:val="21"/>
+          <w:szCs w:val="21"/>
+        </w:rPr>
+        <w:t xml:space="preserve">Robotic Requirement: </w:t>
+      </w:r>
+      <w:r>
+        <w:rPr>
+          <w:rFonts w:ascii="Arial" w:cs="Arial" w:eastAsia="Arial" w:hAnsi="Arial"/>
+          <w:color w:val="333333"/>
+          <w:sz w:val="21"/>
+          <w:szCs w:val="21"/>
+        </w:rPr>
+        <w:t xml:space="preserve">Must divide the deck into approximately equal quarters and restack them in reverse order (top to bottom). Portion sizes do not need to be exact but should be roughly equal. The direction of the strip (top quarters to felt) must be consistent and verifiable. This adds a non-riffle randomization step that defeats card-tracking techniques.</w:t>
+      </w:r>
+    </w:p>
+    <w:p>
+      <w:pPr>
+        <w:spacing w:before="200" w:after="120"/>
+      </w:pPr>
+      <w:r>
+        <w:rPr>
+          <w:rFonts w:ascii="Arial" w:cs="Arial" w:eastAsia="Arial" w:hAnsi="Arial"/>
+          <w:b/>
+          <w:bCs/>
+          <w:color w:val="C0392B"/>
+          <w:sz w:val="22"/>
+          <w:szCs w:val="22"/>
+        </w:rPr>
         <w:t xml:space="preserve">Cut</w:t>
       </w:r>
     </w:p>
@@ -520,7 +676,35 @@
           <w:sz w:val="21"/>
           <w:szCs w:val="21"/>
         </w:rPr>
-        <w:t xml:space="preserve">After the final riffle, the dealer cuts the deck by lifting approximately one-third to two-thirds from the top and placing it on the table, then stacking the remainder on top. In many casino environments, a cut card (solid-colored plastic card) is offered to a player to cut the deck. The cut card is then placed at the bottom of the deck to prevent the bottom card from being visible during dealing.</w:t>
+        <w:t xml:space="preserve">After the final riffle, the dealer cuts the deck using one hand only. The cut card (a solid-colored plastic card) is placed in front of the deck with the dull side up (the shiny side could reflect a card face). The dealer takes either one-third off the top or leaves one-third on the bottom and places the lifted portion onto the cut card. Then the remaining portion goes on top. This prevents anyone from being able to follow a specific card through the entire shuffle sequence. The cut card remains at the bottom of the deck throughout dealing, preventing the bottom card from being visible.</w:t>
+      </w:r>
+    </w:p>
+    <w:p>
+      <w:pPr>
+        <w:spacing w:after="160" w:line="276"/>
+      </w:pPr>
+      <w:r>
+        <w:rPr>
+          <w:rFonts w:ascii="Arial" w:cs="Arial" w:eastAsia="Arial" w:hAnsi="Arial"/>
+          <w:color w:val="333333"/>
+          <w:sz w:val="21"/>
+          <w:szCs w:val="21"/>
+        </w:rPr>
+        <w:t xml:space="preserve">Important timing note: After the final riffle and before the cut is the appropriate time for the dealer to perform any non-dealing administrative tasks (collecting antes in a tournament, processing a buy-in in a cash game). Once the cut begins, the dealer should complete the cut and proceed directly to pitching cards. Interrupting the dealing sequence after the cut creates opportunities for deck manipulation and is considered a procedural vulnerability.</w:t>
+      </w:r>
+    </w:p>
+    <w:p>
+      <w:pPr>
+        <w:spacing w:after="160" w:line="276"/>
+      </w:pPr>
+      <w:r>
+        <w:rPr>
+          <w:rFonts w:ascii="Arial" w:cs="Arial" w:eastAsia="Arial" w:hAnsi="Arial"/>
+          <w:color w:val="333333"/>
+          <w:sz w:val="21"/>
+          <w:szCs w:val="21"/>
+        </w:rPr>
+        <w:t xml:space="preserve">The cut is also where professional card manipulators face the most difficulty. As demonstrated in security analysis sessions, false riffles and false boxes can retain card positions through the shuffle, but the cut is harder to fake with one hand. Two-handed cuts are a red flag for surveillance: a legitimate casino cut is always performed with one hand. Magicians have developed one-handed false cuts (using a blocking finger on the bottom to appear to cut while retaining positions), but these are detectable by trained observers.</w:t>
       </w:r>
     </w:p>
     <w:p>
@@ -545,7 +729,7 @@
           <w:sz w:val="21"/>
           <w:szCs w:val="21"/>
         </w:rPr>
-        <w:t xml:space="preserve">Must execute a clean deck cut. If the system is designed to interact with players who cut the deck, it must be able to offer and accept a cut card from a player. The cut card must remain at the bottom of the deck throughout the dealing process.</w:t>
+        <w:t xml:space="preserve">Must execute a clean single-motion deck cut. The cut card must remain at the bottom of the deck throughout the dealing process. If the system is designed to interact with players who cut the deck, it must be able to offer and accept a cut card from a player. The cut must be verifiably random (not to the same position each time) to prevent exploitation.</w:t>
       </w:r>
     </w:p>
     <w:p>
@@ -1485,21 +1669,201 @@
           <w:sz w:val="21"/>
           <w:szCs w:val="21"/>
         </w:rPr>
-        <w:t xml:space="preserve">The deck is held in the non-dominant hand (typically left) with a slight angle, tilted approximately 15 to 20 degrees from horizontal. This angle allows the thumb to push the top card off the deck smoothly. The deck must NOT be held flat (makes card removal harder) or angled too steeply (exposes card faces to players on one side of the table). The forefinger rests on the front edge of the deck, preventing cards from sliding forward, but must not press too high or cards will bend upward when pushed off, exposing their value.</w:t>
-      </w:r>
-    </w:p>
-    <w:p>
-      <w:pPr>
-        <w:spacing w:after="160" w:line="276"/>
-      </w:pPr>
-      <w:r>
-        <w:rPr>
-          <w:rFonts w:ascii="Arial" w:cs="Arial" w:eastAsia="Arial" w:hAnsi="Arial"/>
-          <w:color w:val="333333"/>
-          <w:sz w:val="21"/>
-          <w:szCs w:val="21"/>
-        </w:rPr>
-        <w:t xml:space="preserve">To pitch a card, the thumb pushes the top card slightly off the deck toward the upper-right corner. The throwing hand (dominant) grabs this card between the thumb (underneath), index finger (on top), and middle finger (finding a comfortable grip point along the card edge). The card is then propelled by extending the middle finger outward while releasing the thumb and index finger. There is no wrist flick and no arm motion. The entire pitch comes from opening the hand. This is critical for avoiding repetitive strain injuries during 8-hour dealing shifts.</w:t>
+        <w:t xml:space="preserve">The pitch is taught in the TruePokerDealer curriculum as the skill that benefits most from learning correctly the first time. Mark Shumer emphasizes: it is extremely important to learn the pitch correctly from the start, because once the body trains muscle memory for an incorrect pitch, unlearning it is an enormous effort. Dealers who learn wrong develop chronic injuries and have to essentially start over.</w:t>
+      </w:r>
+    </w:p>
+    <w:p>
+      <w:pPr>
+        <w:spacing w:before="200" w:after="120"/>
+      </w:pPr>
+      <w:r>
+        <w:rPr>
+          <w:rFonts w:ascii="Arial" w:cs="Arial" w:eastAsia="Arial" w:hAnsi="Arial"/>
+          <w:b/>
+          <w:bCs/>
+          <w:color w:val="C0392B"/>
+          <w:sz w:val="22"/>
+          <w:szCs w:val="22"/>
+        </w:rPr>
+        <w:t xml:space="preserve">Body Position</w:t>
+      </w:r>
+    </w:p>
+    <w:p>
+      <w:pPr>
+        <w:spacing w:after="160" w:line="276"/>
+      </w:pPr>
+      <w:r>
+        <w:rPr>
+          <w:rFonts w:ascii="Arial" w:cs="Arial" w:eastAsia="Arial" w:hAnsi="Arial"/>
+          <w:color w:val="333333"/>
+          <w:sz w:val="21"/>
+          <w:szCs w:val="21"/>
+        </w:rPr>
+        <w:t xml:space="preserve">Elbows must be in by the sides, not flared out. Palms face the ceiling (or tilted very slightly inward). The deck hand (non-dominant, typically left) holds the deck with a slight angle, tilted approximately 15 to 20 degrees from horizontal. This angle allows the thumb to push the top card off smoothly. The deck must NOT be held flat (makes card removal harder) and must NOT be tilted toward players. A deck tilted toward any player exposes card faces on every single pitch. Players who can see the flash will not say anything because they benefit from the information, so the dealer may never know they are exposing cards.</w:t>
+      </w:r>
+    </w:p>
+    <w:p>
+      <w:pPr>
+        <w:spacing w:before="200" w:after="120"/>
+      </w:pPr>
+      <w:r>
+        <w:rPr>
+          <w:rFonts w:ascii="Arial" w:cs="Arial" w:eastAsia="Arial" w:hAnsi="Arial"/>
+          <w:b/>
+          <w:bCs/>
+          <w:color w:val="C0392B"/>
+          <w:sz w:val="22"/>
+          <w:szCs w:val="22"/>
+        </w:rPr>
+        <w:t xml:space="preserve">Deck Hand Grip</w:t>
+      </w:r>
+    </w:p>
+    <w:p>
+      <w:pPr>
+        <w:spacing w:after="160" w:line="276"/>
+      </w:pPr>
+      <w:r>
+        <w:rPr>
+          <w:rFonts w:ascii="Arial" w:cs="Arial" w:eastAsia="Arial" w:hAnsi="Arial"/>
+          <w:color w:val="333333"/>
+          <w:sz w:val="21"/>
+          <w:szCs w:val="21"/>
+        </w:rPr>
+        <w:t xml:space="preserve">The forefinger rests on the front edge of the deck, protecting the front card from sliding forward and exposing. However, the forefinger must not press too high: if it rides up on the card face, every card pushed off the deck will bend upward against the finger and flash its value. The three remaining fingers (middle, ring, pinky) rest along the side of the deck, feeling for how many cards are being pushed off (must always be exactly one). The thumb is positioned on top of the deck in a flexible position, ready to push cards off.</w:t>
+      </w:r>
+    </w:p>
+    <w:p>
+      <w:pPr>
+        <w:spacing w:before="200" w:after="120"/>
+      </w:pPr>
+      <w:r>
+        <w:rPr>
+          <w:rFonts w:ascii="Arial" w:cs="Arial" w:eastAsia="Arial" w:hAnsi="Arial"/>
+          <w:b/>
+          <w:bCs/>
+          <w:color w:val="C0392B"/>
+          <w:sz w:val="22"/>
+          <w:szCs w:val="22"/>
+        </w:rPr>
+        <w:t xml:space="preserve">The Primary Pitch (Top Corner Grab)</w:t>
+      </w:r>
+    </w:p>
+    <w:p>
+      <w:pPr>
+        <w:spacing w:after="160" w:line="276"/>
+      </w:pPr>
+      <w:r>
+        <w:rPr>
+          <w:rFonts w:ascii="Arial" w:cs="Arial" w:eastAsia="Arial" w:hAnsi="Arial"/>
+          <w:color w:val="333333"/>
+          <w:sz w:val="21"/>
+          <w:szCs w:val="21"/>
+        </w:rPr>
+        <w:t xml:space="preserve">Step 1: The thumb pushes the top card slightly off the deck toward the upper-right corner. Do not push the card too far off. Step 2: The throwing hand grabs the card at the top-right corner with the thumb underneath and the index finger on top. The grip is loose, not tight. If the thumb and index finger squeeze too hard, the card will bend upward during projection and flash. Step 3: The middle finger finds its ‘divot’ — a comfortable grip point along the card edge that is slightly different for every dealer. This middle finger is what propels the card. Step 4: The card is projected by opening the hand. The middle finger extends outward, pushing the card, while the thumb and index finger release simultaneously. The follow-through is the hand opening fully with all fingers extended.</w:t>
+      </w:r>
+    </w:p>
+    <w:p>
+      <w:pPr>
+        <w:spacing w:after="160" w:line="276"/>
+      </w:pPr>
+      <w:r>
+        <w:rPr>
+          <w:rFonts w:ascii="Arial" w:cs="Arial" w:eastAsia="Arial" w:hAnsi="Arial"/>
+          <w:color w:val="333333"/>
+          <w:sz w:val="21"/>
+          <w:szCs w:val="21"/>
+        </w:rPr>
+        <w:t xml:space="preserve">Critical: There is NO wrist flick and NO arm motion. The entire pitch comes from opening the hand. This is not a suggestion for better form — it is a medical necessity. Dealers who pitch with wrist action develop ganglion cysts (a fluid-filled bump on the wrist caused by repetitive strain). Multiple dealers in the TruePokerDealer community have reported developing ganglion cysts specifically from incorrect pitch mechanics, with the cysts persisting for years. Dealers who pitch with arm motion are slower, less accurate, and fatigue faster.</w:t>
+      </w:r>
+    </w:p>
+    <w:p>
+      <w:pPr>
+        <w:spacing w:before="200" w:after="120"/>
+      </w:pPr>
+      <w:r>
+        <w:rPr>
+          <w:rFonts w:ascii="Arial" w:cs="Arial" w:eastAsia="Arial" w:hAnsi="Arial"/>
+          <w:b/>
+          <w:bCs/>
+          <w:color w:val="C0392B"/>
+          <w:sz w:val="22"/>
+          <w:szCs w:val="22"/>
+        </w:rPr>
+        <w:t xml:space="preserve">The Secondary Pitch (Center Grab)</w:t>
+      </w:r>
+    </w:p>
+    <w:p>
+      <w:pPr>
+        <w:spacing w:after="160" w:line="276"/>
+      </w:pPr>
+      <w:r>
+        <w:rPr>
+          <w:rFonts w:ascii="Arial" w:cs="Arial" w:eastAsia="Arial" w:hAnsi="Arial"/>
+          <w:color w:val="333333"/>
+          <w:sz w:val="21"/>
+          <w:szCs w:val="21"/>
+        </w:rPr>
+        <w:t xml:space="preserve">An alternative grip for situations where the primary pitch is insufficient. The card is pushed further off the deck and grabbed toward the center of the card (slightly above center) rather than the top corner. The middle finger goes to the back of the card. This grip allows the card to project more easily and travel further, which is useful when dealing on tables with poor felt (where cards do not glide well) or when the dealer needs extra distance. The center grab is slower than the top corner grab, which is why it is taught as a secondary technique. Professional dealers learn both grips and switch between them as table conditions require.</w:t>
+      </w:r>
+    </w:p>
+    <w:p>
+      <w:pPr>
+        <w:spacing w:before="200" w:after="120"/>
+      </w:pPr>
+      <w:r>
+        <w:rPr>
+          <w:rFonts w:ascii="Arial" w:cs="Arial" w:eastAsia="Arial" w:hAnsi="Arial"/>
+          <w:b/>
+          <w:bCs/>
+          <w:color w:val="C0392B"/>
+          <w:sz w:val="22"/>
+          <w:szCs w:val="22"/>
+        </w:rPr>
+        <w:t xml:space="preserve">Directional Pitching and Chair Position</w:t>
+      </w:r>
+    </w:p>
+    <w:p>
+      <w:pPr>
+        <w:spacing w:after="160" w:line="276"/>
+      </w:pPr>
+      <w:r>
+        <w:rPr>
+          <w:rFonts w:ascii="Arial" w:cs="Arial" w:eastAsia="Arial" w:hAnsi="Arial"/>
+          <w:color w:val="333333"/>
+          <w:sz w:val="21"/>
+          <w:szCs w:val="21"/>
+        </w:rPr>
+        <w:t xml:space="preserve">To pitch to different positions around the table, the dealer turns their entire body in the chair (a swivel chair is essential). The dealer should always try to be as centered as possible toward the target position. Pitching straight ahead is the most accurate trajectory. Pitching sideways (reaching to the far left or right without turning) causes cards to fly off-angle, increases exposure risk, and accelerates shoulder strain. In extreme cases where a player is at the very edge of the table, the dealer may need to angle their body rather than relying on the arm alone.</w:t>
+      </w:r>
+    </w:p>
+    <w:p>
+      <w:pPr>
+        <w:spacing w:before="200" w:after="120"/>
+      </w:pPr>
+      <w:r>
+        <w:rPr>
+          <w:rFonts w:ascii="Arial" w:cs="Arial" w:eastAsia="Arial" w:hAnsi="Arial"/>
+          <w:b/>
+          <w:bCs/>
+          <w:color w:val="C0392B"/>
+          <w:sz w:val="22"/>
+          <w:szCs w:val="22"/>
+        </w:rPr>
+        <w:t xml:space="preserve">Keeping Cards Face-Down During Pitch</w:t>
+      </w:r>
+    </w:p>
+    <w:p>
+      <w:pPr>
+        <w:spacing w:after="160" w:line="276"/>
+      </w:pPr>
+      <w:r>
+        <w:rPr>
+          <w:rFonts w:ascii="Arial" w:cs="Arial" w:eastAsia="Arial" w:hAnsi="Arial"/>
+          <w:color w:val="333333"/>
+          <w:sz w:val="21"/>
+          <w:szCs w:val="21"/>
+        </w:rPr>
+        <w:t xml:space="preserve">The most common pitch failure is a card flipping face-up during delivery. The primary cause is the wrist being angled downward rather than upward. As noted in TruePokerDealer training: to keep cards down when pitching, turn the wrist up toward the ceiling more. This simple adjustment changes the card’s trajectory from a tumbling arc to a flat glide. Dealers who consistently flip cards have their wrist position corrected first before any other adjustment is attempted.</w:t>
       </w:r>
     </w:p>
     <w:p>
@@ -1524,7 +1888,7 @@
           <w:sz w:val="21"/>
           <w:szCs w:val="21"/>
         </w:rPr>
-        <w:t xml:space="preserve">Pitching with wrist action (causes chronic wrist injuries including ganglion cysts), holding the deck tilted toward players (exposes card faces), gripping the card too tightly (causes it to bend upward and flash), and using arm motion instead of finger extension (slower, less accurate, more fatiguing).</w:t>
+        <w:t xml:space="preserve">Pitching with wrist action (causes ganglion cysts and chronic wrist injuries). Holding the deck tilted toward players (flashes every card dealt). Gripping the card too tightly with thumb and index finger (causes it to bend upward and flash). Using arm motion instead of finger extension (slower, less accurate, more fatiguing). Not turning the body in the chair when pitching to edge positions (causes inaccuracy and shoulder strain). Forefinger riding too high on the front of the deck (bends every card pushed off).</w:t>
       </w:r>
     </w:p>
     <w:p>
@@ -1549,7 +1913,7 @@
           <w:sz w:val="21"/>
           <w:szCs w:val="21"/>
         </w:rPr>
-        <w:t xml:space="preserve">Must deliver individual cards from a held deck to specific positions around a semicircular table (up to 10 player positions). Cards must travel flat (no flutter or flip) and land face-down at each player position. Card faces must not be visible at any point during the pitch. System must be capable of delivering 2 cards to each of 10 positions (20 pitches) in under 15 seconds for competitive speed. Each card must land within approximately 6 inches of the target position.</w:t>
+        <w:t xml:space="preserve">Must deliver individual cards from a held deck to specific positions around a semicircular table (up to 10 player positions). Cards must travel flat (no flutter or flip) and land face-down at each player position. Card faces must not be visible at any point during the pitch. System must be capable of delivering 2 cards to each of 10 positions (20 pitches) in under 15 seconds for competitive speed. Each card must land within approximately 6 inches of the target position. The pitching mechanism must be able to vary trajectory angle to reach all table positions without moving the entire base unit.</w:t>
       </w:r>
     </w:p>
     <w:p>
@@ -1748,21 +2112,49 @@
           <w:sz w:val="21"/>
           <w:szCs w:val="21"/>
         </w:rPr>
-        <w:t xml:space="preserve">Step 1: After all preflop action is complete and all bets have been gathered into the pot, the dealer taps the table. This is a gentle tap, not a slap, that serves as an audible notification that the flop is coming. The purpose is to alert any player who may not have acted yet. This is particularly important for the big blind, who sometimes only needs to check and may not have clearly indicated their action.</w:t>
-      </w:r>
-    </w:p>
-    <w:p>
-      <w:pPr>
-        <w:spacing w:after="160" w:line="276"/>
-      </w:pPr>
-      <w:r>
-        <w:rPr>
-          <w:rFonts w:ascii="Arial" w:cs="Arial" w:eastAsia="Arial" w:hAnsi="Arial"/>
-          <w:color w:val="333333"/>
-          <w:sz w:val="21"/>
-          <w:szCs w:val="21"/>
-        </w:rPr>
-        <w:t xml:space="preserve">Step 2: Burn a card. The dealer pushes the top card off the deck with their thumb, places their index finger underneath and thumb on top, and opens their hand against the card to pull it down to the felt while completely shielding it from all angles. The burn card goes underneath the pot or to a designated burn pile. The burn prevents any player who may have marked or identified the top card from knowing what community card is coming.</w:t>
+        <w:t xml:space="preserve">The transition from preflop to the flop is one of the most procedurally dense moments in dealing. As taught in TruePokerDealer Lesson 18, the exact sequence is:</w:t>
+      </w:r>
+    </w:p>
+    <w:p>
+      <w:pPr>
+        <w:spacing w:after="160" w:line="276"/>
+      </w:pPr>
+      <w:r>
+        <w:rPr>
+          <w:rFonts w:ascii="Arial" w:cs="Arial" w:eastAsia="Arial" w:hAnsi="Arial"/>
+          <w:color w:val="333333"/>
+          <w:sz w:val="21"/>
+          <w:szCs w:val="21"/>
+        </w:rPr>
+        <w:t xml:space="preserve">Step 1: Bring all bets in. After all preflop action is complete, the dealer sweeps all bets into the center pot. The pot should be gathered neatly.</w:t>
+      </w:r>
+    </w:p>
+    <w:p>
+      <w:pPr>
+        <w:spacing w:after="160" w:line="276"/>
+      </w:pPr>
+      <w:r>
+        <w:rPr>
+          <w:rFonts w:ascii="Arial" w:cs="Arial" w:eastAsia="Arial" w:hAnsi="Arial"/>
+          <w:color w:val="333333"/>
+          <w:sz w:val="21"/>
+          <w:szCs w:val="21"/>
+        </w:rPr>
+        <w:t xml:space="preserve">Step 2: Tap the table. This is a gentle tap, not a slap or a hammer. At the World Series of Poker in particular, loud taps are actively discouraged. The tap serves as an audible notification that the flop is coming. This is critical because it is possible that a player has not acted and nobody at the table realized it. The most common case: the big blind is last to act preflop, often only needs to check, and sometimes the dealer or table assumes they have checked when they have not. The tap gives that player a final moment to act before community cards are exposed.</w:t>
+      </w:r>
+    </w:p>
+    <w:p>
+      <w:pPr>
+        <w:spacing w:after="160" w:line="276"/>
+      </w:pPr>
+      <w:r>
+        <w:rPr>
+          <w:rFonts w:ascii="Arial" w:cs="Arial" w:eastAsia="Arial" w:hAnsi="Arial"/>
+          <w:color w:val="333333"/>
+          <w:sz w:val="21"/>
+          <w:szCs w:val="21"/>
+        </w:rPr>
+        <w:t xml:space="preserve">Step 3: Burn a card. The burn card procedure requires precise hand mechanics to prevent any exposure. The dealer pushes the top card off the deck with the thumb of the deck hand. Then the throwing hand takes the card with the index finger underneath and the thumb on top. The dealer opens their full hand against the card, creating a shield. The deck is brought close to the felt, and the burn card is pulled down underneath the hand so that it is completely covered throughout the entire motion from deck to felt. The burn card goes underneath the pot or in a diagonal pattern toward the dealer.</w:t>
       </w:r>
     </w:p>
     <w:p>
@@ -1787,21 +2179,35 @@
           <w:sz w:val="21"/>
           <w:szCs w:val="21"/>
         </w:rPr>
-        <w:t xml:space="preserve">Many inexperienced dealers grab the burn card with thumb and finger and pull it down in a way that briefly exposes the corner. Players positioned to the dealer’s left or right can see this flash. The correct technique involves opening the full hand over the card as a shield while bringing it to the felt. A robotic system must ensure zero exposure of the burn card during removal.</w:t>
-      </w:r>
-    </w:p>
-    <w:p>
-      <w:pPr>
-        <w:spacing w:after="160" w:line="276"/>
-      </w:pPr>
-      <w:r>
-        <w:rPr>
-          <w:rFonts w:ascii="Arial" w:cs="Arial" w:eastAsia="Arial" w:hAnsi="Arial"/>
-          <w:color w:val="333333"/>
-          <w:sz w:val="21"/>
-          <w:szCs w:val="21"/>
-        </w:rPr>
-        <w:t xml:space="preserve">Step 3: Deal three cards face-down, one at a time, from the deck. Place your index finger under each card and thumb on top, bring it down to the felt. Arrange all three cards roughly aligned. Then slide your thumb along one edge and fingers along the other to push them together neatly. Finally, place your thumb on the edge of the three-card block and pull/slide them apart so there is visible felt between each card.</w:t>
+        <w:t xml:space="preserve">Many inexperienced dealers grab the burn card with just the thumb and finger (like a pinch grip) and pull it down in a way that briefly exposes the corner. Players positioned to the dealer’s left or right can see this flash. Those players will not say anything because seeing the burn card is free information for them. The correct technique involves opening the full hand over the card as a complete shield while bringing it to the felt. The card must be invisible from the moment it leaves the deck to the moment it is on the felt. A robotic system must ensure zero exposure of the burn card during removal.</w:t>
+      </w:r>
+    </w:p>
+    <w:p>
+      <w:pPr>
+        <w:spacing w:after="160" w:line="276"/>
+      </w:pPr>
+      <w:r>
+        <w:rPr>
+          <w:rFonts w:ascii="Arial" w:cs="Arial" w:eastAsia="Arial" w:hAnsi="Arial"/>
+          <w:color w:val="333333"/>
+          <w:sz w:val="21"/>
+          <w:szCs w:val="21"/>
+        </w:rPr>
+        <w:t xml:space="preserve">Step 4: Deal three flop cards. For each card, the dealer places the index finger underneath the card and the thumb on top, then brings it down to the felt face-down. All three cards are dealt this way, roughly aligned in a row. The dealer then slides their thumb along one edge and the other fingers along the opposite edge to push the three cards neatly together. This creates a single block of three cards.</w:t>
+      </w:r>
+    </w:p>
+    <w:p>
+      <w:pPr>
+        <w:spacing w:after="160" w:line="276"/>
+      </w:pPr>
+      <w:r>
+        <w:rPr>
+          <w:rFonts w:ascii="Arial" w:cs="Arial" w:eastAsia="Arial" w:hAnsi="Arial"/>
+          <w:color w:val="333333"/>
+          <w:sz w:val="21"/>
+          <w:szCs w:val="21"/>
+        </w:rPr>
+        <w:t xml:space="preserve">Step 5: Spread the flop. The dealer places their thumb on the edge of the three-card block and pulls/slides the cards apart so there is visible felt between each card. This is the display position. Every card must be clearly visible to all player positions. Cards that are touching or overlapping are a sign of an inexperienced dealer and make it harder for players to read the board.</w:t>
       </w:r>
     </w:p>
     <w:p>
@@ -1826,7 +2232,7 @@
           <w:sz w:val="21"/>
           <w:szCs w:val="21"/>
         </w:rPr>
-        <w:t xml:space="preserve">Must deal 3 cards face-down, align them, then spread them face-up with visible separation between each card. Cards must be readable from all player positions. The spread must be consistent in spacing and orientation every time.</w:t>
+        <w:t xml:space="preserve">Must deal 3 cards face-down, align them into a block, then spread them face-up with visible felt separation between each card. Cards must be readable from all player positions simultaneously. The spread spacing and orientation must be consistent every time. The burn card must be completely shielded during removal — zero exposure tolerance.</w:t>
       </w:r>
     </w:p>
     <w:p>
@@ -1857,7 +2263,21 @@
           <w:sz w:val="21"/>
           <w:szCs w:val="21"/>
         </w:rPr>
-        <w:t xml:space="preserve">The turn and river each follow the same pattern: tap the table, burn one card (shielded), deal one card face-down, then flip it face-up next to the existing community cards. The turn card goes to the right of the flop. The river card goes to the right of the turn. A diagonal placement of burn cards (angled toward the dealer, away from the community cards) is the standard layout for keeping burn cards visually separated from the board.</w:t>
+        <w:t xml:space="preserve">The turn and river each follow the same pattern: tap the table (gently), burn one card (fully shielded using the same hand-over-card technique), deal one card face-down, then flip it face-up. For the flip: the dealer pushes the card out from the deck, turns their hand upside down so the index finger is on top and the thumb is underneath on the top corner, then flips the card face-up. The dealer may flip it directly into position next to the existing community cards, or flip it in front of themselves and then slide it into position. Both methods are accepted; the choice is often a matter of dealer preference or supervisor instruction.</w:t>
+      </w:r>
+    </w:p>
+    <w:p>
+      <w:pPr>
+        <w:spacing w:after="160" w:line="276"/>
+      </w:pPr>
+      <w:r>
+        <w:rPr>
+          <w:rFonts w:ascii="Arial" w:cs="Arial" w:eastAsia="Arial" w:hAnsi="Arial"/>
+          <w:color w:val="333333"/>
+          <w:sz w:val="21"/>
+          <w:szCs w:val="21"/>
+        </w:rPr>
+        <w:t xml:space="preserve">The turn card goes to the right of the flop. The river card goes to the right of the turn. Burn cards are placed in a diagonal pattern angled toward the dealer, away from the community cards. This diagonal placement serves a critical purpose: if a player accidentally mucks a card onto the burn pile area, the diagonal orientation makes it easy to distinguish burn cards from mucked cards. This protects the hand in case of any dispute about which cards belong where.</w:t>
       </w:r>
     </w:p>
     <w:p>
@@ -1882,7 +2302,7 @@
           <w:sz w:val="21"/>
           <w:szCs w:val="21"/>
         </w:rPr>
-        <w:t xml:space="preserve">Must execute the burn-and-turn sequence 3 times per hand (flop, turn, river) with zero card exposure on burns. Must maintain a clean, consistent community card layout that is visible from all 10 player positions simultaneously.</w:t>
+        <w:t xml:space="preserve">Must execute the burn-and-turn sequence 3 times per hand (flop, turn, river) with zero card exposure on burns. Must maintain a clean, consistent community card layout that is visible from all 10 player positions simultaneously. Burn cards must be physically separated from community cards in a distinguishable pattern.</w:t>
       </w:r>
     </w:p>
     <w:p>
@@ -2309,7 +2729,63 @@
           <w:sz w:val="21"/>
           <w:szCs w:val="21"/>
         </w:rPr>
-        <w:t xml:space="preserve">The dealer places an all-in button in front of each all-in player so the table can see their status. The all-in button is a physical marker that says ALL-IN on one side and CALL on the other. It is placed clearly visible in front of the player’s betting area, not on top of chips or underneath them.</w:t>
+        <w:t xml:space="preserve">The all-in button has become a standard tool in casino poker rooms over the last decade, recommended by the Tournament Directors Association (TDA Recommended Procedure 1). The dealer keeps one or two all-in buttons in their chip tray. When a player goes all-in, the dealer pulls the button from the tray and places it clearly in front of the player’s betting area, then verbally announces ‘all-in’ to the table. The verbal announcement is mandatory; the button does not replace it. The button says ALL-IN on one side and CALL on the other.</w:t>
+      </w:r>
+    </w:p>
+    <w:p>
+      <w:pPr>
+        <w:spacing w:after="160" w:line="276"/>
+      </w:pPr>
+      <w:r>
+        <w:rPr>
+          <w:rFonts w:ascii="Arial" w:cs="Arial" w:eastAsia="Arial" w:hAnsi="Arial"/>
+          <w:color w:val="333333"/>
+          <w:sz w:val="21"/>
+          <w:szCs w:val="21"/>
+        </w:rPr>
+        <w:t xml:space="preserve">Placement rules: The button must be fully visible to all players. It must NOT be placed underneath chips, on top of chips, or in any position where it could be obscured. Placing the button on top of a player’s chips is considered unprofessional and can create unintentional tells about the dealer’s perception of the situation. The button should not interact with the player’s chips at all.</w:t>
+      </w:r>
+    </w:p>
+    <w:p>
+      <w:pPr>
+        <w:spacing w:after="160" w:line="276"/>
+      </w:pPr>
+      <w:r>
+        <w:rPr>
+          <w:rFonts w:ascii="Arial" w:cs="Arial" w:eastAsia="Arial" w:hAnsi="Arial"/>
+          <w:color w:val="333333"/>
+          <w:sz w:val="21"/>
+          <w:szCs w:val="21"/>
+        </w:rPr>
+        <w:t xml:space="preserve">Multiple all-ins: If a second player goes all-in, the dealer uses a second button if available. If only one button exists, the dealer slides the button from the first all-in player to the most recent all-in player (the most recent all-in is the most relevant to the current action). If a third player goes all-in, the first button can be moved to them.</w:t>
+      </w:r>
+    </w:p>
+    <w:p>
+      <w:pPr>
+        <w:spacing w:after="160" w:line="276"/>
+      </w:pPr>
+      <w:r>
+        <w:rPr>
+          <w:rFonts w:ascii="Arial" w:cs="Arial" w:eastAsia="Arial" w:hAnsi="Arial"/>
+          <w:color w:val="333333"/>
+          <w:sz w:val="21"/>
+          <w:szCs w:val="21"/>
+        </w:rPr>
+        <w:t xml:space="preserve">The CALL side: In tournament play, the call button is especially valuable. When a player calls an all-in in a tournament, it is crucial information for all other players at the table because it affects their tournament equity calculations. In cash games, the call button is used less frequently because the stakes are contained to that hand. This is a judgment call for the dealer: in tournaments, always use the call side; in cash games, use judgment.</w:t>
+      </w:r>
+    </w:p>
+    <w:p>
+      <w:pPr>
+        <w:spacing w:after="160" w:line="276"/>
+      </w:pPr>
+      <w:r>
+        <w:rPr>
+          <w:rFonts w:ascii="Arial" w:cs="Arial" w:eastAsia="Arial" w:hAnsi="Arial"/>
+          <w:color w:val="333333"/>
+          <w:sz w:val="21"/>
+          <w:szCs w:val="21"/>
+        </w:rPr>
+        <w:t xml:space="preserve">Player confirmation: The all-in button alone is not sufficient to confirm a player is all-in. Best practice is to have the player push at least one chip into the pot in addition to the button placement. This prevents situations where a miscommunication results in a player being committed all-in when they did not intend it. Some poker rooms have this as an official or unofficial rule.</w:t>
       </w:r>
     </w:p>
     <w:p>
@@ -2721,7 +3197,63 @@
           <w:sz w:val="21"/>
           <w:szCs w:val="21"/>
         </w:rPr>
-        <w:t xml:space="preserve">As a game protection measure, dealers are expected to count the remaining cards in the deck (the stub) at least once per down (typically a 30-minute dealing session). In a 10-player Texas Hold’em hand that goes to the river, the stub should contain exactly 24 cards (52 minus 20 hole cards minus 3 burns minus 5 community cards). Dealers count the stub in groups of 8 while action is ongoing on the river, without announcing the count out loud. If the count is wrong, it indicates a card is missing (possibly stuck to another card, on the floor, or palmed) and the floor must be called immediately.</w:t>
+        <w:t xml:space="preserve">The stub count is a game protection measure that verifies all 52 cards are accounted for. Dealers are expected to count the stub at least once per down (a down is a 30-minute dealing session, after which the dealer rotates to a break or another table). The count should ideally be done during one of the first few hands at the table, because discovering a card discrepancy later in the down is far more problematic than catching it early.</w:t>
+      </w:r>
+    </w:p>
+    <w:p>
+      <w:pPr>
+        <w:spacing w:after="160" w:line="276"/>
+      </w:pPr>
+      <w:r>
+        <w:rPr>
+          <w:rFonts w:ascii="Arial" w:cs="Arial" w:eastAsia="Arial" w:hAnsi="Arial"/>
+          <w:color w:val="333333"/>
+          <w:sz w:val="21"/>
+          <w:szCs w:val="21"/>
+        </w:rPr>
+        <w:t xml:space="preserve">The math: In a 10-player Texas Hold’em hand that goes to the river, 28 cards have been used (20 hole cards + 3 burn cards + 5 community cards). The stub should contain exactly 24 cards (52 minus 28). The dealer counts the stub by taking cards off the top of the deck and dropping them in groups of 8. Three groups of 8 equals 24, confirming the count. The counting is done silently during river action while players are betting. The dealer never announces the count out loud, as it would be distracting and reveal information about game protection procedures.</w:t>
+      </w:r>
+    </w:p>
+    <w:p>
+      <w:pPr>
+        <w:spacing w:after="160" w:line="276"/>
+      </w:pPr>
+      <w:r>
+        <w:rPr>
+          <w:rFonts w:ascii="Arial" w:cs="Arial" w:eastAsia="Arial" w:hAnsi="Arial"/>
+          <w:color w:val="333333"/>
+          <w:sz w:val="21"/>
+          <w:szCs w:val="21"/>
+        </w:rPr>
+        <w:t xml:space="preserve">Adjustments for different player counts: With 9 players, 26 cards are used (18 hole cards + 8 community/burn), leaving 26 in the stub. Three groups of 8 equals 24, plus 2 remaining cards. With 8 players, 24 cards are used, leaving 28 in the stub (three groups of 8 plus 4 remaining). The dealer adjusts the expected remainder based on player count.</w:t>
+      </w:r>
+    </w:p>
+    <w:p>
+      <w:pPr>
+        <w:spacing w:after="160" w:line="276"/>
+      </w:pPr>
+      <w:r>
+        <w:rPr>
+          <w:rFonts w:ascii="Arial" w:cs="Arial" w:eastAsia="Arial" w:hAnsi="Arial"/>
+          <w:color w:val="333333"/>
+          <w:sz w:val="21"/>
+          <w:szCs w:val="21"/>
+        </w:rPr>
+        <w:t xml:space="preserve">Adjustments for incomplete hands: If the hand ends before the river (e.g., everyone folds on the turn), the dealer must account for the missing burn card and community card. For a hand that ended on the turn: add 2 to the expected stub count (one burn and one river card that were never dealt). The count still works; you just have 2 extra cards in the stub.</w:t>
+      </w:r>
+    </w:p>
+    <w:p>
+      <w:pPr>
+        <w:spacing w:after="160" w:line="276"/>
+      </w:pPr>
+      <w:r>
+        <w:rPr>
+          <w:rFonts w:ascii="Arial" w:cs="Arial" w:eastAsia="Arial" w:hAnsi="Arial"/>
+          <w:color w:val="333333"/>
+          <w:sz w:val="21"/>
+          <w:szCs w:val="21"/>
+        </w:rPr>
+        <w:t xml:space="preserve">If the count is wrong, it indicates a card is missing. Possible causes: a card stuck to another card (the most common cause), a card on the floor, a card palmed by a player or dealer (the most serious cause), or a card left in a player’s possession (sometimes players accidentally pocket a card). The floor must be called immediately if the count is off. The table may need to be searched, and in serious cases, the hand may be voided.</w:t>
       </w:r>
     </w:p>
     <w:p>
@@ -2746,7 +3278,7 @@
           <w:sz w:val="21"/>
           <w:szCs w:val="21"/>
         </w:rPr>
-        <w:t xml:space="preserve">Must maintain a real-time count of all cards dealt, burned, and remaining. Must verify 52-card integrity at configurable intervals. Must alert operators immediately if any discrepancy is detected. This is a trivial task for a computer but a non-trivial game protection task for a human dealer.</w:t>
+        <w:t xml:space="preserve">Must maintain a real-time count of all cards dealt, burned, and remaining. Must verify 52-card integrity at configurable intervals (recommended: every hand, since this is trivial for a computer). Must alert operators immediately if any discrepancy is detected. Should track the exact identity of every card dealt and remaining (not just count), enabling immediate identification of which specific card is missing. This is a trivial task for a computer but a non-trivial game protection task for a human dealer, making it one of the clearest advantages of robotic dealing.</w:t>
       </w:r>
     </w:p>
     <w:p>
@@ -2813,21 +3345,21 @@
           <w:sz w:val="21"/>
           <w:szCs w:val="21"/>
         </w:rPr>
-        <w:t xml:space="preserve">Chips are broken down (cut) in standardized groupings for verification. Chips with denominations of $1, $2, $5, and $100 are broken into stacks of 5 (so a full stack of 20 chips shows as 4 groups of 5). Chips with denominations of $0.50, $25, and $500 are broken into stacks of 4 (so a full stack of 20 shows as 5 groups of 4). These specific groupings make it easy for the dealer, surveillance, and players to quickly verify amounts: a stack of 20 x $5 chips cut in fives = $25 per cut, $100 total.</w:t>
-      </w:r>
-    </w:p>
-    <w:p>
-      <w:pPr>
-        <w:spacing w:after="160" w:line="276"/>
-      </w:pPr>
-      <w:r>
-        <w:rPr>
-          <w:rFonts w:ascii="Arial" w:cs="Arial" w:eastAsia="Arial" w:hAnsi="Arial"/>
-          <w:color w:val="333333"/>
-          <w:sz w:val="21"/>
-          <w:szCs w:val="21"/>
-        </w:rPr>
-        <w:t xml:space="preserve">The physical technique: Using the index finger, the dealer slides it across the top of a tall stack to separate the correct number of chips, lifts the portion with a pinch grip, and places it adjacent to the remaining stack. Professional dealers cut with their index finger (not thumb) because it offers greater range of motion and higher speed ceiling. The cut is done toward the dealer (not away) for security reasons. All cut chips remain visible to surveillance and the table.</w:t>
+        <w:t xml:space="preserve">Chips are broken down (cut) in standardized groupings for verification. A full stack in any casino is 20 chips of a single denomination. The breakdown groupings are industry standard and exist to make visual verification instantaneous for the dealer, surveillance, and players:</w:t>
+      </w:r>
+    </w:p>
+    <w:p>
+      <w:pPr>
+        <w:spacing w:after="160" w:line="276"/>
+      </w:pPr>
+      <w:r>
+        <w:rPr>
+          <w:rFonts w:ascii="Arial" w:cs="Arial" w:eastAsia="Arial" w:hAnsi="Arial"/>
+          <w:color w:val="333333"/>
+          <w:sz w:val="21"/>
+          <w:szCs w:val="21"/>
+        </w:rPr>
+        <w:t xml:space="preserve">Cut in groups of 5: $1 chips ($5 per group, $100 per full stack), $2 chips ($10 per group, $40 per full stack), $5 chips ($25 per group, $100 per full stack), $100 chips ($500 per group, $2,000 per full stack). Cut in groups of 4: $0.50 chips ($2 per group, $10 per full stack), $25 chips ($100 per group, $500 per full stack), $500 chips ($2,000 per group, $10,000 per full stack). These groupings are chosen so that each cut-group equals a clean dollar amount, making pot calculations and change-making faster.</w:t>
       </w:r>
     </w:p>
     <w:p>
@@ -2843,6 +3375,148 @@
           <w:sz w:val="22"/>
           <w:szCs w:val="22"/>
         </w:rPr>
+        <w:t xml:space="preserve">The Bump-and-Prove Technique</w:t>
+      </w:r>
+    </w:p>
+    <w:p>
+      <w:pPr>
+        <w:spacing w:after="160" w:line="276"/>
+      </w:pPr>
+      <w:r>
+        <w:rPr>
+          <w:rFonts w:ascii="Arial" w:cs="Arial" w:eastAsia="Arial" w:hAnsi="Arial"/>
+          <w:color w:val="333333"/>
+          <w:sz w:val="21"/>
+          <w:szCs w:val="21"/>
+        </w:rPr>
+        <w:t xml:space="preserve">The physical chip cutting technique, as detailed in TruePokerDealer Lesson 5a, follows a specific sequence called ‘bump and prove’:</w:t>
+      </w:r>
+    </w:p>
+    <w:p>
+      <w:pPr>
+        <w:spacing w:after="160" w:line="276"/>
+      </w:pPr>
+      <w:r>
+        <w:rPr>
+          <w:rFonts w:ascii="Arial" w:cs="Arial" w:eastAsia="Arial" w:hAnsi="Arial"/>
+          <w:color w:val="333333"/>
+          <w:sz w:val="21"/>
+          <w:szCs w:val="21"/>
+        </w:rPr>
+        <w:t xml:space="preserve">Step 1 (Grip): The dealer uses their index finger (considered the most professional method; some dealers use their thumb, but the index finger provides a higher speed ceiling and greater range of motion). The grip has the thumb on one side of the stack, middle finger on the other side, and pinky behind the stack protecting it from shifting backward. The index finger is lifted and positioned flat on top.</w:t>
+      </w:r>
+    </w:p>
+    <w:p>
+      <w:pPr>
+        <w:spacing w:after="160" w:line="276"/>
+      </w:pPr>
+      <w:r>
+        <w:rPr>
+          <w:rFonts w:ascii="Arial" w:cs="Arial" w:eastAsia="Arial" w:hAnsi="Arial"/>
+          <w:color w:val="333333"/>
+          <w:sz w:val="21"/>
+          <w:szCs w:val="21"/>
+        </w:rPr>
+        <w:t xml:space="preserve">Step 2 (Initial cut): The dealer picks up all chips except the bottom 5 (or 4, depending on denomination). If they accidentally take one too many or one too few, they simply adjust. With practice, dealers get the correct count on the first try most of the time.</w:t>
+      </w:r>
+    </w:p>
+    <w:p>
+      <w:pPr>
+        <w:spacing w:after="160" w:line="276"/>
+      </w:pPr>
+      <w:r>
+        <w:rPr>
+          <w:rFonts w:ascii="Arial" w:cs="Arial" w:eastAsia="Arial" w:hAnsi="Arial"/>
+          <w:color w:val="333333"/>
+          <w:sz w:val="21"/>
+          <w:szCs w:val="21"/>
+        </w:rPr>
+        <w:t xml:space="preserve">Step 3 (Placement): The lifted stack is placed slightly behind the remaining stack (during training; at speed, it is placed close). This is where the pinky protecting the back becomes critical: without it, the stack will shift backward when pushed forward.</w:t>
+      </w:r>
+    </w:p>
+    <w:p>
+      <w:pPr>
+        <w:spacing w:after="160" w:line="276"/>
+      </w:pPr>
+      <w:r>
+        <w:rPr>
+          <w:rFonts w:ascii="Arial" w:cs="Arial" w:eastAsia="Arial" w:hAnsi="Arial"/>
+          <w:color w:val="333333"/>
+          <w:sz w:val="21"/>
+          <w:szCs w:val="21"/>
+        </w:rPr>
+        <w:t xml:space="preserve">Step 4 (Bump): The dealer pushes the held stack forward into the stationary stack. This is the ‘bump.’ The physical contact between the two stacks stabilizes them and creates a reference point for the next step.</w:t>
+      </w:r>
+    </w:p>
+    <w:p>
+      <w:pPr>
+        <w:spacing w:after="160" w:line="276"/>
+      </w:pPr>
+      <w:r>
+        <w:rPr>
+          <w:rFonts w:ascii="Arial" w:cs="Arial" w:eastAsia="Arial" w:hAnsi="Arial"/>
+          <w:color w:val="333333"/>
+          <w:sz w:val="21"/>
+          <w:szCs w:val="21"/>
+        </w:rPr>
+        <w:t xml:space="preserve">Step 5 (Prove): The dealer slides the index finger flat across the top of the held stack toward the stationary stack. When the index finger makes contact with the stationary stack at the same height as the held stack, this ‘proves’ that both stacks are the same height (and therefore the same count). The dealer then lifts the proved portion and drops the next group of 5 (or 4).</w:t>
+      </w:r>
+    </w:p>
+    <w:p>
+      <w:pPr>
+        <w:spacing w:after="160" w:line="276"/>
+      </w:pPr>
+      <w:r>
+        <w:rPr>
+          <w:rFonts w:ascii="Arial" w:cs="Arial" w:eastAsia="Arial" w:hAnsi="Arial"/>
+          <w:color w:val="333333"/>
+          <w:sz w:val="21"/>
+          <w:szCs w:val="21"/>
+        </w:rPr>
+        <w:t xml:space="preserve">Step 6 (Repeat): Bump and prove all the way down. After the final drop, the dealer proves one more time even though there are no more chips to pull up. This final prove verifies that the last dropped group matches all the others. Without this final prove, the last group could be off by one chip and the error would go undetected.</w:t>
+      </w:r>
+    </w:p>
+    <w:p>
+      <w:pPr>
+        <w:spacing w:after="160" w:line="276"/>
+      </w:pPr>
+      <w:r>
+        <w:rPr>
+          <w:rFonts w:ascii="Arial" w:cs="Arial" w:eastAsia="Arial" w:hAnsi="Arial"/>
+          <w:color w:val="333333"/>
+          <w:sz w:val="21"/>
+          <w:szCs w:val="21"/>
+        </w:rPr>
+        <w:t xml:space="preserve">Step 7 (Splash): The dealer takes the proven stacks between thumb and middle finger at a slight angle and pushes them off the felt in a fanning motion. This ‘splash’ separates the groups horizontally so that each group of 5 (or 4) is visually distinct and countable at a glance. Do not spin or drop the chips; if they are sticky (common with heavily used casino chips), spinning causes them to fly apart.</w:t>
+      </w:r>
+    </w:p>
+    <w:p>
+      <w:pPr>
+        <w:spacing w:after="160" w:line="276"/>
+      </w:pPr>
+      <w:r>
+        <w:rPr>
+          <w:rFonts w:ascii="Arial" w:cs="Arial" w:eastAsia="Arial" w:hAnsi="Arial"/>
+          <w:color w:val="333333"/>
+          <w:sz w:val="21"/>
+          <w:szCs w:val="21"/>
+        </w:rPr>
+        <w:t xml:space="preserve">Step 8 (Clear and verify): The dealer clears their hands (shows palms). Then they scoop the chips back up with thumb on one side, middle finger on the other, ring finger and pinky behind, and prove one final time as they pick up. This final prove ensures no chip was palmed during the splash. Then the chips are handed off or placed in the tray.</w:t>
+      </w:r>
+    </w:p>
+    <w:p>
+      <w:pPr>
+        <w:spacing w:before="200" w:after="120"/>
+      </w:pPr>
+      <w:r>
+        <w:rPr>
+          <w:rFonts w:ascii="Arial" w:cs="Arial" w:eastAsia="Arial" w:hAnsi="Arial"/>
+          <w:b/>
+          <w:bCs/>
+          <w:color w:val="C0392B"/>
+          <w:sz w:val="22"/>
+          <w:szCs w:val="22"/>
+        </w:rPr>
         <w:t xml:space="preserve">The Moment-of-Contact Principle</w:t>
       </w:r>
     </w:p>
@@ -2862,6 +3536,36 @@
     </w:p>
     <w:p>
       <w:pPr>
+        <w:spacing w:before="200" w:after="120"/>
+      </w:pPr>
+      <w:r>
+        <w:rPr>
+          <w:rFonts w:ascii="Arial" w:cs="Arial" w:eastAsia="Arial" w:hAnsi="Arial"/>
+          <w:b/>
+          <w:bCs/>
+          <w:color w:val="C0392B"/>
+          <w:sz w:val="22"/>
+          <w:szCs w:val="22"/>
+        </w:rPr>
+        <w:t xml:space="preserve">Chip Geometry Note</w:t>
+      </w:r>
+    </w:p>
+    <w:p>
+      <w:pPr>
+        <w:spacing w:after="160" w:line="276"/>
+      </w:pPr>
+      <w:r>
+        <w:rPr>
+          <w:rFonts w:ascii="Arial" w:cs="Arial" w:eastAsia="Arial" w:hAnsi="Arial"/>
+          <w:color w:val="333333"/>
+          <w:sz w:val="21"/>
+          <w:szCs w:val="21"/>
+        </w:rPr>
+        <w:t xml:space="preserve">A surprising physical property of casino chips relevant to visual verification systems: a single chip stood on its edge is exactly 12 chips tall when stacked. This means a standard chip is almost exactly a perfect square when viewed from the side (the diameter-to-height ratio of stacked chips is 12:1, and a single chip on edge equals 12 stacked). This property is consistent across virtually all casino chip manufacturers and is useful for calibrating visual chip-counting systems.</w:t>
+      </w:r>
+    </w:p>
+    <w:p>
+      <w:pPr>
         <w:spacing w:after="160" w:line="276"/>
       </w:pPr>
       <w:r>
@@ -2882,7 +3586,7 @@
           <w:sz w:val="21"/>
           <w:szCs w:val="21"/>
         </w:rPr>
-        <w:t xml:space="preserve">Must separate chip stacks into standard casino groupings (5s or 4s depending on denomination). Must identify denominations by color, markings, or RFID. Must execute cuts quickly and display results clearly for verification. Must maintain organized chip bank with denominations in standard order.</w:t>
+        <w:t xml:space="preserve">Must separate chip stacks into standard casino groupings (5s or 4s depending on denomination). Must identify denominations by color, markings, or RFID. Must execute cuts quickly and display results clearly for verification. Must maintain organized chip bank with denominations in standard order. Must learn both hands (the bump-and-prove technique must be executable from either side of the tray). All chip movements must be camera-friendly for surveillance verification.</w:t>
       </w:r>
     </w:p>
     <w:p>
@@ -3778,7 +4482,91 @@
           <w:sz w:val="26"/>
           <w:szCs w:val="26"/>
         </w:rPr>
-        <w:t xml:space="preserve">10.4 Player Pace and Game Energy</w:t>
+        <w:t xml:space="preserve">10.4 Reading the Customer</w:t>
+      </w:r>
+    </w:p>
+    <w:p>
+      <w:pPr>
+        <w:spacing w:after="160" w:line="276"/>
+      </w:pPr>
+      <w:r>
+        <w:rPr>
+          <w:rFonts w:ascii="Arial" w:cs="Arial" w:eastAsia="Arial" w:hAnsi="Arial"/>
+          <w:color w:val="333333"/>
+          <w:sz w:val="21"/>
+          <w:szCs w:val="21"/>
+        </w:rPr>
+        <w:t xml:space="preserve">Dealers are expected to ‘read the customer’ — observing subtle clues about each player’s mood, patience level, personality, and wants, then adjusting their interaction style accordingly. If a player clearly wants silence, the dealer deals in silence. If a player is superstitious (common in poker), the dealer respects those superstitions (e.g., not touching the player’s chips if they’re superstitious about it). The goal is that every player leaves the casino with a positive impression, regardless of their results.</w:t>
+      </w:r>
+    </w:p>
+    <w:p>
+      <w:pPr>
+        <w:spacing w:after="160" w:line="276"/>
+      </w:pPr>
+      <w:r>
+        <w:rPr>
+          <w:rFonts w:ascii="Arial" w:cs="Arial" w:eastAsia="Arial" w:hAnsi="Arial"/>
+          <w:color w:val="333333"/>
+          <w:sz w:val="21"/>
+          <w:szCs w:val="21"/>
+        </w:rPr>
+        <w:t xml:space="preserve">An important unwritten rule in poker dealing: the dealer should never look at a player’s face while that player is in action (making a betting decision). This is a game integrity issue — the dealer’s gaze could give away information or make the player uncomfortable. When it is not a player’s turn and they are interacting with the dealer about something unrelated to the hand, normal eye contact is appropriate. But during action, the dealer’s eyes stay on the chips, the cards, or the table.</w:t>
+      </w:r>
+    </w:p>
+    <w:p>
+      <w:pPr>
+        <w:spacing w:after="160" w:line="276"/>
+      </w:pPr>
+      <w:r>
+        <w:rPr>
+          <w:rFonts w:ascii="Arial" w:cs="Arial" w:eastAsia="Arial" w:hAnsi="Arial"/>
+          <w:color w:val="333333"/>
+          <w:sz w:val="21"/>
+          <w:szCs w:val="21"/>
+        </w:rPr>
+        <w:t xml:space="preserve">The most difficult reading situation occurs when players at the table contradict each other. Poker players are competitive and sometimes deliberately try to create conflict or tilt other players. The dealer must navigate these situations without taking sides, appearing to favor anyone, or escalating the tension. When contradictions become confrontational, the floor is called.</w:t>
+      </w:r>
+    </w:p>
+    <w:p>
+      <w:pPr>
+        <w:spacing w:after="160" w:line="276"/>
+      </w:pPr>
+      <w:r>
+        <w:rPr>
+          <w:rFonts w:ascii="Arial" w:cs="Arial" w:eastAsia="Arial" w:hAnsi="Arial"/>
+          <w:b/>
+          <w:bCs/>
+          <w:color w:val="2C3E50"/>
+          <w:sz w:val="21"/>
+          <w:szCs w:val="21"/>
+        </w:rPr>
+        <w:t xml:space="preserve">Robotic Requirement: </w:t>
+      </w:r>
+      <w:r>
+        <w:rPr>
+          <w:rFonts w:ascii="Arial" w:cs="Arial" w:eastAsia="Arial" w:hAnsi="Arial"/>
+          <w:color w:val="333333"/>
+          <w:sz w:val="21"/>
+          <w:szCs w:val="21"/>
+        </w:rPr>
+        <w:t xml:space="preserve">A robotic system would not need to ‘read’ customers in the emotional sense, but it must be able to detect and respond to player states: waiting for action, engaged in conversation (do not interrupt), visibly agitated (notify floor staff), absent from seat (skip in dealing), and attempting to communicate with the dealer (respond to questions about pot size, action, etc.). The system should never direct cameras or sensors at a player’s face during their action, respecting the same privacy principle that human dealers follow.</w:t>
+      </w:r>
+    </w:p>
+    <w:p>
+      <w:pPr>
+        <w:pStyle w:val="Heading2"/>
+        <w:spacing w:before="280" w:after="160"/>
+      </w:pPr>
+      <w:r>
+        <w:rPr>
+          <w:rFonts w:ascii="Arial" w:cs="Arial" w:eastAsia="Arial" w:hAnsi="Arial"/>
+          <w:b/>
+          <w:bCs/>
+          <w:color w:val="2C3E50"/>
+          <w:sz w:val="26"/>
+          <w:szCs w:val="26"/>
+        </w:rPr>
+        <w:t xml:space="preserve">10.5 Player Pace and Game Energy</w:t>
       </w:r>
     </w:p>
     <w:p>
@@ -4137,7 +4925,49 @@
           <w:sz w:val="21"/>
           <w:szCs w:val="21"/>
         </w:rPr>
-        <w:t xml:space="preserve">Based on operator interviews, the Virginia charitable gaming market illustrates the complexity of state-by-state regulation. Poker rooms in Virginia operate under charitable gaming licenses with specific requirements around who can deal, how rake is collected, and what games are permitted. Each state has different requirements, and a robotic dealing system would need to be certified in each jurisdiction independently. Some jurisdictions (like Macau) require dealers to be local residents, which is part of what drives the labor shortage that creates the opportunity for automation.</w:t>
+        <w:t xml:space="preserve">The Virginia charitable gaming market provides a detailed case study of what regulatory entry looks like for poker in a new jurisdiction. Virginia’s poker bill (Senate Bill 936) was passed after approximately five years of advocacy, going into effect July 1st of its passage year. The law was built on Virginia’s 50+ year tradition of charitable gaming (primarily bingo), operated by 501(c)(3) organizations, churches, synagogues, VFW posts, Moose and Elks lodges, and similar organizations.</w:t>
+      </w:r>
+    </w:p>
+    <w:p>
+      <w:pPr>
+        <w:spacing w:after="160" w:line="276"/>
+      </w:pPr>
+      <w:r>
+        <w:rPr>
+          <w:rFonts w:ascii="Arial" w:cs="Arial" w:eastAsia="Arial" w:hAnsi="Arial"/>
+          <w:color w:val="333333"/>
+          <w:sz w:val="21"/>
+          <w:szCs w:val="21"/>
+        </w:rPr>
+        <w:t xml:space="preserve">The poker room director is personally responsible for knowing all regulations and legal requirements. This is not a delegable task. The regulations are extensive and, in Virginia’s case, were entirely new (all underlined in the regulatory document, indicating brand-new language with no prior precedent). The initial regulations tend to be simultaneously restrictive in some areas and unrestricted in others, because the regulators have not yet encountered the edge cases that emerge during actual operation. First-year regulations are expected to be refined repeatedly as issues arise.</w:t>
+      </w:r>
+    </w:p>
+    <w:p>
+      <w:pPr>
+        <w:spacing w:after="160" w:line="276"/>
+      </w:pPr>
+      <w:r>
+        <w:rPr>
+          <w:rFonts w:ascii="Arial" w:cs="Arial" w:eastAsia="Arial" w:hAnsi="Arial"/>
+          <w:color w:val="333333"/>
+          <w:sz w:val="21"/>
+          <w:szCs w:val="21"/>
+        </w:rPr>
+        <w:t xml:space="preserve">Operational decisions that require regulatory awareness include: chip design and sourcing (chip manufacturers like Icon typically only sell to licensed casinos), table design and layout (including felt color, logo placement, and betting line decisions), chair selection, room layout, staffing requirements, and game approval. Even aesthetic choices like stitching patterns on chairs matter because they affect the overall impression of legitimacy and professionalism that regulators and players expect.</w:t>
+      </w:r>
+    </w:p>
+    <w:p>
+      <w:pPr>
+        <w:spacing w:after="160" w:line="276"/>
+      </w:pPr>
+      <w:r>
+        <w:rPr>
+          <w:rFonts w:ascii="Arial" w:cs="Arial" w:eastAsia="Arial" w:hAnsi="Arial"/>
+          <w:color w:val="333333"/>
+          <w:sz w:val="21"/>
+          <w:szCs w:val="21"/>
+        </w:rPr>
+        <w:t xml:space="preserve">Each state has different requirements, and a robotic dealing system would need to be certified in each jurisdiction independently. Some jurisdictions (like Macau) require dealers to be local residents, which is part of what drives the labor shortage that creates the opportunity for automation. The Virginia model demonstrates that regulatory entry requires a minimum of 5+ years of advocacy, detailed knowledge of existing charitable gaming frameworks, and a willingness to work through initial regulatory ambiguity.</w:t>
       </w:r>
     </w:p>
     <w:p>
@@ -4209,16 +5039,160 @@
     </w:p>
     <w:p>
       <w:pPr>
-        <w:spacing w:after="160" w:line="276"/>
-      </w:pPr>
-      <w:r>
-        <w:rPr>
-          <w:rFonts w:ascii="Arial" w:cs="Arial" w:eastAsia="Arial" w:hAnsi="Arial"/>
-          <w:color w:val="333333"/>
-          <w:sz w:val="21"/>
-          <w:szCs w:val="21"/>
-        </w:rPr>
-        <w:t xml:space="preserve">A notable set of real-world cheating techniques was documented in interviews with professional magicians who analyzed casino poker dealing. These include: lapping (secretly moving a card from the table to the dealer’s lap), false shuffles (manipulating the riffle so specific cards remain in known positions), peeking (techniques to see the top card of the deck before dealing), and deck manipulation during the cut. These techniques exploit the small margins of error in human card handling.</w:t>
+        <w:spacing w:before="200" w:after="120"/>
+      </w:pPr>
+      <w:r>
+        <w:rPr>
+          <w:rFonts w:ascii="Arial" w:cs="Arial" w:eastAsia="Arial" w:hAnsi="Arial"/>
+          <w:b/>
+          <w:bCs/>
+          <w:color w:val="C0392B"/>
+          <w:sz w:val="22"/>
+          <w:szCs w:val="22"/>
+        </w:rPr>
+        <w:t xml:space="preserve">Documented False Shuffle Techniques</w:t>
+      </w:r>
+    </w:p>
+    <w:p>
+      <w:pPr>
+        <w:spacing w:after="160" w:line="276"/>
+      </w:pPr>
+      <w:r>
+        <w:rPr>
+          <w:rFonts w:ascii="Arial" w:cs="Arial" w:eastAsia="Arial" w:hAnsi="Arial"/>
+          <w:color w:val="333333"/>
+          <w:sz w:val="21"/>
+          <w:szCs w:val="21"/>
+        </w:rPr>
+        <w:t xml:space="preserve">In a landmark security analysis session organized by TruePokerDealer, professional magicians demonstrated the specific techniques that could theoretically be used by a corrupt dealer to manipulate the deck through the standard casino shuffle sequence. These techniques are documented here not as instructions but as the threat model that a robotic system must be immune to:</w:t>
+      </w:r>
+    </w:p>
+    <w:p>
+      <w:pPr>
+        <w:spacing w:after="160" w:line="276"/>
+      </w:pPr>
+      <w:r>
+        <w:rPr>
+          <w:rFonts w:ascii="Arial" w:cs="Arial" w:eastAsia="Arial" w:hAnsi="Arial"/>
+          <w:color w:val="333333"/>
+          <w:sz w:val="21"/>
+          <w:szCs w:val="21"/>
+        </w:rPr>
+        <w:t xml:space="preserve">Retention Shuffle (Blind Shuffle): The dealer performs what appears to be a standard riffle but retains specific cards in known positions (top, bottom, or both) throughout. Cards on the top of the deck can be held in place during the riffle by controlling which half falls last. Cards on the bottom can be retained by controlling the initial split. A skilled manipulator can retain 2-4 cards in position through multiple riffles. The magicians demonstrated retaining cards through two full riffles with the deck appearing to shuffle normally.</w:t>
+      </w:r>
+    </w:p>
+    <w:p>
+      <w:pPr>
+        <w:spacing w:after="160" w:line="276"/>
+      </w:pPr>
+      <w:r>
+        <w:rPr>
+          <w:rFonts w:ascii="Arial" w:cs="Arial" w:eastAsia="Arial" w:hAnsi="Arial"/>
+          <w:color w:val="333333"/>
+          <w:sz w:val="21"/>
+          <w:szCs w:val="21"/>
+        </w:rPr>
+        <w:t xml:space="preserve">Push-Through Shuffle: The most deceptive false riffle. The two halves are interlaced during the riffle, but instead of being squared together, the halves are pushed through each other and separated again. It appears that the deck is squared and then cut, but the cards have returned to their original positions. This technique naturally leads into a cut (the halves separate into a cut position), making it look like a legitimate riffle followed by a legitimate cut. If the push-through is executed at the correct position, the entire deck retains its order.</w:t>
+      </w:r>
+    </w:p>
+    <w:p>
+      <w:pPr>
+        <w:spacing w:after="160" w:line="276"/>
+      </w:pPr>
+      <w:r>
+        <w:rPr>
+          <w:rFonts w:ascii="Arial" w:cs="Arial" w:eastAsia="Arial" w:hAnsi="Arial"/>
+          <w:color w:val="333333"/>
+          <w:sz w:val="21"/>
+          <w:szCs w:val="21"/>
+        </w:rPr>
+        <w:t xml:space="preserve">Zarrow Shuffle (named after Herb Zarrow): A false riffle where the two halves appear to interleave but one half slides on top of the other without actually interlacing. The result is a split, an apparent riffle, a squaring, and the deck is in the same order it started. This can be executed in a single motion and is considered the most dangerous false shuffle because it mimics a real shuffle so closely that even trained observers miss it.</w:t>
+      </w:r>
+    </w:p>
+    <w:p>
+      <w:pPr>
+        <w:spacing w:after="160" w:line="276"/>
+      </w:pPr>
+      <w:r>
+        <w:rPr>
+          <w:rFonts w:ascii="Arial" w:cs="Arial" w:eastAsia="Arial" w:hAnsi="Arial"/>
+          <w:color w:val="333333"/>
+          <w:sz w:val="21"/>
+          <w:szCs w:val="21"/>
+        </w:rPr>
+        <w:t xml:space="preserve">False Box/Strip: Instead of stripping from top to bottom (which reverses the quarter order), the manipulator strips from bottom to top or performs the strip in a way that returns the quarters to their original positions. From the outside, the motion looks identical. Surveillance can detect this if they know to watch the direction of the strip, but most observers cannot distinguish the two at game speed.</w:t>
+      </w:r>
+    </w:p>
+    <w:p>
+      <w:pPr>
+        <w:spacing w:after="160" w:line="276"/>
+      </w:pPr>
+      <w:r>
+        <w:rPr>
+          <w:rFonts w:ascii="Arial" w:cs="Arial" w:eastAsia="Arial" w:hAnsi="Arial"/>
+          <w:color w:val="333333"/>
+          <w:sz w:val="21"/>
+          <w:szCs w:val="21"/>
+        </w:rPr>
+        <w:t xml:space="preserve">False Cut: A one-handed false cut where the deck appears to be cut but the blocking finger on the bottom retains the card order. Two-handed false cuts are easier to execute but are a red flag (legitimate casino cuts use one hand). The magicians demonstrated one-handed false cuts that were visually indistinguishable from real cuts, though they noted it is the hardest part of the sequence to fake.</w:t>
+      </w:r>
+    </w:p>
+    <w:p>
+      <w:pPr>
+        <w:spacing w:before="200" w:after="120"/>
+      </w:pPr>
+      <w:r>
+        <w:rPr>
+          <w:rFonts w:ascii="Arial" w:cs="Arial" w:eastAsia="Arial" w:hAnsi="Arial"/>
+          <w:b/>
+          <w:bCs/>
+          <w:color w:val="C0392B"/>
+          <w:sz w:val="22"/>
+          <w:szCs w:val="22"/>
+        </w:rPr>
+        <w:t xml:space="preserve">Documented Peeking Techniques</w:t>
+      </w:r>
+    </w:p>
+    <w:p>
+      <w:pPr>
+        <w:spacing w:after="160" w:line="276"/>
+      </w:pPr>
+      <w:r>
+        <w:rPr>
+          <w:rFonts w:ascii="Arial" w:cs="Arial" w:eastAsia="Arial" w:hAnsi="Arial"/>
+          <w:color w:val="333333"/>
+          <w:sz w:val="21"/>
+          <w:szCs w:val="21"/>
+        </w:rPr>
+        <w:t xml:space="preserve">The Bubble Peek: While holding the deck in the dealing position, the dealer applies slight thumb pressure to the top card, creating a tiny ‘bubble’ (a bend in the card) that briefly exposes the index corner. This is done during normal dealing motion — while announcing action, looking at the board, or moving chips. The peek takes a fraction of a second. The magicians demonstrated peeking at the top 1-5 cards during what appeared to be normal dealing activity, with the peek completely invisible to players or a camera positioned at table level.</w:t>
+      </w:r>
+    </w:p>
+    <w:p>
+      <w:pPr>
+        <w:spacing w:after="160" w:line="276"/>
+      </w:pPr>
+      <w:r>
+        <w:rPr>
+          <w:rFonts w:ascii="Arial" w:cs="Arial" w:eastAsia="Arial" w:hAnsi="Arial"/>
+          <w:color w:val="333333"/>
+          <w:sz w:val="21"/>
+          <w:szCs w:val="21"/>
+        </w:rPr>
+        <w:t xml:space="preserve">The Misdirection Peek: The dealer creates a small distraction (chip movement, verbal announcement, reaching for something) and peeks at the top card during the moment when all eyes are directed elsewhere. Combined with second dealing (dealing the second card from the top instead of the first), this allows the dealer to control which player receives specific cards.</w:t>
+      </w:r>
+    </w:p>
+    <w:p>
+      <w:pPr>
+        <w:spacing w:after="160" w:line="276"/>
+      </w:pPr>
+      <w:r>
+        <w:rPr>
+          <w:rFonts w:ascii="Arial" w:cs="Arial" w:eastAsia="Arial" w:hAnsi="Arial"/>
+          <w:color w:val="333333"/>
+          <w:sz w:val="21"/>
+          <w:szCs w:val="21"/>
+        </w:rPr>
+        <w:t xml:space="preserve">The magicians concluded that a skilled card manipulator who was also a trained dealer could, in theory, stack the deck through the standard casino shuffle sequence if the wash were omitted or poorly executed. The wash is the single procedure that defeats all of these techniques, because it physically separates all cards from their positions before the riffle sequence begins. This is why surveillance enforcement of the wash is considered the highest priority in shuffle monitoring.</w:t>
       </w:r>
     </w:p>
     <w:p>
@@ -4243,7 +5217,7 @@
           <w:sz w:val="21"/>
           <w:szCs w:val="21"/>
         </w:rPr>
-        <w:t xml:space="preserve">A properly designed robotic system would be immune to most forms of physical card manipulation, false shuffles, and peeking. The shuffle would be mechanically verifiable. Card positions would be tracked digitally. The system would never inadvertently expose a card. This is a significant security improvement over human dealing and a strong selling point for casino operators concerned about game integrity.</w:t>
+        <w:t xml:space="preserve">A properly designed robotic system would be immune to all forms of false shuffles, false cuts, peeking, and deck manipulation. The shuffle would be mechanically verifiable (every card position tracked). Card identities would not be accessible to any system component before dealing. The system would never inadvertently expose a card. There would be no possibility of second dealing, bottom dealing, or card retention. This eliminates the entire threat model described above and is a significant security improvement over human dealing.</w:t>
       </w:r>
     </w:p>
     <w:p>
@@ -4274,7 +5248,35 @@
           <w:sz w:val="21"/>
           <w:szCs w:val="21"/>
         </w:rPr>
-        <w:t xml:space="preserve">Casino surveillance (the “eye in the sky”) monitors all table games via overhead cameras. Dealers are trained to perform certain actions in view of cameras: cutting chips toward the camera, clearing hands to show they are empty, and spreading cards in specific patterns for verification. A dealer who receives surveillance write-ups for failing to follow these procedures faces disciplinary action. A robotic system must integrate with existing surveillance infrastructure and may be able to provide even better camera angles and data feeds than human dealing allows.</w:t>
+        <w:t xml:space="preserve">Casino surveillance (the “eye in the sky”) monitors all table games via overhead cameras. Dealers are trained to perform certain actions in view of cameras: cutting chips toward the camera, clearing hands to show they are empty, and spreading cards in specific patterns for verification. A dealer who receives surveillance write-ups for failing to follow these procedures faces disciplinary action.</w:t>
+      </w:r>
+    </w:p>
+    <w:p>
+      <w:pPr>
+        <w:spacing w:after="160" w:line="276"/>
+      </w:pPr>
+      <w:r>
+        <w:rPr>
+          <w:rFonts w:ascii="Arial" w:cs="Arial" w:eastAsia="Arial" w:hAnsi="Arial"/>
+          <w:color w:val="333333"/>
+          <w:sz w:val="21"/>
+          <w:szCs w:val="21"/>
+        </w:rPr>
+        <w:t xml:space="preserve">The severity of surveillance enforcement is documented extensively in the TruePokerDealer community. One former dealer reported receiving over 40 write-ups in a single review period for performing coin magic tricks with tip chips at the table. Surveillance could not track where the chips went during the sleight-of-hand movements and built a file documenting every instance. The write-ups covered ‘taking a tip and not being able to determine where it went’ — even though the chips were going into the tip box every time. The incident illustrates that surveillance prioritizes trackability above all else: if a chip movement cannot be followed frame-by-frame on camera, it is flagged regardless of intent. This principle is critical for robotic system design: every chip and card movement must be traceable on camera.</w:t>
+      </w:r>
+    </w:p>
+    <w:p>
+      <w:pPr>
+        <w:spacing w:after="160" w:line="276"/>
+      </w:pPr>
+      <w:r>
+        <w:rPr>
+          <w:rFonts w:ascii="Arial" w:cs="Arial" w:eastAsia="Arial" w:hAnsi="Arial"/>
+          <w:color w:val="333333"/>
+          <w:sz w:val="21"/>
+          <w:szCs w:val="21"/>
+        </w:rPr>
+        <w:t xml:space="preserve">A robotic system must integrate with existing surveillance infrastructure and may be able to provide even better camera angles and data feeds than human dealing allows. The system could provide direct digital audit logs to surveillance in addition to camera feeds, creating a dual-verification system that exceeds what is possible with human dealers.</w:t>
       </w:r>
     </w:p>
     <w:p>
@@ -4341,7 +5343,49 @@
           <w:sz w:val="21"/>
           <w:szCs w:val="21"/>
         </w:rPr>
-        <w:t xml:space="preserve">Dealing poker requires standing for 6 to 8 hours per shift with a 30-minute break every 30 minutes of dealing. The repetitive motions of shuffling, pitching, and chip handling cause chronic injuries including ganglion cysts on the wrist (from improper pitch mechanics), shoulder strain (from extended reaching across the table), back pain (from the standing position and forward lean), and hand fatigue. Dealers who learn improper pitch mechanics early in their career develop these injuries faster, and retraining pitch mechanics after years of muscle memory is extremely difficult.</w:t>
+        <w:t xml:space="preserve">A standard dealing shift is 8 hours. Dealers work in ‘downs’ of approximately 30 minutes (dealing at one table), then rotate to a break or another table. In a typical 8-hour shift, a dealer may deal 10 to 12 tables with approximately 4 breaks totaling about 2 hours off the table. The actual dealing time is 5 to 6 hours of continuous repetitive motion.</w:t>
+      </w:r>
+    </w:p>
+    <w:p>
+      <w:pPr>
+        <w:spacing w:after="160" w:line="276"/>
+      </w:pPr>
+      <w:r>
+        <w:rPr>
+          <w:rFonts w:ascii="Arial" w:cs="Arial" w:eastAsia="Arial" w:hAnsi="Arial"/>
+          <w:color w:val="333333"/>
+          <w:sz w:val="21"/>
+          <w:szCs w:val="21"/>
+        </w:rPr>
+        <w:t xml:space="preserve">The most serious chronic injury is the ganglion cyst, a fluid-filled lump that develops on the wrist from repetitive strain. This is directly caused by incorrect pitch mechanics — specifically, pitching with wrist flick action instead of finger extension. Multiple dealers in the TruePokerDealer community have documented developing ganglion cysts that persist for years. One dealer developed a visible cyst after pitching with wrist action and had to be retrained to use the correct finger-extension technique. The cyst remained after retraining. This injury is almost entirely preventable with correct mechanics, which is why proper pitch training is considered a medical priority, not just a technique preference.</w:t>
+      </w:r>
+    </w:p>
+    <w:p>
+      <w:pPr>
+        <w:spacing w:after="160" w:line="276"/>
+      </w:pPr>
+      <w:r>
+        <w:rPr>
+          <w:rFonts w:ascii="Arial" w:cs="Arial" w:eastAsia="Arial" w:hAnsi="Arial"/>
+          <w:color w:val="333333"/>
+          <w:sz w:val="21"/>
+          <w:szCs w:val="21"/>
+        </w:rPr>
+        <w:t xml:space="preserve">Back and neck pain are the most universal complaints, particularly for shorter dealers. Casino poker tables are a standard size designed for average-height dealers. A dealer who is 5’4” must reach significantly further across the table than a dealer who is 6’0”, and that additional reach compounds over thousands of repetitions per shift. Players who place their bets close to themselves (rather than pushing them toward the center) force the dealer to reach further for every single bet, worsening the strain. Poker room chairs with inadequate back support (common in many rooms) compound the problem. Dealers report that working 5 or more consecutive days causes the most severe body issues, even when individual shifts are manageable.</w:t>
+      </w:r>
+    </w:p>
+    <w:p>
+      <w:pPr>
+        <w:spacing w:after="160" w:line="276"/>
+      </w:pPr>
+      <w:r>
+        <w:rPr>
+          <w:rFonts w:ascii="Arial" w:cs="Arial" w:eastAsia="Arial" w:hAnsi="Arial"/>
+          <w:color w:val="333333"/>
+          <w:sz w:val="21"/>
+          <w:szCs w:val="21"/>
+        </w:rPr>
+        <w:t xml:space="preserve">Shoulder strain develops from the repeated reaching motion across the table. The pitch itself, when done correctly, does not cause shoulder issues (it uses only the fingers). But gathering bets, pushing pots, and reaching for cards at the far seats creates cumulative shoulder fatigue over a career.</w:t>
       </w:r>
     </w:p>
     <w:p>
@@ -4372,7 +5416,35 @@
           <w:sz w:val="21"/>
           <w:szCs w:val="21"/>
         </w:rPr>
-        <w:t xml:space="preserve">Poker dealers are primarily compensated through tips (tokes). Base hourly pay is typically minimum wage or slightly above. Tips average $25 to $40 per hour for a competent dealer in a mid-stakes game, with significant variance. Factors affecting tips include dealing speed (more hands per hour means more opportunities to win tips), friendliness and personality (players tip more when they enjoy the dealer), attractiveness (documented in dealer interviews as a real factor, particularly for female dealers), and game stakes (higher stakes games generally produce larger tips). The tip-dependent model creates significant income instability and puts dealers in a position of financial dependence on player generosity.</w:t>
+        <w:t xml:space="preserve">Poker dealers are primarily compensated through tips (tokes). Base hourly pay is typically minimum wage or slightly above. All-in hourly earnings (base plus tips) average $25 to $40 per hour for a competent dealer in a mid-stakes game, with significant variance. A dealer working 3 to 4 days per week can take home $600 to $1,000+ after taxes, making it competitive with many other service industry jobs for the hours worked.</w:t>
+      </w:r>
+    </w:p>
+    <w:p>
+      <w:pPr>
+        <w:spacing w:after="160" w:line="276"/>
+      </w:pPr>
+      <w:r>
+        <w:rPr>
+          <w:rFonts w:ascii="Arial" w:cs="Arial" w:eastAsia="Arial" w:hAnsi="Arial"/>
+          <w:color w:val="333333"/>
+          <w:sz w:val="21"/>
+          <w:szCs w:val="21"/>
+        </w:rPr>
+        <w:t xml:space="preserve">Factors affecting tip income are well-documented in dealer interviews: (1) Dealing speed — more hands per hour means more pots won and more tip opportunities. Fast dealers consistently out-earn slow dealers. (2) Friendliness and personality — players tip more when they enjoy the dealer. However, friendliness creates vulnerability: dealers who open up their personality to players risk having that personality attacked by losing or angry players. Many dealers, especially women, adopt a deliberately neutral demeanor (‘shut up and deal’) to protect themselves emotionally, knowingly sacrificing significant tip income. One experienced dealer estimated she would make ‘twice as much money’ if she were friendlier and more engaging, but chose not to because the emotional cost was too high. (3) Attractiveness — documented in dealer interviews as a real factor, particularly for female dealers. Flirtation can be used as a deliberate tip-maximizing strategy, but comes with the cost of unwanted attention and being hit on at the table. (4) Game stakes — higher stakes games generally produce larger tips. The difference between dealing a 1/3 game and a 5/10 game can be the difference between $25/hour and $50/hour in tips.</w:t>
+      </w:r>
+    </w:p>
+    <w:p>
+      <w:pPr>
+        <w:spacing w:after="160" w:line="276"/>
+      </w:pPr>
+      <w:r>
+        <w:rPr>
+          <w:rFonts w:ascii="Arial" w:cs="Arial" w:eastAsia="Arial" w:hAnsi="Arial"/>
+          <w:color w:val="333333"/>
+          <w:sz w:val="21"/>
+          <w:szCs w:val="21"/>
+        </w:rPr>
+        <w:t xml:space="preserve">The tip-dependent model creates significant income instability. A dealer’s income can swing wildly based on table assignment, player composition, and luck (players tip more when they are winning). Chip runners (the staff who handle buy-ins and run chips to tables) are also tip-dependent, with a biggest-single-tip ceiling around $100-$175 from generous regulars, but average tips much lower. The entire compensation structure of casino poker operations depends on player generosity, which is a fragile foundation.</w:t>
       </w:r>
     </w:p>
     <w:p>
@@ -4389,21 +5461,63 @@
           <w:sz w:val="26"/>
           <w:szCs w:val="26"/>
         </w:rPr>
-        <w:t xml:space="preserve">14.3 Player Abuse</w:t>
-      </w:r>
-    </w:p>
-    <w:p>
-      <w:pPr>
-        <w:spacing w:after="160" w:line="276"/>
-      </w:pPr>
-      <w:r>
-        <w:rPr>
-          <w:rFonts w:ascii="Arial" w:cs="Arial" w:eastAsia="Arial" w:hAnsi="Arial"/>
-          <w:color w:val="333333"/>
-          <w:sz w:val="21"/>
-          <w:szCs w:val="21"/>
-        </w:rPr>
-        <w:t xml:space="preserve">Dealers routinely experience verbal abuse from losing players. This ranges from passive-aggressive comments to direct personal insults. Dealers are expected to maintain composure, de-escalate, and continue dealing. The recommended approach is to listen, show empathy, avoid mirroring the player’s emotional state, and call the floor supervisor if the situation escalates beyond verbal. Female dealers report being hit on, objectified, and receiving inappropriate comments as a regular part of the job. The emotional labor of maintaining a professional demeanor while being personally attacked is a significant factor in dealer burnout and turnover.</w:t>
+        <w:t xml:space="preserve">14.3 Player Abuse and Table Culture</w:t>
+      </w:r>
+    </w:p>
+    <w:p>
+      <w:pPr>
+        <w:spacing w:after="160" w:line="276"/>
+      </w:pPr>
+      <w:r>
+        <w:rPr>
+          <w:rFonts w:ascii="Arial" w:cs="Arial" w:eastAsia="Arial" w:hAnsi="Arial"/>
+          <w:color w:val="333333"/>
+          <w:sz w:val="21"/>
+          <w:szCs w:val="21"/>
+        </w:rPr>
+        <w:t xml:space="preserve">Dealers routinely experience verbal abuse from losing players. The standard negative behavior includes: aggressively folding cards, whispering under their breath, cursing, blaming the dealer for bad cards (‘I haven’t seen a face card in an hour,’ ‘Are there any aces in this deck?’), and general woe-is-me commentary. These complaints are constant and repetitive. Players learn these speech patterns from each other, creating a self-reinforcing culture of negativity at the table. On a typical 8-handed table, at least 5 players will be exhibiting some form of negative behavior at any given time.</w:t>
+      </w:r>
+    </w:p>
+    <w:p>
+      <w:pPr>
+        <w:spacing w:after="160" w:line="276"/>
+      </w:pPr>
+      <w:r>
+        <w:rPr>
+          <w:rFonts w:ascii="Arial" w:cs="Arial" w:eastAsia="Arial" w:hAnsi="Arial"/>
+          <w:color w:val="333333"/>
+          <w:sz w:val="21"/>
+          <w:szCs w:val="21"/>
+        </w:rPr>
+        <w:t xml:space="preserve">The recommended dealer response protocol is: take a few breaths, count down from 10 (or 5 if the pace of the game does not allow 10), remain calm and composed. Human beings naturally tend to mirror one another, so a levelheaded dealer will eventually bring a negative player back to baseline. The dealer should sincerely listen, try to understand the player’s frustration, and offer a degree of sympathy. Most disgruntled players will calm down when they feel heard. In poker specifically (unlike table games where the dealer is the opponent), the dealer should never argue, disagree, or resist. Any resistance from a player should result in an immediate floor call. Confrontation in poker tends to spread (the game is inherently adversarial between players), so de-escalation by the dealer is critical.</w:t>
+      </w:r>
+    </w:p>
+    <w:p>
+      <w:pPr>
+        <w:spacing w:after="160" w:line="276"/>
+      </w:pPr>
+      <w:r>
+        <w:rPr>
+          <w:rFonts w:ascii="Arial" w:cs="Arial" w:eastAsia="Arial" w:hAnsi="Arial"/>
+          <w:color w:val="333333"/>
+          <w:sz w:val="21"/>
+          <w:szCs w:val="21"/>
+        </w:rPr>
+        <w:t xml:space="preserve">Female dealers face additional challenges. Being hit on at the table is described as ‘horrible’ and ‘so awkward’ by female dealers in the TruePokerDealer community — made worse by the fact that 7 or 8 other players are watching. Unwanted attention is sometimes accompanied by tips (‘if you’re gonna hit on me, send the money’), creating a transactional dynamic that is uncomfortable regardless of the financial benefit. Female dealers who are skilled and knowledgeable about the game report less bullying because they leave fewer openings for criticism, but the harassment does not disappear entirely. The poker room environment is described as ‘just not a place that’s pleasant for women’ by both male and female industry professionals.</w:t>
+      </w:r>
+    </w:p>
+    <w:p>
+      <w:pPr>
+        <w:spacing w:after="160" w:line="276"/>
+      </w:pPr>
+      <w:r>
+        <w:rPr>
+          <w:rFonts w:ascii="Arial" w:cs="Arial" w:eastAsia="Arial" w:hAnsi="Arial"/>
+          <w:color w:val="333333"/>
+          <w:sz w:val="21"/>
+          <w:szCs w:val="21"/>
+        </w:rPr>
+        <w:t xml:space="preserve">Floor supervisor training for handling abuse is widely acknowledged as inadequate in the industry. Supervisors are typically ‘thrown into it’ without simulation training, shadowing, or structured preparation for confrontational situations. The result is that when a dealer calls the floor about an abusive player, the supervisor may not handle it effectively, sometimes even siding with the player. This failure of the support system is reported as more demoralizing than the abuse itself. One dealer described being brought to tears not by the abusive player but by the floor supervisor who failed to support her.</w:t>
       </w:r>
     </w:p>
     <w:p>

</xml_diff>

<commit_message>
Add Lesson 31: How to Run Your Game - dealer instincts, confrontation management, table policies
Section 10 expanded with five new subsections from Lesson 31 (Mark Shumaker):
- 10.6 Running the Game: The Four Dealer Instincts (follow action with 100% certainty,
  tie decisions to fundamental rules, maintain integrity without exception, earn table respect)
- 10.7 Preventative Dealing and Confrontation Management (stay ahead of confrontation,
  using fundamental rules as defensive tools, handling player testing, de-escalation)
- 10.8 Speed Management for New Dealers (accuracy over speed, natural speed progression)
- 10.9 Table Surface and Device Policies (felt as sacred space, cell phone enforcement)
- 10.10 Poker Room Hierarchy and When to Call the Floor (director > shift manager >
  supervisor > dealer, comprehensive list of when to call floor, supervisor quality issues)

Source: TruePokerDealer Lesson 31 (Mark Shumaker)

https://claude.ai/code/session_01LLEXfPXvBSATequm3rLG4v
</commit_message>
<xml_diff>
--- a/docs/Deployment_Bible.docx
+++ b/docs/Deployment_Bible.docx
@@ -5804,6 +5804,326 @@
           <w:szCs w:val="21"/>
         </w:rPr>
         <w:t xml:space="preserve">Must maintain a consistent pace of 30 to 40 hands per hour. Must not have variable speed (slowing down when situations get complex). Speed must be adjustable based on the game type and table composition. Must never create dead time between hands: the shuffle, deal, and pot push should be seamless.</w:t>
+      </w:r>
+    </w:p>
+    <w:p>
+      <w:pPr>
+        <w:pStyle w:val="Heading2"/>
+        <w:spacing w:before="280" w:after="160"/>
+      </w:pPr>
+      <w:r>
+        <w:rPr>
+          <w:rFonts w:ascii="Arial" w:cs="Arial" w:eastAsia="Arial" w:hAnsi="Arial"/>
+          <w:b/>
+          <w:bCs/>
+          <w:color w:val="2C3E50"/>
+          <w:sz w:val="26"/>
+          <w:szCs w:val="26"/>
+        </w:rPr>
+        <w:t xml:space="preserve">10.6 Running the Game: The Four Dealer Instincts</w:t>
+      </w:r>
+    </w:p>
+    <w:p>
+      <w:pPr>
+        <w:spacing w:after="160" w:line="276"/>
+      </w:pPr>
+      <w:r>
+        <w:rPr>
+          <w:rFonts w:ascii="Arial" w:cs="Arial" w:eastAsia="Arial" w:hAnsi="Arial"/>
+          <w:color w:val="333333"/>
+          <w:sz w:val="21"/>
+          <w:szCs w:val="21"/>
+        </w:rPr>
+        <w:t xml:space="preserve">Running the game is the most important skill a dealer develops, yet it is almost never taught in dealer school. It encompasses everything beyond the mechanical dealing — managing personalities, defusing confrontation, maintaining integrity under pressure, and projecting confidence. Experienced dealing instructors identify four fundamental instincts that guide every decision at the table:</w:t>
+      </w:r>
+    </w:p>
+    <w:p>
+      <w:pPr>
+        <w:spacing w:after="160" w:line="276"/>
+      </w:pPr>
+      <w:r>
+        <w:rPr>
+          <w:rFonts w:ascii="Arial" w:cs="Arial" w:eastAsia="Arial" w:hAnsi="Arial"/>
+          <w:color w:val="333333"/>
+          <w:sz w:val="21"/>
+          <w:szCs w:val="21"/>
+        </w:rPr>
+        <w:t xml:space="preserve">Instinct 1 — Follow the Action with 100% Certainty: Not 99.9% — 100%. The dealer must know with absolute certainty what every player said and did. When uncertain about a verbal declaration in a noisy environment, the dealer MUST get clarification immediately, even though asking a player to repeat themselves feels uncomfortable (it gives away information by forcing the player to speak again). The alternative — assuming what was said — puts the entire table at risk. Following the action is also the dealer’s primary defensive weapon: when a player challenges the dealer, the dealer who saw everything can articulate exactly what happened, which shuts down angle-shooting and earns the respect of every other player at the table.</w:t>
+      </w:r>
+    </w:p>
+    <w:p>
+      <w:pPr>
+        <w:spacing w:after="160" w:line="276"/>
+      </w:pPr>
+      <w:r>
+        <w:rPr>
+          <w:rFonts w:ascii="Arial" w:cs="Arial" w:eastAsia="Arial" w:hAnsi="Arial"/>
+          <w:color w:val="333333"/>
+          <w:sz w:val="21"/>
+          <w:szCs w:val="21"/>
+        </w:rPr>
+        <w:t xml:space="preserve">Instinct 2 — Tie Every Decision to the Fundamental Rules: When deciding whether to speak up or let something go, the dealer filters through two questions: Does this violate the one-player-per-hand rule? Does this violate the cards-speak rule? If a player is talking about the board (‘three to a straight, I wonder if anyone has a four’), that potentially violates one-player-per-hand because it conveys information or solicits reactions from active players. The dealer says: ‘That violates one player per hand.’ This framing is extremely hard for the player to argue with. If a player asks the dealer how much a clearly visible bet is, instead of answering verbally (which might create a confrontation), the dealer can simply spread the chips out so they are clearly visible — using the principle that all players deserve equal access to table information.</w:t>
+      </w:r>
+    </w:p>
+    <w:p>
+      <w:pPr>
+        <w:spacing w:after="160" w:line="276"/>
+      </w:pPr>
+      <w:r>
+        <w:rPr>
+          <w:rFonts w:ascii="Arial" w:cs="Arial" w:eastAsia="Arial" w:hAnsi="Arial"/>
+          <w:color w:val="333333"/>
+          <w:sz w:val="21"/>
+          <w:szCs w:val="21"/>
+        </w:rPr>
+        <w:t xml:space="preserve">Instinct 3 — Maintain Integrity Without Exception: Own mistakes immediately and openly. When a dealer makes an error and says ‘I messed up, guys’ matter-of-factly, the table’s response is almost always respect. Trying to hide or minimize a mistake destroys trust and invites future challenges. Integrity also means not allowing confrontation, shot-taking, or rule violations to slide because it’s easier to ignore them. A dealer who lets things go trains the table to push boundaries.</w:t>
+      </w:r>
+    </w:p>
+    <w:p>
+      <w:pPr>
+        <w:spacing w:after="160" w:line="276"/>
+      </w:pPr>
+      <w:r>
+        <w:rPr>
+          <w:rFonts w:ascii="Arial" w:cs="Arial" w:eastAsia="Arial" w:hAnsi="Arial"/>
+          <w:color w:val="333333"/>
+          <w:sz w:val="21"/>
+          <w:szCs w:val="21"/>
+        </w:rPr>
+        <w:t xml:space="preserve">Instinct 4 — Make the Table Like and Respect You: This sounds soft, but it is strategically powerful. A table that likes the dealer is a table that does not test the dealer. Every dealer has a different personality they bring — some are witty, some are motherly, some are studious and unflappable — and the best dealers lean into their natural strengths. The goal is not to be everyone’s friend; it is to project competence and approachability so that players see the dealer as an authority worth cooperating with rather than an obstacle to challenge.</w:t>
+      </w:r>
+    </w:p>
+    <w:p>
+      <w:pPr>
+        <w:pStyle w:val="Heading2"/>
+        <w:spacing w:before="280" w:after="160"/>
+      </w:pPr>
+      <w:r>
+        <w:rPr>
+          <w:rFonts w:ascii="Arial" w:cs="Arial" w:eastAsia="Arial" w:hAnsi="Arial"/>
+          <w:b/>
+          <w:bCs/>
+          <w:color w:val="2C3E50"/>
+          <w:sz w:val="26"/>
+          <w:szCs w:val="26"/>
+        </w:rPr>
+        <w:t xml:space="preserve">10.7 Preventative Dealing and Confrontation Management</w:t>
+      </w:r>
+    </w:p>
+    <w:p>
+      <w:pPr>
+        <w:spacing w:after="160" w:line="276"/>
+      </w:pPr>
+      <w:r>
+        <w:rPr>
+          <w:rFonts w:ascii="Arial" w:cs="Arial" w:eastAsia="Arial" w:hAnsi="Arial"/>
+          <w:color w:val="333333"/>
+          <w:sz w:val="21"/>
+          <w:szCs w:val="21"/>
+        </w:rPr>
+        <w:t xml:space="preserve">Preventative dealing is the practice of stopping problems before they escalate, rather than reacting to them after they’ve blown up. The core principle: stay ahead of confrontation between players. When the dealer hears voices rising in tone, even if no specific rule has been broken yet, the dealer steps in immediately: ‘Guys, you got to stop.’ Serious tone. No exceptions. A table where the dealer consistently intervenes early will have dramatically fewer serious confrontations than a table where the dealer waits for things to get bad. Most physical altercations at poker tables (which do happen) could have been prevented by a dealer who stepped in 30 seconds earlier.</w:t>
+      </w:r>
+    </w:p>
+    <w:p>
+      <w:pPr>
+        <w:spacing w:after="160" w:line="276"/>
+      </w:pPr>
+      <w:r>
+        <w:rPr>
+          <w:rFonts w:ascii="Arial" w:cs="Arial" w:eastAsia="Arial" w:hAnsi="Arial"/>
+          <w:color w:val="333333"/>
+          <w:sz w:val="21"/>
+          <w:szCs w:val="21"/>
+        </w:rPr>
+        <w:t xml:space="preserve">Confrontation between a player and the dealer: players will test new dealers. A common angle: a player asks a question directed at another player to extract information (e.g., ‘That’s 20, right?’ when the bet is clearly 15). If the dealer answers, the player may snap ‘I wasn’t asking you.’ The instinct-driven response: the dealer does not engage verbally. Instead, the dealer spreads the bet chips clearly on the table so the amount is visible. This uses the fundamental rule (all players deserve equal access to table information) as a shield. The player has nothing to argue with. The dealer who handles this smoothly signals to the entire table that they cannot be rattled, which prevents future challenges.</w:t>
+      </w:r>
+    </w:p>
+    <w:p>
+      <w:pPr>
+        <w:spacing w:after="160" w:line="276"/>
+      </w:pPr>
+      <w:r>
+        <w:rPr>
+          <w:rFonts w:ascii="Arial" w:cs="Arial" w:eastAsia="Arial" w:hAnsi="Arial"/>
+          <w:color w:val="333333"/>
+          <w:sz w:val="21"/>
+          <w:szCs w:val="21"/>
+        </w:rPr>
+        <w:t xml:space="preserve">Critical rules for confrontation: (1) Never give an opinion — give a clear action or statement using the rules as tools. (2) Never tell a player to ‘calm down’ — this escalates almost every time. Use factual statements: ‘I think that’s over the line’ or ‘Guys, you’ve got to stop.’ (3) If a player resists the dealer’s ruling, the dealer calls the floor immediately rather than arguing. (4) Any situation involving racism, sexism, or illegal behavior: the dealer must address it every time, even if the room’s culture is to let things go. (5) Intoxicated players who are too impaired to function: the dealer notifies the supervisor immediately. A quiet ‘Floor’ followed by ‘seat four’ when the supervisor arrives is sufficient.</w:t>
+      </w:r>
+    </w:p>
+    <w:p>
+      <w:pPr>
+        <w:pStyle w:val="Heading2"/>
+        <w:spacing w:before="280" w:after="160"/>
+      </w:pPr>
+      <w:r>
+        <w:rPr>
+          <w:rFonts w:ascii="Arial" w:cs="Arial" w:eastAsia="Arial" w:hAnsi="Arial"/>
+          <w:b/>
+          <w:bCs/>
+          <w:color w:val="2C3E50"/>
+          <w:sz w:val="26"/>
+          <w:szCs w:val="26"/>
+        </w:rPr>
+        <w:t xml:space="preserve">10.8 Speed Management for New Dealers</w:t>
+      </w:r>
+    </w:p>
+    <w:p>
+      <w:pPr>
+        <w:spacing w:after="160" w:line="276"/>
+      </w:pPr>
+      <w:r>
+        <w:rPr>
+          <w:rFonts w:ascii="Arial" w:cs="Arial" w:eastAsia="Arial" w:hAnsi="Arial"/>
+          <w:color w:val="333333"/>
+          <w:sz w:val="21"/>
+          <w:szCs w:val="21"/>
+        </w:rPr>
+        <w:t xml:space="preserve">The number one mistake new dealers make is trying to go too fast. Speed is the visible marker of experience that new dealers try to imitate, but rushing causes errors, lost control, and a table that has no confidence in the dealer. The correct approach: go at whatever pace allows 100% accuracy. Count bets clearly and slowly: ‘One... two... three hundred... three fifty-five.’ Each stack is separated and visible. Players would rather watch a slow but accurate countdown than a fast dealer who makes mistakes. Speed improves naturally over the first 6-8 months of dealing — experienced dealers who started slow report that they eventually cash out 30-40% more in tips than when they started, purely from dealing more hands per hour.</w:t>
+      </w:r>
+    </w:p>
+    <w:p>
+      <w:pPr>
+        <w:spacing w:after="160" w:line="276"/>
+      </w:pPr>
+      <w:r>
+        <w:rPr>
+          <w:rFonts w:ascii="Arial" w:cs="Arial" w:eastAsia="Arial" w:hAnsi="Arial"/>
+          <w:color w:val="333333"/>
+          <w:sz w:val="21"/>
+          <w:szCs w:val="21"/>
+        </w:rPr>
+        <w:t xml:space="preserve">A related trap: letting players tell the dealer what to do. New dealers, especially younger ones, sometimes defer to experienced players who offer to ‘help’ with chip counting or rule questions. This creates a dependency where the dealer looks to specific players for guidance. The dealer must always be the one to figure things out, even if it takes longer. Players are angrier about errors than about deliberate pace.</w:t>
+      </w:r>
+    </w:p>
+    <w:p>
+      <w:pPr>
+        <w:pStyle w:val="Heading2"/>
+        <w:spacing w:before="280" w:after="160"/>
+      </w:pPr>
+      <w:r>
+        <w:rPr>
+          <w:rFonts w:ascii="Arial" w:cs="Arial" w:eastAsia="Arial" w:hAnsi="Arial"/>
+          <w:b/>
+          <w:bCs/>
+          <w:color w:val="2C3E50"/>
+          <w:sz w:val="26"/>
+          <w:szCs w:val="26"/>
+        </w:rPr>
+        <w:t xml:space="preserve">10.9 Table Surface and Device Policies</w:t>
+      </w:r>
+    </w:p>
+    <w:p>
+      <w:pPr>
+        <w:spacing w:after="160" w:line="276"/>
+      </w:pPr>
+      <w:r>
+        <w:rPr>
+          <w:rFonts w:ascii="Arial" w:cs="Arial" w:eastAsia="Arial" w:hAnsi="Arial"/>
+          <w:color w:val="333333"/>
+          <w:sz w:val="21"/>
+          <w:szCs w:val="21"/>
+        </w:rPr>
+        <w:t xml:space="preserve">The felt surface is sacred. Nothing larger than an individual playing card should be placed flat on the felt — this includes purses, bags, food containers, and chip racks. Large objects can conceal cards, and the dealer must be able to see every card and chip on the table at all times. Chip racks may rest half-on/half-off the rail but should not be placed flat on the felt.</w:t>
+      </w:r>
+    </w:p>
+    <w:p>
+      <w:pPr>
+        <w:spacing w:after="160" w:line="276"/>
+      </w:pPr>
+      <w:r>
+        <w:rPr>
+          <w:rFonts w:ascii="Arial" w:cs="Arial" w:eastAsia="Arial" w:hAnsi="Arial"/>
+          <w:color w:val="333333"/>
+          <w:sz w:val="21"/>
+          <w:szCs w:val="21"/>
+        </w:rPr>
+        <w:t xml:space="preserve">Cell phone policies vary by room and are evolving rapidly. The general direction: tournaments should prohibit any physical interaction with a phone while a player has cards (headphones are acceptable; looking at or touching the screen is not). Cash games are more permissive — players may interact with devices when not in the middle of a decision, but the casino reserves the right to restrict a specific player if their device use creates concerns. Recording devices are technically prohibited in most casinos, though enforcement is inconsistent. The dealer should know their room’s specific policy and enforce it consistently.</w:t>
+      </w:r>
+    </w:p>
+    <w:p>
+      <w:pPr>
+        <w:pStyle w:val="Heading2"/>
+        <w:spacing w:before="280" w:after="160"/>
+      </w:pPr>
+      <w:r>
+        <w:rPr>
+          <w:rFonts w:ascii="Arial" w:cs="Arial" w:eastAsia="Arial" w:hAnsi="Arial"/>
+          <w:b/>
+          <w:bCs/>
+          <w:color w:val="2C3E50"/>
+          <w:sz w:val="26"/>
+          <w:szCs w:val="26"/>
+        </w:rPr>
+        <w:t xml:space="preserve">10.10 Poker Room Hierarchy and When to Call the Floor</w:t>
+      </w:r>
+    </w:p>
+    <w:p>
+      <w:pPr>
+        <w:spacing w:after="160" w:line="276"/>
+      </w:pPr>
+      <w:r>
+        <w:rPr>
+          <w:rFonts w:ascii="Arial" w:cs="Arial" w:eastAsia="Arial" w:hAnsi="Arial"/>
+          <w:color w:val="333333"/>
+          <w:sz w:val="21"/>
+          <w:szCs w:val="21"/>
+        </w:rPr>
+        <w:t xml:space="preserve">The standard poker room hierarchy from top to bottom: Poker Director/Manager (oversees the entire room, reports to table games management or GM) → Shift Managers (responsible for everything during their shift; there must always be one on property) → Supervisors/Floor Staff (handle rulings, player disputes, and table management on the floor) → Dealers. When the dealer encounters a situation they cannot resolve, they call the supervisor. If the supervisor cannot resolve it, they escalate to the shift manager. If the shift manager is stuck, they go to the director.</w:t>
+      </w:r>
+    </w:p>
+    <w:p>
+      <w:pPr>
+        <w:spacing w:after="160" w:line="276"/>
+      </w:pPr>
+      <w:r>
+        <w:rPr>
+          <w:rFonts w:ascii="Arial" w:cs="Arial" w:eastAsia="Arial" w:hAnsi="Arial"/>
+          <w:color w:val="333333"/>
+          <w:sz w:val="21"/>
+          <w:szCs w:val="21"/>
+        </w:rPr>
+        <w:t xml:space="preserve">When to call the floor as a dealer: (1) Any premature card — no exceptions. (2) Any situation where more than one player acted out of turn. (3) Any ambiguity about what a player said or did. (4) Any confrontation that the dealer cannot defuse with a single statement. (5) Any suspected integrity issue (player taking chips back, reaching into the muck, concealing cards inappropriately). (6) Any intoxicated player. (7) Any time the dealer does not know the correct ruling. The dealer should never be afraid to call the floor — it is explicitly part of the job. However, the dealer should also never tell the players what the floor will decide. The correct communication is always: ‘I’m calling the floor. They’ll make a decision.’</w:t>
+      </w:r>
+    </w:p>
+    <w:p>
+      <w:pPr>
+        <w:spacing w:after="160" w:line="276"/>
+      </w:pPr>
+      <w:r>
+        <w:rPr>
+          <w:rFonts w:ascii="Arial" w:cs="Arial" w:eastAsia="Arial" w:hAnsi="Arial"/>
+          <w:color w:val="333333"/>
+          <w:sz w:val="21"/>
+          <w:szCs w:val="21"/>
+        </w:rPr>
+        <w:t xml:space="preserve">A systemic industry problem: supervisor quality is highly variable because there is no universal supervisor training. Supervisors are typically promoted dealers who learn on the job. Some are excellent; others are inconsistent. Dealers sometimes avoid calling the floor because they do not trust the supervisor to make the right call — this is a serious integrity failure that the dealer must not participate in. Call the floor regardless of your confidence in the supervisor. The alternative (the dealer making a ruling they are not authorized to make) is always worse.</w:t>
+      </w:r>
+    </w:p>
+    <w:p>
+      <w:pPr>
+        <w:spacing w:after="160" w:line="276"/>
+      </w:pPr>
+      <w:r>
+        <w:rPr>
+          <w:rFonts w:ascii="Arial" w:cs="Arial" w:eastAsia="Arial" w:hAnsi="Arial"/>
+          <w:b/>
+          <w:bCs/>
+          <w:color w:val="2C3E50"/>
+          <w:sz w:val="21"/>
+          <w:szCs w:val="21"/>
+        </w:rPr>
+        <w:t xml:space="preserve">Robotic Requirement: </w:t>
+      </w:r>
+      <w:r>
+        <w:rPr>
+          <w:rFonts w:ascii="Arial" w:cs="Arial" w:eastAsia="Arial" w:hAnsi="Arial"/>
+          <w:color w:val="333333"/>
+          <w:sz w:val="21"/>
+          <w:szCs w:val="21"/>
+        </w:rPr>
+        <w:t xml:space="preserve">A robotic system eliminates the soft-skill challenges of running the game but must replicate the information-management aspects. Must clearly communicate all bet amounts (visual and/or audio display). Must enforce table surface policies (detect and flag objects on the felt that could conceal cards). Must provide a clear escalation pathway for situations requiring human judgment (supervisor notification system). Must maintain consistent pace regardless of game complexity. Must enforce device policies per configurable room rules. The human elements of running the game — personality, confrontation de-escalation, player psychology — are the aspects most difficult to replicate robotically and represent the strongest argument for retaining human floor staff alongside robotic dealing systems.</w:t>
       </w:r>
     </w:p>
     <w:p>

</xml_diff>

<commit_message>
Expand Section 9.7 with Ace-to-Five Triple Draw and Five-Card Draw High from Mixed Games Lesson 8
Added dedicated subsections for A-5 Triple Draw Lowball (limit-only per WSOP, six-max,
straights/flushes irrelevant, no ante, burn card tracking across draw rounds) and
Five-Card Draw High (no-limit, seven-max, single draw, exposed card rules, short-dealt
player procedure). Added error recovery for Hold'em muscle memory mistakes (accidentally
dealing flops in draw games, premature burns). Added speed management guidance for
game-type transitions. Document: 112,771 → 115,627 bytes.

https://claude.ai/code/session_01LLEXfPXvBSATequm3rLG4v
</commit_message>
<xml_diff>
--- a/docs/Deployment_Bible.docx
+++ b/docs/Deployment_Bible.docx
@@ -7232,6 +7232,284 @@
           <w:szCs w:val="21"/>
         </w:rPr>
         <w:t xml:space="preserve">The dealing procedure for triple draw games: deal five cards to each player face-down, conduct a betting round, allow discards (players announce how many cards they want), deal replacements, repeat for three total draw rounds with a betting round after each. The dealer must track how many cards each player discards, deal the correct number of replacements, and manage the stub carefully because draw games consume cards rapidly — with eight players each drawing multiple cards over three rounds, the deck can be exhausted.</w:t>
+      </w:r>
+    </w:p>
+    <w:p>
+      <w:pPr>
+        <w:spacing w:before="200" w:after="120"/>
+      </w:pPr>
+      <w:r>
+        <w:rPr>
+          <w:rFonts w:ascii="Arial" w:cs="Arial" w:eastAsia="Arial" w:hAnsi="Arial"/>
+          <w:b/>
+          <w:bCs/>
+          <w:color w:val="C0392B"/>
+          <w:sz w:val="22"/>
+          <w:szCs w:val="22"/>
+        </w:rPr>
+        <w:t xml:space="preserve">Ace-to-Five Triple Draw Lowball</w:t>
+      </w:r>
+    </w:p>
+    <w:p>
+      <w:pPr>
+        <w:spacing w:after="160" w:line="276"/>
+      </w:pPr>
+      <w:r>
+        <w:rPr>
+          <w:rFonts w:ascii="Arial" w:cs="Arial" w:eastAsia="Arial" w:hAnsi="Arial"/>
+          <w:color w:val="333333"/>
+          <w:sz w:val="21"/>
+          <w:szCs w:val="21"/>
+        </w:rPr>
+        <w:t xml:space="preserve">Ace-to-Five (A-5) Triple Draw Lowball is structurally almost identical to Deuce-to-Seven Triple Draw with one critical difference: straights and flushes do not count against the hand. The best possible hand is A-2-3-4-5 (the wheel), which is the absolute nuts. Aces are always low. Because straights and flushes are irrelevant, A-5 lowball uses the same low-hand rankings as Razz and the low half of Omaha Hi-Lo — the lowest five unpaired cards win, with aces counting as low.</w:t>
+      </w:r>
+    </w:p>
+    <w:p>
+      <w:pPr>
+        <w:spacing w:after="160" w:line="276"/>
+      </w:pPr>
+      <w:r>
+        <w:rPr>
+          <w:rFonts w:ascii="Arial" w:cs="Arial" w:eastAsia="Arial" w:hAnsi="Arial"/>
+          <w:color w:val="333333"/>
+          <w:sz w:val="21"/>
+          <w:szCs w:val="21"/>
+        </w:rPr>
+        <w:t xml:space="preserve">According to the WSOP manual, Ace-to-Five is only dealt as a limit game. Unlike Deuce-to-Seven, which can be either limit or pot-limit, A-5 does not have a pot-limit variant in WSOP tournament play. The game is dealt six-max (six players per table) because five cards per player in a triple draw format consumes cards rapidly. The betting structure follows standard limit rules: small bet for the first two betting rounds (after the deal and after the first draw), big bet for the last two betting rounds (after the second and third draws).</w:t>
+      </w:r>
+    </w:p>
+    <w:p>
+      <w:pPr>
+        <w:spacing w:after="160" w:line="276"/>
+      </w:pPr>
+      <w:r>
+        <w:rPr>
+          <w:rFonts w:ascii="Arial" w:cs="Arial" w:eastAsia="Arial" w:hAnsi="Arial"/>
+          <w:color w:val="333333"/>
+          <w:sz w:val="21"/>
+          <w:szCs w:val="21"/>
+        </w:rPr>
+        <w:t xml:space="preserve">A-5 Triple Draw does not use an ante — it is dealt with a small blind and a big blind only, just like standard limit hold’em. This is consistent across WSOP documentation. The game uses the same blind structure as any limit game of its stakes (e.g., a 4/8 limit game uses 2/4 blinds).</w:t>
+      </w:r>
+    </w:p>
+    <w:p>
+      <w:pPr>
+        <w:spacing w:after="160" w:line="276"/>
+      </w:pPr>
+      <w:r>
+        <w:rPr>
+          <w:rFonts w:ascii="Arial" w:cs="Arial" w:eastAsia="Arial" w:hAnsi="Arial"/>
+          <w:color w:val="333333"/>
+          <w:sz w:val="21"/>
+          <w:szCs w:val="21"/>
+        </w:rPr>
+        <w:t xml:space="preserve">The discard procedure is identical to Deuce-to-Seven: wait for all players to indicate their discards in turn, announce the discard count for all players (e.g., ‘one, two, two’ or ‘two, three, two, three, three’ for a five-way pot), burn a card, then pitch replacements to each player one at a time. Before moving to the next player, pull their discards to the separate discard pile. After all players have received their replacement cards, slide the discard pile into the muck. The separation of the current round’s discards from the muck is essential for the stub depletion procedure.</w:t>
+      </w:r>
+    </w:p>
+    <w:p>
+      <w:pPr>
+        <w:spacing w:after="160" w:line="276"/>
+      </w:pPr>
+      <w:r>
+        <w:rPr>
+          <w:rFonts w:ascii="Arial" w:cs="Arial" w:eastAsia="Arial" w:hAnsi="Arial"/>
+          <w:color w:val="333333"/>
+          <w:sz w:val="21"/>
+          <w:szCs w:val="21"/>
+        </w:rPr>
+        <w:t xml:space="preserve">The burn card tracking principle is especially important in triple draw games: the number of burn cards on the table tells the dealer which draw round is current. After the initial deal there are zero burns. After the first draw there is one burn card. After the second draw there are two burn cards. After the third and final draw there are three burn cards. This visual check prevents the dealer from losing track of the game state, which is easy to do when the action is fast and multiple players are drawing cards.</w:t>
+      </w:r>
+    </w:p>
+    <w:p>
+      <w:pPr>
+        <w:spacing w:after="160" w:line="276"/>
+      </w:pPr>
+      <w:r>
+        <w:rPr>
+          <w:rFonts w:ascii="Arial" w:cs="Arial" w:eastAsia="Arial" w:hAnsi="Arial"/>
+          <w:color w:val="333333"/>
+          <w:sz w:val="21"/>
+          <w:szCs w:val="21"/>
+        </w:rPr>
+        <w:t xml:space="preserve">A-5 is not a split-pot game — the lowest hand wins the entire pot. This means pot stacking before showdown is not required (unlike badacy, which splits between a badugi hand and an A-5 hand). The dealer simply reads the hands, identifies the lowest, and pushes the pot. When multiple players show identical low hands (e.g., both have 7-5-4-3-A), the pot is split evenly with standard odd-chip rules.</w:t>
+      </w:r>
+    </w:p>
+    <w:p>
+      <w:pPr>
+        <w:spacing w:after="160" w:line="276"/>
+      </w:pPr>
+      <w:r>
+        <w:rPr>
+          <w:rFonts w:ascii="Arial" w:cs="Arial" w:eastAsia="Arial" w:hAnsi="Arial"/>
+          <w:color w:val="333333"/>
+          <w:sz w:val="21"/>
+          <w:szCs w:val="21"/>
+        </w:rPr>
+        <w:t xml:space="preserve">When a player wants to keep all five cards (stand pat), they either tap the table or verbally say ‘pat.’ The dealer announces this in the discard count: ‘one, pat, one’ or ‘pat, pat, one.’ Standing pat gives away significant information to opponents — it signals a made hand — but this is a strategic decision, not a dealing concern. The dealer simply records and announces the action.</w:t>
+      </w:r>
+    </w:p>
+    <w:p>
+      <w:pPr>
+        <w:spacing w:after="160" w:line="276"/>
+      </w:pPr>
+      <w:r>
+        <w:rPr>
+          <w:rFonts w:ascii="Arial" w:cs="Arial" w:eastAsia="Arial" w:hAnsi="Arial"/>
+          <w:b/>
+          <w:bCs/>
+          <w:color w:val="2C3E50"/>
+          <w:sz w:val="21"/>
+          <w:szCs w:val="21"/>
+        </w:rPr>
+        <w:t xml:space="preserve">Robotic Requirement: </w:t>
+      </w:r>
+      <w:r>
+        <w:rPr>
+          <w:rFonts w:ascii="Arial" w:cs="Arial" w:eastAsia="Arial" w:hAnsi="Arial"/>
+          <w:color w:val="333333"/>
+          <w:sz w:val="21"/>
+          <w:szCs w:val="21"/>
+        </w:rPr>
+        <w:t xml:space="preserve">Must enforce the limit-only betting structure for A-5 (no pot-limit option). Must correctly evaluate A-5 lowball hands where straights and flushes do not count against the player. Must track burn cards as a state verification mechanism across three draw rounds. Must announce discard counts before dealing replacements. Must handle the ‘pat’ action (verbal or table tap). The hand evaluation engine must distinguish between A-5 lowball rankings (straights/flushes irrelevant) and 2-7 lowball rankings (straights/flushes count against), as mixing these up is a critical error.</w:t>
+      </w:r>
+    </w:p>
+    <w:p>
+      <w:pPr>
+        <w:spacing w:before="200" w:after="120"/>
+      </w:pPr>
+      <w:r>
+        <w:rPr>
+          <w:rFonts w:ascii="Arial" w:cs="Arial" w:eastAsia="Arial" w:hAnsi="Arial"/>
+          <w:b/>
+          <w:bCs/>
+          <w:color w:val="C0392B"/>
+          <w:sz w:val="22"/>
+          <w:szCs w:val="22"/>
+        </w:rPr>
+        <w:t xml:space="preserve">Five-Card Draw High (No Limit)</w:t>
+      </w:r>
+    </w:p>
+    <w:p>
+      <w:pPr>
+        <w:spacing w:after="160" w:line="276"/>
+      </w:pPr>
+      <w:r>
+        <w:rPr>
+          <w:rFonts w:ascii="Arial" w:cs="Arial" w:eastAsia="Arial" w:hAnsi="Arial"/>
+          <w:color w:val="333333"/>
+          <w:sz w:val="21"/>
+          <w:szCs w:val="21"/>
+        </w:rPr>
+        <w:t xml:space="preserve">Five-Card Draw High is the classic poker game that most players grew up on before Texas Hold’em became dominant. In casino and WSOP tournament play, it is dealt as a no-limit game with a single draw (only one discard/replacement round). It uses standard high hand rankings — the best hand wins. It is dealt seven-max (seven players per table). The game has exactly two betting rounds: one after the initial deal and one after the single draw.</w:t>
+      </w:r>
+    </w:p>
+    <w:p>
+      <w:pPr>
+        <w:spacing w:after="160" w:line="276"/>
+      </w:pPr>
+      <w:r>
+        <w:rPr>
+          <w:rFonts w:ascii="Arial" w:cs="Arial" w:eastAsia="Arial" w:hAnsi="Arial"/>
+          <w:color w:val="333333"/>
+          <w:sz w:val="21"/>
+          <w:szCs w:val="21"/>
+        </w:rPr>
+        <w:t xml:space="preserve">The dealing procedure: post blinds (small blind and big blind, no ante), deal five cards face-down to each player, conduct the first betting round (no-limit), then allow discards. Players may discard any number of cards from zero (standing pat) to all five. After discards, the dealer announces the discard counts, burns a card, pitches replacements to each player in order (pulling discards to the discard pile before moving to the next player), slides discards into the muck, and conducts the final betting round. The simplicity of a single draw means the hand moves quickly compared to triple draw variants.</w:t>
+      </w:r>
+    </w:p>
+    <w:p>
+      <w:pPr>
+        <w:spacing w:after="160" w:line="276"/>
+      </w:pPr>
+      <w:r>
+        <w:rPr>
+          <w:rFonts w:ascii="Arial" w:cs="Arial" w:eastAsia="Arial" w:hAnsi="Arial"/>
+          <w:color w:val="333333"/>
+          <w:sz w:val="21"/>
+          <w:szCs w:val="21"/>
+        </w:rPr>
+        <w:t xml:space="preserve">Exposed card rules in Five-Card Draw and other non-community-card mixed games: if one card is flipped face-up during the initial pitch, leave that card in front of the player, continue dealing around the table until all players have received their full five cards, then take the exposed card from that player (it becomes the burn card) and deal them a replacement card. Show the exposed card to the entire table before using it as the burn. If two or more cards are flipped during the initial pitch, it is a misdeal — all cards are collected and the hand is redealt. This rule mirrors Hold’em’s single-exposed-card tolerance.</w:t>
+      </w:r>
+    </w:p>
+    <w:p>
+      <w:pPr>
+        <w:spacing w:after="160" w:line="276"/>
+      </w:pPr>
+      <w:r>
+        <w:rPr>
+          <w:rFonts w:ascii="Arial" w:cs="Arial" w:eastAsia="Arial" w:hAnsi="Arial"/>
+          <w:color w:val="333333"/>
+          <w:sz w:val="21"/>
+          <w:szCs w:val="21"/>
+        </w:rPr>
+        <w:t xml:space="preserve">Short-dealt player (received fewer than five cards): if a player discovers they only received four cards and has not yet acted on their hand, this is a floor call. The standard ruling (per WSOP) is that the player may receive their fifth card — no burn card is required, the dealer simply pitches one additional card to the player. If the player has already acted on their hand (called, raised, or checked), the hand is dead. The key distinction is whether the player has taken any action — an unacted-upon short hand is correctable; an acted-upon short hand is not.</w:t>
+      </w:r>
+    </w:p>
+    <w:p>
+      <w:pPr>
+        <w:spacing w:after="160" w:line="276"/>
+      </w:pPr>
+      <w:r>
+        <w:rPr>
+          <w:rFonts w:ascii="Arial" w:cs="Arial" w:eastAsia="Arial" w:hAnsi="Arial"/>
+          <w:color w:val="333333"/>
+          <w:sz w:val="21"/>
+          <w:szCs w:val="21"/>
+        </w:rPr>
+        <w:t xml:space="preserve">The most common and dangerous dealer error in Five-Card Draw (and all non-flop draw games) is accidentally burning a card and dealing a flop after collecting bets. This happens because Hold’em muscle memory is deeply ingrained — after bringing in the pot, the dealer’s instinct is to tap, burn, and spread three community cards. In a draw game, this is a floor call. The floor will determine how to handle the prematurely dealt cards (typically they are returned to the top of the stub in order, though the exact ruling varies). The cards were dealt face-down, which makes recovery easier than if they had been exposed.</w:t>
+      </w:r>
+    </w:p>
+    <w:p>
+      <w:pPr>
+        <w:spacing w:after="160" w:line="276"/>
+      </w:pPr>
+      <w:r>
+        <w:rPr>
+          <w:rFonts w:ascii="Arial" w:cs="Arial" w:eastAsia="Arial" w:hAnsi="Arial"/>
+          <w:color w:val="333333"/>
+          <w:sz w:val="21"/>
+          <w:szCs w:val="21"/>
+        </w:rPr>
+        <w:t xml:space="preserve">If the dealer has already burned a card before players have made their discards (burning prematurely), the procedure is to announce ‘we’ve already burned’ so that the table and the supervisor are aware. The burn card stands, and the hand continues normally — players make their discards and the dealer pitches replacements without burning again (since the burn for this round has already occurred). A supervisor should still be present for this announcement, as it represents a procedural irregularity that needs to be documented.</w:t>
+      </w:r>
+    </w:p>
+    <w:p>
+      <w:pPr>
+        <w:spacing w:after="160" w:line="276"/>
+      </w:pPr>
+      <w:r>
+        <w:rPr>
+          <w:rFonts w:ascii="Arial" w:cs="Arial" w:eastAsia="Arial" w:hAnsi="Arial"/>
+          <w:color w:val="333333"/>
+          <w:sz w:val="21"/>
+          <w:szCs w:val="21"/>
+        </w:rPr>
+        <w:t xml:space="preserve">Speed management is critical when transitioning between game types in mixed-game rotations. Dealers who have been dealing multiple rounds of Hold’em develop deeply ingrained habits: dealing two cards per player, burning and flopping after the first betting round, etc. When switching to Five-Card Draw or any draw game, the dealer must consciously slow down and reset their mental model. The instinct to go fast is strong, especially in dealers who take pride in their dealing speed, but speed in an unfamiliar game format leads to procedural errors. The correct approach: slow down, focus on each step deliberately, and increase speed only as comfort with the game grows. One mistake handled well is far better than two mistakes caused by rushing.</w:t>
+      </w:r>
+    </w:p>
+    <w:p>
+      <w:pPr>
+        <w:spacing w:after="160" w:line="276"/>
+      </w:pPr>
+      <w:r>
+        <w:rPr>
+          <w:rFonts w:ascii="Arial" w:cs="Arial" w:eastAsia="Arial" w:hAnsi="Arial"/>
+          <w:b/>
+          <w:bCs/>
+          <w:color w:val="2C3E50"/>
+          <w:sz w:val="21"/>
+          <w:szCs w:val="21"/>
+        </w:rPr>
+        <w:t xml:space="preserve">Robotic Requirement: </w:t>
+      </w:r>
+      <w:r>
+        <w:rPr>
+          <w:rFonts w:ascii="Arial" w:cs="Arial" w:eastAsia="Arial" w:hAnsi="Arial"/>
+          <w:color w:val="333333"/>
+          <w:sz w:val="21"/>
+          <w:szCs w:val="21"/>
+        </w:rPr>
+        <w:t xml:space="preserve">Must support no-limit betting structure for Five-Card Draw. Must handle single-draw mechanics (only one discard/replacement round). Must detect and handle exposed cards during the initial pitch (one exposed = replace with burn; two exposed = misdeal). Must detect short-dealt players and flag for correction before action begins. Must NOT execute community-card dealing procedures (burn-and-flop) in draw game contexts — the game state machine must enforce that draw games follow discard-and-replace logic only. Must support configurable draw counts (single draw for Five-Card Draw, triple draw for A-5 and 2-7). The premature burn scenario requires announcing the irregularity and continuing without a second burn. A robotic system eliminates the Hold’em muscle memory problem entirely, as the software state machine simply will not execute flop procedures during a draw game.</w:t>
       </w:r>
     </w:p>
     <w:p>

</xml_diff>

<commit_message>
Expand Section 9.3 with Big O (Five-Card PLO Hi-Lo) from Mixed Games Lesson 5
Added dedicated Big O subsections: game format (pot-limit, seven-max, eight-or-better),
pot-limit calculation with running pot tracking, five-card pitch and muck verification,
showdown evaluation (10 combinations per player per direction), split-pot stacking
procedure (stack after river, direct action first, push high then low), three-way
chop with odd-chip rules, dirty stack detection, and Big O Double Barrel variant.
Document: 115,627 → 117,972 bytes.

https://claude.ai/code/session_01LLEXfPXvBSATequm3rLG4v
</commit_message>
<xml_diff>
--- a/docs/Deployment_Bible.docx
+++ b/docs/Deployment_Bible.docx
@@ -6751,6 +6751,235 @@
           <w:szCs w:val="21"/>
         </w:rPr>
         <w:t xml:space="preserve">Must evaluate high and low hands independently for every player. Must correctly determine low qualification (8 or better, no pairs). Must handle scoops (no qualifying low) and split pots. Must support 4-card and 5-card Omaha variants. Hand evaluation complexity makes this the game variant where robotic accuracy provides the most dramatic improvement over human dealing.</w:t>
+      </w:r>
+    </w:p>
+    <w:p>
+      <w:pPr>
+        <w:spacing w:before="200" w:after="120"/>
+      </w:pPr>
+      <w:r>
+        <w:rPr>
+          <w:rFonts w:ascii="Arial" w:cs="Arial" w:eastAsia="Arial" w:hAnsi="Arial"/>
+          <w:b/>
+          <w:bCs/>
+          <w:color w:val="C0392B"/>
+          <w:sz w:val="22"/>
+          <w:szCs w:val="22"/>
+        </w:rPr>
+        <w:t xml:space="preserve">Big O: Five-Card Pot-Limit Omaha Hi-Lo (8 or Better)</w:t>
+      </w:r>
+    </w:p>
+    <w:p>
+      <w:pPr>
+        <w:spacing w:after="160" w:line="276"/>
+      </w:pPr>
+      <w:r>
+        <w:rPr>
+          <w:rFonts w:ascii="Arial" w:cs="Arial" w:eastAsia="Arial" w:hAnsi="Arial"/>
+          <w:color w:val="333333"/>
+          <w:sz w:val="21"/>
+          <w:szCs w:val="21"/>
+        </w:rPr>
+        <w:t xml:space="preserve">Big O is the five-card variant of Omaha Hi-Lo (8 or better). Per the WSOP manual, the standard tournament format is pot-limit with high-low split (eight or better qualifying low). The ‘big’ simply refers to receiving five hole cards instead of four. Because five cards per player consumes more of the deck, Big O is dealt seven-max (seven players per table). The game attracts players seeking maximum action and complexity — the additional hole card dramatically increases hand possibilities, creates more multi-way action, and makes split pots more frequent.</w:t>
+      </w:r>
+    </w:p>
+    <w:p>
+      <w:pPr>
+        <w:spacing w:after="160" w:line="276"/>
+      </w:pPr>
+      <w:r>
+        <w:rPr>
+          <w:rFonts w:ascii="Arial" w:cs="Arial" w:eastAsia="Arial" w:hAnsi="Arial"/>
+          <w:color w:val="333333"/>
+          <w:sz w:val="21"/>
+          <w:szCs w:val="21"/>
+        </w:rPr>
+        <w:t xml:space="preserve">The fundamental rules are identical to standard Omaha Hi-Lo: players must use exactly two cards from their hand and three from the board for each half of the pot (high and low), and the low must qualify with five unpaired cards eight or below. The key difference is that five hole cards produce 10 possible two-card combinations instead of 6, meaning each player has 10 possible highs and 10 possible lows to evaluate against the board. At a full seven-player table, the dealer faces up to 140 hand evaluations at showdown (10 combinations × 2 directions × 7 players). This is the single most computationally demanding scenario for human dealers.</w:t>
+      </w:r>
+    </w:p>
+    <w:p>
+      <w:pPr>
+        <w:spacing w:after="160" w:line="276"/>
+      </w:pPr>
+      <w:r>
+        <w:rPr>
+          <w:rFonts w:ascii="Arial" w:cs="Arial" w:eastAsia="Arial" w:hAnsi="Arial"/>
+          <w:color w:val="333333"/>
+          <w:sz w:val="21"/>
+          <w:szCs w:val="21"/>
+        </w:rPr>
+        <w:t xml:space="preserve">Pot-limit calculation in Big O follows the standard formula: three times the previous bet plus the trail plus the pot. In a cash game, the small blind counts as a full big blind for pot-limit calculation purposes. With no limpers, a pot-sized raise is 4× the big blind. With one limper, it’s 5×. The dealer must announce the pot amount when a player says ‘pot’ — for example, in a 5/10 game with one limper, the dealer says ‘pot, 50.’ Because Big O pots grow rapidly (pot-limit structure with many players seeing flops due to five-card hand strength), the dealer must track the running pot total mentally after each betting round. Common pot sizes in Big O escalate dramatically: a pot of 160 after the flop can become 640 on the turn and 2,560 on the river.</w:t>
+      </w:r>
+    </w:p>
+    <w:p>
+      <w:pPr>
+        <w:spacing w:after="160" w:line="276"/>
+      </w:pPr>
+      <w:r>
+        <w:rPr>
+          <w:rFonts w:ascii="Arial" w:cs="Arial" w:eastAsia="Arial" w:hAnsi="Arial"/>
+          <w:color w:val="333333"/>
+          <w:sz w:val="21"/>
+          <w:szCs w:val="21"/>
+        </w:rPr>
+        <w:t xml:space="preserve">The dealing procedure is identical to standard Omaha: pitch five cards (instead of four) to each player, deal community cards exactly as in Hold’em (flop, turn, river with burns). If a card is flipped during the initial pitch, the same rules apply as in Hold’em: one exposed card is shown to the table, replaced, and becomes the burn card; two exposed cards constitute a misdeal. After each muck, the dealer must verify that five cards are being returned (not four, as in standard Omaha, or two, as in Hold’em). Miscounting cards in Big O is easy because five is an unusual number of hole cards.</w:t>
+      </w:r>
+    </w:p>
+    <w:p>
+      <w:pPr>
+        <w:spacing w:before="200" w:after="120"/>
+      </w:pPr>
+      <w:r>
+        <w:rPr>
+          <w:rFonts w:ascii="Arial" w:cs="Arial" w:eastAsia="Arial" w:hAnsi="Arial"/>
+          <w:b/>
+          <w:bCs/>
+          <w:color w:val="C0392B"/>
+          <w:sz w:val="22"/>
+          <w:szCs w:val="22"/>
+        </w:rPr>
+        <w:t xml:space="preserve">Big O Showdown: Evaluating High and Low</w:t>
+      </w:r>
+    </w:p>
+    <w:p>
+      <w:pPr>
+        <w:spacing w:after="160" w:line="276"/>
+      </w:pPr>
+      <w:r>
+        <w:rPr>
+          <w:rFonts w:ascii="Arial" w:cs="Arial" w:eastAsia="Arial" w:hAnsi="Arial"/>
+          <w:color w:val="333333"/>
+          <w:sz w:val="21"/>
+          <w:szCs w:val="21"/>
+        </w:rPr>
+        <w:t xml:space="preserve">At showdown in Big O, the dealer first checks whether a qualifying low exists. Scan the board for at least three cards eight or below (required because the player contributes exactly two low cards, needing three from the board). If no qualifying low is possible, the high hand scoops the entire pot — no stacking or splitting needed. If a qualifying low is possible, the dealer evaluates high and low separately.</w:t>
+      </w:r>
+    </w:p>
+    <w:p>
+      <w:pPr>
+        <w:spacing w:after="160" w:line="276"/>
+      </w:pPr>
+      <w:r>
+        <w:rPr>
+          <w:rFonts w:ascii="Arial" w:cs="Arial" w:eastAsia="Arial" w:hAnsi="Arial"/>
+          <w:color w:val="333333"/>
+          <w:sz w:val="21"/>
+          <w:szCs w:val="21"/>
+        </w:rPr>
+        <w:t xml:space="preserve">The showdown procedure for split-pot Big O: (1) Kill the losing hands that have no claim to either half. (2) Frame the winning high hand — identify the two hole cards and three board cards that make the best high. Push half the pot to the high winner and lock up (kill) the high hand. (3) Frame the winning low hand — identify the two hole cards and three board cards that make the best qualifying low. Push the remaining half to the low winner. If the same player wins both high and low, they scoop the entire pot. When the low half is split between two or more players with identical qualifying lows, the odd chip goes to the player closest to the left of the dealer button (or the player who will receive the button next, depending on house rules).</w:t>
+      </w:r>
+    </w:p>
+    <w:p>
+      <w:pPr>
+        <w:spacing w:after="160" w:line="276"/>
+      </w:pPr>
+      <w:r>
+        <w:rPr>
+          <w:rFonts w:ascii="Arial" w:cs="Arial" w:eastAsia="Arial" w:hAnsi="Arial"/>
+          <w:color w:val="333333"/>
+          <w:sz w:val="21"/>
+          <w:szCs w:val="21"/>
+        </w:rPr>
+        <w:t xml:space="preserve">Critical error prevention: in Big O, because players have five hole cards, they can use different two-card combinations for high and low. A player might use their ace-three for the low and their king-queen for the high. The dealer must not assume the same two cards apply to both halves. The framing technique requires evaluating each direction independently. This is the most common source of human dealer error in Big O and is trivially solved by a robotic system.</w:t>
+      </w:r>
+    </w:p>
+    <w:p>
+      <w:pPr>
+        <w:spacing w:before="200" w:after="120"/>
+      </w:pPr>
+      <w:r>
+        <w:rPr>
+          <w:rFonts w:ascii="Arial" w:cs="Arial" w:eastAsia="Arial" w:hAnsi="Arial"/>
+          <w:b/>
+          <w:bCs/>
+          <w:color w:val="C0392B"/>
+          <w:sz w:val="22"/>
+          <w:szCs w:val="22"/>
+        </w:rPr>
+        <w:t xml:space="preserve">Big O Pot Stacking and Split Procedure</w:t>
+      </w:r>
+    </w:p>
+    <w:p>
+      <w:pPr>
+        <w:spacing w:after="160" w:line="276"/>
+      </w:pPr>
+      <w:r>
+        <w:rPr>
+          <w:rFonts w:ascii="Arial" w:cs="Arial" w:eastAsia="Arial" w:hAnsi="Arial"/>
+          <w:color w:val="333333"/>
+          <w:sz w:val="21"/>
+          <w:szCs w:val="21"/>
+        </w:rPr>
+        <w:t xml:space="preserve">In Big O and all hi-lo split games, the WSOP procedure is to begin stacking the pot after the river card is dealt. The dealer waits until the river is out, then directs the action to ensure players know it is their turn (players should not be waiting on the dealer to finish stacking before they act). Once the action is flowing, the dealer begins stacking by denomination, largest denomination closest to the dealer, so the pot total is quickly readable. The stacks should be visible and stable — avoid tall stacks that could topple into side pots or player chip stacks.</w:t>
+      </w:r>
+    </w:p>
+    <w:p>
+      <w:pPr>
+        <w:spacing w:after="160" w:line="276"/>
+      </w:pPr>
+      <w:r>
+        <w:rPr>
+          <w:rFonts w:ascii="Arial" w:cs="Arial" w:eastAsia="Arial" w:hAnsi="Arial"/>
+          <w:color w:val="333333"/>
+          <w:sz w:val="21"/>
+          <w:szCs w:val="21"/>
+        </w:rPr>
+        <w:t xml:space="preserve">When splitting the pot, stack it so that division in half is straightforward. If the total is odd (e.g., an odd chip remains), the odd chip goes to the high hand in most house rules. The dealer stacks by denomination, divides visually, and pushes each half. In three-way chops (two players split the low, one wins the high), first push the high half, then divide the low half between the two low winners. The extra odd chip in the low half goes to the player closest to receiving the button next. Stacking must be clean enough to spot ‘dirty stacks’ (a wrong-denomination chip mixed into a stack of another denomination). Shipping a dirty stack is a dealer error that can cost players money and is a surveillance flag.</w:t>
+      </w:r>
+    </w:p>
+    <w:p>
+      <w:pPr>
+        <w:spacing w:before="200" w:after="120"/>
+      </w:pPr>
+      <w:r>
+        <w:rPr>
+          <w:rFonts w:ascii="Arial" w:cs="Arial" w:eastAsia="Arial" w:hAnsi="Arial"/>
+          <w:b/>
+          <w:bCs/>
+          <w:color w:val="C0392B"/>
+          <w:sz w:val="22"/>
+          <w:szCs w:val="22"/>
+        </w:rPr>
+        <w:t xml:space="preserve">Big O Double Barrel</w:t>
+      </w:r>
+    </w:p>
+    <w:p>
+      <w:pPr>
+        <w:spacing w:after="160" w:line="276"/>
+      </w:pPr>
+      <w:r>
+        <w:rPr>
+          <w:rFonts w:ascii="Arial" w:cs="Arial" w:eastAsia="Arial" w:hAnsi="Arial"/>
+          <w:color w:val="333333"/>
+          <w:sz w:val="21"/>
+          <w:szCs w:val="21"/>
+        </w:rPr>
+        <w:t xml:space="preserve">Big O Double Barrel is a variant listed in the WSOP manual where two separate boards are dealt. Unlike standard double-board bomb pots (where the pot is split between boards), in double barrel the best hand across either board wins the high, and the best hand across either board wins the low. In other words, a player’s high hand is evaluated against both boards and the best result counts; similarly for the low. This is not a per-board split — there is one high winner and one low winner, each using whichever board gives them the strongest hand. This format is extremely rare in practice and was not commonly spread even at the WSOP during the period documented. Dealers encountering this variant should confirm the exact rules with the floor before dealing, as the format is ambiguous enough that different rooms may implement it differently.</w:t>
+      </w:r>
+    </w:p>
+    <w:p>
+      <w:pPr>
+        <w:spacing w:after="160" w:line="276"/>
+      </w:pPr>
+      <w:r>
+        <w:rPr>
+          <w:rFonts w:ascii="Arial" w:cs="Arial" w:eastAsia="Arial" w:hAnsi="Arial"/>
+          <w:b/>
+          <w:bCs/>
+          <w:color w:val="2C3E50"/>
+          <w:sz w:val="21"/>
+          <w:szCs w:val="21"/>
+        </w:rPr>
+        <w:t xml:space="preserve">Robotic Requirement: </w:t>
+      </w:r>
+      <w:r>
+        <w:rPr>
+          <w:rFonts w:ascii="Arial" w:cs="Arial" w:eastAsia="Arial" w:hAnsi="Arial"/>
+          <w:color w:val="333333"/>
+          <w:sz w:val="21"/>
+          <w:szCs w:val="21"/>
+        </w:rPr>
+        <w:t xml:space="preserve">Must deal five hole cards per player (not four). Must enforce seven-max table size. Must calculate pot-limit amounts in real time and announce them when players declare ‘pot.’ Must track running pot totals across all betting rounds. Must evaluate 10 two-card combinations per player for both high and low directions independently. Must perform split-pot procedures: stack the pot after the river, push high first (kill high hand), then push low (kill low hand). Must handle three-way chops and odd-chip distribution. Must detect dirty stacks. Must support double barrel variant with dual board evaluation. Big O represents the peak complexity for human dealers — combining pot-limit math, five-card hand evaluation, hi-lo splitting, and rapid pot growth. A robotic system eliminates the most error-prone aspects: pot counting, hand reading at showdown, and split-pot math.</w:t>
       </w:r>
     </w:p>
     <w:p>

</xml_diff>

<commit_message>
Expand Sections 5.3 and 9.2 with pot-limit calculation mechanics from Mixed Games Lesson 4
Section 5.3: Added 9 new subsections covering the dealer formula (3× previous bet +
trail + pot), pre-flop shortcuts (4× with no limpers, +1× per limper), trail rules
(never count money in front of active player), all-in-for-less edge case (skip to
previous complete bet), cash vs tournament small blind counting, talking your game
(calculating out loud is acceptable), verbal announcement protocol for pot declarations,
never count down the pot (call floor instead), and unlimited raises in pot-limit.
Section 9.2: Added 4 new subsections for PLO-specific dealing: pot tracking across
streets, time rake, memorization patterns, and dealing with difficult PLO players.
Document: 117,972 → 123,453 bytes.

https://claude.ai/code/session_01LLEXfPXvBSATequm3rLG4v
</commit_message>
<xml_diff>
--- a/docs/Deployment_Bible.docx
+++ b/docs/Deployment_Bible.docx
@@ -2527,66 +2527,35 @@
           <w:sz w:val="22"/>
           <w:szCs w:val="22"/>
         </w:rPr>
-        <w:t xml:space="preserve">Pot-Limit Calculation with Short All-In Blinds</w:t>
-      </w:r>
-    </w:p>
-    <w:p>
-      <w:pPr>
-        <w:spacing w:after="160" w:line="276"/>
-      </w:pPr>
-      <w:r>
-        <w:rPr>
-          <w:rFonts w:ascii="Arial" w:cs="Arial" w:eastAsia="Arial" w:hAnsi="Arial"/>
-          <w:color w:val="333333"/>
-          <w:sz w:val="21"/>
-          <w:szCs w:val="21"/>
-        </w:rPr>
-        <w:t xml:space="preserve">A specific edge case in pot-limit tournament play: when a player is all-in for less than the blind amount, the pot calculation still uses the full blind value, not the actual short amount posted. Example: in a 200/400 tournament, if the big blind player is all-in for only 100, the pot is still calculated as if the big blind is 400 for pot-limit raise purposes. The formula for a pot-limit raise remains: three times the previous bet plus the trail. So a raise to the pot would still be 3 × 400 + 200 = 1,400. This rule exists to prevent the confusion of recalculating pot-limit math with non-standard blind amounts. The same principle applies to a short small blind. If the standard blinds are 200/400 and the small blind is all-in for 100, the pot calculation still assumes a 200 small blind.</w:t>
-      </w:r>
-    </w:p>
-    <w:p>
-      <w:pPr>
-        <w:pStyle w:val="Heading2"/>
-        <w:spacing w:before="280" w:after="160"/>
-      </w:pPr>
-      <w:r>
-        <w:rPr>
-          <w:rFonts w:ascii="Arial" w:cs="Arial" w:eastAsia="Arial" w:hAnsi="Arial"/>
-          <w:b/>
-          <w:bCs/>
-          <w:color w:val="2C3E50"/>
-          <w:sz w:val="26"/>
-          <w:szCs w:val="26"/>
-        </w:rPr>
-        <w:t xml:space="preserve">5.4 Straddles</w:t>
-      </w:r>
-    </w:p>
-    <w:p>
-      <w:pPr>
-        <w:spacing w:after="160" w:line="276"/>
-      </w:pPr>
-      <w:r>
-        <w:rPr>
-          <w:rFonts w:ascii="Arial" w:cs="Arial" w:eastAsia="Arial" w:hAnsi="Arial"/>
-          <w:color w:val="333333"/>
-          <w:sz w:val="21"/>
-          <w:szCs w:val="21"/>
-        </w:rPr>
-        <w:t xml:space="preserve">A straddle is a voluntary blind bet, typically double the big blind, placed before any cards are dealt. Straddles are cash game only — they do not exist in tournaments. The straddle functions as a third blind: the action starts to the left of the straddle, and the straddler acts last preflop (just like the big blind in an unstraddled hand). The dealer must announce ‘live straddle’ loudly and clearly every time, and often needs to announce it twice, because players trained in normal action flow will attempt to act from the wrong position.</w:t>
-      </w:r>
-    </w:p>
-    <w:p>
-      <w:pPr>
-        <w:spacing w:after="160" w:line="276"/>
-      </w:pPr>
-      <w:r>
-        <w:rPr>
-          <w:rFonts w:ascii="Arial" w:cs="Arial" w:eastAsia="Arial" w:hAnsi="Arial"/>
-          <w:color w:val="333333"/>
-          <w:sz w:val="21"/>
-          <w:szCs w:val="21"/>
-        </w:rPr>
-        <w:t xml:space="preserve">Timing rule: the official rule in most rooms is that the straddle must be posted before the first card is off the deck. In practice, many dealers allow it before the straddling player receives their first card. The stricter rule is safer for auditions and new dealers. Once announced or posted, the straddle is binding — the player cannot take it back once dealing has begun.</w:t>
+        <w:t xml:space="preserve">The Pot-Limit Formula: Three Times the Previous Bet Plus the Trail Plus the Pot</w:t>
+      </w:r>
+    </w:p>
+    <w:p>
+      <w:pPr>
+        <w:spacing w:after="160" w:line="276"/>
+      </w:pPr>
+      <w:r>
+        <w:rPr>
+          <w:rFonts w:ascii="Arial" w:cs="Arial" w:eastAsia="Arial" w:hAnsi="Arial"/>
+          <w:color w:val="333333"/>
+          <w:sz w:val="21"/>
+          <w:szCs w:val="21"/>
+        </w:rPr>
+        <w:t xml:space="preserve">The standard dealer formula for calculating a pot-sized raise is: three times the previous bet, plus the trail, plus the pot. The ‘previous bet’ is the most recent complete bet or raise. The ‘trail’ is all other active bets in the current betting round that are in front of players who are NOT the player currently in action. The ‘pot’ is all money from previous betting rounds already in the center. This formula is mathematically equivalent to the conceptual method (call first, then raise by the total pot), but is far faster to compute in real time.</w:t>
+      </w:r>
+    </w:p>
+    <w:p>
+      <w:pPr>
+        <w:spacing w:after="160" w:line="276"/>
+      </w:pPr>
+      <w:r>
+        <w:rPr>
+          <w:rFonts w:ascii="Arial" w:cs="Arial" w:eastAsia="Arial" w:hAnsi="Arial"/>
+          <w:color w:val="333333"/>
+          <w:sz w:val="21"/>
+          <w:szCs w:val="21"/>
+        </w:rPr>
+        <w:t xml:space="preserve">Example in a 5/5 game: three callers at $5 each, next player says ‘pot.’ The formula gives 3 × 5 (previous bet) + 5 + 5 + 5 (trail: three other $5 bets) = 30. But the active player’s own $5 call is NOT counted in the trail, so the actual trail is 5 + 5 = 10 (the two callers other than the small and big blind in front of the active player). Wait — this is the critical nuance: the trail includes all bets in front of OTHER players in this betting round, but NOT the money in front of the player who is acting. If the small blind is $5 and the big blind is $5 and there are two limpers at $5, then for the fifth player: 3 × 5 = 15, plus trail of 5 + 5 + 5 = 15, plus pot of 0, equals 30. The result is the total amount the player puts in (including their call).</w:t>
       </w:r>
     </w:p>
     <w:p>
@@ -2602,35 +2571,35 @@
           <w:sz w:val="22"/>
           <w:szCs w:val="22"/>
         </w:rPr>
-        <w:t xml:space="preserve">Straddle Positions and Variations</w:t>
-      </w:r>
-    </w:p>
-    <w:p>
-      <w:pPr>
-        <w:spacing w:after="160" w:line="276"/>
-      </w:pPr>
-      <w:r>
-        <w:rPr>
-          <w:rFonts w:ascii="Arial" w:cs="Arial" w:eastAsia="Arial" w:hAnsi="Arial"/>
-          <w:color w:val="333333"/>
-          <w:sz w:val="21"/>
-          <w:szCs w:val="21"/>
-        </w:rPr>
-        <w:t xml:space="preserve">Under-the-gun (UTG) straddle: the most common and simplest form. The player immediately to the left of the big blind posts double the big blind. Action starts to their left. Some rooms only allow UTG straddles. Button straddle: allowed in many rooms. The player on the button posts double the big blind. Action starts on the small blind. The dealer must be vigilant because the UTG player will instinctively try to act first — this is the most common error with button straddles. Mississippi straddle (any position): some rooms allow straddling from any seat. If two players want to straddle, the player in the best position (last to act post-flop) gets priority. The dealer must announce where the action starts and actively prevent players from acting out of order.</w:t>
-      </w:r>
-    </w:p>
-    <w:p>
-      <w:pPr>
-        <w:spacing w:after="160" w:line="276"/>
-      </w:pPr>
-      <w:r>
-        <w:rPr>
-          <w:rFonts w:ascii="Arial" w:cs="Arial" w:eastAsia="Arial" w:hAnsi="Arial"/>
-          <w:color w:val="333333"/>
-          <w:sz w:val="21"/>
-          <w:szCs w:val="21"/>
-        </w:rPr>
-        <w:t xml:space="preserve">Consecutive (re-)straddles: some games (typically higher stakes or private games) allow sequential straddles where each player can re-straddle for double the previous straddle. This can cascade around the table: $10, $20, $40, $80, $160. The lock-in rules vary by room — some lock the straddle once first card is dealt, others once posted. Sleeper straddle: a straddle from a middle position that only activates if all players between the blinds and the sleeper fold. If any player in between puts money in, the sleeper comes back. Not common in casinos but seen in some rooms.</w:t>
+        <w:t xml:space="preserve">Pre-Flop Pot-Limit Shortcuts</w:t>
+      </w:r>
+    </w:p>
+    <w:p>
+      <w:pPr>
+        <w:spacing w:after="160" w:line="276"/>
+      </w:pPr>
+      <w:r>
+        <w:rPr>
+          <w:rFonts w:ascii="Arial" w:cs="Arial" w:eastAsia="Arial" w:hAnsi="Arial"/>
+          <w:color w:val="333333"/>
+          <w:sz w:val="21"/>
+          <w:szCs w:val="21"/>
+        </w:rPr>
+        <w:t xml:space="preserve">Pre-flop in a pot-limit game, the math follows predictable patterns that dealers memorize over time. If the first player to enter the pot raises to the maximum (pot), the amount is always four times the big blind. This is because: 3 × big blind (previous bet) + small blind (trail) = 3.5×, but in cash games the small blind is counted as a full big blind for pot-limit purposes, making it exactly 4×. Each subsequent limper who has already called adds one multiple: no limpers = 4×, one limper = 5×, two limpers = 6×, three limpers = 7×, and so on. In a 5/5 game: pot with no limpers = 20, with one limper = 25, with two limpers = 30, with three limpers = 35. These numbers become memorized quickly and dealers should be able to state them instantly.</w:t>
+      </w:r>
+    </w:p>
+    <w:p>
+      <w:pPr>
+        <w:spacing w:after="160" w:line="276"/>
+      </w:pPr>
+      <w:r>
+        <w:rPr>
+          <w:rFonts w:ascii="Arial" w:cs="Arial" w:eastAsia="Arial" w:hAnsi="Arial"/>
+          <w:color w:val="333333"/>
+          <w:sz w:val="21"/>
+          <w:szCs w:val="21"/>
+        </w:rPr>
+        <w:t xml:space="preserve">When all callers are for the same amount, an additional shortcut applies: instead of computing 3 × previous bet + each individual trail bet, just multiply the number of same-sized bets (including the previous bet and trail) by the bet amount. For example, if a player raised to 30 and three players called 30, the next pot-sized raise is: 3 × 30 = 90 for the formula base, plus three more 30-bets in the trail = 90 + 90 = 180. Or more simply: six bets of 30 (3 from the formula + 3 callers) = 180, plus the pot from previous rounds. This shortcut only works when all amounts are identical.</w:t>
       </w:r>
     </w:p>
     <w:p>
@@ -2646,119 +2615,35 @@
           <w:sz w:val="22"/>
           <w:szCs w:val="22"/>
         </w:rPr>
-        <w:t xml:space="preserve">Straddle Effects on Game Mechanics</w:t>
-      </w:r>
-    </w:p>
-    <w:p>
-      <w:pPr>
-        <w:spacing w:after="160" w:line="276"/>
-      </w:pPr>
-      <w:r>
-        <w:rPr>
-          <w:rFonts w:ascii="Arial" w:cs="Arial" w:eastAsia="Arial" w:hAnsi="Arial"/>
-          <w:color w:val="333333"/>
-          <w:sz w:val="21"/>
-          <w:szCs w:val="21"/>
-        </w:rPr>
-        <w:t xml:space="preserve">In no-limit: the straddle becomes the effective big blind for minimum bet/raise purposes. A 2/5 game with a $10 straddle has a minimum raise of $20 preflop, and the minimum post-flop bet becomes $10 (the straddle amount, not the big blind). In limit: the straddle counts as the bet (not a raise), so you still get three raises on top of it — the cap goes one increment higher than normal. Example: 4/8 limit with a full kill straddle to $8 means cap is $8-$16-$24-$32.</w:t>
-      </w:r>
-    </w:p>
-    <w:p>
-      <w:pPr>
-        <w:spacing w:after="160" w:line="276"/>
-      </w:pPr>
-      <w:r>
-        <w:rPr>
-          <w:rFonts w:ascii="Arial" w:cs="Arial" w:eastAsia="Arial" w:hAnsi="Arial"/>
-          <w:color w:val="333333"/>
-          <w:sz w:val="21"/>
-          <w:szCs w:val="21"/>
-        </w:rPr>
-        <w:t xml:space="preserve">Live vs. dead straddle: a live straddle gives the player last action preflop (they can raise if unraised). A dead straddle does not — it is just a blind raise with no special position. Dead straddles are largely obsolete but may exist in some limit games. Straddle-in: in rooms that allow straddles from any position, a player who missed their blinds can sometimes straddle in instead of posting a big blind plus dead small. This is considered good for the game because it encourages action.</w:t>
-      </w:r>
-    </w:p>
-    <w:p>
-      <w:pPr>
-        <w:spacing w:after="160" w:line="276"/>
-      </w:pPr>
-      <w:r>
-        <w:rPr>
-          <w:rFonts w:ascii="Arial" w:cs="Arial" w:eastAsia="Arial" w:hAnsi="Arial"/>
-          <w:color w:val="333333"/>
-          <w:sz w:val="21"/>
-          <w:szCs w:val="21"/>
-        </w:rPr>
-        <w:t xml:space="preserve">Denomination optimization: in 1/2 NL, the original straddle of $4 (double the big blind) was changed to $5 in most rooms because $4 bets and calls create constant change-making that slows the game. The $5 straddle uses the standard red chip denomination. Similarly, 1/3 NL games often use a $5 straddle. This is a small procedural detail that has a large impact on dealing speed.</w:t>
-      </w:r>
-    </w:p>
-    <w:p>
-      <w:pPr>
-        <w:spacing w:after="160" w:line="276"/>
-      </w:pPr>
-      <w:r>
-        <w:rPr>
-          <w:rFonts w:ascii="Arial" w:cs="Arial" w:eastAsia="Arial" w:hAnsi="Arial"/>
-          <w:color w:val="333333"/>
-          <w:sz w:val="21"/>
-          <w:szCs w:val="21"/>
-        </w:rPr>
-        <w:t xml:space="preserve">Mandatory straddles: some high-stakes and private games have mandatory button straddles or mandatory UTG straddles. The straddle is not optional — every hand has it. This effectively makes the game play at double the blind level.</w:t>
-      </w:r>
-    </w:p>
-    <w:p>
-      <w:pPr>
-        <w:spacing w:after="160" w:line="276"/>
-      </w:pPr>
-      <w:r>
-        <w:rPr>
-          <w:rFonts w:ascii="Arial" w:cs="Arial" w:eastAsia="Arial" w:hAnsi="Arial"/>
-          <w:b/>
-          <w:bCs/>
-          <w:color w:val="2C3E50"/>
-          <w:sz w:val="21"/>
-          <w:szCs w:val="21"/>
-        </w:rPr>
-        <w:t xml:space="preserve">Robotic Requirement: </w:t>
-      </w:r>
-      <w:r>
-        <w:rPr>
-          <w:rFonts w:ascii="Arial" w:cs="Arial" w:eastAsia="Arial" w:hAnsi="Arial"/>
-          <w:color w:val="333333"/>
-          <w:sz w:val="21"/>
-          <w:szCs w:val="21"/>
-        </w:rPr>
-        <w:t xml:space="preserve">Must support configurable straddle rules: UTG-only, UTG-and-button, any-position (Mississippi), and consecutive re-straddles. Must correctly adjust the action start position based on straddle location. Must announce the straddle clearly (audio or visual display). Must adjust minimum bet/raise calculations for straddle pots. Must enforce timing rules (straddle before first card dealt). Must support mandatory straddle configurations. Must handle straddle-in as an alternative to missed blind posting where configured.</w:t>
-      </w:r>
-    </w:p>
-    <w:p>
-      <w:pPr>
-        <w:pStyle w:val="Heading2"/>
-        <w:spacing w:before="280" w:after="160"/>
-      </w:pPr>
-      <w:r>
-        <w:rPr>
-          <w:rFonts w:ascii="Arial" w:cs="Arial" w:eastAsia="Arial" w:hAnsi="Arial"/>
-          <w:b/>
-          <w:bCs/>
-          <w:color w:val="2C3E50"/>
-          <w:sz w:val="26"/>
-          <w:szCs w:val="26"/>
-        </w:rPr>
-        <w:t xml:space="preserve">5.5 Kill Pots</w:t>
-      </w:r>
-    </w:p>
-    <w:p>
-      <w:pPr>
-        <w:spacing w:after="160" w:line="276"/>
-      </w:pPr>
-      <w:r>
-        <w:rPr>
-          <w:rFonts w:ascii="Arial" w:cs="Arial" w:eastAsia="Arial" w:hAnsi="Arial"/>
-          <w:color w:val="333333"/>
-          <w:sz w:val="21"/>
-          <w:szCs w:val="21"/>
-        </w:rPr>
-        <w:t xml:space="preserve">A kill pot is a hand where the betting limits are increased because a predetermined trigger condition was met. Kills are primarily a limit game feature — they add excitement and bigger pots to limit formats. They are much less common in no-limit because straddles serve the same purpose. A kill can be a full kill (double the limits) or a half kill (1.5x the limits). Example: a 4/8 limit game with a full kill becomes 8/16 on kill hands; with a half kill it becomes 6/12.</w:t>
+        <w:t xml:space="preserve">Trail Rules: Never Count Money in Front of the Active Player</w:t>
+      </w:r>
+    </w:p>
+    <w:p>
+      <w:pPr>
+        <w:spacing w:after="160" w:line="276"/>
+      </w:pPr>
+      <w:r>
+        <w:rPr>
+          <w:rFonts w:ascii="Arial" w:cs="Arial" w:eastAsia="Arial" w:hAnsi="Arial"/>
+          <w:color w:val="333333"/>
+          <w:sz w:val="21"/>
+          <w:szCs w:val="21"/>
+        </w:rPr>
+        <w:t xml:space="preserve">A critical rule that trips up new pot-limit dealers: the trail does NOT include any money already in front of the player who is currently in action. If a player has already put $25 into the pot in a previous action this round (e.g., they called an initial raise) and now wants to re-raise pot, their $25 is not part of the trail. Only bets in front of other players count. This rule follows directly from the conceptual method: the player’s call completes the pot, then they raise by the pot amount. Since their own call is part of ‘completing the pot,’ it is already accounted for in the formula’s ‘3 × previous bet’ component. Counting it again as trail would double-count their contribution.</w:t>
+      </w:r>
+    </w:p>
+    <w:p>
+      <w:pPr>
+        <w:spacing w:after="160" w:line="276"/>
+      </w:pPr>
+      <w:r>
+        <w:rPr>
+          <w:rFonts w:ascii="Arial" w:cs="Arial" w:eastAsia="Arial" w:hAnsi="Arial"/>
+          <w:color w:val="333333"/>
+          <w:sz w:val="21"/>
+          <w:szCs w:val="21"/>
+        </w:rPr>
+        <w:t xml:space="preserve">This is the most dangerous shortcut error in pot-limit dealing. A dealer who pre-calculates the pot amount for a future player’s action must remember to subtract that player’s own contribution from the trail if the action reaches them. Example: dealer calculates that the pot-sized raise is 115 when it was the previous player’s turn. Now the action moves to a player who already has 25 in front of them. The pot-sized raise for this player is NOT 115 — it is 115 minus that player’s 25 trail contribution, recalculated fresh. The safest approach: always recalculate from the formula when the active player changes, rather than relying on cached amounts.</w:t>
       </w:r>
     </w:p>
     <w:p>
@@ -2774,21 +2659,21 @@
           <w:sz w:val="22"/>
           <w:szCs w:val="22"/>
         </w:rPr>
-        <w:t xml:space="preserve">Kill Triggers</w:t>
-      </w:r>
-    </w:p>
-    <w:p>
-      <w:pPr>
-        <w:spacing w:after="160" w:line="276"/>
-      </w:pPr>
-      <w:r>
-        <w:rPr>
-          <w:rFonts w:ascii="Arial" w:cs="Arial" w:eastAsia="Arial" w:hAnsi="Arial"/>
-          <w:color w:val="333333"/>
-          <w:sz w:val="21"/>
-          <w:szCs w:val="21"/>
-        </w:rPr>
-        <w:t xml:space="preserve">Texas Hold’em kill: triggered when a player wins two consecutive pots where the second pot exceeds a threshold amount (e.g., $40 in a 4/8 game). The first win gives the player a ‘leg up’ (tracked with a kill button showing ‘leg up’ on one side and ‘kill’ on the other). If the same player wins the next pot above the threshold, the kill is activated. Omaha Hi-Lo kill: triggered when a player scoops (wins both high and low) a pot above a certain amount. There is no leg-up system — a single scoop above the threshold triggers the kill on the next hand. If the pot is split in any way, no kill. The dealer must track pot sizes to know when the threshold is crossed.</w:t>
+        <w:t xml:space="preserve">All-In for Less in Pot-Limit Calculations</w:t>
+      </w:r>
+    </w:p>
+    <w:p>
+      <w:pPr>
+        <w:spacing w:after="160" w:line="276"/>
+      </w:pPr>
+      <w:r>
+        <w:rPr>
+          <w:rFonts w:ascii="Arial" w:cs="Arial" w:eastAsia="Arial" w:hAnsi="Arial"/>
+          <w:color w:val="333333"/>
+          <w:sz w:val="21"/>
+          <w:szCs w:val="21"/>
+        </w:rPr>
+        <w:t xml:space="preserve">When a player goes all-in for less than the current bet, their all-in amount does NOT count as the ‘previous bet’ in the pot-limit formula. The previous bet remains the last complete bet or raise. The all-in-for-less amount is added to the trail instead. Example: in a hand where the bet is 500 and a player goes all-in for 245, the next player’s pot-sized raise is calculated as: 3 × 500 (previous complete bet, NOT 245) + 245 (the all-in amount, now trail) + pot from previous rounds. If the formula incorrectly used 245 as the previous bet (3 × 245 = 735), the result would be significantly wrong. The all-in for less is functionally just another trail bet that happens to be short.</w:t>
       </w:r>
     </w:p>
     <w:p>
@@ -2804,35 +2689,21 @@
           <w:sz w:val="22"/>
           <w:szCs w:val="22"/>
         </w:rPr>
-        <w:t xml:space="preserve">Kill Pot Mechanics</w:t>
-      </w:r>
-    </w:p>
-    <w:p>
-      <w:pPr>
-        <w:spacing w:after="160" w:line="276"/>
-      </w:pPr>
-      <w:r>
-        <w:rPr>
-          <w:rFonts w:ascii="Arial" w:cs="Arial" w:eastAsia="Arial" w:hAnsi="Arial"/>
-          <w:color w:val="333333"/>
-          <w:sz w:val="21"/>
-          <w:szCs w:val="21"/>
-        </w:rPr>
-        <w:t xml:space="preserve">When a kill is triggered, the winning player receives a kill button (turned to the ‘kill’ side). On the next hand, they post the kill amount (double the big blind for full kill, 1.5x for half kill) regardless of their seat position. The blinds remain the same. Action handling varies by room: some start action to the left of the kill (like a straddle), others start in the normal position with the kill amount as the effective bet. In limit, the kill changes the betting increments for the entire hand: a 4/8 full kill hand uses 8/16 betting. The cap calculation adjusts accordingly. The kill stays active as long as the kill player keeps winning — it resets when someone else wins a pot.</w:t>
-      </w:r>
-    </w:p>
-    <w:p>
-      <w:pPr>
-        <w:spacing w:after="160" w:line="276"/>
-      </w:pPr>
-      <w:r>
-        <w:rPr>
-          <w:rFonts w:ascii="Arial" w:cs="Arial" w:eastAsia="Arial" w:hAnsi="Arial"/>
-          <w:color w:val="333333"/>
-          <w:sz w:val="21"/>
-          <w:szCs w:val="21"/>
-        </w:rPr>
-        <w:t xml:space="preserve">Kill obligations: the player with the kill button cannot escape paying the kill. Even if they want to cash out, they must post the kill for that hand first. This is not optional — it is part of agreeing to play in a kill game.</w:t>
+        <w:t xml:space="preserve">Cash Game vs. Tournament Small Blind Counting</w:t>
+      </w:r>
+    </w:p>
+    <w:p>
+      <w:pPr>
+        <w:spacing w:after="160" w:line="276"/>
+      </w:pPr>
+      <w:r>
+        <w:rPr>
+          <w:rFonts w:ascii="Arial" w:cs="Arial" w:eastAsia="Arial" w:hAnsi="Arial"/>
+          <w:color w:val="333333"/>
+          <w:sz w:val="21"/>
+          <w:szCs w:val="21"/>
+        </w:rPr>
+        <w:t xml:space="preserve">In cash games, the small blind is treated as a full big blind for pot-limit calculation purposes, regardless of its actual amount. In a 5/10 game, the small blind of 5 counts as 10 for the pot formula. This means the first pot-sized raise is 4 × 10 = 40 (not 35 as strict math would give). This convention simplifies calculations and is universally accepted in cash games. In tournaments, the small blind counts as its actual posted amount. In a 100/200 tournament, the first pot-sized raise is 3 × 200 + 100 = 700 (not 800). This difference is important for dealers transitioning between cash and tournament PLO.</w:t>
       </w:r>
     </w:p>
     <w:p>
@@ -2848,77 +2719,21 @@
           <w:sz w:val="22"/>
           <w:szCs w:val="22"/>
         </w:rPr>
-        <w:t xml:space="preserve">The Rock</w:t>
-      </w:r>
-    </w:p>
-    <w:p>
-      <w:pPr>
-        <w:spacing w:after="160" w:line="276"/>
-      </w:pPr>
-      <w:r>
-        <w:rPr>
-          <w:rFonts w:ascii="Arial" w:cs="Arial" w:eastAsia="Arial" w:hAnsi="Arial"/>
-          <w:color w:val="333333"/>
-          <w:sz w:val="21"/>
-          <w:szCs w:val="21"/>
-        </w:rPr>
-        <w:t xml:space="preserve">A rock is a special object (often chips wrapped in a rubber band) used in some games to create a permanent straddle. The player who wins a pot receives the rock. On the next hand, regardless of their position, they must post a straddle using the rock chips. This means every single hand has a straddle. The rock effectively doubles the game — a 5/10 game with a rock plays like a 10/20 game. The rock is popular in home games and some casino games. Practical note: a rubber-banded rock drags on the felt and causes wear; some games use a single chip or a dedicated marker instead.</w:t>
-      </w:r>
-    </w:p>
-    <w:p>
-      <w:pPr>
-        <w:spacing w:after="160" w:line="276"/>
-      </w:pPr>
-      <w:r>
-        <w:rPr>
-          <w:rFonts w:ascii="Arial" w:cs="Arial" w:eastAsia="Arial" w:hAnsi="Arial"/>
-          <w:b/>
-          <w:bCs/>
-          <w:color w:val="2C3E50"/>
-          <w:sz w:val="21"/>
-          <w:szCs w:val="21"/>
-        </w:rPr>
-        <w:t xml:space="preserve">Robotic Requirement: </w:t>
-      </w:r>
-      <w:r>
-        <w:rPr>
-          <w:rFonts w:ascii="Arial" w:cs="Arial" w:eastAsia="Arial" w:hAnsi="Arial"/>
-          <w:color w:val="333333"/>
-          <w:sz w:val="21"/>
-          <w:szCs w:val="21"/>
-        </w:rPr>
-        <w:t xml:space="preserve">Must support configurable kill rules: full kill, half kill, per-game triggers (consecutive wins for Hold’em, scoop threshold for Hi-Lo). Must track the kill button state (leg up vs. active kill). Must adjust betting limits dynamically for kill hands. Must track pot sizes for scoop-threshold kills in Hi-Lo. Must support rock games with automatic straddle assignment to pot winners. Kill pots are an excellent showcase for robotic dealing because the limit adjustments, pot tracking, and button management happen seamlessly with no dealer confusion.</w:t>
-      </w:r>
-    </w:p>
-    <w:p>
-      <w:pPr>
-        <w:pStyle w:val="Heading2"/>
-        <w:spacing w:before="280" w:after="160"/>
-      </w:pPr>
-      <w:r>
-        <w:rPr>
-          <w:rFonts w:ascii="Arial" w:cs="Arial" w:eastAsia="Arial" w:hAnsi="Arial"/>
-          <w:b/>
-          <w:bCs/>
-          <w:color w:val="2C3E50"/>
-          <w:sz w:val="26"/>
-          <w:szCs w:val="26"/>
-        </w:rPr>
-        <w:t xml:space="preserve">5.6 Button Movement and Missed Blinds</w:t>
-      </w:r>
-    </w:p>
-    <w:p>
-      <w:pPr>
-        <w:spacing w:after="160" w:line="276"/>
-      </w:pPr>
-      <w:r>
-        <w:rPr>
-          <w:rFonts w:ascii="Arial" w:cs="Arial" w:eastAsia="Arial" w:hAnsi="Arial"/>
-          <w:color w:val="333333"/>
-          <w:sz w:val="21"/>
-          <w:szCs w:val="21"/>
-        </w:rPr>
-        <w:t xml:space="preserve">The dealer button determines playing position and blind posting obligations. Button movement is a cash-game-only complexity — in tournaments, every seat is dealt in every hand and there are no missed blinds. The core rule: a player may never receive the button unless they have paid both the big blind and the small blind. This rule ensures no player can gain the most advantageous position (last to act post-flop) without first having paid the cost of the worst positions.</w:t>
+        <w:t xml:space="preserve">Pot-Limit Calculation with Short All-In Blinds</w:t>
+      </w:r>
+    </w:p>
+    <w:p>
+      <w:pPr>
+        <w:spacing w:after="160" w:line="276"/>
+      </w:pPr>
+      <w:r>
+        <w:rPr>
+          <w:rFonts w:ascii="Arial" w:cs="Arial" w:eastAsia="Arial" w:hAnsi="Arial"/>
+          <w:color w:val="333333"/>
+          <w:sz w:val="21"/>
+          <w:szCs w:val="21"/>
+        </w:rPr>
+        <w:t xml:space="preserve">A specific edge case in pot-limit tournament play: when a player is all-in for less than the blind amount, the pot calculation still uses the full blind value, not the actual short amount posted. Example: in a 200/400 tournament, if the big blind player is all-in for only 100, the pot is still calculated as if the big blind is 400 for pot-limit raise purposes. The formula for a pot-limit raise remains: three times the previous bet plus the trail. So a raise to the pot would still be 3 × 400 + 200 = 1,400. This rule exists to prevent the confusion of recalculating pot-limit math with non-standard blind amounts. The same principle applies to a short small blind. If the standard blinds are 200/400 and the small blind is all-in for 100, the pot calculation still assumes a 200 small blind.</w:t>
       </w:r>
     </w:p>
     <w:p>
@@ -2934,21 +2749,35 @@
           <w:sz w:val="22"/>
           <w:szCs w:val="22"/>
         </w:rPr>
-        <w:t xml:space="preserve">Standard Button Movement</w:t>
-      </w:r>
-    </w:p>
-    <w:p>
-      <w:pPr>
-        <w:spacing w:after="160" w:line="276"/>
-      </w:pPr>
-      <w:r>
-        <w:rPr>
-          <w:rFonts w:ascii="Arial" w:cs="Arial" w:eastAsia="Arial" w:hAnsi="Arial"/>
-          <w:color w:val="333333"/>
-          <w:sz w:val="21"/>
-          <w:szCs w:val="21"/>
-        </w:rPr>
-        <w:t xml:space="preserve">The button follows the small blind: after each hand, the button moves to the player who was just the small blind. Under normal circumstances with all seats occupied, this means the button advances one seat clockwise each hand. The cycle is: button → small blind → big blind → under the gun, repeating around the table.</w:t>
+        <w:t xml:space="preserve">Talking Your Game: Calculating Out Loud</w:t>
+      </w:r>
+    </w:p>
+    <w:p>
+      <w:pPr>
+        <w:spacing w:after="160" w:line="276"/>
+      </w:pPr>
+      <w:r>
+        <w:rPr>
+          <w:rFonts w:ascii="Arial" w:cs="Arial" w:eastAsia="Arial" w:hAnsi="Arial"/>
+          <w:color w:val="333333"/>
+          <w:sz w:val="21"/>
+          <w:szCs w:val="21"/>
+        </w:rPr>
+        <w:t xml:space="preserve">A common misconception among new pot-limit dealers is that they must produce the pot amount instantaneously when a player says ‘pot.’ In reality, it is completely acceptable to calculate out loud in front of the table. When a player says ‘pot,’ the dealer can respond: ‘75, 100, 125 — pot, 125.’ This is not a sign of weakness or incompetence. It demonstrates transparency, allows other players to verify the calculation, and reduces errors. Over time, as the dealer’s familiarity with common amounts grows, many of these calculations become memorized and the response becomes instant. But even experienced dealers will calculate out loud for unusual amounts. The key is getting the number right, not getting it fast.</w:t>
+      </w:r>
+    </w:p>
+    <w:p>
+      <w:pPr>
+        <w:spacing w:after="160" w:line="276"/>
+      </w:pPr>
+      <w:r>
+        <w:rPr>
+          <w:rFonts w:ascii="Arial" w:cs="Arial" w:eastAsia="Arial" w:hAnsi="Arial"/>
+          <w:color w:val="333333"/>
+          <w:sz w:val="21"/>
+          <w:szCs w:val="21"/>
+        </w:rPr>
+        <w:t xml:space="preserve">Proactive calculation: while a player is thinking about their decision, the dealer can pre-calculate what the pot-sized raise would be. When the player finally says ‘pot,’ the dealer already has the answer. This technique makes the dealer appear instantly responsive while actually having done the work during the player’s decision time. However, if the action changes (a player between the dealer’s calculation and the acting player does something unexpected), the pre-calculated amount must be discarded and recalculated.</w:t>
       </w:r>
     </w:p>
     <w:p>
@@ -2964,21 +2793,21 @@
           <w:sz w:val="22"/>
           <w:szCs w:val="22"/>
         </w:rPr>
-        <w:t xml:space="preserve">Dead Button vs. Active Button Systems</w:t>
-      </w:r>
-    </w:p>
-    <w:p>
-      <w:pPr>
-        <w:spacing w:after="160" w:line="276"/>
-      </w:pPr>
-      <w:r>
-        <w:rPr>
-          <w:rFonts w:ascii="Arial" w:cs="Arial" w:eastAsia="Arial" w:hAnsi="Arial"/>
-          <w:color w:val="333333"/>
-          <w:sz w:val="21"/>
-          <w:szCs w:val="21"/>
-        </w:rPr>
-        <w:t xml:space="preserve">Two competing systems exist for handling empty seats. Dead button system: the button moves one seat clockwise every hand, even if that seat is empty. If the button lands on an empty seat, there is simply no small blind for that hand (just a big blind). This system is simpler but creates situations where a new player at the table must wait a hand because the button is in front of their empty seat, and one player may get last position two hands in a row. Active button system (preferred for cash): the button always stays in front of an active player. When a seat empties, the button stays with the closest active player rather than advancing to an empty seat. This system creates more flexibility for seating new players because there is always an active player on the button, but it can result in a player having the button for two consecutive hands (which would have happened anyway under the dead button system). Dead button is preferred for tournaments because it avoids giving any transferring player the button without having paid blinds. Active button is preferred for cash because it maximizes the number of hands dealt and lets new players sit in sooner.</w:t>
+        <w:t xml:space="preserve">Verbal Announcement Protocol for Pot Declarations</w:t>
+      </w:r>
+    </w:p>
+    <w:p>
+      <w:pPr>
+        <w:spacing w:after="160" w:line="276"/>
+      </w:pPr>
+      <w:r>
+        <w:rPr>
+          <w:rFonts w:ascii="Arial" w:cs="Arial" w:eastAsia="Arial" w:hAnsi="Arial"/>
+          <w:color w:val="333333"/>
+          <w:sz w:val="21"/>
+          <w:szCs w:val="21"/>
+        </w:rPr>
+        <w:t xml:space="preserve">When a player says ‘pot,’ the dealer repeats ‘pot’ and states the amount: ‘pot, 125.’ The word ‘pot’ replaces ‘raise’ in the announcement — the dealer does not need to say ‘raise’ separately. When a player silently puts out chips equal to the exact pot amount, the dealer must recognize this and announce ‘pot’ plus the amount. If the player puts out more than the pot amount, the dealer announces ‘pot’ and corrects the bet to the pot maximum, returning the excess. If a player verbally declares an amount higher than pot (e.g., ‘175’ when pot is 125), the dealer corrects it: ‘pot, 125.’ The verbal declaration is binding, but pot-limit caps the maximum. When a player puts out a non-pot amount without verbal declaration, the dealer announces ‘raise’ and the amount — it is only announced as ‘pot’ if the amount exactly matches the pot.</w:t>
       </w:r>
     </w:p>
     <w:p>
@@ -2994,49 +2823,35 @@
           <w:sz w:val="22"/>
           <w:szCs w:val="22"/>
         </w:rPr>
-        <w:t xml:space="preserve">Missed Blind Procedures</w:t>
-      </w:r>
-    </w:p>
-    <w:p>
-      <w:pPr>
-        <w:spacing w:after="160" w:line="276"/>
-      </w:pPr>
-      <w:r>
-        <w:rPr>
-          <w:rFonts w:ascii="Arial" w:cs="Arial" w:eastAsia="Arial" w:hAnsi="Arial"/>
-          <w:color w:val="333333"/>
-          <w:sz w:val="21"/>
-          <w:szCs w:val="21"/>
-        </w:rPr>
-        <w:t xml:space="preserve">When a player leaves the table and misses their big blind, they receive a missed blind button (a physical marker placed at their seat). When they return, they must post a big blind plus a dead small blind to rejoin the game from any position (the dead small goes into the pot but does not count toward their bet). Exception: if the player returns when it is their natural big blind position, they simply post the big blind with no dead small. If a player only missed a small blind: they must post a dead small to rejoin. However, if they come back on their natural big blind, just the big blind with no dead small is sufficient.</w:t>
-      </w:r>
-    </w:p>
-    <w:p>
-      <w:pPr>
-        <w:spacing w:after="160" w:line="276"/>
-      </w:pPr>
-      <w:r>
-        <w:rPr>
-          <w:rFonts w:ascii="Arial" w:cs="Arial" w:eastAsia="Arial" w:hAnsi="Arial"/>
-          <w:color w:val="333333"/>
-          <w:sz w:val="21"/>
-          <w:szCs w:val="21"/>
-        </w:rPr>
-        <w:t xml:space="preserve">If a player misses the small blind and subsequent hands pass until they miss the big blind too, the small blind button is replaced with a big blind button — it is treated as if they only missed the big blind. The big blind miss always takes precedence. A missed small blind does NOT expire into a missed big blind on its own; the transition happens when the big blind position passes the absent player.</w:t>
-      </w:r>
-    </w:p>
-    <w:p>
-      <w:pPr>
-        <w:spacing w:after="160" w:line="276"/>
-      </w:pPr>
-      <w:r>
-        <w:rPr>
-          <w:rFonts w:ascii="Arial" w:cs="Arial" w:eastAsia="Arial" w:hAnsi="Arial"/>
-          <w:color w:val="333333"/>
-          <w:sz w:val="21"/>
-          <w:szCs w:val="21"/>
-        </w:rPr>
-        <w:t xml:space="preserve">Key rules: (1) A player can NEVER start on the small blind — they have not paid the big blind. (2) A player can NEVER start on the button — they have not paid both blinds. (3) Posting a blind or straddle is not considered action for any purpose other than getting dealt in. (4) New players to a table: in rooms that require posting, a new player must post a big blind before being dealt in (many players wait for their natural big blind to avoid the extra post). In rooms that do not require posting, the player is simply dealt in immediately for free hands until the big blind reaches them.</w:t>
+        <w:t xml:space="preserve">Never Count Down the Pot</w:t>
+      </w:r>
+    </w:p>
+    <w:p>
+      <w:pPr>
+        <w:spacing w:after="160" w:line="276"/>
+      </w:pPr>
+      <w:r>
+        <w:rPr>
+          <w:rFonts w:ascii="Arial" w:cs="Arial" w:eastAsia="Arial" w:hAnsi="Arial"/>
+          <w:color w:val="333333"/>
+          <w:sz w:val="21"/>
+          <w:szCs w:val="21"/>
+        </w:rPr>
+        <w:t xml:space="preserve">If the dealer loses track of the pot total during a hand, the correct procedure is to call the floor — not to physically count the pot. Counting the pot violates several principles: it exposes the pot size to all players (violating the one-player-per-hand principle, since players should track the pot independently), it slows the game, and it signals to supervisors that the dealer has lost control of the game state. In an audition, being caught counting the pot is likely to disqualify the dealer from dealing pot-limit games. The supervisor called to count the pot will do so with proper oversight, ensuring the count is accurate and that no chips are displaced. The rule against counting the pot also protects dealers from potential integrity issues — a dealer with hands in the pot and no supervisor present creates a surveillance concern.</w:t>
+      </w:r>
+    </w:p>
+    <w:p>
+      <w:pPr>
+        <w:spacing w:after="160" w:line="276"/>
+      </w:pPr>
+      <w:r>
+        <w:rPr>
+          <w:rFonts w:ascii="Arial" w:cs="Arial" w:eastAsia="Arial" w:hAnsi="Arial"/>
+          <w:color w:val="333333"/>
+          <w:sz w:val="21"/>
+          <w:szCs w:val="21"/>
+        </w:rPr>
+        <w:t xml:space="preserve">Prevention technique: keep dead money from folded players separate from the main pot until you are ready to calculate the new total. When pulling in bets after a round, figure out the total BEFORE melding all chips together into one pot. Once the bets are merged with the existing pot, reconstructing the pot total from memory is much harder than computing it incrementally. Take an extra 5 to 10 seconds to verify the pot total as you bring bets in — this is a small time investment that prevents floor calls and errors.</w:t>
       </w:r>
     </w:p>
     <w:p>
@@ -3052,35 +2867,66 @@
           <w:sz w:val="22"/>
           <w:szCs w:val="22"/>
         </w:rPr>
-        <w:t xml:space="preserve">Buying the Button</w:t>
-      </w:r>
-    </w:p>
-    <w:p>
-      <w:pPr>
-        <w:spacing w:after="160" w:line="276"/>
-      </w:pPr>
-      <w:r>
-        <w:rPr>
-          <w:rFonts w:ascii="Arial" w:cs="Arial" w:eastAsia="Arial" w:hAnsi="Arial"/>
-          <w:color w:val="333333"/>
-          <w:sz w:val="21"/>
-          <w:szCs w:val="21"/>
-        </w:rPr>
-        <w:t xml:space="preserve">Buying the button allows a player to pay both blinds (big blind live + dead small blind) on the current hand so that they receive the button on the next hand. This exists to let players play immediately rather than waiting for the button to pass. The rule for when buying the button is allowed: there must be a small blind to the player’s left and a button to their right. If there is a big blind to their left (e.g., because the natural small blind seat is empty), buying the button does NOT work — the next hand would leave the buyer without having paid a small blind, breaking the system. When buying the button: the existing small blind and big blind push their blinds back, the buyer posts a big blind and a dead small blind, and the existing blind players receive free action for that hand (the former small blind becomes first to act under the gun). Next hand: the button goes to the buyer, and the former blind players resume their normal small blind/big blind positions.</w:t>
-      </w:r>
-    </w:p>
-    <w:p>
-      <w:pPr>
-        <w:spacing w:after="160" w:line="276"/>
-      </w:pPr>
-      <w:r>
-        <w:rPr>
-          <w:rFonts w:ascii="Arial" w:cs="Arial" w:eastAsia="Arial" w:hAnsi="Arial"/>
-          <w:color w:val="333333"/>
-          <w:sz w:val="21"/>
-          <w:szCs w:val="21"/>
-        </w:rPr>
-        <w:t xml:space="preserve">If two new players sit down simultaneously adjacent to each other, only the one in worse position (closer to the blinds) is asked first about buying the button. If they buy it, the second player must wait one hand. If they decline, the second player is asked. Both cannot buy in the same hand.</w:t>
+        <w:t xml:space="preserve">Unlimited Raises in Pot-Limit</w:t>
+      </w:r>
+    </w:p>
+    <w:p>
+      <w:pPr>
+        <w:spacing w:after="160" w:line="276"/>
+      </w:pPr>
+      <w:r>
+        <w:rPr>
+          <w:rFonts w:ascii="Arial" w:cs="Arial" w:eastAsia="Arial" w:hAnsi="Arial"/>
+          <w:color w:val="333333"/>
+          <w:sz w:val="21"/>
+          <w:szCs w:val="21"/>
+        </w:rPr>
+        <w:t xml:space="preserve">Unlike limit poker (which caps the number of raises per round, typically at four), pot-limit allows unlimited re-raises. A player can raise, be re-raised, and re-raise again as many times as they have chips. The pot-limit cap is on the size of each individual raise (capped at pot), not on the number of raises. This makes pot-limit structurally similar to no-limit in terms of the number of actions per round, but with the constraint that each raise cannot exceed the pot. Dealers must not apply a raise cap in pot-limit games.</w:t>
+      </w:r>
+    </w:p>
+    <w:p>
+      <w:pPr>
+        <w:pStyle w:val="Heading2"/>
+        <w:spacing w:before="280" w:after="160"/>
+      </w:pPr>
+      <w:r>
+        <w:rPr>
+          <w:rFonts w:ascii="Arial" w:cs="Arial" w:eastAsia="Arial" w:hAnsi="Arial"/>
+          <w:b/>
+          <w:bCs/>
+          <w:color w:val="2C3E50"/>
+          <w:sz w:val="26"/>
+          <w:szCs w:val="26"/>
+        </w:rPr>
+        <w:t xml:space="preserve">5.4 Straddles</w:t>
+      </w:r>
+    </w:p>
+    <w:p>
+      <w:pPr>
+        <w:spacing w:after="160" w:line="276"/>
+      </w:pPr>
+      <w:r>
+        <w:rPr>
+          <w:rFonts w:ascii="Arial" w:cs="Arial" w:eastAsia="Arial" w:hAnsi="Arial"/>
+          <w:color w:val="333333"/>
+          <w:sz w:val="21"/>
+          <w:szCs w:val="21"/>
+        </w:rPr>
+        <w:t xml:space="preserve">A straddle is a voluntary blind bet, typically double the big blind, placed before any cards are dealt. Straddles are cash game only — they do not exist in tournaments. The straddle functions as a third blind: the action starts to the left of the straddle, and the straddler acts last preflop (just like the big blind in an unstraddled hand). The dealer must announce ‘live straddle’ loudly and clearly every time, and often needs to announce it twice, because players trained in normal action flow will attempt to act from the wrong position.</w:t>
+      </w:r>
+    </w:p>
+    <w:p>
+      <w:pPr>
+        <w:spacing w:after="160" w:line="276"/>
+      </w:pPr>
+      <w:r>
+        <w:rPr>
+          <w:rFonts w:ascii="Arial" w:cs="Arial" w:eastAsia="Arial" w:hAnsi="Arial"/>
+          <w:color w:val="333333"/>
+          <w:sz w:val="21"/>
+          <w:szCs w:val="21"/>
+        </w:rPr>
+        <w:t xml:space="preserve">Timing rule: the official rule in most rooms is that the straddle must be posted before the first card is off the deck. In practice, many dealers allow it before the straddling player receives their first card. The stricter rule is safer for auditions and new dealers. Once announced or posted, the straddle is binding — the player cannot take it back once dealing has begun.</w:t>
       </w:r>
     </w:p>
     <w:p>
@@ -3096,21 +2942,35 @@
           <w:sz w:val="22"/>
           <w:szCs w:val="22"/>
         </w:rPr>
-        <w:t xml:space="preserve">Heads-Up Button Rules</w:t>
-      </w:r>
-    </w:p>
-    <w:p>
-      <w:pPr>
-        <w:spacing w:after="160" w:line="276"/>
-      </w:pPr>
-      <w:r>
-        <w:rPr>
-          <w:rFonts w:ascii="Arial" w:cs="Arial" w:eastAsia="Arial" w:hAnsi="Arial"/>
-          <w:color w:val="333333"/>
-          <w:sz w:val="21"/>
-          <w:szCs w:val="21"/>
-        </w:rPr>
-        <w:t xml:space="preserve">When the table gets down to two players (heads-up), special rules apply. The button posts the small blind and acts first preflop but last on all subsequent streets. The first card is dealt to the big blind (non-button player), second card to the button. This is the opposite of the normal dealing order. When transitioning from three-handed to heads-up: determine which player was supposed to be the big blind next — that player remains the big blind. The button goes to the other player. This may mean a player gets the button twice in a row, which is unavoidable.</w:t>
+        <w:t xml:space="preserve">Straddle Positions and Variations</w:t>
+      </w:r>
+    </w:p>
+    <w:p>
+      <w:pPr>
+        <w:spacing w:after="160" w:line="276"/>
+      </w:pPr>
+      <w:r>
+        <w:rPr>
+          <w:rFonts w:ascii="Arial" w:cs="Arial" w:eastAsia="Arial" w:hAnsi="Arial"/>
+          <w:color w:val="333333"/>
+          <w:sz w:val="21"/>
+          <w:szCs w:val="21"/>
+        </w:rPr>
+        <w:t xml:space="preserve">Under-the-gun (UTG) straddle: the most common and simplest form. The player immediately to the left of the big blind posts double the big blind. Action starts to their left. Some rooms only allow UTG straddles. Button straddle: allowed in many rooms. The player on the button posts double the big blind. Action starts on the small blind. The dealer must be vigilant because the UTG player will instinctively try to act first — this is the most common error with button straddles. Mississippi straddle (any position): some rooms allow straddling from any seat. If two players want to straddle, the player in the best position (last to act post-flop) gets priority. The dealer must announce where the action starts and actively prevent players from acting out of order.</w:t>
+      </w:r>
+    </w:p>
+    <w:p>
+      <w:pPr>
+        <w:spacing w:after="160" w:line="276"/>
+      </w:pPr>
+      <w:r>
+        <w:rPr>
+          <w:rFonts w:ascii="Arial" w:cs="Arial" w:eastAsia="Arial" w:hAnsi="Arial"/>
+          <w:color w:val="333333"/>
+          <w:sz w:val="21"/>
+          <w:szCs w:val="21"/>
+        </w:rPr>
+        <w:t xml:space="preserve">Consecutive (re-)straddles: some games (typically higher stakes or private games) allow sequential straddles where each player can re-straddle for double the previous straddle. This can cascade around the table: $10, $20, $40, $80, $160. The lock-in rules vary by room — some lock the straddle once first card is dealt, others once posted. Sleeper straddle: a straddle from a middle position that only activates if all players between the blinds and the sleeper fold. If any player in between puts money in, the sleeper comes back. Not common in casinos but seen in some rooms.</w:t>
       </w:r>
     </w:p>
     <w:p>
@@ -3126,21 +2986,63 @@
           <w:sz w:val="22"/>
           <w:szCs w:val="22"/>
         </w:rPr>
-        <w:t xml:space="preserve">Absent Player Management</w:t>
-      </w:r>
-    </w:p>
-    <w:p>
-      <w:pPr>
-        <w:spacing w:after="160" w:line="276"/>
-      </w:pPr>
-      <w:r>
-        <w:rPr>
-          <w:rFonts w:ascii="Arial" w:cs="Arial" w:eastAsia="Arial" w:hAnsi="Arial"/>
-          <w:color w:val="333333"/>
-          <w:sz w:val="21"/>
-          <w:szCs w:val="21"/>
-        </w:rPr>
-        <w:t xml:space="preserve">Poker rooms track how long players are away from the table. Common systems: (1) Digital tracking via player management software (Bravo, PokerAtlas) that flags players as absent after a set time. (2) Physical button tracking: each new dealer that taps in gives the absent player another miss-blind button or an ‘out’/‘absent’ button; two or three absent buttons means the player is picked up (their chips are racked and the seat is opened). (3) Third/fourth man walking rules: when three or more players are absent from a table, the third or fourth player may be picked up immediately to maintain table size. (4) Meal buttons: some rooms allow extended absence once per session for meals.</w:t>
+        <w:t xml:space="preserve">Straddle Effects on Game Mechanics</w:t>
+      </w:r>
+    </w:p>
+    <w:p>
+      <w:pPr>
+        <w:spacing w:after="160" w:line="276"/>
+      </w:pPr>
+      <w:r>
+        <w:rPr>
+          <w:rFonts w:ascii="Arial" w:cs="Arial" w:eastAsia="Arial" w:hAnsi="Arial"/>
+          <w:color w:val="333333"/>
+          <w:sz w:val="21"/>
+          <w:szCs w:val="21"/>
+        </w:rPr>
+        <w:t xml:space="preserve">In no-limit: the straddle becomes the effective big blind for minimum bet/raise purposes. A 2/5 game with a $10 straddle has a minimum raise of $20 preflop, and the minimum post-flop bet becomes $10 (the straddle amount, not the big blind). In limit: the straddle counts as the bet (not a raise), so you still get three raises on top of it — the cap goes one increment higher than normal. Example: 4/8 limit with a full kill straddle to $8 means cap is $8-$16-$24-$32.</w:t>
+      </w:r>
+    </w:p>
+    <w:p>
+      <w:pPr>
+        <w:spacing w:after="160" w:line="276"/>
+      </w:pPr>
+      <w:r>
+        <w:rPr>
+          <w:rFonts w:ascii="Arial" w:cs="Arial" w:eastAsia="Arial" w:hAnsi="Arial"/>
+          <w:color w:val="333333"/>
+          <w:sz w:val="21"/>
+          <w:szCs w:val="21"/>
+        </w:rPr>
+        <w:t xml:space="preserve">Live vs. dead straddle: a live straddle gives the player last action preflop (they can raise if unraised). A dead straddle does not — it is just a blind raise with no special position. Dead straddles are largely obsolete but may exist in some limit games. Straddle-in: in rooms that allow straddles from any position, a player who missed their blinds can sometimes straddle in instead of posting a big blind plus dead small. This is considered good for the game because it encourages action.</w:t>
+      </w:r>
+    </w:p>
+    <w:p>
+      <w:pPr>
+        <w:spacing w:after="160" w:line="276"/>
+      </w:pPr>
+      <w:r>
+        <w:rPr>
+          <w:rFonts w:ascii="Arial" w:cs="Arial" w:eastAsia="Arial" w:hAnsi="Arial"/>
+          <w:color w:val="333333"/>
+          <w:sz w:val="21"/>
+          <w:szCs w:val="21"/>
+        </w:rPr>
+        <w:t xml:space="preserve">Denomination optimization: in 1/2 NL, the original straddle of $4 (double the big blind) was changed to $5 in most rooms because $4 bets and calls create constant change-making that slows the game. The $5 straddle uses the standard red chip denomination. Similarly, 1/3 NL games often use a $5 straddle. This is a small procedural detail that has a large impact on dealing speed.</w:t>
+      </w:r>
+    </w:p>
+    <w:p>
+      <w:pPr>
+        <w:spacing w:after="160" w:line="276"/>
+      </w:pPr>
+      <w:r>
+        <w:rPr>
+          <w:rFonts w:ascii="Arial" w:cs="Arial" w:eastAsia="Arial" w:hAnsi="Arial"/>
+          <w:color w:val="333333"/>
+          <w:sz w:val="21"/>
+          <w:szCs w:val="21"/>
+        </w:rPr>
+        <w:t xml:space="preserve">Mandatory straddles: some high-stakes and private games have mandatory button straddles or mandatory UTG straddles. The straddle is not optional — every hand has it. This effectively makes the game play at double the blind level.</w:t>
       </w:r>
     </w:p>
     <w:p>
@@ -3165,7 +3067,7 @@
           <w:sz w:val="21"/>
           <w:szCs w:val="21"/>
         </w:rPr>
-        <w:t xml:space="preserve">Must implement configurable button movement logic (dead button for tournaments, active button for cash). Must track missed blind status for every seat with automatic button assignment. Must enforce the rule that no player receives the button without paying both blinds. Must support buying the button with correct blind restructuring. Must correctly handle heads-up transitions and multi-way eliminations. Must track player presence and absence duration with configurable pickup thresholds. Button movement logic is a complex state machine that human dealers frequently get wrong, especially in edge cases involving multiple empty seats — a robotic system eliminates these errors entirely.</w:t>
+        <w:t xml:space="preserve">Must support configurable straddle rules: UTG-only, UTG-and-button, any-position (Mississippi), and consecutive re-straddles. Must correctly adjust the action start position based on straddle location. Must announce the straddle clearly (audio or visual display). Must adjust minimum bet/raise calculations for straddle pots. Must enforce timing rules (straddle before first card dealt). Must support mandatory straddle configurations. Must handle straddle-in as an alternative to missed blind posting where configured.</w:t>
       </w:r>
     </w:p>
     <w:p>
@@ -3182,35 +3084,21 @@
           <w:sz w:val="26"/>
           <w:szCs w:val="26"/>
         </w:rPr>
-        <w:t xml:space="preserve">5.7 Ambiguous Verbal Declarations and Floor Calls</w:t>
-      </w:r>
-    </w:p>
-    <w:p>
-      <w:pPr>
-        <w:spacing w:after="160" w:line="276"/>
-      </w:pPr>
-      <w:r>
-        <w:rPr>
-          <w:rFonts w:ascii="Arial" w:cs="Arial" w:eastAsia="Arial" w:hAnsi="Arial"/>
-          <w:color w:val="333333"/>
-          <w:sz w:val="21"/>
-          <w:szCs w:val="21"/>
-        </w:rPr>
-        <w:t xml:space="preserve">‘I put you all in’: If a player says this phrase, the dealer’s job is simple — call the floor immediately. The phrase is problematic because a player cannot force another player to bet their chips. The language is confusing and creates headaches that supervisors must resolve. The floor may rule it as an all-in declaration by the speaking player (since that is what the words literally describe from the speaker’s perspective), or they may evaluate the context including whether it caused any other player to act. As a dealer, do not try to interpret this — just call the floor.</w:t>
-      </w:r>
-    </w:p>
-    <w:p>
-      <w:pPr>
-        <w:spacing w:after="160" w:line="276"/>
-      </w:pPr>
-      <w:r>
-        <w:rPr>
-          <w:rFonts w:ascii="Arial" w:cs="Arial" w:eastAsia="Arial" w:hAnsi="Arial"/>
-          <w:color w:val="333333"/>
-          <w:sz w:val="21"/>
-          <w:szCs w:val="21"/>
-        </w:rPr>
-        <w:t xml:space="preserve">Chip pull-back: If a player has a chip out that is sufficient to cover the call and pulls it back, this is a floor call if they do anything other than raise. The logic: the only reason to pull back a chip that already covers the call is to adjust a raise amount. If the player pulls the chip back and then just calls or folds, it suggests they were influenced by table reaction (angle shooting). Example: blinds are 100/200, a player puts out a 500 chip to call. Another player raises to 400. The original player pulls their 500 chip back and puts out exactly 400. This is suspicious — the 500 chip already covered the 400 call. The pull-back-and-reduce is treated as an action indicator that should result in a mandatory minimum raise.</w:t>
+        <w:t xml:space="preserve">5.5 Kill Pots</w:t>
+      </w:r>
+    </w:p>
+    <w:p>
+      <w:pPr>
+        <w:spacing w:after="160" w:line="276"/>
+      </w:pPr>
+      <w:r>
+        <w:rPr>
+          <w:rFonts w:ascii="Arial" w:cs="Arial" w:eastAsia="Arial" w:hAnsi="Arial"/>
+          <w:color w:val="333333"/>
+          <w:sz w:val="21"/>
+          <w:szCs w:val="21"/>
+        </w:rPr>
+        <w:t xml:space="preserve">A kill pot is a hand where the betting limits are increased because a predetermined trigger condition was met. Kills are primarily a limit game feature — they add excitement and bigger pots to limit formats. They are much less common in no-limit because straddles serve the same purpose. A kill can be a full kill (double the limits) or a half kill (1.5x the limits). Example: a 4/8 limit game with a full kill becomes 8/16 on kill hands; with a half kill it becomes 6/12.</w:t>
       </w:r>
     </w:p>
     <w:p>
@@ -3226,6 +3114,458 @@
           <w:sz w:val="22"/>
           <w:szCs w:val="22"/>
         </w:rPr>
+        <w:t xml:space="preserve">Kill Triggers</w:t>
+      </w:r>
+    </w:p>
+    <w:p>
+      <w:pPr>
+        <w:spacing w:after="160" w:line="276"/>
+      </w:pPr>
+      <w:r>
+        <w:rPr>
+          <w:rFonts w:ascii="Arial" w:cs="Arial" w:eastAsia="Arial" w:hAnsi="Arial"/>
+          <w:color w:val="333333"/>
+          <w:sz w:val="21"/>
+          <w:szCs w:val="21"/>
+        </w:rPr>
+        <w:t xml:space="preserve">Texas Hold’em kill: triggered when a player wins two consecutive pots where the second pot exceeds a threshold amount (e.g., $40 in a 4/8 game). The first win gives the player a ‘leg up’ (tracked with a kill button showing ‘leg up’ on one side and ‘kill’ on the other). If the same player wins the next pot above the threshold, the kill is activated. Omaha Hi-Lo kill: triggered when a player scoops (wins both high and low) a pot above a certain amount. There is no leg-up system — a single scoop above the threshold triggers the kill on the next hand. If the pot is split in any way, no kill. The dealer must track pot sizes to know when the threshold is crossed.</w:t>
+      </w:r>
+    </w:p>
+    <w:p>
+      <w:pPr>
+        <w:spacing w:before="200" w:after="120"/>
+      </w:pPr>
+      <w:r>
+        <w:rPr>
+          <w:rFonts w:ascii="Arial" w:cs="Arial" w:eastAsia="Arial" w:hAnsi="Arial"/>
+          <w:b/>
+          <w:bCs/>
+          <w:color w:val="C0392B"/>
+          <w:sz w:val="22"/>
+          <w:szCs w:val="22"/>
+        </w:rPr>
+        <w:t xml:space="preserve">Kill Pot Mechanics</w:t>
+      </w:r>
+    </w:p>
+    <w:p>
+      <w:pPr>
+        <w:spacing w:after="160" w:line="276"/>
+      </w:pPr>
+      <w:r>
+        <w:rPr>
+          <w:rFonts w:ascii="Arial" w:cs="Arial" w:eastAsia="Arial" w:hAnsi="Arial"/>
+          <w:color w:val="333333"/>
+          <w:sz w:val="21"/>
+          <w:szCs w:val="21"/>
+        </w:rPr>
+        <w:t xml:space="preserve">When a kill is triggered, the winning player receives a kill button (turned to the ‘kill’ side). On the next hand, they post the kill amount (double the big blind for full kill, 1.5x for half kill) regardless of their seat position. The blinds remain the same. Action handling varies by room: some start action to the left of the kill (like a straddle), others start in the normal position with the kill amount as the effective bet. In limit, the kill changes the betting increments for the entire hand: a 4/8 full kill hand uses 8/16 betting. The cap calculation adjusts accordingly. The kill stays active as long as the kill player keeps winning — it resets when someone else wins a pot.</w:t>
+      </w:r>
+    </w:p>
+    <w:p>
+      <w:pPr>
+        <w:spacing w:after="160" w:line="276"/>
+      </w:pPr>
+      <w:r>
+        <w:rPr>
+          <w:rFonts w:ascii="Arial" w:cs="Arial" w:eastAsia="Arial" w:hAnsi="Arial"/>
+          <w:color w:val="333333"/>
+          <w:sz w:val="21"/>
+          <w:szCs w:val="21"/>
+        </w:rPr>
+        <w:t xml:space="preserve">Kill obligations: the player with the kill button cannot escape paying the kill. Even if they want to cash out, they must post the kill for that hand first. This is not optional — it is part of agreeing to play in a kill game.</w:t>
+      </w:r>
+    </w:p>
+    <w:p>
+      <w:pPr>
+        <w:spacing w:before="200" w:after="120"/>
+      </w:pPr>
+      <w:r>
+        <w:rPr>
+          <w:rFonts w:ascii="Arial" w:cs="Arial" w:eastAsia="Arial" w:hAnsi="Arial"/>
+          <w:b/>
+          <w:bCs/>
+          <w:color w:val="C0392B"/>
+          <w:sz w:val="22"/>
+          <w:szCs w:val="22"/>
+        </w:rPr>
+        <w:t xml:space="preserve">The Rock</w:t>
+      </w:r>
+    </w:p>
+    <w:p>
+      <w:pPr>
+        <w:spacing w:after="160" w:line="276"/>
+      </w:pPr>
+      <w:r>
+        <w:rPr>
+          <w:rFonts w:ascii="Arial" w:cs="Arial" w:eastAsia="Arial" w:hAnsi="Arial"/>
+          <w:color w:val="333333"/>
+          <w:sz w:val="21"/>
+          <w:szCs w:val="21"/>
+        </w:rPr>
+        <w:t xml:space="preserve">A rock is a special object (often chips wrapped in a rubber band) used in some games to create a permanent straddle. The player who wins a pot receives the rock. On the next hand, regardless of their position, they must post a straddle using the rock chips. This means every single hand has a straddle. The rock effectively doubles the game — a 5/10 game with a rock plays like a 10/20 game. The rock is popular in home games and some casino games. Practical note: a rubber-banded rock drags on the felt and causes wear; some games use a single chip or a dedicated marker instead.</w:t>
+      </w:r>
+    </w:p>
+    <w:p>
+      <w:pPr>
+        <w:spacing w:after="160" w:line="276"/>
+      </w:pPr>
+      <w:r>
+        <w:rPr>
+          <w:rFonts w:ascii="Arial" w:cs="Arial" w:eastAsia="Arial" w:hAnsi="Arial"/>
+          <w:b/>
+          <w:bCs/>
+          <w:color w:val="2C3E50"/>
+          <w:sz w:val="21"/>
+          <w:szCs w:val="21"/>
+        </w:rPr>
+        <w:t xml:space="preserve">Robotic Requirement: </w:t>
+      </w:r>
+      <w:r>
+        <w:rPr>
+          <w:rFonts w:ascii="Arial" w:cs="Arial" w:eastAsia="Arial" w:hAnsi="Arial"/>
+          <w:color w:val="333333"/>
+          <w:sz w:val="21"/>
+          <w:szCs w:val="21"/>
+        </w:rPr>
+        <w:t xml:space="preserve">Must support configurable kill rules: full kill, half kill, per-game triggers (consecutive wins for Hold’em, scoop threshold for Hi-Lo). Must track the kill button state (leg up vs. active kill). Must adjust betting limits dynamically for kill hands. Must track pot sizes for scoop-threshold kills in Hi-Lo. Must support rock games with automatic straddle assignment to pot winners. Kill pots are an excellent showcase for robotic dealing because the limit adjustments, pot tracking, and button management happen seamlessly with no dealer confusion.</w:t>
+      </w:r>
+    </w:p>
+    <w:p>
+      <w:pPr>
+        <w:pStyle w:val="Heading2"/>
+        <w:spacing w:before="280" w:after="160"/>
+      </w:pPr>
+      <w:r>
+        <w:rPr>
+          <w:rFonts w:ascii="Arial" w:cs="Arial" w:eastAsia="Arial" w:hAnsi="Arial"/>
+          <w:b/>
+          <w:bCs/>
+          <w:color w:val="2C3E50"/>
+          <w:sz w:val="26"/>
+          <w:szCs w:val="26"/>
+        </w:rPr>
+        <w:t xml:space="preserve">5.6 Button Movement and Missed Blinds</w:t>
+      </w:r>
+    </w:p>
+    <w:p>
+      <w:pPr>
+        <w:spacing w:after="160" w:line="276"/>
+      </w:pPr>
+      <w:r>
+        <w:rPr>
+          <w:rFonts w:ascii="Arial" w:cs="Arial" w:eastAsia="Arial" w:hAnsi="Arial"/>
+          <w:color w:val="333333"/>
+          <w:sz w:val="21"/>
+          <w:szCs w:val="21"/>
+        </w:rPr>
+        <w:t xml:space="preserve">The dealer button determines playing position and blind posting obligations. Button movement is a cash-game-only complexity — in tournaments, every seat is dealt in every hand and there are no missed blinds. The core rule: a player may never receive the button unless they have paid both the big blind and the small blind. This rule ensures no player can gain the most advantageous position (last to act post-flop) without first having paid the cost of the worst positions.</w:t>
+      </w:r>
+    </w:p>
+    <w:p>
+      <w:pPr>
+        <w:spacing w:before="200" w:after="120"/>
+      </w:pPr>
+      <w:r>
+        <w:rPr>
+          <w:rFonts w:ascii="Arial" w:cs="Arial" w:eastAsia="Arial" w:hAnsi="Arial"/>
+          <w:b/>
+          <w:bCs/>
+          <w:color w:val="C0392B"/>
+          <w:sz w:val="22"/>
+          <w:szCs w:val="22"/>
+        </w:rPr>
+        <w:t xml:space="preserve">Standard Button Movement</w:t>
+      </w:r>
+    </w:p>
+    <w:p>
+      <w:pPr>
+        <w:spacing w:after="160" w:line="276"/>
+      </w:pPr>
+      <w:r>
+        <w:rPr>
+          <w:rFonts w:ascii="Arial" w:cs="Arial" w:eastAsia="Arial" w:hAnsi="Arial"/>
+          <w:color w:val="333333"/>
+          <w:sz w:val="21"/>
+          <w:szCs w:val="21"/>
+        </w:rPr>
+        <w:t xml:space="preserve">The button follows the small blind: after each hand, the button moves to the player who was just the small blind. Under normal circumstances with all seats occupied, this means the button advances one seat clockwise each hand. The cycle is: button → small blind → big blind → under the gun, repeating around the table.</w:t>
+      </w:r>
+    </w:p>
+    <w:p>
+      <w:pPr>
+        <w:spacing w:before="200" w:after="120"/>
+      </w:pPr>
+      <w:r>
+        <w:rPr>
+          <w:rFonts w:ascii="Arial" w:cs="Arial" w:eastAsia="Arial" w:hAnsi="Arial"/>
+          <w:b/>
+          <w:bCs/>
+          <w:color w:val="C0392B"/>
+          <w:sz w:val="22"/>
+          <w:szCs w:val="22"/>
+        </w:rPr>
+        <w:t xml:space="preserve">Dead Button vs. Active Button Systems</w:t>
+      </w:r>
+    </w:p>
+    <w:p>
+      <w:pPr>
+        <w:spacing w:after="160" w:line="276"/>
+      </w:pPr>
+      <w:r>
+        <w:rPr>
+          <w:rFonts w:ascii="Arial" w:cs="Arial" w:eastAsia="Arial" w:hAnsi="Arial"/>
+          <w:color w:val="333333"/>
+          <w:sz w:val="21"/>
+          <w:szCs w:val="21"/>
+        </w:rPr>
+        <w:t xml:space="preserve">Two competing systems exist for handling empty seats. Dead button system: the button moves one seat clockwise every hand, even if that seat is empty. If the button lands on an empty seat, there is simply no small blind for that hand (just a big blind). This system is simpler but creates situations where a new player at the table must wait a hand because the button is in front of their empty seat, and one player may get last position two hands in a row. Active button system (preferred for cash): the button always stays in front of an active player. When a seat empties, the button stays with the closest active player rather than advancing to an empty seat. This system creates more flexibility for seating new players because there is always an active player on the button, but it can result in a player having the button for two consecutive hands (which would have happened anyway under the dead button system). Dead button is preferred for tournaments because it avoids giving any transferring player the button without having paid blinds. Active button is preferred for cash because it maximizes the number of hands dealt and lets new players sit in sooner.</w:t>
+      </w:r>
+    </w:p>
+    <w:p>
+      <w:pPr>
+        <w:spacing w:before="200" w:after="120"/>
+      </w:pPr>
+      <w:r>
+        <w:rPr>
+          <w:rFonts w:ascii="Arial" w:cs="Arial" w:eastAsia="Arial" w:hAnsi="Arial"/>
+          <w:b/>
+          <w:bCs/>
+          <w:color w:val="C0392B"/>
+          <w:sz w:val="22"/>
+          <w:szCs w:val="22"/>
+        </w:rPr>
+        <w:t xml:space="preserve">Missed Blind Procedures</w:t>
+      </w:r>
+    </w:p>
+    <w:p>
+      <w:pPr>
+        <w:spacing w:after="160" w:line="276"/>
+      </w:pPr>
+      <w:r>
+        <w:rPr>
+          <w:rFonts w:ascii="Arial" w:cs="Arial" w:eastAsia="Arial" w:hAnsi="Arial"/>
+          <w:color w:val="333333"/>
+          <w:sz w:val="21"/>
+          <w:szCs w:val="21"/>
+        </w:rPr>
+        <w:t xml:space="preserve">When a player leaves the table and misses their big blind, they receive a missed blind button (a physical marker placed at their seat). When they return, they must post a big blind plus a dead small blind to rejoin the game from any position (the dead small goes into the pot but does not count toward their bet). Exception: if the player returns when it is their natural big blind position, they simply post the big blind with no dead small. If a player only missed a small blind: they must post a dead small to rejoin. However, if they come back on their natural big blind, just the big blind with no dead small is sufficient.</w:t>
+      </w:r>
+    </w:p>
+    <w:p>
+      <w:pPr>
+        <w:spacing w:after="160" w:line="276"/>
+      </w:pPr>
+      <w:r>
+        <w:rPr>
+          <w:rFonts w:ascii="Arial" w:cs="Arial" w:eastAsia="Arial" w:hAnsi="Arial"/>
+          <w:color w:val="333333"/>
+          <w:sz w:val="21"/>
+          <w:szCs w:val="21"/>
+        </w:rPr>
+        <w:t xml:space="preserve">If a player misses the small blind and subsequent hands pass until they miss the big blind too, the small blind button is replaced with a big blind button — it is treated as if they only missed the big blind. The big blind miss always takes precedence. A missed small blind does NOT expire into a missed big blind on its own; the transition happens when the big blind position passes the absent player.</w:t>
+      </w:r>
+    </w:p>
+    <w:p>
+      <w:pPr>
+        <w:spacing w:after="160" w:line="276"/>
+      </w:pPr>
+      <w:r>
+        <w:rPr>
+          <w:rFonts w:ascii="Arial" w:cs="Arial" w:eastAsia="Arial" w:hAnsi="Arial"/>
+          <w:color w:val="333333"/>
+          <w:sz w:val="21"/>
+          <w:szCs w:val="21"/>
+        </w:rPr>
+        <w:t xml:space="preserve">Key rules: (1) A player can NEVER start on the small blind — they have not paid the big blind. (2) A player can NEVER start on the button — they have not paid both blinds. (3) Posting a blind or straddle is not considered action for any purpose other than getting dealt in. (4) New players to a table: in rooms that require posting, a new player must post a big blind before being dealt in (many players wait for their natural big blind to avoid the extra post). In rooms that do not require posting, the player is simply dealt in immediately for free hands until the big blind reaches them.</w:t>
+      </w:r>
+    </w:p>
+    <w:p>
+      <w:pPr>
+        <w:spacing w:before="200" w:after="120"/>
+      </w:pPr>
+      <w:r>
+        <w:rPr>
+          <w:rFonts w:ascii="Arial" w:cs="Arial" w:eastAsia="Arial" w:hAnsi="Arial"/>
+          <w:b/>
+          <w:bCs/>
+          <w:color w:val="C0392B"/>
+          <w:sz w:val="22"/>
+          <w:szCs w:val="22"/>
+        </w:rPr>
+        <w:t xml:space="preserve">Buying the Button</w:t>
+      </w:r>
+    </w:p>
+    <w:p>
+      <w:pPr>
+        <w:spacing w:after="160" w:line="276"/>
+      </w:pPr>
+      <w:r>
+        <w:rPr>
+          <w:rFonts w:ascii="Arial" w:cs="Arial" w:eastAsia="Arial" w:hAnsi="Arial"/>
+          <w:color w:val="333333"/>
+          <w:sz w:val="21"/>
+          <w:szCs w:val="21"/>
+        </w:rPr>
+        <w:t xml:space="preserve">Buying the button allows a player to pay both blinds (big blind live + dead small blind) on the current hand so that they receive the button on the next hand. This exists to let players play immediately rather than waiting for the button to pass. The rule for when buying the button is allowed: there must be a small blind to the player’s left and a button to their right. If there is a big blind to their left (e.g., because the natural small blind seat is empty), buying the button does NOT work — the next hand would leave the buyer without having paid a small blind, breaking the system. When buying the button: the existing small blind and big blind push their blinds back, the buyer posts a big blind and a dead small blind, and the existing blind players receive free action for that hand (the former small blind becomes first to act under the gun). Next hand: the button goes to the buyer, and the former blind players resume their normal small blind/big blind positions.</w:t>
+      </w:r>
+    </w:p>
+    <w:p>
+      <w:pPr>
+        <w:spacing w:after="160" w:line="276"/>
+      </w:pPr>
+      <w:r>
+        <w:rPr>
+          <w:rFonts w:ascii="Arial" w:cs="Arial" w:eastAsia="Arial" w:hAnsi="Arial"/>
+          <w:color w:val="333333"/>
+          <w:sz w:val="21"/>
+          <w:szCs w:val="21"/>
+        </w:rPr>
+        <w:t xml:space="preserve">If two new players sit down simultaneously adjacent to each other, only the one in worse position (closer to the blinds) is asked first about buying the button. If they buy it, the second player must wait one hand. If they decline, the second player is asked. Both cannot buy in the same hand.</w:t>
+      </w:r>
+    </w:p>
+    <w:p>
+      <w:pPr>
+        <w:spacing w:before="200" w:after="120"/>
+      </w:pPr>
+      <w:r>
+        <w:rPr>
+          <w:rFonts w:ascii="Arial" w:cs="Arial" w:eastAsia="Arial" w:hAnsi="Arial"/>
+          <w:b/>
+          <w:bCs/>
+          <w:color w:val="C0392B"/>
+          <w:sz w:val="22"/>
+          <w:szCs w:val="22"/>
+        </w:rPr>
+        <w:t xml:space="preserve">Heads-Up Button Rules</w:t>
+      </w:r>
+    </w:p>
+    <w:p>
+      <w:pPr>
+        <w:spacing w:after="160" w:line="276"/>
+      </w:pPr>
+      <w:r>
+        <w:rPr>
+          <w:rFonts w:ascii="Arial" w:cs="Arial" w:eastAsia="Arial" w:hAnsi="Arial"/>
+          <w:color w:val="333333"/>
+          <w:sz w:val="21"/>
+          <w:szCs w:val="21"/>
+        </w:rPr>
+        <w:t xml:space="preserve">When the table gets down to two players (heads-up), special rules apply. The button posts the small blind and acts first preflop but last on all subsequent streets. The first card is dealt to the big blind (non-button player), second card to the button. This is the opposite of the normal dealing order. When transitioning from three-handed to heads-up: determine which player was supposed to be the big blind next — that player remains the big blind. The button goes to the other player. This may mean a player gets the button twice in a row, which is unavoidable.</w:t>
+      </w:r>
+    </w:p>
+    <w:p>
+      <w:pPr>
+        <w:spacing w:before="200" w:after="120"/>
+      </w:pPr>
+      <w:r>
+        <w:rPr>
+          <w:rFonts w:ascii="Arial" w:cs="Arial" w:eastAsia="Arial" w:hAnsi="Arial"/>
+          <w:b/>
+          <w:bCs/>
+          <w:color w:val="C0392B"/>
+          <w:sz w:val="22"/>
+          <w:szCs w:val="22"/>
+        </w:rPr>
+        <w:t xml:space="preserve">Absent Player Management</w:t>
+      </w:r>
+    </w:p>
+    <w:p>
+      <w:pPr>
+        <w:spacing w:after="160" w:line="276"/>
+      </w:pPr>
+      <w:r>
+        <w:rPr>
+          <w:rFonts w:ascii="Arial" w:cs="Arial" w:eastAsia="Arial" w:hAnsi="Arial"/>
+          <w:color w:val="333333"/>
+          <w:sz w:val="21"/>
+          <w:szCs w:val="21"/>
+        </w:rPr>
+        <w:t xml:space="preserve">Poker rooms track how long players are away from the table. Common systems: (1) Digital tracking via player management software (Bravo, PokerAtlas) that flags players as absent after a set time. (2) Physical button tracking: each new dealer that taps in gives the absent player another miss-blind button or an ‘out’/‘absent’ button; two or three absent buttons means the player is picked up (their chips are racked and the seat is opened). (3) Third/fourth man walking rules: when three or more players are absent from a table, the third or fourth player may be picked up immediately to maintain table size. (4) Meal buttons: some rooms allow extended absence once per session for meals.</w:t>
+      </w:r>
+    </w:p>
+    <w:p>
+      <w:pPr>
+        <w:spacing w:after="160" w:line="276"/>
+      </w:pPr>
+      <w:r>
+        <w:rPr>
+          <w:rFonts w:ascii="Arial" w:cs="Arial" w:eastAsia="Arial" w:hAnsi="Arial"/>
+          <w:b/>
+          <w:bCs/>
+          <w:color w:val="2C3E50"/>
+          <w:sz w:val="21"/>
+          <w:szCs w:val="21"/>
+        </w:rPr>
+        <w:t xml:space="preserve">Robotic Requirement: </w:t>
+      </w:r>
+      <w:r>
+        <w:rPr>
+          <w:rFonts w:ascii="Arial" w:cs="Arial" w:eastAsia="Arial" w:hAnsi="Arial"/>
+          <w:color w:val="333333"/>
+          <w:sz w:val="21"/>
+          <w:szCs w:val="21"/>
+        </w:rPr>
+        <w:t xml:space="preserve">Must implement configurable button movement logic (dead button for tournaments, active button for cash). Must track missed blind status for every seat with automatic button assignment. Must enforce the rule that no player receives the button without paying both blinds. Must support buying the button with correct blind restructuring. Must correctly handle heads-up transitions and multi-way eliminations. Must track player presence and absence duration with configurable pickup thresholds. Button movement logic is a complex state machine that human dealers frequently get wrong, especially in edge cases involving multiple empty seats — a robotic system eliminates these errors entirely.</w:t>
+      </w:r>
+    </w:p>
+    <w:p>
+      <w:pPr>
+        <w:pStyle w:val="Heading2"/>
+        <w:spacing w:before="280" w:after="160"/>
+      </w:pPr>
+      <w:r>
+        <w:rPr>
+          <w:rFonts w:ascii="Arial" w:cs="Arial" w:eastAsia="Arial" w:hAnsi="Arial"/>
+          <w:b/>
+          <w:bCs/>
+          <w:color w:val="2C3E50"/>
+          <w:sz w:val="26"/>
+          <w:szCs w:val="26"/>
+        </w:rPr>
+        <w:t xml:space="preserve">5.7 Ambiguous Verbal Declarations and Floor Calls</w:t>
+      </w:r>
+    </w:p>
+    <w:p>
+      <w:pPr>
+        <w:spacing w:after="160" w:line="276"/>
+      </w:pPr>
+      <w:r>
+        <w:rPr>
+          <w:rFonts w:ascii="Arial" w:cs="Arial" w:eastAsia="Arial" w:hAnsi="Arial"/>
+          <w:color w:val="333333"/>
+          <w:sz w:val="21"/>
+          <w:szCs w:val="21"/>
+        </w:rPr>
+        <w:t xml:space="preserve">‘I put you all in’: If a player says this phrase, the dealer’s job is simple — call the floor immediately. The phrase is problematic because a player cannot force another player to bet their chips. The language is confusing and creates headaches that supervisors must resolve. The floor may rule it as an all-in declaration by the speaking player (since that is what the words literally describe from the speaker’s perspective), or they may evaluate the context including whether it caused any other player to act. As a dealer, do not try to interpret this — just call the floor.</w:t>
+      </w:r>
+    </w:p>
+    <w:p>
+      <w:pPr>
+        <w:spacing w:after="160" w:line="276"/>
+      </w:pPr>
+      <w:r>
+        <w:rPr>
+          <w:rFonts w:ascii="Arial" w:cs="Arial" w:eastAsia="Arial" w:hAnsi="Arial"/>
+          <w:color w:val="333333"/>
+          <w:sz w:val="21"/>
+          <w:szCs w:val="21"/>
+        </w:rPr>
+        <w:t xml:space="preserve">Chip pull-back: If a player has a chip out that is sufficient to cover the call and pulls it back, this is a floor call if they do anything other than raise. The logic: the only reason to pull back a chip that already covers the call is to adjust a raise amount. If the player pulls the chip back and then just calls or folds, it suggests they were influenced by table reaction (angle shooting). Example: blinds are 100/200, a player puts out a 500 chip to call. Another player raises to 400. The original player pulls their 500 chip back and puts out exactly 400. This is suspicious — the 500 chip already covered the 400 call. The pull-back-and-reduce is treated as an action indicator that should result in a mandatory minimum raise.</w:t>
+      </w:r>
+    </w:p>
+    <w:p>
+      <w:pPr>
+        <w:spacing w:before="200" w:after="120"/>
+      </w:pPr>
+      <w:r>
+        <w:rPr>
+          <w:rFonts w:ascii="Arial" w:cs="Arial" w:eastAsia="Arial" w:hAnsi="Arial"/>
+          <w:b/>
+          <w:bCs/>
+          <w:color w:val="C0392B"/>
+          <w:sz w:val="22"/>
+          <w:szCs w:val="22"/>
+        </w:rPr>
         <w:t xml:space="preserve">Minimum Raise Disputes with Incomplete All-Ins</w:t>
       </w:r>
     </w:p>
@@ -6660,6 +7000,168 @@
     </w:p>
     <w:p>
       <w:pPr>
+        <w:spacing w:before="200" w:after="120"/>
+      </w:pPr>
+      <w:r>
+        <w:rPr>
+          <w:rFonts w:ascii="Arial" w:cs="Arial" w:eastAsia="Arial" w:hAnsi="Arial"/>
+          <w:b/>
+          <w:bCs/>
+          <w:color w:val="C0392B"/>
+          <w:sz w:val="22"/>
+          <w:szCs w:val="22"/>
+        </w:rPr>
+        <w:t xml:space="preserve">Pot Tracking Across Streets in PLO</w:t>
+      </w:r>
+    </w:p>
+    <w:p>
+      <w:pPr>
+        <w:spacing w:after="160" w:line="276"/>
+      </w:pPr>
+      <w:r>
+        <w:rPr>
+          <w:rFonts w:ascii="Arial" w:cs="Arial" w:eastAsia="Arial" w:hAnsi="Arial"/>
+          <w:color w:val="333333"/>
+          <w:sz w:val="21"/>
+          <w:szCs w:val="21"/>
+        </w:rPr>
+        <w:t xml:space="preserve">The most critical discipline for a PLO dealer is knowing the pot total at every moment without physically counting it. After each betting round, before bringing bets into the center, the dealer calculates the new pot total: count the number of players, multiply by their bet, add any dead money from folds, and add the existing pot. Example: 4 players at 75 each = 300, plus 20 dead from pre-flop folders = 320. That number (320) must be locked in memory before the bets are merged into the pot. On the next street, if two players bet 150 each, the new total is 320 + 300 = 620. This incremental tracking is the only reliable method — reconstructing the pot total from a pile of mixed chips is nearly impossible without a physical count.</w:t>
+      </w:r>
+    </w:p>
+    <w:p>
+      <w:pPr>
+        <w:spacing w:after="160" w:line="276"/>
+      </w:pPr>
+      <w:r>
+        <w:rPr>
+          <w:rFonts w:ascii="Arial" w:cs="Arial" w:eastAsia="Arial" w:hAnsi="Arial"/>
+          <w:color w:val="333333"/>
+          <w:sz w:val="21"/>
+          <w:szCs w:val="21"/>
+        </w:rPr>
+        <w:t xml:space="preserve">When pulling in bets that include dead money from folders, keep the dead money physically separate until you have computed the total. This is an acceptable practice: the dead money sits next to the pot rather than being immediately pushed in. Once the dealer has the number, everything merges. The key discipline: never bring a flop, turn, or river until you know the pot total. Taking 5 to 10 extra seconds to verify the math is always preferable to calling a floor supervisor to count down the pot mid-hand.</w:t>
+      </w:r>
+    </w:p>
+    <w:p>
+      <w:pPr>
+        <w:spacing w:before="200" w:after="120"/>
+      </w:pPr>
+      <w:r>
+        <w:rPr>
+          <w:rFonts w:ascii="Arial" w:cs="Arial" w:eastAsia="Arial" w:hAnsi="Arial"/>
+          <w:b/>
+          <w:bCs/>
+          <w:color w:val="C0392B"/>
+          <w:sz w:val="22"/>
+          <w:szCs w:val="22"/>
+        </w:rPr>
+        <w:t xml:space="preserve">PLO Time Rake and Game Pace</w:t>
+      </w:r>
+    </w:p>
+    <w:p>
+      <w:pPr>
+        <w:spacing w:after="160" w:line="276"/>
+      </w:pPr>
+      <w:r>
+        <w:rPr>
+          <w:rFonts w:ascii="Arial" w:cs="Arial" w:eastAsia="Arial" w:hAnsi="Arial"/>
+          <w:color w:val="333333"/>
+          <w:sz w:val="21"/>
+          <w:szCs w:val="21"/>
+        </w:rPr>
+        <w:t xml:space="preserve">Most PLO games use a time rake rather than a per-hand pot rake. The casino charges each player a fixed amount per half hour (or per hour) instead of taking a percentage of each pot. Time rake is used because PLO naturally plays slower than Hold’em: four cards to deal instead of two, more complex betting decisions, pot-limit calculations that take time, and larger pots that require more chip handling. Fewer hands per hour means fewer rake drops, making per-hand raking uneconomical for the casino. For the dealer, time rake eliminates one entire category of mental work — no calculating the rake, no making change for the rake, no dropping the rake at the correct threshold. This makes PLO paradoxically more relaxing to deal than Hold’em for experienced dealers, despite the more complex pot math.</w:t>
+      </w:r>
+    </w:p>
+    <w:p>
+      <w:pPr>
+        <w:spacing w:before="200" w:after="120"/>
+      </w:pPr>
+      <w:r>
+        <w:rPr>
+          <w:rFonts w:ascii="Arial" w:cs="Arial" w:eastAsia="Arial" w:hAnsi="Arial"/>
+          <w:b/>
+          <w:bCs/>
+          <w:color w:val="C0392B"/>
+          <w:sz w:val="22"/>
+          <w:szCs w:val="22"/>
+        </w:rPr>
+        <w:t xml:space="preserve">PLO Memorization and Pattern Recognition</w:t>
+      </w:r>
+    </w:p>
+    <w:p>
+      <w:pPr>
+        <w:spacing w:after="160" w:line="276"/>
+      </w:pPr>
+      <w:r>
+        <w:rPr>
+          <w:rFonts w:ascii="Arial" w:cs="Arial" w:eastAsia="Arial" w:hAnsi="Arial"/>
+          <w:color w:val="333333"/>
+          <w:sz w:val="21"/>
+          <w:szCs w:val="21"/>
+        </w:rPr>
+        <w:t xml:space="preserve">Pot-limit calculations that seem daunting at first become memorized through repetition. In a 5/5 game, the first pot-sized raise is always 20. The first re-pot is always 70 (or 90 with a caller). These numbers repeat hand after hand, and within a few sessions the dealer knows them without calculating. The process is similar to dealing craps, where dealers memorize payout formulas through repetition rather than computing them fresh each time. Common PLO sequences (open to 20, re-pot to 70, caller makes it 90, re-pot to 310) become as automatic as dealing Hold’em. The challenging moments come when unusual bet sizes, all-ins for less, or odd structures create amounts that break the memorized patterns — and that is when the formula (3× previous bet + trail + pot) must be computed fresh.</w:t>
+      </w:r>
+    </w:p>
+    <w:p>
+      <w:pPr>
+        <w:spacing w:before="200" w:after="120"/>
+      </w:pPr>
+      <w:r>
+        <w:rPr>
+          <w:rFonts w:ascii="Arial" w:cs="Arial" w:eastAsia="Arial" w:hAnsi="Arial"/>
+          <w:b/>
+          <w:bCs/>
+          <w:color w:val="C0392B"/>
+          <w:sz w:val="22"/>
+          <w:szCs w:val="22"/>
+        </w:rPr>
+        <w:t xml:space="preserve">Dealing with Difficult PLO Players</w:t>
+      </w:r>
+    </w:p>
+    <w:p>
+      <w:pPr>
+        <w:spacing w:after="160" w:line="276"/>
+      </w:pPr>
+      <w:r>
+        <w:rPr>
+          <w:rFonts w:ascii="Arial" w:cs="Arial" w:eastAsia="Arial" w:hAnsi="Arial"/>
+          <w:color w:val="333333"/>
+          <w:sz w:val="21"/>
+          <w:szCs w:val="21"/>
+        </w:rPr>
+        <w:t xml:space="preserve">Certain PLO players deliberately test dealers by putting out stacks of chips without verbal declaration, forcing the dealer to calculate whether the amount matches the pot, exceeds it, or represents a non-pot raise. Some players derive satisfaction from catching dealer errors. The dealer’s best defense: pre-calculate the pot amount during the player’s thinking time, so when chips hit the felt, the dealer already knows whether the amount is correct. When a player puts out a stack, the dealer silently counts it. If it matches pot, announce ‘pot’ and the amount. If it exceeds pot, announce ‘pot’ and the corrected amount, pushing back the excess. If it is under pot, announce ‘raise’ and the amount.</w:t>
+      </w:r>
+    </w:p>
+    <w:p>
+      <w:pPr>
+        <w:spacing w:after="160" w:line="276"/>
+      </w:pPr>
+      <w:r>
+        <w:rPr>
+          <w:rFonts w:ascii="Arial" w:cs="Arial" w:eastAsia="Arial" w:hAnsi="Arial"/>
+          <w:color w:val="333333"/>
+          <w:sz w:val="21"/>
+          <w:szCs w:val="21"/>
+        </w:rPr>
+        <w:t xml:space="preserve">When a dealer does make a mistake (saying the wrong pot amount, allowing an over-bet), the correct response is: ‘I made a mistake — I’m going to call the floor. They’ll fix it.’ Do not apologize excessively. Do not blame the player for putting out a confusing amount. Take ownership without being self-deprecating, because the implicit message is that mistakes are part of the game — including the player’s choice to put out an ambiguous bet. This framing allows other players at the table to apply social pressure to the difficult player, which is far more effective than any response from the dealer. The floor resolves the situation, the game continues, and the dealer maintains professionalism.</w:t>
+      </w:r>
+    </w:p>
+    <w:p>
+      <w:pPr>
+        <w:spacing w:after="160" w:line="276"/>
+      </w:pPr>
+      <w:r>
+        <w:rPr>
+          <w:rFonts w:ascii="Arial" w:cs="Arial" w:eastAsia="Arial" w:hAnsi="Arial"/>
+          <w:color w:val="333333"/>
+          <w:sz w:val="21"/>
+          <w:szCs w:val="21"/>
+        </w:rPr>
+        <w:t xml:space="preserve">Preparation is the best weapon: when sitting down at an unfamiliar PLO table, especially one with unusual blind structures or dead antes, ask the outgoing dealer or the players a few quick questions during the tap-out. ‘You’re playing 5/10/10 with a dead 100 — so the first raise is to 500?’ Players appreciate a dealer who takes 10 seconds to verify the structure before dealing, rather than a dealer who guesses wrong on the first hand. This is especially important for high-stakes PLO games where structures vary significantly between tables and casinos.</w:t>
+      </w:r>
+    </w:p>
+    <w:p>
+      <w:pPr>
         <w:spacing w:after="160" w:line="276"/>
       </w:pPr>
       <w:r>
@@ -6680,7 +7182,7 @@
           <w:sz w:val="21"/>
           <w:szCs w:val="21"/>
         </w:rPr>
-        <w:t xml:space="preserve">Must deal 4 cards per player (up to 40 cards for a full table). Must calculate pot-limit maximum bets in real time and announce them on request. Must correctly evaluate 4-card hands using exactly 2 hole cards and 3 community cards at showdown, which requires evaluating 60 possible 5-card combinations per player. Must never misapply the Omaha hand-reading rule. This is perhaps the strongest single argument for robotic dealing accuracy over human dealing.</w:t>
+        <w:t xml:space="preserve">Must deal 4 cards per player (up to 40 cards for a full table). Must calculate pot-limit maximum bets in real time and announce them on request. Must track the running pot total across all streets without physical counting. Must correctly evaluate 4-card hands using exactly 2 hole cards and 3 community cards at showdown, which requires evaluating 60 possible 5-card combinations per player. Must never misapply the Omaha hand-reading rule. Must instantly detect when a player’s chip amount matches, exceeds, or falls short of the pot maximum. Must apply the all-in-for-less trail rule, the cash-game small-blind-equals-big-blind rule, and the trail-excludes-active-player rule simultaneously. Pot-limit calculation is perhaps the strongest single argument for robotic dealing accuracy over human dealing — a computer computes the pot instantly and never loses track of the running total.</w:t>
       </w:r>
     </w:p>
     <w:p>

</xml_diff>

<commit_message>
Expand Section 9.7 with Deuce-to-Seven Triple Draw and Single Draw from Mixed Games Lesson 7
Added 8 new subsections before the existing A-5 content: cash vs tournament card
delivery (pitch vs push-pull), Deuce-to-Seven Triple Draw Lowball (limit/pot-limit,
six-max, ace-high, straights/flushes count against), discard announcement binding rule,
burn card importance in draw games (game-state markers, never muck burns), Deuce-to-Seven
Single Draw (no-limit, seven-max, two betting rounds), mixed game table size management
(absent buttons for excess players), and exposed card rules in draw games.
Document: 123,453 → 126,647 bytes.

https://claude.ai/code/session_01LLEXfPXvBSATequm3rLG4v
</commit_message>
<xml_diff>
--- a/docs/Deployment_Bible.docx
+++ b/docs/Deployment_Bible.docx
@@ -7963,6 +7963,339 @@
           <w:szCs w:val="21"/>
         </w:rPr>
         <w:t xml:space="preserve">The dealing procedure for triple draw games: deal five cards to each player face-down, conduct a betting round, allow discards (players announce how many cards they want), deal replacements, repeat for three total draw rounds with a betting round after each. The dealer must track how many cards each player discards, deal the correct number of replacements, and manage the stub carefully because draw games consume cards rapidly — with eight players each drawing multiple cards over three rounds, the deck can be exhausted.</w:t>
+      </w:r>
+    </w:p>
+    <w:p>
+      <w:pPr>
+        <w:spacing w:before="200" w:after="120"/>
+      </w:pPr>
+      <w:r>
+        <w:rPr>
+          <w:rFonts w:ascii="Arial" w:cs="Arial" w:eastAsia="Arial" w:hAnsi="Arial"/>
+          <w:b/>
+          <w:bCs/>
+          <w:color w:val="C0392B"/>
+          <w:sz w:val="22"/>
+          <w:szCs w:val="22"/>
+        </w:rPr>
+        <w:t xml:space="preserve">Cash vs. Tournament Card Delivery in Draw Games</w:t>
+      </w:r>
+    </w:p>
+    <w:p>
+      <w:pPr>
+        <w:spacing w:after="160" w:line="276"/>
+      </w:pPr>
+      <w:r>
+        <w:rPr>
+          <w:rFonts w:ascii="Arial" w:cs="Arial" w:eastAsia="Arial" w:hAnsi="Arial"/>
+          <w:color w:val="333333"/>
+          <w:sz w:val="21"/>
+          <w:szCs w:val="21"/>
+        </w:rPr>
+        <w:t xml:space="preserve">In cash games, replacement cards are pitched to players just like the initial deal — the dealer flicks the card toward the player. In tournaments, cards are NEVER pitched during draws. The correct tournament procedure is push-pull delivery: the dealer places the replacement card(s) face-down on the table and pushes (slides) them toward the player, then pulls (slides) the player’s discards back toward the discard pile. Push-pull keeps cards in contact with the felt at all times, dramatically reducing the chance of exposing a card. This distinction is critical: pitching in a tournament draw game is a procedural error. Pitching in a cash game draw is standard practice (though some cash rooms also require push-pull — verify with the house).</w:t>
+      </w:r>
+    </w:p>
+    <w:p>
+      <w:pPr>
+        <w:spacing w:after="160" w:line="276"/>
+      </w:pPr>
+      <w:r>
+        <w:rPr>
+          <w:rFonts w:ascii="Arial" w:cs="Arial" w:eastAsia="Arial" w:hAnsi="Arial"/>
+          <w:color w:val="333333"/>
+          <w:sz w:val="21"/>
+          <w:szCs w:val="21"/>
+        </w:rPr>
+        <w:t xml:space="preserve">The push-pull sequence per player: (1) Place the correct number of replacement cards face-down near the player and slide them forward. (2) Slide the player’s face-down discards back toward the discard pile. (3) Move to the next player and repeat. The discards from all players in the current round accumulate in the discard pile. After all players have received their replacements for that round, the entire discard pile is slid into the muck. The key physical discipline: cards should never be lifted off the felt during push-pull — they slide across the surface. On a small table this can be difficult, but the principle remains: minimize airtime to minimize exposure risk.</w:t>
+      </w:r>
+    </w:p>
+    <w:p>
+      <w:pPr>
+        <w:spacing w:before="200" w:after="120"/>
+      </w:pPr>
+      <w:r>
+        <w:rPr>
+          <w:rFonts w:ascii="Arial" w:cs="Arial" w:eastAsia="Arial" w:hAnsi="Arial"/>
+          <w:b/>
+          <w:bCs/>
+          <w:color w:val="C0392B"/>
+          <w:sz w:val="22"/>
+          <w:szCs w:val="22"/>
+        </w:rPr>
+        <w:t xml:space="preserve">Deuce-to-Seven Triple Draw Lowball (Limit and Pot-Limit)</w:t>
+      </w:r>
+    </w:p>
+    <w:p>
+      <w:pPr>
+        <w:spacing w:after="160" w:line="276"/>
+      </w:pPr>
+      <w:r>
+        <w:rPr>
+          <w:rFonts w:ascii="Arial" w:cs="Arial" w:eastAsia="Arial" w:hAnsi="Arial"/>
+          <w:color w:val="333333"/>
+          <w:sz w:val="21"/>
+          <w:szCs w:val="21"/>
+        </w:rPr>
+        <w:t xml:space="preserve">Deuce-to-Seven (2-7) Triple Draw is the foundational draw game in WSOP mixed-game rotations. It is a lowball game where the goal is to make the worst possible poker hand by standard high-hand rankings. Straights and flushes COUNT against you (unlike Ace-to-Five, where they do not). Aces are HIGH (not low). The best possible hand is 7-5-4-3-2 of mixed suits — the lowest non-straight, non-flush, non-paired five-card combination. A hand like 6-5-4-3-2 is a straight and therefore terrible; A-5-4-3-2 is also a straight (ace high) and terrible.</w:t>
+      </w:r>
+    </w:p>
+    <w:p>
+      <w:pPr>
+        <w:spacing w:after="160" w:line="276"/>
+      </w:pPr>
+      <w:r>
+        <w:rPr>
+          <w:rFonts w:ascii="Arial" w:cs="Arial" w:eastAsia="Arial" w:hAnsi="Arial"/>
+          <w:color w:val="333333"/>
+          <w:sz w:val="21"/>
+          <w:szCs w:val="21"/>
+        </w:rPr>
+        <w:t xml:space="preserve">The limit version is dealt six-max (six players per table) because five cards per player with three draw rounds rapidly depletes the 52-card deck. The blind structure is standard limit: small blind and big blind, no ante. Four betting rounds: the first two use the small bet increment, the last two use the big bet increment. Example: a 4/8 limit game has 2/4 blinds, $4 bets for the first two rounds, and $8 bets for the last two. Raises follow standard limit rules: a bet and three raises per round (four total bets). The pot-limit version is identical in structure but adds an ante (in tournament play) and uses pot-limit betting mechanics. The pot-limit version is covered by the pot-limit calculation rules in Section 5.3.</w:t>
+      </w:r>
+    </w:p>
+    <w:p>
+      <w:pPr>
+        <w:spacing w:after="160" w:line="276"/>
+      </w:pPr>
+      <w:r>
+        <w:rPr>
+          <w:rFonts w:ascii="Arial" w:cs="Arial" w:eastAsia="Arial" w:hAnsi="Arial"/>
+          <w:color w:val="333333"/>
+          <w:sz w:val="21"/>
+          <w:szCs w:val="21"/>
+        </w:rPr>
+        <w:t xml:space="preserve">The dealing procedure: (1) Post blinds (small and big). (2) Deal five cards face-down to each player. (3) First betting round (small bet). (4) First discard round: players discard in positional order, starting with the player closest to the left of the button; dealer announces discard counts for all players; dealer burns one card; dealer delivers replacement cards to each player in order, pulling discards to the separate discard pile after each player; slide discard pile into muck. (5) Second betting round (small bet). (6) Second discard round (same procedure, burn, deliver, muck discards). (7) Third betting round (big bet). (8) Third discard round (same procedure, burn, deliver, muck discards). (9) Fourth and final betting round (big bet). (10) Showdown: lowest hand wins the entire pot.</w:t>
+      </w:r>
+    </w:p>
+    <w:p>
+      <w:pPr>
+        <w:spacing w:before="200" w:after="120"/>
+      </w:pPr>
+      <w:r>
+        <w:rPr>
+          <w:rFonts w:ascii="Arial" w:cs="Arial" w:eastAsia="Arial" w:hAnsi="Arial"/>
+          <w:b/>
+          <w:bCs/>
+          <w:color w:val="C0392B"/>
+          <w:sz w:val="22"/>
+          <w:szCs w:val="22"/>
+        </w:rPr>
+        <w:t xml:space="preserve">Discard Announcement and Binding Rule</w:t>
+      </w:r>
+    </w:p>
+    <w:p>
+      <w:pPr>
+        <w:spacing w:after="160" w:line="276"/>
+      </w:pPr>
+      <w:r>
+        <w:rPr>
+          <w:rFonts w:ascii="Arial" w:cs="Arial" w:eastAsia="Arial" w:hAnsi="Arial"/>
+          <w:color w:val="333333"/>
+          <w:sz w:val="21"/>
+          <w:szCs w:val="21"/>
+        </w:rPr>
+        <w:t xml:space="preserve">Per WSOP rules, the dealer must not begin delivering replacement cards until ALL players have placed their discards forward (or indicated ‘pat’). Once all discards are down, the dealer announces the count for every player in positional order: ‘one, three, two, three, three’ or ‘pat, two, two, two, two.’ This announcement serves two purposes: (1) it informs the table of each player’s draw count, which is strategic information; (2) it LOCKS the discard count — no player may change the number of cards they are discarding after the announcement. If a player placed two cards forward and then tries to change to three after the announcement, the original two stands. The announcement is the binding moment.</w:t>
+      </w:r>
+    </w:p>
+    <w:p>
+      <w:pPr>
+        <w:spacing w:after="160" w:line="276"/>
+      </w:pPr>
+      <w:r>
+        <w:rPr>
+          <w:rFonts w:ascii="Arial" w:cs="Arial" w:eastAsia="Arial" w:hAnsi="Arial"/>
+          <w:color w:val="333333"/>
+          <w:sz w:val="21"/>
+          <w:szCs w:val="21"/>
+        </w:rPr>
+        <w:t xml:space="preserve">If a player wishes to discard their entire hand (all five cards), they receive all five replacement cards consecutively from the deck. There is no rule against receiving consecutive cards in draw games — the historical restriction on consecutive cards from some older game formats does not apply here.</w:t>
+      </w:r>
+    </w:p>
+    <w:p>
+      <w:pPr>
+        <w:spacing w:before="200" w:after="120"/>
+      </w:pPr>
+      <w:r>
+        <w:rPr>
+          <w:rFonts w:ascii="Arial" w:cs="Arial" w:eastAsia="Arial" w:hAnsi="Arial"/>
+          <w:b/>
+          <w:bCs/>
+          <w:color w:val="C0392B"/>
+          <w:sz w:val="22"/>
+          <w:szCs w:val="22"/>
+        </w:rPr>
+        <w:t xml:space="preserve">Burn Card Importance in Draw Games</w:t>
+      </w:r>
+    </w:p>
+    <w:p>
+      <w:pPr>
+        <w:spacing w:after="160" w:line="276"/>
+      </w:pPr>
+      <w:r>
+        <w:rPr>
+          <w:rFonts w:ascii="Arial" w:cs="Arial" w:eastAsia="Arial" w:hAnsi="Arial"/>
+          <w:color w:val="333333"/>
+          <w:sz w:val="21"/>
+          <w:szCs w:val="21"/>
+        </w:rPr>
+        <w:t xml:space="preserve">Burn cards serve a uniquely important function in draw games: they mark which discard round the hand is on. After the first discard round, there is one burn card on the table. After the second, two. After the third, three. If the dealer loses track of which round the hand is on (easy to do when switching between game types in a mixed-game rotation), counting the burn cards provides an immediate answer. Burn cards in draw games must NEVER be prematurely mucked — they remain on the table, tucked under a chip for security, until the winner has been determined and the pot is pushed. They are also never mixed into the muck for a reshuffle during stub depletion. Burn cards are sacred in draw games.</w:t>
+      </w:r>
+    </w:p>
+    <w:p>
+      <w:pPr>
+        <w:spacing w:after="160" w:line="276"/>
+      </w:pPr>
+      <w:r>
+        <w:rPr>
+          <w:rFonts w:ascii="Arial" w:cs="Arial" w:eastAsia="Arial" w:hAnsi="Arial"/>
+          <w:color w:val="333333"/>
+          <w:sz w:val="21"/>
+          <w:szCs w:val="21"/>
+        </w:rPr>
+        <w:t xml:space="preserve">A card must be burned prior to EVERY draw round, including rounds where all remaining players stand pat. If every player says ‘pat,’ the dealer still burns one card to designate that round before the next betting round begins. This ensures the burn card count always accurately reflects the game state.</w:t>
+      </w:r>
+    </w:p>
+    <w:p>
+      <w:pPr>
+        <w:spacing w:before="200" w:after="120"/>
+      </w:pPr>
+      <w:r>
+        <w:rPr>
+          <w:rFonts w:ascii="Arial" w:cs="Arial" w:eastAsia="Arial" w:hAnsi="Arial"/>
+          <w:b/>
+          <w:bCs/>
+          <w:color w:val="C0392B"/>
+          <w:sz w:val="22"/>
+          <w:szCs w:val="22"/>
+        </w:rPr>
+        <w:t xml:space="preserve">Deuce-to-Seven Single Draw (No Limit)</w:t>
+      </w:r>
+    </w:p>
+    <w:p>
+      <w:pPr>
+        <w:spacing w:after="160" w:line="276"/>
+      </w:pPr>
+      <w:r>
+        <w:rPr>
+          <w:rFonts w:ascii="Arial" w:cs="Arial" w:eastAsia="Arial" w:hAnsi="Arial"/>
+          <w:color w:val="333333"/>
+          <w:sz w:val="21"/>
+          <w:szCs w:val="21"/>
+        </w:rPr>
+        <w:t xml:space="preserve">Deuce-to-Seven Single Draw is the no-limit variant with only one discard round and two betting rounds (pre-draw and post-draw). It is dealt seven-max (seven players per table) because a single draw consumes fewer cards than triple draw. The hand rankings are identical to 2-7 Triple Draw: lowest non-straight, non-flush, non-paired hand wins, aces are high, best hand is 7-5-4-3-2. The no-limit structure creates a different strategic dynamic: because there is only one chance to improve, the best starting hands tend to be better in single draw, and large bets can end hands before the draw.</w:t>
+      </w:r>
+    </w:p>
+    <w:p>
+      <w:pPr>
+        <w:spacing w:after="160" w:line="276"/>
+      </w:pPr>
+      <w:r>
+        <w:rPr>
+          <w:rFonts w:ascii="Arial" w:cs="Arial" w:eastAsia="Arial" w:hAnsi="Arial"/>
+          <w:color w:val="333333"/>
+          <w:sz w:val="21"/>
+          <w:szCs w:val="21"/>
+        </w:rPr>
+        <w:t xml:space="preserve">The dealing procedure is simpler than triple draw: (1) Post blinds (and ante if applicable — antes may be introduced later in tournament structures, similar to no-limit Hold’em). (2) Deal five cards face-down to each player. (3) First betting round (no-limit). (4) Single discard round: players discard in order, dealer announces counts, burns one card, delivers replacements (push-pull in tournament, pitch in cash). (5) Second and final betting round (no-limit). (6) Showdown. Because there is only one draw, the positional advantage of seeing opponents’ discard counts before deciding your own is even more significant than in triple draw.</w:t>
+      </w:r>
+    </w:p>
+    <w:p>
+      <w:pPr>
+        <w:spacing w:after="160" w:line="276"/>
+      </w:pPr>
+      <w:r>
+        <w:rPr>
+          <w:rFonts w:ascii="Arial" w:cs="Arial" w:eastAsia="Arial" w:hAnsi="Arial"/>
+          <w:color w:val="333333"/>
+          <w:sz w:val="21"/>
+          <w:szCs w:val="21"/>
+        </w:rPr>
+        <w:t xml:space="preserve">The ante structure in single draw follows the same pattern as no-limit Hold’em tournaments: antes are not present in early levels and are introduced as the tournament progresses. In cash games, ante structures vary by house rules. The optional rule requiring the first player to enter the pot to open for at least double the big blind (rather than just calling) exists in some structures — verify with the event structure and tournament director before dealing.</w:t>
+      </w:r>
+    </w:p>
+    <w:p>
+      <w:pPr>
+        <w:spacing w:before="200" w:after="120"/>
+      </w:pPr>
+      <w:r>
+        <w:rPr>
+          <w:rFonts w:ascii="Arial" w:cs="Arial" w:eastAsia="Arial" w:hAnsi="Arial"/>
+          <w:b/>
+          <w:bCs/>
+          <w:color w:val="C0392B"/>
+          <w:sz w:val="22"/>
+          <w:szCs w:val="22"/>
+        </w:rPr>
+        <w:t xml:space="preserve">Mixed Game Table Size Management for Draw Games</w:t>
+      </w:r>
+    </w:p>
+    <w:p>
+      <w:pPr>
+        <w:spacing w:after="160" w:line="276"/>
+      </w:pPr>
+      <w:r>
+        <w:rPr>
+          <w:rFonts w:ascii="Arial" w:cs="Arial" w:eastAsia="Arial" w:hAnsi="Arial"/>
+          <w:color w:val="333333"/>
+          <w:sz w:val="21"/>
+          <w:szCs w:val="21"/>
+        </w:rPr>
+        <w:t xml:space="preserve">When draw games appear in a mixed-game rotation and the table has more players than the draw game allows (e.g., an 8-handed table rotates into 6-max triple draw), the excess players are dealt out using absent buttons. The player(s) in the worst position(s) — typically the under-the-gun seat(s) closest to the big blind — receive an absent button placed in front of their seat. They do not receive cards for that hand. The absent button ensures the dealer remembers not to pitch to that seat. When the game rotates back to a format that allows more players (e.g., Hold’em at 8-max), the absent buttons are removed and all seats are dealt in again.</w:t>
+      </w:r>
+    </w:p>
+    <w:p>
+      <w:pPr>
+        <w:spacing w:before="200" w:after="120"/>
+      </w:pPr>
+      <w:r>
+        <w:rPr>
+          <w:rFonts w:ascii="Arial" w:cs="Arial" w:eastAsia="Arial" w:hAnsi="Arial"/>
+          <w:b/>
+          <w:bCs/>
+          <w:color w:val="C0392B"/>
+          <w:sz w:val="22"/>
+          <w:szCs w:val="22"/>
+        </w:rPr>
+        <w:t xml:space="preserve">Exposed Card Rules in Draw Games</w:t>
+      </w:r>
+    </w:p>
+    <w:p>
+      <w:pPr>
+        <w:spacing w:after="160" w:line="276"/>
+      </w:pPr>
+      <w:r>
+        <w:rPr>
+          <w:rFonts w:ascii="Arial" w:cs="Arial" w:eastAsia="Arial" w:hAnsi="Arial"/>
+          <w:color w:val="333333"/>
+          <w:sz w:val="21"/>
+          <w:szCs w:val="21"/>
+        </w:rPr>
+        <w:t xml:space="preserve">During the initial deal: one exposed card is handled identically to Hold’em — leave the exposed card in front of the player, complete the deal to all players, then replace the exposed card with the burn card (the exposed card becomes the burn). Show the exposed card to the entire table before it becomes the burn. Two or more exposed cards during the initial deal constitute a misdeal. During the draw rounds in cash games (‘live action games’ per WSOP terminology), all exposed cards while drawing must be replaced — a player cannot keep a card that was accidentally flipped. In tournaments, exposed cards during the initial deal follow the same one/two rule, and exposed cards during draws are replaced using the push-pull method (which makes exposure extremely rare).</w:t>
+      </w:r>
+    </w:p>
+    <w:p>
+      <w:pPr>
+        <w:spacing w:after="160" w:line="276"/>
+      </w:pPr>
+      <w:r>
+        <w:rPr>
+          <w:rFonts w:ascii="Arial" w:cs="Arial" w:eastAsia="Arial" w:hAnsi="Arial"/>
+          <w:b/>
+          <w:bCs/>
+          <w:color w:val="2C3E50"/>
+          <w:sz w:val="21"/>
+          <w:szCs w:val="21"/>
+        </w:rPr>
+        <w:t xml:space="preserve">Robotic Requirement: </w:t>
+      </w:r>
+      <w:r>
+        <w:rPr>
+          <w:rFonts w:ascii="Arial" w:cs="Arial" w:eastAsia="Arial" w:hAnsi="Arial"/>
+          <w:color w:val="333333"/>
+          <w:sz w:val="21"/>
+          <w:szCs w:val="21"/>
+        </w:rPr>
+        <w:t xml:space="preserve">Must support both limit and no-limit betting structures for Deuce-to-Seven variants. Must enforce six-max for triple draw and seven-max for single draw. Must correctly evaluate 2-7 lowball hands where straights and flushes count against the player and aces are high. Must implement push-pull delivery for tournament mode and pitch delivery for cash mode. Must track burn cards as game-state markers and never mix them into the muck or reshuffled stub. Must announce discard counts and enforce the binding rule (no changes after announcement). Must manage absent buttons when draw games appear in mixed-game rotations with excess players. Must burn a card even when all players stand pat. The 2-7 hand evaluation is the inverse of standard poker rankings and must be implemented as a distinct evaluation module.</w:t>
       </w:r>
     </w:p>
     <w:p>

</xml_diff>

<commit_message>
Expand Sections 9.2, 9.3, and 6.13 with Omaha hand reading and split-pot procedures
Incorporates Mixed Games Lesson 3 (TruePokerDealer): systematic board reading
methodology for Omaha showdowns, board type classification (unpaired, paired,
two-pair, trips, flush/straight boards), low hand reading methodology, split
pot showdown kill sequence, odd chip rules (high always gets odd chip between
halves), pot stacking timing (cash vs tournament), stub counting in Omaha, and
cash vs tournament chip handling differences.

https://claude.ai/code/session_01LLEXfPXvBSATequm3rLG4v
</commit_message>
<xml_diff>
--- a/docs/Deployment_Bible.docx
+++ b/docs/Deployment_Bible.docx
@@ -5345,6 +5345,20 @@
     </w:p>
     <w:p>
       <w:pPr>
+        <w:spacing w:after="160" w:line="276"/>
+      </w:pPr>
+      <w:r>
+        <w:rPr>
+          <w:rFonts w:ascii="Arial" w:cs="Arial" w:eastAsia="Arial" w:hAnsi="Arial"/>
+          <w:color w:val="333333"/>
+          <w:sz w:val="21"/>
+          <w:szCs w:val="21"/>
+        </w:rPr>
+        <w:t xml:space="preserve">An important distinction: the suit-based tiebreaker above applies to odd chip decisions within the same half of a hi-lo pot (e.g., two players tie for the low). For the odd chip between the high and low halves themselves, a different and simpler rule applies: the high hand always receives the extra chip, regardless of seat position or suit. This is universal across WSOP, TDA, and virtually all house rules. The dealer first divides the pot into high and low halves; if a chip cannot be evenly split, it goes to the high side. Only after each half is established does the within-half odd chip rule (worst position for low ties, or high card by suit for high ties) apply to further tiebreakers within that half.</w:t>
+      </w:r>
+    </w:p>
+    <w:p>
+      <w:pPr>
         <w:spacing w:before="200" w:after="120"/>
       </w:pPr>
       <w:r>
@@ -6981,21 +6995,35 @@
           <w:sz w:val="22"/>
           <w:szCs w:val="22"/>
         </w:rPr>
-        <w:t xml:space="preserve">Pot-Limit Calculation</w:t>
-      </w:r>
-    </w:p>
-    <w:p>
-      <w:pPr>
-        <w:spacing w:after="160" w:line="276"/>
-      </w:pPr>
-      <w:r>
-        <w:rPr>
-          <w:rFonts w:ascii="Arial" w:cs="Arial" w:eastAsia="Arial" w:hAnsi="Arial"/>
-          <w:color w:val="333333"/>
-          <w:sz w:val="21"/>
-          <w:szCs w:val="21"/>
-        </w:rPr>
-        <w:t xml:space="preserve">In pot-limit games, the maximum bet is the current pot size plus the amount needed to call. This means the dealer must track the pot total continuously. After multiple raises in a single round, the pot-limit calculation becomes: pot before action + all previous bets in this round + the amount needed to call the current bet. Dealers are frequently asked “what’s the pot?” and must answer immediately. In round-up raking environments, odd amounts from previous pot calculations make tracking even harder. This is one of the most requested features for dealer assistance technology.</w:t>
+        <w:t xml:space="preserve">Systematic Board Reading for Omaha Showdown</w:t>
+      </w:r>
+    </w:p>
+    <w:p>
+      <w:pPr>
+        <w:spacing w:after="160" w:line="276"/>
+      </w:pPr>
+      <w:r>
+        <w:rPr>
+          <w:rFonts w:ascii="Arial" w:cs="Arial" w:eastAsia="Arial" w:hAnsi="Arial"/>
+          <w:color w:val="333333"/>
+          <w:sz w:val="21"/>
+          <w:szCs w:val="21"/>
+        </w:rPr>
+        <w:t xml:space="preserve">The key to accurate Omaha hand reading is to read the board first, not the players’ hands. Before looking at any hole cards, the dealer classifies the board by what hands are possible, working from the highest possible hand downward. This top-down elimination approach is far more efficient than trying to evaluate each player’s 6 two-card combinations independently. The hierarchy: (1) Is the board paired? If yes, four of a kind and full houses are possible. (2) Are there three or more cards of one suit? If yes, flushes are possible. (3) Are there three or more connected or near-connected cards? If yes, straights are possible. (4) After eliminating the impossible, the dealer knows exactly which card combinations to look for in each player’s hand.</w:t>
+      </w:r>
+    </w:p>
+    <w:p>
+      <w:pPr>
+        <w:spacing w:after="160" w:line="276"/>
+      </w:pPr>
+      <w:r>
+        <w:rPr>
+          <w:rFonts w:ascii="Arial" w:cs="Arial" w:eastAsia="Arial" w:hAnsi="Arial"/>
+          <w:color w:val="333333"/>
+          <w:sz w:val="21"/>
+          <w:szCs w:val="21"/>
+        </w:rPr>
+        <w:t xml:space="preserve">The board reading hierarchy from highest to lowest: four of a kind (requires a paired board plus a player holding the matching pocket pair), full house (requires a paired board), flush (requires three or more suited board cards), straight (requires three or more connected board cards), three of a kind (set with unpaired board, or trips with paired board), two pair, one pair, high card. At each level, the dealer asks: ‘Is this hand possible given this board?’ If not, skip to the next level down. This is the same logical process a computer uses, and training dealers to think algorithmically — always starting from the top and working down — dramatically reduces showdown errors.</w:t>
       </w:r>
     </w:p>
     <w:p>
@@ -7011,35 +7039,77 @@
           <w:sz w:val="22"/>
           <w:szCs w:val="22"/>
         </w:rPr>
-        <w:t xml:space="preserve">Pot Tracking Across Streets in PLO</w:t>
-      </w:r>
-    </w:p>
-    <w:p>
-      <w:pPr>
-        <w:spacing w:after="160" w:line="276"/>
-      </w:pPr>
-      <w:r>
-        <w:rPr>
-          <w:rFonts w:ascii="Arial" w:cs="Arial" w:eastAsia="Arial" w:hAnsi="Arial"/>
-          <w:color w:val="333333"/>
-          <w:sz w:val="21"/>
-          <w:szCs w:val="21"/>
-        </w:rPr>
-        <w:t xml:space="preserve">The most critical discipline for a PLO dealer is knowing the pot total at every moment without physically counting it. After each betting round, before bringing bets into the center, the dealer calculates the new pot total: count the number of players, multiply by their bet, add any dead money from folds, and add the existing pot. Example: 4 players at 75 each = 300, plus 20 dead from pre-flop folders = 320. That number (320) must be locked in memory before the bets are merged into the pot. On the next street, if two players bet 150 each, the new total is 320 + 300 = 620. This incremental tracking is the only reliable method — reconstructing the pot total from a pile of mixed chips is nearly impossible without a physical count.</w:t>
-      </w:r>
-    </w:p>
-    <w:p>
-      <w:pPr>
-        <w:spacing w:after="160" w:line="276"/>
-      </w:pPr>
-      <w:r>
-        <w:rPr>
-          <w:rFonts w:ascii="Arial" w:cs="Arial" w:eastAsia="Arial" w:hAnsi="Arial"/>
-          <w:color w:val="333333"/>
-          <w:sz w:val="21"/>
-          <w:szCs w:val="21"/>
-        </w:rPr>
-        <w:t xml:space="preserve">When pulling in bets that include dead money from folders, keep the dead money physically separate until you have computed the total. This is an acceptable practice: the dead money sits next to the pot rather than being immediately pushed in. Once the dealer has the number, everything merges. The key discipline: never bring a flop, turn, or river until you know the pot total. Taking 5 to 10 extra seconds to verify the math is always preferable to calling a floor supervisor to count down the pot mid-hand.</w:t>
+        <w:t xml:space="preserve">Board Type Classification</w:t>
+      </w:r>
+    </w:p>
+    <w:p>
+      <w:pPr>
+        <w:spacing w:after="160" w:line="276"/>
+      </w:pPr>
+      <w:r>
+        <w:rPr>
+          <w:rFonts w:ascii="Arial" w:cs="Arial" w:eastAsia="Arial" w:hAnsi="Arial"/>
+          <w:color w:val="333333"/>
+          <w:sz w:val="21"/>
+          <w:szCs w:val="21"/>
+        </w:rPr>
+        <w:t xml:space="preserve">Unpaired board with no straight and no flush possible (e.g., K♠7♠Q♠9♣2): The best possible hand is two pair using two hole cards that match two board cards. No full houses, flushes, or straights are possible. The dealer only needs to check for two pair or a set if a player’s pocket pair matches a board card. These boards produce the simplest showdowns in Omaha.</w:t>
+      </w:r>
+    </w:p>
+    <w:p>
+      <w:pPr>
+        <w:spacing w:after="160" w:line="276"/>
+      </w:pPr>
+      <w:r>
+        <w:rPr>
+          <w:rFonts w:ascii="Arial" w:cs="Arial" w:eastAsia="Arial" w:hAnsi="Arial"/>
+          <w:color w:val="333333"/>
+          <w:sz w:val="21"/>
+          <w:szCs w:val="21"/>
+        </w:rPr>
+        <w:t xml:space="preserve">Possible straight boards: When three or more board cards can contribute to a straight, the dealer must identify which two-card combinations from a player’s hand would complete it. A four-straight board (four cards to a straight) means only one specific card value is needed from the hand, making straights very likely. A five-straight board (five consecutive cards on board) means any player with two cards that include a card above the top of the sequence has the best possible straight. The dealer must carefully verify that the player is using exactly two cards from their hand — a board of 5-6-7-8-9 does not give a straight to a player holding only a 10 with no other connector. They need two hand cards that work together with exactly three board cards.</w:t>
+      </w:r>
+    </w:p>
+    <w:p>
+      <w:pPr>
+        <w:spacing w:after="160" w:line="276"/>
+      </w:pPr>
+      <w:r>
+        <w:rPr>
+          <w:rFonts w:ascii="Arial" w:cs="Arial" w:eastAsia="Arial" w:hAnsi="Arial"/>
+          <w:color w:val="333333"/>
+          <w:sz w:val="21"/>
+          <w:szCs w:val="21"/>
+        </w:rPr>
+        <w:t xml:space="preserve">Flush boards: When three board cards share a suit, a flush is possible if a player holds two cards of that suit (using two from hand, three from board). With four suited board cards, a player needs only one card of that suit from their hand — but in Omaha, they still must use exactly two cards total, so the second card from their hand becomes a non-flush card paired with three suited board cards. With five suited board cards, every player with at least two cards of that suit has a flush; the winner is determined by who holds the highest card of that suit. The most common dealer error on flush boards: forgetting that the player must use TWO hand cards. A player with the ace of hearts and no other heart does NOT have a flush on a four-heart board in Omaha — they would need to use two hand cards and only three board cards, and they only have one heart.</w:t>
+      </w:r>
+    </w:p>
+    <w:p>
+      <w:pPr>
+        <w:spacing w:after="160" w:line="276"/>
+      </w:pPr>
+      <w:r>
+        <w:rPr>
+          <w:rFonts w:ascii="Arial" w:cs="Arial" w:eastAsia="Arial" w:hAnsi="Arial"/>
+          <w:color w:val="333333"/>
+          <w:sz w:val="21"/>
+          <w:szCs w:val="21"/>
+        </w:rPr>
+        <w:t xml:space="preserve">Paired boards: When the board contains a pair, full houses become possible. The dealer first checks for four of a kind (a player holding the other two cards matching the board pair — extremely rare but must be checked). Then checks for full houses: a player with a pocket pair matching any unpaired board card, or a player with one card matching the board pair and one matching another board card. On a paired board that also has flush possibilities, the dealer must check for the full house FIRST because it beats a flush. This ordering is critical — inexperienced dealers who spot a flush first and declare a winner before checking for a full house cause costly showdown errors.</w:t>
+      </w:r>
+    </w:p>
+    <w:p>
+      <w:pPr>
+        <w:spacing w:after="160" w:line="276"/>
+      </w:pPr>
+      <w:r>
+        <w:rPr>
+          <w:rFonts w:ascii="Arial" w:cs="Arial" w:eastAsia="Arial" w:hAnsi="Arial"/>
+          <w:color w:val="333333"/>
+          <w:sz w:val="21"/>
+          <w:szCs w:val="21"/>
+        </w:rPr>
+        <w:t xml:space="preserve">Two-pair boards (e.g., K-K-7-7-2): Full houses are very likely. Any player holding a king, a seven, or a deuce paired with another board card has a full house. Check for four of a kind first (pocket kings or pocket sevens), then evaluate full houses by rank. Three-of-a-kind boards (e.g., 9-9-9-K-3): Four of a kind is possible if a player holds the case nine. Otherwise, the best possible hand is a full house — the player uses all three nines from the board plus a pocket pair from their hand. The dealer must remember: exactly two cards from hand and three from board, so with trip nines on board, the player contributes a pocket pair and takes all three nines from the board for nines full.</w:t>
       </w:r>
     </w:p>
     <w:p>
@@ -7055,21 +7125,21 @@
           <w:sz w:val="22"/>
           <w:szCs w:val="22"/>
         </w:rPr>
-        <w:t xml:space="preserve">PLO Time Rake and Game Pace</w:t>
-      </w:r>
-    </w:p>
-    <w:p>
-      <w:pPr>
-        <w:spacing w:after="160" w:line="276"/>
-      </w:pPr>
-      <w:r>
-        <w:rPr>
-          <w:rFonts w:ascii="Arial" w:cs="Arial" w:eastAsia="Arial" w:hAnsi="Arial"/>
-          <w:color w:val="333333"/>
-          <w:sz w:val="21"/>
-          <w:szCs w:val="21"/>
-        </w:rPr>
-        <w:t xml:space="preserve">Most PLO games use a time rake rather than a per-hand pot rake. The casino charges each player a fixed amount per half hour (or per hour) instead of taking a percentage of each pot. Time rake is used because PLO naturally plays slower than Hold’em: four cards to deal instead of two, more complex betting decisions, pot-limit calculations that take time, and larger pots that require more chip handling. Fewer hands per hour means fewer rake drops, making per-hand raking uneconomical for the casino. For the dealer, time rake eliminates one entire category of mental work — no calculating the rake, no making change for the rake, no dropping the rake at the correct threshold. This makes PLO paradoxically more relaxing to deal than Hold’em for experienced dealers, despite the more complex pot math.</w:t>
+        <w:t xml:space="preserve">Stub Counting in Omaha</w:t>
+      </w:r>
+    </w:p>
+    <w:p>
+      <w:pPr>
+        <w:spacing w:after="160" w:line="276"/>
+      </w:pPr>
+      <w:r>
+        <w:rPr>
+          <w:rFonts w:ascii="Arial" w:cs="Arial" w:eastAsia="Arial" w:hAnsi="Arial"/>
+          <w:color w:val="333333"/>
+          <w:sz w:val="21"/>
+          <w:szCs w:val="21"/>
+        </w:rPr>
+        <w:t xml:space="preserve">Stub counting — verifying the correct number of cards remain in the deck — must be adjusted for Omaha’s increased card distribution. In a full 10-player Omaha game: 4 cards per player × 10 players = 40 hole cards, plus 3 burn cards, plus 5 community cards = 48 cards dealt. That leaves only 4 cards in the stub. In a 9-player game, the stub has 8 cards. Compare this to Hold’em: 10 players × 2 cards = 20 + 3 burns + 5 board = 28 cards, leaving 24 in the stub. Dealers accustomed to Hold’em stub counts are often surprised by how thin the Omaha stub is. With only 4 cards remaining at a full table, any dealing error — double-dealing, forgetting to burn, dealing to a mucked seat — is immediately apparent because the stub will not have enough cards to complete the board. In Big O (5 cards per player, 7-max): 5 × 7 = 35 + 3 burns + 5 board = 43, leaving 9 in the stub.</w:t>
       </w:r>
     </w:p>
     <w:p>
@@ -7085,21 +7155,21 @@
           <w:sz w:val="22"/>
           <w:szCs w:val="22"/>
         </w:rPr>
-        <w:t xml:space="preserve">PLO Memorization and Pattern Recognition</w:t>
-      </w:r>
-    </w:p>
-    <w:p>
-      <w:pPr>
-        <w:spacing w:after="160" w:line="276"/>
-      </w:pPr>
-      <w:r>
-        <w:rPr>
-          <w:rFonts w:ascii="Arial" w:cs="Arial" w:eastAsia="Arial" w:hAnsi="Arial"/>
-          <w:color w:val="333333"/>
-          <w:sz w:val="21"/>
-          <w:szCs w:val="21"/>
-        </w:rPr>
-        <w:t xml:space="preserve">Pot-limit calculations that seem daunting at first become memorized through repetition. In a 5/5 game, the first pot-sized raise is always 20. The first re-pot is always 70 (or 90 with a caller). These numbers repeat hand after hand, and within a few sessions the dealer knows them without calculating. The process is similar to dealing craps, where dealers memorize payout formulas through repetition rather than computing them fresh each time. Common PLO sequences (open to 20, re-pot to 70, caller makes it 90, re-pot to 310) become as automatic as dealing Hold’em. The challenging moments come when unusual bet sizes, all-ins for less, or odd structures create amounts that break the memorized patterns — and that is when the formula (3× previous bet + trail + pot) must be computed fresh.</w:t>
+        <w:t xml:space="preserve">Cash vs Tournament Chip Handling in Omaha</w:t>
+      </w:r>
+    </w:p>
+    <w:p>
+      <w:pPr>
+        <w:spacing w:after="160" w:line="276"/>
+      </w:pPr>
+      <w:r>
+        <w:rPr>
+          <w:rFonts w:ascii="Arial" w:cs="Arial" w:eastAsia="Arial" w:hAnsi="Arial"/>
+          <w:color w:val="333333"/>
+          <w:sz w:val="21"/>
+          <w:szCs w:val="21"/>
+        </w:rPr>
+        <w:t xml:space="preserve">Chip handling rules differ between cash games and tournaments in ways that affect Omaha dealing specifically, because of the frequency of split pots and pot stacking in hi-lo variants. In cash games, the dealer must use fingertips only when touching chips in the tray or the pot — no palming, no cupping, no picking up full stacks with the hand wrapped around them. This is a security protocol to prevent chip theft: fingertips-only contact ensures surveillance cameras can always see the chips and the dealer’s hands. In tournaments, the dealer can pick up chips with a full grip because tournament chips have no cash value and the security concern is eliminated. This distinction matters most in Omaha Hi-Lo and Big O where the dealer is frequently stacking, splitting, and moving chips between multiple pot halves. Tournament dealing allows faster chip handling, while cash game dealing prioritizes visible security over speed.</w:t>
       </w:r>
     </w:p>
     <w:p>
@@ -7115,6 +7185,140 @@
           <w:sz w:val="22"/>
           <w:szCs w:val="22"/>
         </w:rPr>
+        <w:t xml:space="preserve">Pot-Limit Calculation</w:t>
+      </w:r>
+    </w:p>
+    <w:p>
+      <w:pPr>
+        <w:spacing w:after="160" w:line="276"/>
+      </w:pPr>
+      <w:r>
+        <w:rPr>
+          <w:rFonts w:ascii="Arial" w:cs="Arial" w:eastAsia="Arial" w:hAnsi="Arial"/>
+          <w:color w:val="333333"/>
+          <w:sz w:val="21"/>
+          <w:szCs w:val="21"/>
+        </w:rPr>
+        <w:t xml:space="preserve">In pot-limit games, the maximum bet is the current pot size plus the amount needed to call. This means the dealer must track the pot total continuously. After multiple raises in a single round, the pot-limit calculation becomes: pot before action + all previous bets in this round + the amount needed to call the current bet. Dealers are frequently asked “what’s the pot?” and must answer immediately. In round-up raking environments, odd amounts from previous pot calculations make tracking even harder. This is one of the most requested features for dealer assistance technology.</w:t>
+      </w:r>
+    </w:p>
+    <w:p>
+      <w:pPr>
+        <w:spacing w:before="200" w:after="120"/>
+      </w:pPr>
+      <w:r>
+        <w:rPr>
+          <w:rFonts w:ascii="Arial" w:cs="Arial" w:eastAsia="Arial" w:hAnsi="Arial"/>
+          <w:b/>
+          <w:bCs/>
+          <w:color w:val="C0392B"/>
+          <w:sz w:val="22"/>
+          <w:szCs w:val="22"/>
+        </w:rPr>
+        <w:t xml:space="preserve">Pot Tracking Across Streets in PLO</w:t>
+      </w:r>
+    </w:p>
+    <w:p>
+      <w:pPr>
+        <w:spacing w:after="160" w:line="276"/>
+      </w:pPr>
+      <w:r>
+        <w:rPr>
+          <w:rFonts w:ascii="Arial" w:cs="Arial" w:eastAsia="Arial" w:hAnsi="Arial"/>
+          <w:color w:val="333333"/>
+          <w:sz w:val="21"/>
+          <w:szCs w:val="21"/>
+        </w:rPr>
+        <w:t xml:space="preserve">The most critical discipline for a PLO dealer is knowing the pot total at every moment without physically counting it. After each betting round, before bringing bets into the center, the dealer calculates the new pot total: count the number of players, multiply by their bet, add any dead money from folds, and add the existing pot. Example: 4 players at 75 each = 300, plus 20 dead from pre-flop folders = 320. That number (320) must be locked in memory before the bets are merged into the pot. On the next street, if two players bet 150 each, the new total is 320 + 300 = 620. This incremental tracking is the only reliable method — reconstructing the pot total from a pile of mixed chips is nearly impossible without a physical count.</w:t>
+      </w:r>
+    </w:p>
+    <w:p>
+      <w:pPr>
+        <w:spacing w:after="160" w:line="276"/>
+      </w:pPr>
+      <w:r>
+        <w:rPr>
+          <w:rFonts w:ascii="Arial" w:cs="Arial" w:eastAsia="Arial" w:hAnsi="Arial"/>
+          <w:color w:val="333333"/>
+          <w:sz w:val="21"/>
+          <w:szCs w:val="21"/>
+        </w:rPr>
+        <w:t xml:space="preserve">When pulling in bets that include dead money from folders, keep the dead money physically separate until you have computed the total. This is an acceptable practice: the dead money sits next to the pot rather than being immediately pushed in. Once the dealer has the number, everything merges. The key discipline: never bring a flop, turn, or river until you know the pot total. Taking 5 to 10 extra seconds to verify the math is always preferable to calling a floor supervisor to count down the pot mid-hand.</w:t>
+      </w:r>
+    </w:p>
+    <w:p>
+      <w:pPr>
+        <w:spacing w:before="200" w:after="120"/>
+      </w:pPr>
+      <w:r>
+        <w:rPr>
+          <w:rFonts w:ascii="Arial" w:cs="Arial" w:eastAsia="Arial" w:hAnsi="Arial"/>
+          <w:b/>
+          <w:bCs/>
+          <w:color w:val="C0392B"/>
+          <w:sz w:val="22"/>
+          <w:szCs w:val="22"/>
+        </w:rPr>
+        <w:t xml:space="preserve">PLO Time Rake and Game Pace</w:t>
+      </w:r>
+    </w:p>
+    <w:p>
+      <w:pPr>
+        <w:spacing w:after="160" w:line="276"/>
+      </w:pPr>
+      <w:r>
+        <w:rPr>
+          <w:rFonts w:ascii="Arial" w:cs="Arial" w:eastAsia="Arial" w:hAnsi="Arial"/>
+          <w:color w:val="333333"/>
+          <w:sz w:val="21"/>
+          <w:szCs w:val="21"/>
+        </w:rPr>
+        <w:t xml:space="preserve">Most PLO games use a time rake rather than a per-hand pot rake. The casino charges each player a fixed amount per half hour (or per hour) instead of taking a percentage of each pot. Time rake is used because PLO naturally plays slower than Hold’em: four cards to deal instead of two, more complex betting decisions, pot-limit calculations that take time, and larger pots that require more chip handling. Fewer hands per hour means fewer rake drops, making per-hand raking uneconomical for the casino. For the dealer, time rake eliminates one entire category of mental work — no calculating the rake, no making change for the rake, no dropping the rake at the correct threshold. This makes PLO paradoxically more relaxing to deal than Hold’em for experienced dealers, despite the more complex pot math.</w:t>
+      </w:r>
+    </w:p>
+    <w:p>
+      <w:pPr>
+        <w:spacing w:before="200" w:after="120"/>
+      </w:pPr>
+      <w:r>
+        <w:rPr>
+          <w:rFonts w:ascii="Arial" w:cs="Arial" w:eastAsia="Arial" w:hAnsi="Arial"/>
+          <w:b/>
+          <w:bCs/>
+          <w:color w:val="C0392B"/>
+          <w:sz w:val="22"/>
+          <w:szCs w:val="22"/>
+        </w:rPr>
+        <w:t xml:space="preserve">PLO Memorization and Pattern Recognition</w:t>
+      </w:r>
+    </w:p>
+    <w:p>
+      <w:pPr>
+        <w:spacing w:after="160" w:line="276"/>
+      </w:pPr>
+      <w:r>
+        <w:rPr>
+          <w:rFonts w:ascii="Arial" w:cs="Arial" w:eastAsia="Arial" w:hAnsi="Arial"/>
+          <w:color w:val="333333"/>
+          <w:sz w:val="21"/>
+          <w:szCs w:val="21"/>
+        </w:rPr>
+        <w:t xml:space="preserve">Pot-limit calculations that seem daunting at first become memorized through repetition. In a 5/5 game, the first pot-sized raise is always 20. The first re-pot is always 70 (or 90 with a caller). These numbers repeat hand after hand, and within a few sessions the dealer knows them without calculating. The process is similar to dealing craps, where dealers memorize payout formulas through repetition rather than computing them fresh each time. Common PLO sequences (open to 20, re-pot to 70, caller makes it 90, re-pot to 310) become as automatic as dealing Hold’em. The challenging moments come when unusual bet sizes, all-ins for less, or odd structures create amounts that break the memorized patterns — and that is when the formula (3× previous bet + trail + pot) must be computed fresh.</w:t>
+      </w:r>
+    </w:p>
+    <w:p>
+      <w:pPr>
+        <w:spacing w:before="200" w:after="120"/>
+      </w:pPr>
+      <w:r>
+        <w:rPr>
+          <w:rFonts w:ascii="Arial" w:cs="Arial" w:eastAsia="Arial" w:hAnsi="Arial"/>
+          <w:b/>
+          <w:bCs/>
+          <w:color w:val="C0392B"/>
+          <w:sz w:val="22"/>
+          <w:szCs w:val="22"/>
+        </w:rPr>
         <w:t xml:space="preserve">Dealing with Difficult PLO Players</w:t>
       </w:r>
     </w:p>
@@ -7182,7 +7386,7 @@
           <w:sz w:val="21"/>
           <w:szCs w:val="21"/>
         </w:rPr>
-        <w:t xml:space="preserve">Must deal 4 cards per player (up to 40 cards for a full table). Must calculate pot-limit maximum bets in real time and announce them on request. Must track the running pot total across all streets without physical counting. Must correctly evaluate 4-card hands using exactly 2 hole cards and 3 community cards at showdown, which requires evaluating 60 possible 5-card combinations per player. Must never misapply the Omaha hand-reading rule. Must instantly detect when a player’s chip amount matches, exceeds, or falls short of the pot maximum. Must apply the all-in-for-less trail rule, the cash-game small-blind-equals-big-blind rule, and the trail-excludes-active-player rule simultaneously. Pot-limit calculation is perhaps the strongest single argument for robotic dealing accuracy over human dealing — a computer computes the pot instantly and never loses track of the running total.</w:t>
+        <w:t xml:space="preserve">Must deal 4 cards per player (up to 40 cards for a full table). Must calculate pot-limit maximum bets in real time and announce them on request. Must track the running pot total across all streets without physical counting. Must correctly evaluate 4-card hands using exactly 2 hole cards and 3 community cards at showdown, which requires evaluating 60 possible 5-card combinations per player. Must implement systematic board reading: classify the board type (unpaired, paired, two-pair, trips, flush-possible, straight-possible) and evaluate hands from highest possible downward (four of a kind → full house → flush → straight → trips → two pair → pair → high card). Must never misapply the Omaha hand-reading rule. Must instantly detect when a player’s chip amount matches, exceeds, or falls short of the pot maximum. Must apply the all-in-for-less trail rule, the cash-game small-blind-equals-big-blind rule, and the trail-excludes-active-player rule simultaneously. Must perform stub count verification adjusted for Omaha card distribution (4 cards per player leaves only 4 remaining at a full 10-player table). Must differentiate chip handling protocols between cash (fingertips only) and tournament (full grip allowed) modes. Pot-limit calculation is perhaps the strongest single argument for robotic dealing accuracy over human dealing — a computer computes the pot instantly and never loses track of the running total.</w:t>
       </w:r>
     </w:p>
     <w:p>
@@ -7252,7 +7456,169 @@
           <w:sz w:val="21"/>
           <w:szCs w:val="21"/>
         </w:rPr>
-        <w:t xml:space="preserve">Must evaluate high and low hands independently for every player. Must correctly determine low qualification (8 or better, no pairs). Must handle scoops (no qualifying low) and split pots. Must support 4-card and 5-card Omaha variants. Hand evaluation complexity makes this the game variant where robotic accuracy provides the most dramatic improvement over human dealing.</w:t>
+        <w:t xml:space="preserve">Must evaluate high and low hands independently for every player using different two-card combinations for each direction. Must correctly determine low qualification (8 or better, five unpaired cards, exactly 2 from hand and 3 from board). Must first scan the board for three or more cards eight or below before attempting low evaluation. Must handle scoops (no qualifying low) and split pots. Must implement the kill sequence: push high first, muck high hand, then push low, muck low hand. Must enforce odd chip rules: high always gets the odd chip between halves; worst position gets the odd chip within tied lows. Must support both cash (stack during hand) and tournament (stack after river only) pot stacking modes. Must support 4-card and 5-card Omaha variants. Hand evaluation complexity makes this the game variant where robotic accuracy provides the most dramatic improvement over human dealing.</w:t>
+      </w:r>
+    </w:p>
+    <w:p>
+      <w:pPr>
+        <w:spacing w:before="200" w:after="120"/>
+      </w:pPr>
+      <w:r>
+        <w:rPr>
+          <w:rFonts w:ascii="Arial" w:cs="Arial" w:eastAsia="Arial" w:hAnsi="Arial"/>
+          <w:b/>
+          <w:bCs/>
+          <w:color w:val="C0392B"/>
+          <w:sz w:val="22"/>
+          <w:szCs w:val="22"/>
+        </w:rPr>
+        <w:t xml:space="preserve">Low Hand Reading Methodology</w:t>
+      </w:r>
+    </w:p>
+    <w:p>
+      <w:pPr>
+        <w:spacing w:after="160" w:line="276"/>
+      </w:pPr>
+      <w:r>
+        <w:rPr>
+          <w:rFonts w:ascii="Arial" w:cs="Arial" w:eastAsia="Arial" w:hAnsi="Arial"/>
+          <w:color w:val="333333"/>
+          <w:sz w:val="21"/>
+          <w:szCs w:val="21"/>
+        </w:rPr>
+        <w:t xml:space="preserve">Reading the low in Omaha Hi-Lo requires a fundamentally different mental process than reading the high. A qualifying low hand must consist of five unpaired cards, all ranked eight or below, using exactly two cards from the player’s hand and three from the board. The dealer’s first step is to examine the board: are there at least three cards ranked eight or below? If not, no qualifying low is possible, and the high hand scoops the entire pot — no splitting needed. If yes, identify which three board cards will be used for the low (the three lowest unpaired cards on the board). Then examine each player’s hand for two cards ranked eight or below that do not duplicate the board’s low cards. Aces always count as low for the low half.</w:t>
+      </w:r>
+    </w:p>
+    <w:p>
+      <w:pPr>
+        <w:spacing w:after="160" w:line="276"/>
+      </w:pPr>
+      <w:r>
+        <w:rPr>
+          <w:rFonts w:ascii="Arial" w:cs="Arial" w:eastAsia="Arial" w:hAnsi="Arial"/>
+          <w:color w:val="333333"/>
+          <w:sz w:val="21"/>
+          <w:szCs w:val="21"/>
+        </w:rPr>
+        <w:t xml:space="preserve">Identifying the nut low: the nut low is the lowest possible five-card combination given the three low board cards. On a board of 2-5-8-K-Q, the three qualifying board cards are 2-5-8. The nut low requires a player to hold A-3 (making A-2-3-5-8). The second nut low is A-4 (making A-2-4-5-8), then A-6 (making A-2-5-6-8), and so on. The dealer reads lows from the bottom up, starting with ace and working through the lowest available non-duplicating cards. Lows are compared starting from the highest card downward: 8-5-3-2-A beats 8-6-3-2-A because the second-highest card (5 vs 6) is lower. This ‘read from the top’ comparison is counterintuitive for dealers accustomed to high-hand evaluation and is a frequent source of errors.</w:t>
+      </w:r>
+    </w:p>
+    <w:p>
+      <w:pPr>
+        <w:spacing w:after="160" w:line="276"/>
+      </w:pPr>
+      <w:r>
+        <w:rPr>
+          <w:rFonts w:ascii="Arial" w:cs="Arial" w:eastAsia="Arial" w:hAnsi="Arial"/>
+          <w:color w:val="333333"/>
+          <w:sz w:val="21"/>
+          <w:szCs w:val="21"/>
+        </w:rPr>
+        <w:t xml:space="preserve">Four-to-a-low boards (four cards eight or below on the board) are deceptively tricky. The player still must contribute exactly two cards from their hand, and those two cards must not pair any of the board’s low cards. With four low board cards, the dealer selects the three lowest unpaired board cards and then needs the player to have two cards that improve the low below the fourth board card. Common dealer error: seeing four low cards on the board and assuming everyone with an ace has a low. The ace must be accompanied by a second qualifying low card that does not pair any board card. A player holding A-K on a board of 2-4-6-8-J does not have a qualifying low — the king does not qualify, and they need TWO low cards from their hand.</w:t>
+      </w:r>
+    </w:p>
+    <w:p>
+      <w:pPr>
+        <w:spacing w:before="200" w:after="120"/>
+      </w:pPr>
+      <w:r>
+        <w:rPr>
+          <w:rFonts w:ascii="Arial" w:cs="Arial" w:eastAsia="Arial" w:hAnsi="Arial"/>
+          <w:b/>
+          <w:bCs/>
+          <w:color w:val="C0392B"/>
+          <w:sz w:val="22"/>
+          <w:szCs w:val="22"/>
+        </w:rPr>
+        <w:t xml:space="preserve">Split Pot Showdown Procedure in Omaha Hi-Lo</w:t>
+      </w:r>
+    </w:p>
+    <w:p>
+      <w:pPr>
+        <w:spacing w:after="160" w:line="276"/>
+      </w:pPr>
+      <w:r>
+        <w:rPr>
+          <w:rFonts w:ascii="Arial" w:cs="Arial" w:eastAsia="Arial" w:hAnsi="Arial"/>
+          <w:color w:val="333333"/>
+          <w:sz w:val="21"/>
+          <w:szCs w:val="21"/>
+        </w:rPr>
+        <w:t xml:space="preserve">The standard showdown procedure for Omaha Hi-Lo split pots follows a strict kill sequence. After the river action is complete and the pot is stacked: (1) Evaluate all remaining hands for the high. Determine the high winner. Push half the pot to the high winner. Immediately kill (muck) the high winner’s hand. (2) Evaluate the remaining hands for the low. Determine the low winner. Push the other half to the low winner. Kill the low winner’s hand. The kill-after-push sequence is critical: once a hand’s pot portion is pushed, that hand is immediately mucked so it cannot be confused with hands still in contention for the other half. If the same player wins both high and low, they scoop the entire pot and no splitting is necessary.</w:t>
+      </w:r>
+    </w:p>
+    <w:p>
+      <w:pPr>
+        <w:spacing w:after="160" w:line="276"/>
+      </w:pPr>
+      <w:r>
+        <w:rPr>
+          <w:rFonts w:ascii="Arial" w:cs="Arial" w:eastAsia="Arial" w:hAnsi="Arial"/>
+          <w:color w:val="333333"/>
+          <w:sz w:val="21"/>
+          <w:szCs w:val="21"/>
+        </w:rPr>
+        <w:t xml:space="preserve">When two or more players tie for the low, the low half is further divided. Push the high half first, kill the high hand. Then split the low half equally among the tying low hands. In a three-way low chop, divide the low half into three equal portions. Any remainder chips follow the odd chip rule for the low portion. After pushing each low share, kill that player’s hand immediately before pushing the next share. This orderly kill sequence prevents any confusion about which hands have been paid and which are still pending. Never gather hands to the center — always leave cards in front of their respective players until that player’s portion is pushed.</w:t>
+      </w:r>
+    </w:p>
+    <w:p>
+      <w:pPr>
+        <w:spacing w:before="200" w:after="120"/>
+      </w:pPr>
+      <w:r>
+        <w:rPr>
+          <w:rFonts w:ascii="Arial" w:cs="Arial" w:eastAsia="Arial" w:hAnsi="Arial"/>
+          <w:b/>
+          <w:bCs/>
+          <w:color w:val="C0392B"/>
+          <w:sz w:val="22"/>
+          <w:szCs w:val="22"/>
+        </w:rPr>
+        <w:t xml:space="preserve">Odd Chip Rules in Omaha Hi-Lo</w:t>
+      </w:r>
+    </w:p>
+    <w:p>
+      <w:pPr>
+        <w:spacing w:after="160" w:line="276"/>
+      </w:pPr>
+      <w:r>
+        <w:rPr>
+          <w:rFonts w:ascii="Arial" w:cs="Arial" w:eastAsia="Arial" w:hAnsi="Arial"/>
+          <w:color w:val="333333"/>
+          <w:sz w:val="21"/>
+          <w:szCs w:val="21"/>
+        </w:rPr>
+        <w:t xml:space="preserve">In Omaha Hi-Lo, the odd chip between the high and low halves of the pot ALWAYS goes to the high hand. This is not position-based like the odd chip rule in Hold’em ties — it is direction-based. The high hand receives the extra chip regardless of seat position. This rule is universal across WSOP, TDA, and virtually all house rules. If the low half is further split between two or more tying low hands and an odd chip remains within that low portion, that odd chip goes to the player in worst position (closest to receiving the button next, i.e., the first player to act post-flop among the tied low winners). If three players chop the low and two odd chips remain, the two worst-position players each receive one extra chip. The hierarchy is: (1) odd chip between high and low always goes to high, (2) odd chip within a tied low goes to worst position, (3) odd chip within a tied high follows standard high-card-by-suit tiebreaker rules.</w:t>
+      </w:r>
+    </w:p>
+    <w:p>
+      <w:pPr>
+        <w:spacing w:before="200" w:after="120"/>
+      </w:pPr>
+      <w:r>
+        <w:rPr>
+          <w:rFonts w:ascii="Arial" w:cs="Arial" w:eastAsia="Arial" w:hAnsi="Arial"/>
+          <w:b/>
+          <w:bCs/>
+          <w:color w:val="C0392B"/>
+          <w:sz w:val="22"/>
+          <w:szCs w:val="22"/>
+        </w:rPr>
+        <w:t xml:space="preserve">Pot Stacking Timing: Cash vs Tournament</w:t>
+      </w:r>
+    </w:p>
+    <w:p>
+      <w:pPr>
+        <w:spacing w:after="160" w:line="276"/>
+      </w:pPr>
+      <w:r>
+        <w:rPr>
+          <w:rFonts w:ascii="Arial" w:cs="Arial" w:eastAsia="Arial" w:hAnsi="Arial"/>
+          <w:color w:val="333333"/>
+          <w:sz w:val="21"/>
+          <w:szCs w:val="21"/>
+        </w:rPr>
+        <w:t xml:space="preserve">The timing of when to stack the pot differs between cash games and tournaments and is particularly important in hi-lo split games where stacking is a prerequisite for an accurate split. In cash games, the dealer may begin stacking the pot during the hand as action progresses — organizing chips by denomination while players are still betting on earlier streets. This saves time at showdown and is considered acceptable practice. In tournaments, particularly under WSOP rules, the dealer should not stack the pot until the river card is dealt. The rationale: stacking during the hand can slow down the action (players may hesitate while the dealer is handling chips), and visible pot organization can inadvertently communicate pot size information that influences betting decisions. Once the river is out and all action is complete, the dealer stacks by denomination with the largest denomination closest to the dealer, creating an organized display that can be quickly and accurately divided in half for the split.</w:t>
       </w:r>
     </w:p>
     <w:p>

</xml_diff>

<commit_message>
Expand Section 9.4 with all four stud variants and core stud procedures
Incorporates Mixed Games Lesson 6 (TruePokerDealer): adds eight-player max
card math, Seventh Street stub management (three scenarios), up-card pitch
technique, ante/bring-in procedure, complete vs raise distinction, action
order across streets, burn card discipline, showdown order, and announcing
possible hands. Adds new subsections for Stud Hi-Lo 8 or Better, Razz, and
Stud Hi-Lo Regular with variant-specific rules. Comprehensive robotic
requirement updated for all four stud variants.

https://claude.ai/code/session_01LLEXfPXvBSATequm3rLG4v
</commit_message>
<xml_diff>
--- a/docs/Deployment_Bible.docx
+++ b/docs/Deployment_Bible.docx
@@ -7894,21 +7894,21 @@
           <w:sz w:val="22"/>
           <w:szCs w:val="22"/>
         </w:rPr>
-        <w:t xml:space="preserve">Picking Up Up-Cards — Dead Hand Rule</w:t>
-      </w:r>
-    </w:p>
-    <w:p>
-      <w:pPr>
-        <w:spacing w:after="160" w:line="276"/>
-      </w:pPr>
-      <w:r>
-        <w:rPr>
-          <w:rFonts w:ascii="Arial" w:cs="Arial" w:eastAsia="Arial" w:hAnsi="Arial"/>
-          <w:color w:val="333333"/>
-          <w:sz w:val="21"/>
-          <w:szCs w:val="21"/>
-        </w:rPr>
-        <w:t xml:space="preserve">In stud poker, if a player picks up their face-up cards while facing action (a bet they must respond to), the hand is supposed to be dead. This rule exists because the up-cards are public information that other players have used to make decisions — removing them from view compromises game integrity. Proper mucking in stud is turning all up-cards face-down and pushing them forward. However, enforcement is inconsistent because players routinely touch and rearrange their cards. If a player picks up their up-cards and the dealer identifies it, the dealer should say ‘you picked up your up-cards — your hand is supposed to be dead.’ If the player complies, proceed. If there is any resistance, call the floor immediately. As with all hand-killing situations, the dealer should never force the issue.</w:t>
+        <w:t xml:space="preserve">Eight-Player Maximum and Card Mathematics</w:t>
+      </w:r>
+    </w:p>
+    <w:p>
+      <w:pPr>
+        <w:spacing w:after="160" w:line="276"/>
+      </w:pPr>
+      <w:r>
+        <w:rPr>
+          <w:rFonts w:ascii="Arial" w:cs="Arial" w:eastAsia="Arial" w:hAnsi="Arial"/>
+          <w:color w:val="333333"/>
+          <w:sz w:val="21"/>
+          <w:szCs w:val="21"/>
+        </w:rPr>
+        <w:t xml:space="preserve">All stud variants are eight-player maximum games. The reason is purely mathematical: 8 players × 7 cards each = 56 cards, which already exceeds the 52-card deck. The maximum was chosen so that a full table can almost always complete a hand, but in rare cases where all eight players stay to Seventh Street, the deck will run short. By contrast, in Hold’em with 10 players: 10 × 2 = 20 hole cards + 3 burns + 5 board = 28 cards dealt, leaving 24 in the stub. Stud’s card consumption is dramatically higher, which drives several unique procedures that do not exist in community-card games.</w:t>
       </w:r>
     </w:p>
     <w:p>
@@ -7924,21 +7924,35 @@
           <w:sz w:val="22"/>
           <w:szCs w:val="22"/>
         </w:rPr>
-        <w:t xml:space="preserve">Bring-In with Short Stacks</w:t>
-      </w:r>
-    </w:p>
-    <w:p>
-      <w:pPr>
-        <w:spacing w:after="160" w:line="276"/>
-      </w:pPr>
-      <w:r>
-        <w:rPr>
-          <w:rFonts w:ascii="Arial" w:cs="Arial" w:eastAsia="Arial" w:hAnsi="Arial"/>
-          <w:color w:val="333333"/>
-          <w:sz w:val="21"/>
-          <w:szCs w:val="21"/>
-        </w:rPr>
-        <w:t xml:space="preserve">If the player dealt the lowest card by suit is all-in for the ante (meaning they have zero chips remaining after posting the ante), they cannot post the bring-in. In this case, betting starts to the left of that player, and the first player with chips must bet at least the bring-in amount or fold. If that player is also all-in, it continues leftward until a player with chips is reached. The all-in player for the ante is eligible to win only the antes.</w:t>
+        <w:t xml:space="preserve">Seventh Street Stub Management</w:t>
+      </w:r>
+    </w:p>
+    <w:p>
+      <w:pPr>
+        <w:spacing w:after="160" w:line="276"/>
+      </w:pPr>
+      <w:r>
+        <w:rPr>
+          <w:rFonts w:ascii="Arial" w:cs="Arial" w:eastAsia="Arial" w:hAnsi="Arial"/>
+          <w:color w:val="333333"/>
+          <w:sz w:val="21"/>
+          <w:szCs w:val="21"/>
+        </w:rPr>
+        <w:t xml:space="preserve">Before dealing Seventh Street (the final down card), the dealer must verify that enough cards remain in the stub. The required count is: one burn card + one card per remaining player + one card that stays on the cut card at the bottom of the stub (never dealt). So for five remaining players, the dealer needs 5 + 2 = 7 cards. For eight players, the dealer needs 8 + 2 = 10 cards. During the Sixth Street betting round, the dealer discreetly counts the stub without exposing any cards.</w:t>
+      </w:r>
+    </w:p>
+    <w:p>
+      <w:pPr>
+        <w:spacing w:after="160" w:line="276"/>
+      </w:pPr>
+      <w:r>
+        <w:rPr>
+          <w:rFonts w:ascii="Arial" w:cs="Arial" w:eastAsia="Arial" w:hAnsi="Arial"/>
+          <w:color w:val="333333"/>
+          <w:sz w:val="21"/>
+          <w:szCs w:val="21"/>
+        </w:rPr>
+        <w:t xml:space="preserve">Three scenarios arise. Scenario 1: the stub has enough cards. The dealer burns and deals a face-down card to each remaining player normally. Scenario 2: the stub alone does not have enough, but adding the burn cards from earlier streets brings the total to the required number. The dealer picks up the burn cards (without showing them), adds them to the stub, performs a mini-shuffle (riffle or strip as best as possible with the small number of cards), cuts, then burns one card and deals the final down cards normally. Scenario 3: even after adding the burn cards, there are not enough cards to give each player an individual down card. In this case, the dealer adds the burn cards to the stub, performs the mini-shuffle and cut, burns one card, and deals a single face-up community card that all remaining players share as their seventh card. A betting round still occurs after this community card. This community card scenario is rare but must be handled correctly when it arises — it typically only occurs when six or more players remain at Seventh Street.</w:t>
       </w:r>
     </w:p>
     <w:p>
@@ -7954,21 +7968,21 @@
           <w:sz w:val="22"/>
           <w:szCs w:val="22"/>
         </w:rPr>
-        <w:t xml:space="preserve">Matching High Hands — Suit Tiebreaker</w:t>
-      </w:r>
-    </w:p>
-    <w:p>
-      <w:pPr>
-        <w:spacing w:after="160" w:line="276"/>
-      </w:pPr>
-      <w:r>
-        <w:rPr>
-          <w:rFonts w:ascii="Arial" w:cs="Arial" w:eastAsia="Arial" w:hAnsi="Arial"/>
-          <w:color w:val="333333"/>
-          <w:sz w:val="21"/>
-          <w:szCs w:val="21"/>
-        </w:rPr>
-        <w:t xml:space="preserve">When two or more players show the same highest hand on a given street (e.g., both have a queen showing on Fourth Street), the TDA recommends determining who acts first by the highest card by suit. Suit rankings in poker are reverse alphabetical by first letter: Spades (highest), Hearts, Diamonds, Clubs (lowest). So if two players both show a queen, the queen of spades acts before the queen of diamonds. The WSOP historically used ‘closest to the left of the dealer’ for this tiebreak, but the TDA is recommending the suit-based method for consistency across all stud variants, including Razz.</w:t>
+        <w:t xml:space="preserve">Up-Card Pitch Technique</w:t>
+      </w:r>
+    </w:p>
+    <w:p>
+      <w:pPr>
+        <w:spacing w:after="160" w:line="276"/>
+      </w:pPr>
+      <w:r>
+        <w:rPr>
+          <w:rFonts w:ascii="Arial" w:cs="Arial" w:eastAsia="Arial" w:hAnsi="Arial"/>
+          <w:color w:val="333333"/>
+          <w:sz w:val="21"/>
+          <w:szCs w:val="21"/>
+        </w:rPr>
+        <w:t xml:space="preserve">Dealing face-up cards in stud requires a specific technique: push the top card off the deck with the thumb, grip it near the lower edge (not the top corner — the dealer needs room for the middle finger to project the card), flip it face-up in the hand, and pitch it to the player in one fluid motion. The critical discipline: do not pause to look at the card after flipping it. There is a strong tendency for dealers to flip the card, examine it, and then pitch — this slows the game significantly when dealing up-cards to eight players across multiple streets. The dealer’s eyes should follow the cards after they land to read the board, not during the pitch. Stud requires the dealer to know what every up-card is (for determining action order and identifying pairs), but this reading happens after all cards for that street are dealt, not during the pitch.</w:t>
       </w:r>
     </w:p>
     <w:p>
@@ -7984,21 +7998,35 @@
           <w:sz w:val="22"/>
           <w:szCs w:val="22"/>
         </w:rPr>
-        <w:t xml:space="preserve">Fourth Street Pair Showing — Double Bet Option</w:t>
-      </w:r>
-    </w:p>
-    <w:p>
-      <w:pPr>
-        <w:spacing w:after="160" w:line="276"/>
-      </w:pPr>
-      <w:r>
-        <w:rPr>
-          <w:rFonts w:ascii="Arial" w:cs="Arial" w:eastAsia="Arial" w:hAnsi="Arial"/>
-          <w:color w:val="333333"/>
-          <w:sz w:val="21"/>
-          <w:szCs w:val="21"/>
-        </w:rPr>
-        <w:t xml:space="preserve">An old stud rule allows any player at the table to bet the big bet increment (instead of the small bet) on Fourth Street when any player’s first two up-cards form a pair. The WSOP currently enforces this rule. However, the TDA recommends eliminating it, based on feedback from longtime high-stakes stud players (notably Barry Greenstein) who argue the rule kills action, confuses players, and serves no modern purpose. The rule originated from an era when a pair showing would sometimes halt the hand entirely — allowing a bigger bet was a workaround. That concern is no longer relevant. Dealers should know both approaches: enforce the double-bet option at WSOP events, but be aware the TDA is phasing it out.</w:t>
+        <w:t xml:space="preserve">Ante Collection and the Bring-In</w:t>
+      </w:r>
+    </w:p>
+    <w:p>
+      <w:pPr>
+        <w:spacing w:after="160" w:line="276"/>
+      </w:pPr>
+      <w:r>
+        <w:rPr>
+          <w:rFonts w:ascii="Arial" w:cs="Arial" w:eastAsia="Arial" w:hAnsi="Arial"/>
+          <w:color w:val="333333"/>
+          <w:sz w:val="21"/>
+          <w:szCs w:val="21"/>
+        </w:rPr>
+        <w:t xml:space="preserve">Before dealing each stud hand, the dealer collects antes from all players at the table. Unlike blinds in Hold’em, there is no dealer button in stud — every seated player posts an equal ante. The dealer collects antes by going in one consistent direction around the table (typically left to right) to avoid accidentally skipping a seat. If a player misses an ante, they simply miss the hand — there is no ‘missed ante’ button and no makeup requirement on the next hand. After collecting antes, the dealer cuts the deck and begins pitching immediately. In a 4/8 limit game, the typical ante is $1 with a $1 forced bring-in and a $4 complete. Tournament antes scale with the blind/limit structure.</w:t>
+      </w:r>
+    </w:p>
+    <w:p>
+      <w:pPr>
+        <w:spacing w:after="160" w:line="276"/>
+      </w:pPr>
+      <w:r>
+        <w:rPr>
+          <w:rFonts w:ascii="Arial" w:cs="Arial" w:eastAsia="Arial" w:hAnsi="Arial"/>
+          <w:color w:val="333333"/>
+          <w:sz w:val="21"/>
+          <w:szCs w:val="21"/>
+        </w:rPr>
+        <w:t xml:space="preserve">After dealing third street (two down cards and one up card to each player), the player with the lowest up-card by rank and suit is forced to ‘bring it in’ — post a mandatory bet at the bring-in amount ($1 in a 4/8 game). They may alternatively complete to the lower limit ($4). The deuce of clubs is always the lowest possible card and will always bring it in if dealt face-up. If the bring-in player puts out an unclear amount between the bring-in and the complete (e.g., $2 in a 4/8 game), the halfway rule applies: amounts at or below the midpoint are pushed back to the bring-in; amounts above the midpoint force a complete.</w:t>
       </w:r>
     </w:p>
     <w:p>
@@ -8014,21 +8042,21 @@
           <w:sz w:val="22"/>
           <w:szCs w:val="22"/>
         </w:rPr>
-        <w:t xml:space="preserve">Exposed Card on Initial Deal in Stud</w:t>
-      </w:r>
-    </w:p>
-    <w:p>
-      <w:pPr>
-        <w:spacing w:after="160" w:line="276"/>
-      </w:pPr>
-      <w:r>
-        <w:rPr>
-          <w:rFonts w:ascii="Arial" w:cs="Arial" w:eastAsia="Arial" w:hAnsi="Arial"/>
-          <w:color w:val="333333"/>
-          <w:sz w:val="21"/>
-          <w:szCs w:val="21"/>
-        </w:rPr>
-        <w:t xml:space="preserve">If a down-card is accidentally flipped face-up during the initial stud deal, the WSOP rules call for a misdeal. The TDA takes a different approach (based on random card theory): continue dealing, but when it is time to deal the up-card to that player, deal them a down card instead. The exposed card becomes their up-card since it is already public information. Under this approach, the player may also be eligible for the bring-in (if their exposed card is the lowest). In the old rules, an exposed player was exempt from the bring-in — which created a perverse incentive and is being phased out.</w:t>
+        <w:t xml:space="preserve">Complete vs Raise Distinction</w:t>
+      </w:r>
+    </w:p>
+    <w:p>
+      <w:pPr>
+        <w:spacing w:after="160" w:line="276"/>
+      </w:pPr>
+      <w:r>
+        <w:rPr>
+          <w:rFonts w:ascii="Arial" w:cs="Arial" w:eastAsia="Arial" w:hAnsi="Arial"/>
+          <w:color w:val="333333"/>
+          <w:sz w:val="21"/>
+          <w:szCs w:val="21"/>
+        </w:rPr>
+        <w:t xml:space="preserve">A critical stud rule: the complete does not count as a raise. In a 4/8 game with a $1 bring-in, if a player completes to $4, that is not considered a raise — it is a completion of the initial bet. Subsequent players may then raise to $8 (first raise), $12 (second raise), and cap at $16 (third raise), following the standard ‘bet plus three raises’ structure. The distinction matters because the bring-in is a forced partial bet, not a full bet. Going from $1 to $4 merely brings the action up to the normal betting level. This rule applies in all four stud variants (Stud High, Stud Hi-Lo 8 or Better, Razz, and Stud Hi-Lo Regular).</w:t>
       </w:r>
     </w:p>
     <w:p>
@@ -8044,21 +8072,21 @@
           <w:sz w:val="22"/>
           <w:szCs w:val="22"/>
         </w:rPr>
-        <w:t xml:space="preserve">Exposed Card on Seventh Street (Final Down Card)</w:t>
-      </w:r>
-    </w:p>
-    <w:p>
-      <w:pPr>
-        <w:spacing w:after="160" w:line="276"/>
-      </w:pPr>
-      <w:r>
-        <w:rPr>
-          <w:rFonts w:ascii="Arial" w:cs="Arial" w:eastAsia="Arial" w:hAnsi="Arial"/>
-          <w:color w:val="333333"/>
-          <w:sz w:val="21"/>
-          <w:szCs w:val="21"/>
-        </w:rPr>
-        <w:t xml:space="preserve">If a card is accidentally exposed on Seventh Street (the final down card), the replacement procedure depends on the ruleset. TDA recommended procedure: set the exposed card aside, perform a mini-wash and shuffle of the remaining stub, then pitch replacement cards from the shuffled stub. This ensures the replacement cards are random. WSOP procedure: the exposed card stays with the player, and the player may declare themselves all-in (opting out of further betting to avoid the information disadvantage). The TDA is moving away from the all-in declaration option. Critical note: this is always a floor call. The dealer never handles a premature or exposed card situation alone in stud.</w:t>
+        <w:t xml:space="preserve">Action Order Across Streets</w:t>
+      </w:r>
+    </w:p>
+    <w:p>
+      <w:pPr>
+        <w:spacing w:after="160" w:line="276"/>
+      </w:pPr>
+      <w:r>
+        <w:rPr>
+          <w:rFonts w:ascii="Arial" w:cs="Arial" w:eastAsia="Arial" w:hAnsi="Arial"/>
+          <w:color w:val="333333"/>
+          <w:sz w:val="21"/>
+          <w:szCs w:val="21"/>
+        </w:rPr>
+        <w:t xml:space="preserve">In seven-card stud high (the standard variant), the lowest up-card by suit brings it in on Third Street, and the highest hand showing acts first on Fourth through Seventh Streets. When two players show identical high hands (e.g., both have a queen showing), the tiebreaker varies: the WSOP traditionally uses ‘closest to the left of the dealer,’ while the TDA recommends using suit rankings (highest suit acts first). From Fifth Street onward, the higher betting limit applies ($8 in a 4/8 game). Critically, the action leader changes every street based on the visible cards — unlike Hold’em where position relative to the button is fixed for the entire hand.</w:t>
       </w:r>
     </w:p>
     <w:p>
@@ -8074,21 +8102,21 @@
           <w:sz w:val="22"/>
           <w:szCs w:val="22"/>
         </w:rPr>
-        <w:t xml:space="preserve">Dealing to Absent Players in Stud Tournaments</w:t>
-      </w:r>
-    </w:p>
-    <w:p>
-      <w:pPr>
-        <w:spacing w:after="160" w:line="276"/>
-      </w:pPr>
-      <w:r>
-        <w:rPr>
-          <w:rFonts w:ascii="Arial" w:cs="Arial" w:eastAsia="Arial" w:hAnsi="Arial"/>
-          <w:color w:val="333333"/>
-          <w:sz w:val="21"/>
-          <w:szCs w:val="21"/>
-        </w:rPr>
-        <w:t xml:space="preserve">When a player is absent in a stud tournament, the WSOP traditionally deals their up-card position to preserve card order (the absent player’s cards are then mucked, but the card that would have gone to them still comes off the deck). The TDA is recommending that rooms stop doing this, citing random card theory: the cards that each player receives are random regardless of whether a phantom card was burned for an absent seat. Online poker platforms (e.g., Full Tilt) did not even maintain a 52-card deck in their software — they drew random cards from a pool — and the game was perfectly fair. Preserving card order adds complexity without improving fairness. However, WSOP auditions still expect this procedure, so dealers should know both methods.</w:t>
+        <w:t xml:space="preserve">Burn Card Discipline in Stud</w:t>
+      </w:r>
+    </w:p>
+    <w:p>
+      <w:pPr>
+        <w:spacing w:after="160" w:line="276"/>
+      </w:pPr>
+      <w:r>
+        <w:rPr>
+          <w:rFonts w:ascii="Arial" w:cs="Arial" w:eastAsia="Arial" w:hAnsi="Arial"/>
+          <w:color w:val="333333"/>
+          <w:sz w:val="21"/>
+          <w:szCs w:val="21"/>
+        </w:rPr>
+        <w:t xml:space="preserve">For dealers accustomed to Hold’em, remembering to burn a card before each street in stud is surprisingly difficult. In Hold’em, the burn is mentally linked to dealing community cards (flop, turn, river). In stud, there are no community cards — the burn happens before pitching individual up-cards (or down-cards on Seventh Street) to each player. Without the community-card trigger, Hold’em dealers frequently forget to burn, especially on Fourth and Fifth Streets where the dealing rhythm feels like simply continuing the pitch. The consequences of a missed burn are significant: it affects card distribution for all remaining players and streets. Dealers transitioning to stud should consciously pause before each street to verify the burn.</w:t>
       </w:r>
     </w:p>
     <w:p>
@@ -8104,6 +8132,276 @@
           <w:sz w:val="22"/>
           <w:szCs w:val="22"/>
         </w:rPr>
+        <w:t xml:space="preserve">Showdown Order in Stud Games</w:t>
+      </w:r>
+    </w:p>
+    <w:p>
+      <w:pPr>
+        <w:spacing w:after="160" w:line="276"/>
+      </w:pPr>
+      <w:r>
+        <w:rPr>
+          <w:rFonts w:ascii="Arial" w:cs="Arial" w:eastAsia="Arial" w:hAnsi="Arial"/>
+          <w:color w:val="333333"/>
+          <w:sz w:val="21"/>
+          <w:szCs w:val="21"/>
+        </w:rPr>
+        <w:t xml:space="preserve">When all players check on the final betting round and no one volunteers to show, the showdown order depends on the variant. In seven-card stud high and stud hi-lo eight or better, the player with the highest visible board must show first. In Razz and stud hi-lo regular (which follow Razz conventions for action), the player with the lowest visible board must show first. Per WSOP rules, every tabled hand must be read by the dealer regardless of whether it appears to be a winner — the dealer reads each hand completely before mucking losing hands.</w:t>
+      </w:r>
+    </w:p>
+    <w:p>
+      <w:pPr>
+        <w:spacing w:before="200" w:after="120"/>
+      </w:pPr>
+      <w:r>
+        <w:rPr>
+          <w:rFonts w:ascii="Arial" w:cs="Arial" w:eastAsia="Arial" w:hAnsi="Arial"/>
+          <w:b/>
+          <w:bCs/>
+          <w:color w:val="C0392B"/>
+          <w:sz w:val="22"/>
+          <w:szCs w:val="22"/>
+        </w:rPr>
+        <w:t xml:space="preserve">Announcing Possible Hands in Stud</w:t>
+      </w:r>
+    </w:p>
+    <w:p>
+      <w:pPr>
+        <w:spacing w:after="160" w:line="276"/>
+      </w:pPr>
+      <w:r>
+        <w:rPr>
+          <w:rFonts w:ascii="Arial" w:cs="Arial" w:eastAsia="Arial" w:hAnsi="Arial"/>
+          <w:color w:val="333333"/>
+          <w:sz w:val="21"/>
+          <w:szCs w:val="21"/>
+        </w:rPr>
+        <w:t xml:space="preserve">Some casinos require the dealer to announce possible hand types based on visible up-cards — for example, ‘possible flush’ when four cards of the same suit are showing, or ‘possible straight’ when four connected cards are visible. This practice has fallen out of favor at higher stakes where players consider it unnecessary and even patronizing. The practice of announcing pairs on board is more commonly retained. Dealers should determine their room’s specific expectations rather than assuming one approach applies everywhere, as this is one of the most inconsistently applied rules across the industry.</w:t>
+      </w:r>
+    </w:p>
+    <w:p>
+      <w:pPr>
+        <w:spacing w:before="200" w:after="120"/>
+      </w:pPr>
+      <w:r>
+        <w:rPr>
+          <w:rFonts w:ascii="Arial" w:cs="Arial" w:eastAsia="Arial" w:hAnsi="Arial"/>
+          <w:b/>
+          <w:bCs/>
+          <w:color w:val="C0392B"/>
+          <w:sz w:val="22"/>
+          <w:szCs w:val="22"/>
+        </w:rPr>
+        <w:t xml:space="preserve">Picking Up Up-Cards — Dead Hand Rule</w:t>
+      </w:r>
+    </w:p>
+    <w:p>
+      <w:pPr>
+        <w:spacing w:after="160" w:line="276"/>
+      </w:pPr>
+      <w:r>
+        <w:rPr>
+          <w:rFonts w:ascii="Arial" w:cs="Arial" w:eastAsia="Arial" w:hAnsi="Arial"/>
+          <w:color w:val="333333"/>
+          <w:sz w:val="21"/>
+          <w:szCs w:val="21"/>
+        </w:rPr>
+        <w:t xml:space="preserve">In stud poker, if a player picks up their face-up cards while facing action (a bet they must respond to), the hand is supposed to be dead. This rule exists because the up-cards are public information that other players have used to make decisions — removing them from view compromises game integrity. Proper mucking in stud is turning all up-cards face-down and pushing them forward. However, enforcement is inconsistent because players routinely touch and rearrange their cards. If a player picks up their up-cards and the dealer identifies it, the dealer should say ‘you picked up your up-cards — your hand is supposed to be dead.’ If the player complies, proceed. If there is any resistance, call the floor immediately. As with all hand-killing situations, the dealer should never force the issue.</w:t>
+      </w:r>
+    </w:p>
+    <w:p>
+      <w:pPr>
+        <w:spacing w:before="200" w:after="120"/>
+      </w:pPr>
+      <w:r>
+        <w:rPr>
+          <w:rFonts w:ascii="Arial" w:cs="Arial" w:eastAsia="Arial" w:hAnsi="Arial"/>
+          <w:b/>
+          <w:bCs/>
+          <w:color w:val="C0392B"/>
+          <w:sz w:val="22"/>
+          <w:szCs w:val="22"/>
+        </w:rPr>
+        <w:t xml:space="preserve">Bring-In with Short Stacks</w:t>
+      </w:r>
+    </w:p>
+    <w:p>
+      <w:pPr>
+        <w:spacing w:after="160" w:line="276"/>
+      </w:pPr>
+      <w:r>
+        <w:rPr>
+          <w:rFonts w:ascii="Arial" w:cs="Arial" w:eastAsia="Arial" w:hAnsi="Arial"/>
+          <w:color w:val="333333"/>
+          <w:sz w:val="21"/>
+          <w:szCs w:val="21"/>
+        </w:rPr>
+        <w:t xml:space="preserve">If the player dealt the lowest card by suit is all-in for the ante (meaning they have zero chips remaining after posting the ante), they cannot post the bring-in. In this case, betting starts to the left of that player, and the first player with chips must bet at least the bring-in amount or fold. If that player is also all-in, it continues leftward until a player with chips is reached. The all-in player for the ante is eligible to win only the antes.</w:t>
+      </w:r>
+    </w:p>
+    <w:p>
+      <w:pPr>
+        <w:spacing w:before="200" w:after="120"/>
+      </w:pPr>
+      <w:r>
+        <w:rPr>
+          <w:rFonts w:ascii="Arial" w:cs="Arial" w:eastAsia="Arial" w:hAnsi="Arial"/>
+          <w:b/>
+          <w:bCs/>
+          <w:color w:val="C0392B"/>
+          <w:sz w:val="22"/>
+          <w:szCs w:val="22"/>
+        </w:rPr>
+        <w:t xml:space="preserve">Matching High Hands — Suit Tiebreaker</w:t>
+      </w:r>
+    </w:p>
+    <w:p>
+      <w:pPr>
+        <w:spacing w:after="160" w:line="276"/>
+      </w:pPr>
+      <w:r>
+        <w:rPr>
+          <w:rFonts w:ascii="Arial" w:cs="Arial" w:eastAsia="Arial" w:hAnsi="Arial"/>
+          <w:color w:val="333333"/>
+          <w:sz w:val="21"/>
+          <w:szCs w:val="21"/>
+        </w:rPr>
+        <w:t xml:space="preserve">When two or more players show the same highest hand on a given street (e.g., both have a queen showing on Fourth Street), the TDA recommends determining who acts first by the highest card by suit. Suit rankings in poker are reverse alphabetical by first letter: Spades (highest), Hearts, Diamonds, Clubs (lowest). So if two players both show a queen, the queen of spades acts before the queen of diamonds. The WSOP historically used ‘closest to the left of the dealer’ for this tiebreak, but the TDA is recommending the suit-based method for consistency across all stud variants, including Razz.</w:t>
+      </w:r>
+    </w:p>
+    <w:p>
+      <w:pPr>
+        <w:spacing w:before="200" w:after="120"/>
+      </w:pPr>
+      <w:r>
+        <w:rPr>
+          <w:rFonts w:ascii="Arial" w:cs="Arial" w:eastAsia="Arial" w:hAnsi="Arial"/>
+          <w:b/>
+          <w:bCs/>
+          <w:color w:val="C0392B"/>
+          <w:sz w:val="22"/>
+          <w:szCs w:val="22"/>
+        </w:rPr>
+        <w:t xml:space="preserve">Fourth Street Pair Showing — Double Bet Option</w:t>
+      </w:r>
+    </w:p>
+    <w:p>
+      <w:pPr>
+        <w:spacing w:after="160" w:line="276"/>
+      </w:pPr>
+      <w:r>
+        <w:rPr>
+          <w:rFonts w:ascii="Arial" w:cs="Arial" w:eastAsia="Arial" w:hAnsi="Arial"/>
+          <w:color w:val="333333"/>
+          <w:sz w:val="21"/>
+          <w:szCs w:val="21"/>
+        </w:rPr>
+        <w:t xml:space="preserve">An old stud rule allows any player at the table to bet the big bet increment (instead of the small bet) on Fourth Street when any player’s first two up-cards form a pair. The WSOP currently enforces this rule. However, the TDA recommends eliminating it, based on feedback from longtime high-stakes stud players (notably Barry Greenstein) who argue the rule kills action, confuses players, and serves no modern purpose. The rule originated from an era when a pair showing would sometimes halt the hand entirely — allowing a bigger bet was a workaround. That concern is no longer relevant. Dealers should know both approaches: enforce the double-bet option at WSOP events, but be aware the TDA is phasing it out.</w:t>
+      </w:r>
+    </w:p>
+    <w:p>
+      <w:pPr>
+        <w:spacing w:before="200" w:after="120"/>
+      </w:pPr>
+      <w:r>
+        <w:rPr>
+          <w:rFonts w:ascii="Arial" w:cs="Arial" w:eastAsia="Arial" w:hAnsi="Arial"/>
+          <w:b/>
+          <w:bCs/>
+          <w:color w:val="C0392B"/>
+          <w:sz w:val="22"/>
+          <w:szCs w:val="22"/>
+        </w:rPr>
+        <w:t xml:space="preserve">Exposed Card on Initial Deal in Stud</w:t>
+      </w:r>
+    </w:p>
+    <w:p>
+      <w:pPr>
+        <w:spacing w:after="160" w:line="276"/>
+      </w:pPr>
+      <w:r>
+        <w:rPr>
+          <w:rFonts w:ascii="Arial" w:cs="Arial" w:eastAsia="Arial" w:hAnsi="Arial"/>
+          <w:color w:val="333333"/>
+          <w:sz w:val="21"/>
+          <w:szCs w:val="21"/>
+        </w:rPr>
+        <w:t xml:space="preserve">If a down-card is accidentally flipped face-up during the initial stud deal, the WSOP rules call for a misdeal. The TDA takes a different approach (based on random card theory): continue dealing, but when it is time to deal the up-card to that player, deal them a down card instead. The exposed card becomes their up-card since it is already public information. Under this approach, the player may also be eligible for the bring-in (if their exposed card is the lowest). In the old rules, an exposed player was exempt from the bring-in — which created a perverse incentive and is being phased out.</w:t>
+      </w:r>
+    </w:p>
+    <w:p>
+      <w:pPr>
+        <w:spacing w:before="200" w:after="120"/>
+      </w:pPr>
+      <w:r>
+        <w:rPr>
+          <w:rFonts w:ascii="Arial" w:cs="Arial" w:eastAsia="Arial" w:hAnsi="Arial"/>
+          <w:b/>
+          <w:bCs/>
+          <w:color w:val="C0392B"/>
+          <w:sz w:val="22"/>
+          <w:szCs w:val="22"/>
+        </w:rPr>
+        <w:t xml:space="preserve">Exposed Card on Seventh Street (Final Down Card)</w:t>
+      </w:r>
+    </w:p>
+    <w:p>
+      <w:pPr>
+        <w:spacing w:after="160" w:line="276"/>
+      </w:pPr>
+      <w:r>
+        <w:rPr>
+          <w:rFonts w:ascii="Arial" w:cs="Arial" w:eastAsia="Arial" w:hAnsi="Arial"/>
+          <w:color w:val="333333"/>
+          <w:sz w:val="21"/>
+          <w:szCs w:val="21"/>
+        </w:rPr>
+        <w:t xml:space="preserve">If a card is accidentally exposed on Seventh Street (the final down card), the replacement procedure depends on the ruleset. TDA recommended procedure: set the exposed card aside, perform a mini-wash and shuffle of the remaining stub, then pitch replacement cards from the shuffled stub. This ensures the replacement cards are random. WSOP procedure: the exposed card stays with the player, and the player may declare themselves all-in (opting out of further betting to avoid the information disadvantage). The TDA is moving away from the all-in declaration option. Critical note: this is always a floor call. The dealer never handles a premature or exposed card situation alone in stud.</w:t>
+      </w:r>
+    </w:p>
+    <w:p>
+      <w:pPr>
+        <w:spacing w:before="200" w:after="120"/>
+      </w:pPr>
+      <w:r>
+        <w:rPr>
+          <w:rFonts w:ascii="Arial" w:cs="Arial" w:eastAsia="Arial" w:hAnsi="Arial"/>
+          <w:b/>
+          <w:bCs/>
+          <w:color w:val="C0392B"/>
+          <w:sz w:val="22"/>
+          <w:szCs w:val="22"/>
+        </w:rPr>
+        <w:t xml:space="preserve">Dealing to Absent Players in Stud Tournaments</w:t>
+      </w:r>
+    </w:p>
+    <w:p>
+      <w:pPr>
+        <w:spacing w:after="160" w:line="276"/>
+      </w:pPr>
+      <w:r>
+        <w:rPr>
+          <w:rFonts w:ascii="Arial" w:cs="Arial" w:eastAsia="Arial" w:hAnsi="Arial"/>
+          <w:color w:val="333333"/>
+          <w:sz w:val="21"/>
+          <w:szCs w:val="21"/>
+        </w:rPr>
+        <w:t xml:space="preserve">When a player is absent in a stud tournament, the WSOP traditionally deals their up-card position to preserve card order (the absent player’s cards are then mucked, but the card that would have gone to them still comes off the deck). The TDA is recommending that rooms stop doing this, citing random card theory: the cards that each player receives are random regardless of whether a phantom card was burned for an absent seat. Online poker platforms (e.g., Full Tilt) did not even maintain a 52-card deck in their software — they drew random cards from a pool — and the game was perfectly fair. Preserving card order adds complexity without improving fairness. However, WSOP auditions still expect this procedure, so dealers should know both methods.</w:t>
+      </w:r>
+    </w:p>
+    <w:p>
+      <w:pPr>
+        <w:spacing w:before="200" w:after="120"/>
+      </w:pPr>
+      <w:r>
+        <w:rPr>
+          <w:rFonts w:ascii="Arial" w:cs="Arial" w:eastAsia="Arial" w:hAnsi="Arial"/>
+          <w:b/>
+          <w:bCs/>
+          <w:color w:val="C0392B"/>
+          <w:sz w:val="22"/>
+          <w:szCs w:val="22"/>
+        </w:rPr>
         <w:t xml:space="preserve">Premature Card on Later Streets in Stud</w:t>
       </w:r>
     </w:p>
@@ -8123,6 +8421,180 @@
     </w:p>
     <w:p>
       <w:pPr>
+        <w:spacing w:before="200" w:after="120"/>
+      </w:pPr>
+      <w:r>
+        <w:rPr>
+          <w:rFonts w:ascii="Arial" w:cs="Arial" w:eastAsia="Arial" w:hAnsi="Arial"/>
+          <w:b/>
+          <w:bCs/>
+          <w:color w:val="C0392B"/>
+          <w:sz w:val="22"/>
+          <w:szCs w:val="22"/>
+        </w:rPr>
+        <w:t xml:space="preserve">Seven-Card Stud Hi-Lo Split Eight or Better</w:t>
+      </w:r>
+    </w:p>
+    <w:p>
+      <w:pPr>
+        <w:spacing w:after="160" w:line="276"/>
+      </w:pPr>
+      <w:r>
+        <w:rPr>
+          <w:rFonts w:ascii="Arial" w:cs="Arial" w:eastAsia="Arial" w:hAnsi="Arial"/>
+          <w:color w:val="333333"/>
+          <w:sz w:val="21"/>
+          <w:szCs w:val="21"/>
+        </w:rPr>
+        <w:t xml:space="preserve">In stud hi-lo eight or better, the pot is split between the best high hand and the best qualifying low hand. The qualifying low requires five cards of different ranks, all eight or below — the same qualification as Omaha Hi-Lo. Straights and flushes do not count against the low. If no player has a qualifying low at showdown, the high hand scoops the entire pot. Each player’s best five-card high hand and best five-card low hand are evaluated independently from their seven cards — a player may use different cards for each direction.</w:t>
+      </w:r>
+    </w:p>
+    <w:p>
+      <w:pPr>
+        <w:spacing w:after="160" w:line="276"/>
+      </w:pPr>
+      <w:r>
+        <w:rPr>
+          <w:rFonts w:ascii="Arial" w:cs="Arial" w:eastAsia="Arial" w:hAnsi="Arial"/>
+          <w:color w:val="333333"/>
+          <w:sz w:val="21"/>
+          <w:szCs w:val="21"/>
+        </w:rPr>
+        <w:t xml:space="preserve">Dealing and betting structure: the game is dealt identically to seven-card stud high — two down, one up, three more up, one final down, with antes and a bring-in. The low card by suit still brings it in on Third Street, and the high hand showing acts first from Fourth Street onward. However, unlike regular stud high, the open pair on Fourth Street does NOT affect the betting limits — it remains at the lower increment. This distinction trips up many dealers: the double-bet option for an open pair exists only in stud high, not in any hi-lo variant.</w:t>
+      </w:r>
+    </w:p>
+    <w:p>
+      <w:pPr>
+        <w:spacing w:after="160" w:line="276"/>
+      </w:pPr>
+      <w:r>
+        <w:rPr>
+          <w:rFonts w:ascii="Arial" w:cs="Arial" w:eastAsia="Arial" w:hAnsi="Arial"/>
+          <w:color w:val="333333"/>
+          <w:sz w:val="21"/>
+          <w:szCs w:val="21"/>
+        </w:rPr>
+        <w:t xml:space="preserve">Split pot procedure: the WSOP manual instructs dealers to stack the pot after the final card is dealt (not during the hand). After all action is complete, the dealer stacks by denomination with largest closest to the dealer, divides in half, and pushes the high half first, then the low half. The odd chip between high and low goes to the high hand. If the low half is further split between tying low hands, the odd chip within the low goes to the player in worst position (closest to receiving the button next — though in stud there is no button, so ‘closest to the dealer’s left’ is typically used). Heads-up on the river in a split-pot game: the WSOP prefers leaving bets in front of the players rather than dragging them into the center, to speed up the split.</w:t>
+      </w:r>
+    </w:p>
+    <w:p>
+      <w:pPr>
+        <w:spacing w:before="200" w:after="120"/>
+      </w:pPr>
+      <w:r>
+        <w:rPr>
+          <w:rFonts w:ascii="Arial" w:cs="Arial" w:eastAsia="Arial" w:hAnsi="Arial"/>
+          <w:b/>
+          <w:bCs/>
+          <w:color w:val="C0392B"/>
+          <w:sz w:val="22"/>
+          <w:szCs w:val="22"/>
+        </w:rPr>
+        <w:t xml:space="preserve">Seven-Card Razz</w:t>
+      </w:r>
+    </w:p>
+    <w:p>
+      <w:pPr>
+        <w:spacing w:after="160" w:line="276"/>
+      </w:pPr>
+      <w:r>
+        <w:rPr>
+          <w:rFonts w:ascii="Arial" w:cs="Arial" w:eastAsia="Arial" w:hAnsi="Arial"/>
+          <w:color w:val="333333"/>
+          <w:sz w:val="21"/>
+          <w:szCs w:val="21"/>
+        </w:rPr>
+        <w:t xml:space="preserve">Razz is pure lowball stud — the lowest five-card hand wins the entire pot. There is no qualifier; the best hand is always awarded regardless of how high it is. The best possible Razz hand is the wheel: 5-4-3-2-A (ace is always low in Razz). Straights and flushes do not count against the hand. Pairs do count against the player — a hand with a pair is worse than any unpaired hand. If a player’s best five-card selection still contains a pair, it is evaluated as a paired hand (e.g., sixes with a king kicker). Low hands are compared starting from the highest card downward: a 10-5 low (10-5-4-3-2) loses to a 9-7 low (9-7-6-5-A) because 10 is higher than 9 at the first comparison point.</w:t>
+      </w:r>
+    </w:p>
+    <w:p>
+      <w:pPr>
+        <w:spacing w:after="160" w:line="276"/>
+      </w:pPr>
+      <w:r>
+        <w:rPr>
+          <w:rFonts w:ascii="Arial" w:cs="Arial" w:eastAsia="Arial" w:hAnsi="Arial"/>
+          <w:color w:val="333333"/>
+          <w:sz w:val="21"/>
+          <w:szCs w:val="21"/>
+        </w:rPr>
+        <w:t xml:space="preserve">Key rule differences from stud high: the HIGH card by rank and suit brings it in on Third Street (the king of spades is always the bring-in card). From Fourth Street onward, the LOWEST hand showing acts first — the opposite of stud high. When two players tie for the lowest visible hand, the tiebreaker follows the same pattern: WSOP uses closest to the left of the dealer, while TDA recommends suit rankings. The betting structure is identical (lower limit on Third and Fourth Streets, higher limit from Fifth Street onward), and the complete-vs-raise distinction still applies. Pot stacking is not required since Razz is not a split-pot game — the entire pot goes to one winner.</w:t>
+      </w:r>
+    </w:p>
+    <w:p>
+      <w:pPr>
+        <w:spacing w:after="160" w:line="276"/>
+      </w:pPr>
+      <w:r>
+        <w:rPr>
+          <w:rFonts w:ascii="Arial" w:cs="Arial" w:eastAsia="Arial" w:hAnsi="Arial"/>
+          <w:color w:val="333333"/>
+          <w:sz w:val="21"/>
+          <w:szCs w:val="21"/>
+        </w:rPr>
+        <w:t xml:space="preserve">Misdeal and exposed card rules are the same as in all stud variants. However, because Razz reverses the desirability of high and low cards, an exposed low card on the initial deal is especially damaging to the player (it reveals the strength of their hand). The WSOP misdeal rule for any exposed card on first or second street applies equally in Razz.</w:t>
+      </w:r>
+    </w:p>
+    <w:p>
+      <w:pPr>
+        <w:spacing w:before="200" w:after="120"/>
+      </w:pPr>
+      <w:r>
+        <w:rPr>
+          <w:rFonts w:ascii="Arial" w:cs="Arial" w:eastAsia="Arial" w:hAnsi="Arial"/>
+          <w:b/>
+          <w:bCs/>
+          <w:color w:val="C0392B"/>
+          <w:sz w:val="22"/>
+          <w:szCs w:val="22"/>
+        </w:rPr>
+        <w:t xml:space="preserve">Seven-Card Stud Hi-Lo Split Regular (No Qualifier)</w:t>
+      </w:r>
+    </w:p>
+    <w:p>
+      <w:pPr>
+        <w:spacing w:after="160" w:line="276"/>
+      </w:pPr>
+      <w:r>
+        <w:rPr>
+          <w:rFonts w:ascii="Arial" w:cs="Arial" w:eastAsia="Arial" w:hAnsi="Arial"/>
+          <w:color w:val="333333"/>
+          <w:sz w:val="21"/>
+          <w:szCs w:val="21"/>
+        </w:rPr>
+        <w:t xml:space="preserve">This variant splits the pot between the best high hand and the best Razz (low) hand with no qualifying requirement. Every pot is always split — there is no possibility of the high hand scooping due to no qualifying low, because every seven-card hand produces some five-card low (even if it is a poor one like a king-high). The low hand is evaluated using Razz rules: straights and flushes do not count, ace is low, pairs count against the hand, and comparison starts from the highest card downward.</w:t>
+      </w:r>
+    </w:p>
+    <w:p>
+      <w:pPr>
+        <w:spacing w:after="160" w:line="276"/>
+      </w:pPr>
+      <w:r>
+        <w:rPr>
+          <w:rFonts w:ascii="Arial" w:cs="Arial" w:eastAsia="Arial" w:hAnsi="Arial"/>
+          <w:color w:val="333333"/>
+          <w:sz w:val="21"/>
+          <w:szCs w:val="21"/>
+        </w:rPr>
+        <w:t xml:space="preserve">Action conventions follow Razz rules rather than stud high: the high card by rank and suit brings it in on Third Street, and the lowest hand showing acts first from Fourth Street onward. Showdown order (when all check on the river) also follows Razz: the lowest visible board shows first. The open pair on Fourth Street does not change the betting limit (this rule only exists in stud high). The odd chip between high and low goes to the high hand, consistent with all hi-lo games.</w:t>
+      </w:r>
+    </w:p>
+    <w:p>
+      <w:pPr>
+        <w:spacing w:after="160" w:line="276"/>
+      </w:pPr>
+      <w:r>
+        <w:rPr>
+          <w:rFonts w:ascii="Arial" w:cs="Arial" w:eastAsia="Arial" w:hAnsi="Arial"/>
+          <w:color w:val="333333"/>
+          <w:sz w:val="21"/>
+          <w:szCs w:val="21"/>
+        </w:rPr>
+        <w:t xml:space="preserve">The community card procedure (when the stub runs short on Seventh Street) is especially relevant in this variant because players are motivated to stay in hands longer — even a weak high hand might have a competitive low, and vice versa. With more players reaching Seventh Street, the likelihood of needing the burn-card shuffle or a community card is higher than in stud high or Razz.</w:t>
+      </w:r>
+    </w:p>
+    <w:p>
+      <w:pPr>
         <w:spacing w:after="160" w:line="276"/>
       </w:pPr>
       <w:r>
@@ -8143,7 +8615,7 @@
           <w:sz w:val="21"/>
           <w:szCs w:val="21"/>
         </w:rPr>
-        <w:t xml:space="preserve">Must deal cards face-up and face-down in alternating sequences across multiple rounds. Must read visible hands to determine betting order using suit tiebreakers. Must track antes and bring-in bets including short all-in scenarios. Must manage up to 56 cards in play simultaneously (8 players x 7 cards). Must correctly handle exposed cards using either WSOP or TDA procedures per configuration. Must track which cards are public information vs. private. A robotic system eliminates the most common stud dealing errors: flashing down-cards, dealing to the wrong player, and misreading which hand acts first. Stud is the variant where human dealer errors are most frequent due to the complex multi-round dealing pattern.</w:t>
+        <w:t xml:space="preserve">Must deal cards face-up and face-down in alternating sequences across multiple rounds for all four stud variants (Stud High, Stud Hi-Lo 8 or Better, Razz, Stud Hi-Lo Regular). Must implement variant-specific action rules: lowest card brings it in and high hand leads in Stud High and Stud Hi-Lo 8OB; highest card brings it in and low hand leads in Razz and Stud Hi-Lo Regular. Must read visible hands to determine betting order using suit tiebreakers, with action leader potentially changing every street. Must track antes and bring-in bets including short all-in scenarios. Must manage up to 56 cards in play simultaneously (8 players × 7 cards). Must implement the complete-vs-raise distinction (complete is not a raise). Must enforce the open pair double-bet option on Fourth Street in Stud High only (not in any other variant). Must monitor stub count and execute the three Seventh Street scenarios: deal normally, shuffle in burn cards, or deal a community card. Must correctly handle exposed cards using either WSOP or TDA procedures per configuration. Must evaluate high hands, Razz hands, and qualifying lows (8 or better) depending on variant. Must perform split-pot procedures in hi-lo variants: stack after river, push high first, odd chip to high. Must track which cards are public information vs. private for all players across all streets. A robotic system eliminates the most common stud dealing errors: flashing down-cards, forgetting to burn, dealing to the wrong player, misreading which hand acts first, and stub miscounts leading to dealing errors on Seventh Street.</w:t>
       </w:r>
     </w:p>
     <w:p>

</xml_diff>

<commit_message>
Expand Sections 6.9, 9.2, 9.3 with limit Omaha procedures
Incorporates Mixed Games Lesson 2 (TruePokerDealer): adds four-card muck
verification for Omaha folds, framing protocol (frame only as you improve),
50% all-in raise rule with cascading plateau example for limit games, always
stack pot in hi-lo even when no low is possible, evaluate high before low
discipline, and limit Omaha player expectation management.

https://claude.ai/code/session_01LLEXfPXvBSATequm3rLG4v
</commit_message>
<xml_diff>
--- a/docs/Deployment_Bible.docx
+++ b/docs/Deployment_Bible.docx
@@ -4757,52 +4757,35 @@
           <w:sz w:val="22"/>
           <w:szCs w:val="22"/>
         </w:rPr>
-        <w:t xml:space="preserve">All-In for Less Than the Blind</w:t>
-      </w:r>
-    </w:p>
-    <w:p>
-      <w:pPr>
-        <w:spacing w:after="160" w:line="276"/>
-      </w:pPr>
-      <w:r>
-        <w:rPr>
-          <w:rFonts w:ascii="Arial" w:cs="Arial" w:eastAsia="Arial" w:hAnsi="Arial"/>
-          <w:color w:val="333333"/>
-          <w:sz w:val="21"/>
-          <w:szCs w:val="21"/>
-        </w:rPr>
-        <w:t xml:space="preserve">In tournaments, a player can go all-in for less than the big blind. They are only eligible to win that amount from each other player. In cash games, house rules vary: some rooms require a minimum of one big blind to play a hand, while others allow any legitimate chip amount. In tournaments specifically, if the blinds are 200/400 with a 400 big blind ante and a player has exactly 400 chips, the ante is posted first. If they win, they only get the antes back. If they had 500, the 400 goes to the ante and only 100 goes toward their big blind — they can only win 100 from each player’s bet in addition to the antes.</w:t>
-      </w:r>
-    </w:p>
-    <w:p>
-      <w:pPr>
-        <w:pStyle w:val="Heading2"/>
-        <w:spacing w:before="280" w:after="160"/>
-      </w:pPr>
-      <w:r>
-        <w:rPr>
-          <w:rFonts w:ascii="Arial" w:cs="Arial" w:eastAsia="Arial" w:hAnsi="Arial"/>
-          <w:b/>
-          <w:bCs/>
-          <w:color w:val="2C3E50"/>
-          <w:sz w:val="26"/>
-          <w:szCs w:val="26"/>
-        </w:rPr>
-        <w:t xml:space="preserve">6.10 Table Communication and Player Confidence</w:t>
-      </w:r>
-    </w:p>
-    <w:p>
-      <w:pPr>
-        <w:spacing w:after="160" w:line="276"/>
-      </w:pPr>
-      <w:r>
-        <w:rPr>
-          <w:rFonts w:ascii="Arial" w:cs="Arial" w:eastAsia="Arial" w:hAnsi="Arial"/>
-          <w:color w:val="333333"/>
-          <w:sz w:val="21"/>
-          <w:szCs w:val="21"/>
-        </w:rPr>
-        <w:t xml:space="preserve">Side pots and multi-way all-ins are the scenario where dealer communication skills matter most. Players are not comfortable in these situations because they have seen dealers make mistakes with their money. The dealer’s job is to earn trust through clear, deliberate communication. Every action should be announced before it is taken.</w:t>
+        <w:t xml:space="preserve">The 50% Rule: All-In for Less Than a Full Raise in Limit</w:t>
+      </w:r>
+    </w:p>
+    <w:p>
+      <w:pPr>
+        <w:spacing w:after="160" w:line="276"/>
+      </w:pPr>
+      <w:r>
+        <w:rPr>
+          <w:rFonts w:ascii="Arial" w:cs="Arial" w:eastAsia="Arial" w:hAnsi="Arial"/>
+          <w:color w:val="333333"/>
+          <w:sz w:val="21"/>
+          <w:szCs w:val="21"/>
+        </w:rPr>
+        <w:t xml:space="preserve">When a player goes all-in in a limit game for an amount that is less than a full raise, whether it counts as a raise depends on the 50% threshold. If the all-in amount is 50% or more of a full raise above the previous bet or raise, it counts as a raise and shifts the plateau number that subsequent raises are calculated from. If it is less than 50%, it does not count as a raise — the previous plateau remains in effect. Example in a 4/8 game on the $8 streets: Player A bets 8. Player B goes all-in for 14 (6 more than 8). Since 6 is 75% of the $8 raise increment, this counts as a raise. The new plateau is now 14, not 16. Player C goes all-in for 16 (only 2 more than 14). Since 2 is only 25% of the $8 increment, this does NOT count as a raise. Player D goes all-in for 18 (4 more than the 14 plateau). Since 4 is exactly 50% of 8, this DOES count as a raise — making it a re-raise with the new plateau at 18. Player E goes all-in for 22 (4 more than 18), which again meets the 50% threshold, creating the cap.</w:t>
+      </w:r>
+    </w:p>
+    <w:p>
+      <w:pPr>
+        <w:spacing w:after="160" w:line="276"/>
+      </w:pPr>
+      <w:r>
+        <w:rPr>
+          <w:rFonts w:ascii="Arial" w:cs="Arial" w:eastAsia="Arial" w:hAnsi="Arial"/>
+          <w:color w:val="333333"/>
+          <w:sz w:val="21"/>
+          <w:szCs w:val="21"/>
+        </w:rPr>
+        <w:t xml:space="preserve">The critical detail: each all-in is compared to the last valid raise plateau, not to the immediately preceding all-in. In the example above, Player C’s 16 does not shift the plateau because it did not meet the 50% threshold against the 14 plateau. Player D’s 18 is still compared to 14 (not 16), and because the 4-dollar increment meets the 50% threshold, it creates a new plateau. This cascading calculation is one of the most confusing limit betting scenarios a dealer encounters. The bet-plus-three-raises cap applies as usual: once three valid raises have occurred (counting only those that meet the 50% threshold), the betting is capped. Dealers must track both the current plateau number and the raise count simultaneously.</w:t>
       </w:r>
     </w:p>
     <w:p>
@@ -4818,21 +4801,52 @@
           <w:sz w:val="22"/>
           <w:szCs w:val="22"/>
         </w:rPr>
-        <w:t xml:space="preserve">The Communication Pattern</w:t>
-      </w:r>
-    </w:p>
-    <w:p>
-      <w:pPr>
-        <w:spacing w:after="160" w:line="276"/>
-      </w:pPr>
-      <w:r>
-        <w:rPr>
-          <w:rFonts w:ascii="Arial" w:cs="Arial" w:eastAsia="Arial" w:hAnsi="Arial"/>
-          <w:color w:val="333333"/>
-          <w:sz w:val="21"/>
-          <w:szCs w:val="21"/>
-        </w:rPr>
-        <w:t xml:space="preserve">Talk your game continuously during pot building. The pattern is: (1) Announce the short stack amount: ‘This player is all-in for $645.’ (2) Announce the action: ‘I’m taking $645 from every stack.’ (3) Say the amount each time you take from a player: ‘$645… $645… $645…’ (4) Announce the result: ‘This is the main pot. This player is eligible.’ (5) Announce the next action: ‘Now building the side pot.’ This constant narration is not for the dealer’s benefit — it is for the players. It gives them confidence that the dealer knows exactly what they are doing.</w:t>
+        <w:t xml:space="preserve">All-In for Less Than the Blind</w:t>
+      </w:r>
+    </w:p>
+    <w:p>
+      <w:pPr>
+        <w:spacing w:after="160" w:line="276"/>
+      </w:pPr>
+      <w:r>
+        <w:rPr>
+          <w:rFonts w:ascii="Arial" w:cs="Arial" w:eastAsia="Arial" w:hAnsi="Arial"/>
+          <w:color w:val="333333"/>
+          <w:sz w:val="21"/>
+          <w:szCs w:val="21"/>
+        </w:rPr>
+        <w:t xml:space="preserve">In tournaments, a player can go all-in for less than the big blind. They are only eligible to win that amount from each other player. In cash games, house rules vary: some rooms require a minimum of one big blind to play a hand, while others allow any legitimate chip amount. In tournaments specifically, if the blinds are 200/400 with a 400 big blind ante and a player has exactly 400 chips, the ante is posted first. If they win, they only get the antes back. If they had 500, the 400 goes to the ante and only 100 goes toward their big blind — they can only win 100 from each player’s bet in addition to the antes.</w:t>
+      </w:r>
+    </w:p>
+    <w:p>
+      <w:pPr>
+        <w:pStyle w:val="Heading2"/>
+        <w:spacing w:before="280" w:after="160"/>
+      </w:pPr>
+      <w:r>
+        <w:rPr>
+          <w:rFonts w:ascii="Arial" w:cs="Arial" w:eastAsia="Arial" w:hAnsi="Arial"/>
+          <w:b/>
+          <w:bCs/>
+          <w:color w:val="2C3E50"/>
+          <w:sz w:val="26"/>
+          <w:szCs w:val="26"/>
+        </w:rPr>
+        <w:t xml:space="preserve">6.10 Table Communication and Player Confidence</w:t>
+      </w:r>
+    </w:p>
+    <w:p>
+      <w:pPr>
+        <w:spacing w:after="160" w:line="276"/>
+      </w:pPr>
+      <w:r>
+        <w:rPr>
+          <w:rFonts w:ascii="Arial" w:cs="Arial" w:eastAsia="Arial" w:hAnsi="Arial"/>
+          <w:color w:val="333333"/>
+          <w:sz w:val="21"/>
+          <w:szCs w:val="21"/>
+        </w:rPr>
+        <w:t xml:space="preserve">Side pots and multi-way all-ins are the scenario where dealer communication skills matter most. Players are not comfortable in these situations because they have seen dealers make mistakes with their money. The dealer’s job is to earn trust through clear, deliberate communication. Every action should be announced before it is taken.</w:t>
       </w:r>
     </w:p>
     <w:p>
@@ -4848,35 +4862,21 @@
           <w:sz w:val="22"/>
           <w:szCs w:val="22"/>
         </w:rPr>
-        <w:t xml:space="preserve">Handling Skeptical or Aggressive Players</w:t>
-      </w:r>
-    </w:p>
-    <w:p>
-      <w:pPr>
-        <w:spacing w:after="160" w:line="276"/>
-      </w:pPr>
-      <w:r>
-        <w:rPr>
-          <w:rFonts w:ascii="Arial" w:cs="Arial" w:eastAsia="Arial" w:hAnsi="Arial"/>
-          <w:color w:val="333333"/>
-          <w:sz w:val="21"/>
-          <w:szCs w:val="21"/>
-        </w:rPr>
-        <w:t xml:space="preserve">Players who challenge the dealer during side pot construction are not being malicious — they are worried. They have seen dealers mess up these situations with their money on the line. The effective response is empathy, not authority. Never say ‘there’s one dealer at the table’ or anything that asserts dominance. Instead, acknowledge their concern: ‘I totally understand that dealers make mistakes sometimes. I’m going to talk through everything I do. You’ll see every step. If you have questions as I go, just ask.’ This accomplishes three things: it validates their concern, it commits you to transparency, and it redirects their energy from challenging you to watching you work.</w:t>
-      </w:r>
-    </w:p>
-    <w:p>
-      <w:pPr>
-        <w:spacing w:after="160" w:line="276"/>
-      </w:pPr>
-      <w:r>
-        <w:rPr>
-          <w:rFonts w:ascii="Arial" w:cs="Arial" w:eastAsia="Arial" w:hAnsi="Arial"/>
-          <w:color w:val="333333"/>
-          <w:sz w:val="21"/>
-          <w:szCs w:val="21"/>
-        </w:rPr>
-        <w:t xml:space="preserve">When you handle this well, other players at the table will tell the skeptical player to back off and let you work. That peer pressure is far more effective than anything the dealer could say. But it only happens if you have earned the table’s trust through clear communication, good chip handling, and professional composure. If you respond with arrogance, the skeptical player will feel justified, and the rest of the table will silently agree.</w:t>
+        <w:t xml:space="preserve">The Communication Pattern</w:t>
+      </w:r>
+    </w:p>
+    <w:p>
+      <w:pPr>
+        <w:spacing w:after="160" w:line="276"/>
+      </w:pPr>
+      <w:r>
+        <w:rPr>
+          <w:rFonts w:ascii="Arial" w:cs="Arial" w:eastAsia="Arial" w:hAnsi="Arial"/>
+          <w:color w:val="333333"/>
+          <w:sz w:val="21"/>
+          <w:szCs w:val="21"/>
+        </w:rPr>
+        <w:t xml:space="preserve">Talk your game continuously during pot building. The pattern is: (1) Announce the short stack amount: ‘This player is all-in for $645.’ (2) Announce the action: ‘I’m taking $645 from every stack.’ (3) Say the amount each time you take from a player: ‘$645… $645… $645…’ (4) Announce the result: ‘This is the main pot. This player is eligible.’ (5) Announce the next action: ‘Now building the side pot.’ This constant narration is not for the dealer’s benefit — it is for the players. It gives them confidence that the dealer knows exactly what they are doing.</w:t>
       </w:r>
     </w:p>
     <w:p>
@@ -4892,21 +4892,35 @@
           <w:sz w:val="22"/>
           <w:szCs w:val="22"/>
         </w:rPr>
-        <w:t xml:space="preserve">Requesting a Floor Supervisor</w:t>
-      </w:r>
-    </w:p>
-    <w:p>
-      <w:pPr>
-        <w:spacing w:after="160" w:line="276"/>
-      </w:pPr>
-      <w:r>
-        <w:rPr>
-          <w:rFonts w:ascii="Arial" w:cs="Arial" w:eastAsia="Arial" w:hAnsi="Arial"/>
-          <w:color w:val="333333"/>
-          <w:sz w:val="21"/>
-          <w:szCs w:val="21"/>
-        </w:rPr>
-        <w:t xml:space="preserve">In any multi-way all-in involving four or more players, it is good practice to call a floor supervisor to the table proactively. Do not wait until you make a mistake — get the extra set of eyes there before you start building pots. Supervisors appreciate being called early. In the entire history of multi-way all-ins, a supervisor has never not come to the table for a nine-way all-in. They will be watching everything you do, which is a good thing — it protects you from errors and protects the players’ money.</w:t>
+        <w:t xml:space="preserve">Handling Skeptical or Aggressive Players</w:t>
+      </w:r>
+    </w:p>
+    <w:p>
+      <w:pPr>
+        <w:spacing w:after="160" w:line="276"/>
+      </w:pPr>
+      <w:r>
+        <w:rPr>
+          <w:rFonts w:ascii="Arial" w:cs="Arial" w:eastAsia="Arial" w:hAnsi="Arial"/>
+          <w:color w:val="333333"/>
+          <w:sz w:val="21"/>
+          <w:szCs w:val="21"/>
+        </w:rPr>
+        <w:t xml:space="preserve">Players who challenge the dealer during side pot construction are not being malicious — they are worried. They have seen dealers mess up these situations with their money on the line. The effective response is empathy, not authority. Never say ‘there’s one dealer at the table’ or anything that asserts dominance. Instead, acknowledge their concern: ‘I totally understand that dealers make mistakes sometimes. I’m going to talk through everything I do. You’ll see every step. If you have questions as I go, just ask.’ This accomplishes three things: it validates their concern, it commits you to transparency, and it redirects their energy from challenging you to watching you work.</w:t>
+      </w:r>
+    </w:p>
+    <w:p>
+      <w:pPr>
+        <w:spacing w:after="160" w:line="276"/>
+      </w:pPr>
+      <w:r>
+        <w:rPr>
+          <w:rFonts w:ascii="Arial" w:cs="Arial" w:eastAsia="Arial" w:hAnsi="Arial"/>
+          <w:color w:val="333333"/>
+          <w:sz w:val="21"/>
+          <w:szCs w:val="21"/>
+        </w:rPr>
+        <w:t xml:space="preserve">When you handle this well, other players at the table will tell the skeptical player to back off and let you work. That peer pressure is far more effective than anything the dealer could say. But it only happens if you have earned the table’s trust through clear communication, good chip handling, and professional composure. If you respond with arrogance, the skeptical player will feel justified, and the rest of the table will silently agree.</w:t>
       </w:r>
     </w:p>
     <w:p>
@@ -4922,307 +4936,21 @@
           <w:sz w:val="22"/>
           <w:szCs w:val="22"/>
         </w:rPr>
-        <w:t xml:space="preserve">Players Showing Hands Prematurely</w:t>
-      </w:r>
-    </w:p>
-    <w:p>
-      <w:pPr>
-        <w:spacing w:after="160" w:line="276"/>
-      </w:pPr>
-      <w:r>
-        <w:rPr>
-          <w:rFonts w:ascii="Arial" w:cs="Arial" w:eastAsia="Arial" w:hAnsi="Arial"/>
-          <w:color w:val="333333"/>
-          <w:sz w:val="21"/>
-          <w:szCs w:val="21"/>
-        </w:rPr>
-        <w:t xml:space="preserve">When multiple players are all-in but there are still active players with chips, the all-in players may start flipping their cards face-up out of excitement. The dealer must be preventative: before running out the remaining board cards, announce ‘Do not show your hands yet, there is still action.’ Say this before it happens, not after. Players in multi-way all-in situations are excited and will instinctively want to reveal their hands. If all-in players do expose their hands before remaining action is complete, the dealer must manage the situation but cannot force the cards back face-down — the information is already public.</w:t>
-      </w:r>
-    </w:p>
-    <w:p>
-      <w:pPr>
-        <w:pStyle w:val="Heading2"/>
-        <w:spacing w:before="280" w:after="160"/>
-      </w:pPr>
-      <w:r>
-        <w:rPr>
-          <w:rFonts w:ascii="Arial" w:cs="Arial" w:eastAsia="Arial" w:hAnsi="Arial"/>
-          <w:b/>
-          <w:bCs/>
-          <w:color w:val="2C3E50"/>
-          <w:sz w:val="26"/>
-          <w:szCs w:val="26"/>
-        </w:rPr>
-        <w:t xml:space="preserve">6.11 Common Dealer Errors in Side Pot Scenarios</w:t>
-      </w:r>
-    </w:p>
-    <w:p>
-      <w:pPr>
-        <w:spacing w:after="160" w:line="276"/>
-      </w:pPr>
-      <w:r>
-        <w:rPr>
-          <w:rFonts w:ascii="Arial" w:cs="Arial" w:eastAsia="Arial" w:hAnsi="Arial"/>
-          <w:color w:val="333333"/>
-          <w:sz w:val="21"/>
-          <w:szCs w:val="21"/>
-        </w:rPr>
-        <w:t xml:space="preserve">Putting chips into the wrong pot. When action continues after one player is all-in, subsequent bets must go into the side pot, not the main pot. Dealers who lose track of which pot is which will misallocate chips, resulting in incorrect payouts.</w:t>
-      </w:r>
-    </w:p>
-    <w:p>
-      <w:pPr>
-        <w:spacing w:after="160" w:line="276"/>
-      </w:pPr>
-      <w:r>
-        <w:rPr>
-          <w:rFonts w:ascii="Arial" w:cs="Arial" w:eastAsia="Arial" w:hAnsi="Arial"/>
-          <w:color w:val="333333"/>
-          <w:sz w:val="21"/>
-          <w:szCs w:val="21"/>
-        </w:rPr>
-        <w:t xml:space="preserve">Forgetting the rake. With the mental load of building multiple pots, the rake falls out of the workflow. Before pushing the final pot, always check the rake drop slot. Train this as a reflex. The worst outcome is pushing a massive multi-way pot and having a supervisor realize you took zero dollars for the house.</w:t>
-      </w:r>
-    </w:p>
-    <w:p>
-      <w:pPr>
-        <w:spacing w:after="160" w:line="276"/>
-      </w:pPr>
-      <w:r>
-        <w:rPr>
-          <w:rFonts w:ascii="Arial" w:cs="Arial" w:eastAsia="Arial" w:hAnsi="Arial"/>
-          <w:color w:val="333333"/>
-          <w:sz w:val="21"/>
-          <w:szCs w:val="21"/>
-        </w:rPr>
-        <w:t xml:space="preserve">Incorrect payouts when running it twice. If the table agrees to run the board twice (deal two separate sets of community cards), and one player is already all-in and eligible only for the main pot, that player is playing for one board on the main pot while the remaining players split the side pot across two boards. Dealers frequently miscalculate which player gets what from which pot on which board.</w:t>
-      </w:r>
-    </w:p>
-    <w:p>
-      <w:pPr>
-        <w:spacing w:after="160" w:line="276"/>
-      </w:pPr>
-      <w:r>
-        <w:rPr>
-          <w:rFonts w:ascii="Arial" w:cs="Arial" w:eastAsia="Arial" w:hAnsi="Arial"/>
-          <w:color w:val="333333"/>
-          <w:sz w:val="21"/>
-          <w:szCs w:val="21"/>
-        </w:rPr>
-        <w:t xml:space="preserve">Stacking pots during construction. Do not build neat stacks during pot construction in normal hands — scoop chips into a spread pot. Stacking takes longer, reduces the visual excitement of a big pot (which affects tips), and in Omaha Hi-Lo games, stacked pots can topple and intermingle with side pots. However, during multi-way all-ins with many pots, temporary stacking while building and verifying pot amounts is acceptable and often necessary to keep things organized.</w:t>
-      </w:r>
-    </w:p>
-    <w:p>
-      <w:pPr>
-        <w:spacing w:after="160" w:line="276"/>
-      </w:pPr>
-      <w:r>
-        <w:rPr>
-          <w:rFonts w:ascii="Arial" w:cs="Arial" w:eastAsia="Arial" w:hAnsi="Arial"/>
-          <w:color w:val="333333"/>
-          <w:sz w:val="21"/>
-          <w:szCs w:val="21"/>
-        </w:rPr>
-        <w:t xml:space="preserve">Freezing under pressure. A four-way all-in with different stack sizes requires creating three side pots under the gaze of players with tens of thousands of dollars at stake. Many dealers visibly slow down, make arithmetic errors, and lose the confidence of the table. This single scenario is the strongest argument for robotic dealing in terms of accuracy improvement.</w:t>
-      </w:r>
-    </w:p>
-    <w:p>
-      <w:pPr>
-        <w:spacing w:after="160" w:line="276"/>
-      </w:pPr>
-      <w:r>
-        <w:rPr>
-          <w:rFonts w:ascii="Arial" w:cs="Arial" w:eastAsia="Arial" w:hAnsi="Arial"/>
-          <w:color w:val="333333"/>
-          <w:sz w:val="21"/>
-          <w:szCs w:val="21"/>
-        </w:rPr>
-        <w:t xml:space="preserve">Gathering hands to the center. Collecting all-in players’ hands to the center of the table or next to the board is a common bad habit from televised poker. It makes it nearly impossible to track which hand belongs to which player when pushing pots. Always leave hands in front of their respective players.</w:t>
-      </w:r>
-    </w:p>
-    <w:p>
-      <w:pPr>
-        <w:spacing w:after="160" w:line="276"/>
-      </w:pPr>
-      <w:r>
-        <w:rPr>
-          <w:rFonts w:ascii="Arial" w:cs="Arial" w:eastAsia="Arial" w:hAnsi="Arial"/>
-          <w:color w:val="333333"/>
-          <w:sz w:val="21"/>
-          <w:szCs w:val="21"/>
-        </w:rPr>
-        <w:t xml:space="preserve">Not having players push chips forward. When multiple players go all-in, the dealer must ask all players to push their stacks forward. If you do not verify that all chips are visible and forward, players can hide chips or pocket them. ‘All right, everybody’s all-in, I need you to push your chips forward please.’</w:t>
-      </w:r>
-    </w:p>
-    <w:p>
-      <w:pPr>
-        <w:spacing w:after="160" w:line="276"/>
-      </w:pPr>
-      <w:r>
-        <w:rPr>
-          <w:rFonts w:ascii="Arial" w:cs="Arial" w:eastAsia="Arial" w:hAnsi="Arial"/>
-          <w:color w:val="333333"/>
-          <w:sz w:val="21"/>
-          <w:szCs w:val="21"/>
-        </w:rPr>
-        <w:t xml:space="preserve">Miscounting when switching between pots. When going around the table taking amounts from multiple stacks, it is easy to lose track of which player you have already collected from. Clear your hands between each stack. If you get lost, count the chip stacks or markers — the number of red chips in a pot should match the number of players who contributed.</w:t>
-      </w:r>
-    </w:p>
-    <w:p>
-      <w:pPr>
-        <w:spacing w:after="160" w:line="276"/>
-      </w:pPr>
-      <w:r>
-        <w:rPr>
-          <w:rFonts w:ascii="Arial" w:cs="Arial" w:eastAsia="Arial" w:hAnsi="Arial"/>
-          <w:b/>
-          <w:bCs/>
-          <w:color w:val="2C3E50"/>
-          <w:sz w:val="21"/>
-          <w:szCs w:val="21"/>
-        </w:rPr>
-        <w:t xml:space="preserve">Robotic Requirement: </w:t>
-      </w:r>
-      <w:r>
-        <w:rPr>
-          <w:rFonts w:ascii="Arial" w:cs="Arial" w:eastAsia="Arial" w:hAnsi="Arial"/>
-          <w:color w:val="333333"/>
-          <w:sz w:val="21"/>
-          <w:szCs w:val="21"/>
-        </w:rPr>
-        <w:t xml:space="preserve">Must calculate side pots instantly and correctly for any number of all-in players with any stack sizes. Must physically separate pot amounts on the table and maintain tracking of which players are eligible for which pots. Must handle running-it-twice scenarios with multi-pot eligibility. Must display pot totals and eligibility either physically or on a digital display. Must never forget the rake regardless of pot complexity. Must track all player stacks via sensors to prevent chip hiding. This is a pure computational task that a robotic system would handle with zero errors, eliminating the single most common source of dealer mistakes in live poker.</w:t>
-      </w:r>
-    </w:p>
-    <w:p>
-      <w:pPr>
-        <w:pStyle w:val="Heading2"/>
-        <w:spacing w:before="280" w:after="160"/>
-      </w:pPr>
-      <w:r>
-        <w:rPr>
-          <w:rFonts w:ascii="Arial" w:cs="Arial" w:eastAsia="Arial" w:hAnsi="Arial"/>
-          <w:b/>
-          <w:bCs/>
-          <w:color w:val="2C3E50"/>
-          <w:sz w:val="26"/>
-          <w:szCs w:val="26"/>
-        </w:rPr>
-        <w:t xml:space="preserve">6.12 The Nine-Way All-In: Extreme Scenario</w:t>
-      </w:r>
-    </w:p>
-    <w:p>
-      <w:pPr>
-        <w:spacing w:after="160" w:line="276"/>
-      </w:pPr>
-      <w:r>
-        <w:rPr>
-          <w:rFonts w:ascii="Arial" w:cs="Arial" w:eastAsia="Arial" w:hAnsi="Arial"/>
-          <w:color w:val="333333"/>
-          <w:sz w:val="21"/>
-          <w:szCs w:val="21"/>
-        </w:rPr>
-        <w:t xml:space="preserve">A nine-way all-in — every player at the table all-in with different stack sizes — is the most extreme scenario a dealer can face. It produces up to eight side pots. While rare in cash games (it requires every player to believe they have a legitimate chance of winning, which is hard to come by), it does happen, and a dealer must be prepared for it. In tournaments, multi-way all-ins are more common because short stacks create frequent all-in situations.</w:t>
-      </w:r>
-    </w:p>
-    <w:p>
-      <w:pPr>
-        <w:spacing w:after="160" w:line="276"/>
-      </w:pPr>
-      <w:r>
-        <w:rPr>
-          <w:rFonts w:ascii="Arial" w:cs="Arial" w:eastAsia="Arial" w:hAnsi="Arial"/>
-          <w:color w:val="333333"/>
-          <w:sz w:val="21"/>
-          <w:szCs w:val="21"/>
-        </w:rPr>
-        <w:t xml:space="preserve">The procedure is the same as any multi-way all-in, just with more repetitions. Start with the smallest stack. Take that amount from all nine players. Build the main pot. Find the next smallest stack. Take the difference from the remaining eight players. Build Side Pot 1. Continue through all eight side pots. Use chip markers for each pot, angled toward the eligible player.</w:t>
-      </w:r>
-    </w:p>
-    <w:p>
-      <w:pPr>
-        <w:spacing w:after="160" w:line="276"/>
-      </w:pPr>
-      <w:r>
-        <w:rPr>
-          <w:rFonts w:ascii="Arial" w:cs="Arial" w:eastAsia="Arial" w:hAnsi="Arial"/>
-          <w:color w:val="333333"/>
-          <w:sz w:val="21"/>
-          <w:szCs w:val="21"/>
-        </w:rPr>
-        <w:t xml:space="preserve">Practical realities of a nine-way all-in: It can take 15 to 45 minutes to resolve. The next dealer will be standing behind you waiting. It does not matter — take the time you need. A supervisor will absolutely be at the table; they always come for situations like this. Your chip-handling skills are on full display: cutting chips accurately, making change quickly, and keeping organized under pressure. This is why chip mechanics matter — they pay off in the moments when it matters most.</w:t>
-      </w:r>
-    </w:p>
-    <w:p>
-      <w:pPr>
-        <w:spacing w:after="160" w:line="276"/>
-      </w:pPr>
-      <w:r>
-        <w:rPr>
-          <w:rFonts w:ascii="Arial" w:cs="Arial" w:eastAsia="Arial" w:hAnsi="Arial"/>
-          <w:color w:val="333333"/>
-          <w:sz w:val="21"/>
-          <w:szCs w:val="21"/>
-        </w:rPr>
-        <w:t xml:space="preserve">Color-up during construction: If pot building is creating unmanageable numbers of small-denomination chips, you can color up within a pot. Take five red $5 chips out of a side pot and replace them with one green $25 chip from the bank. Be explicit about what you are doing: ‘I’m coloring up this pot to make it easier to manage.’ This is perfectly acceptable and can prevent chip chaos in large multi-way pots.</w:t>
-      </w:r>
-    </w:p>
-    <w:p>
-      <w:pPr>
-        <w:spacing w:after="160" w:line="276"/>
-      </w:pPr>
-      <w:r>
-        <w:rPr>
-          <w:rFonts w:ascii="Arial" w:cs="Arial" w:eastAsia="Arial" w:hAnsi="Arial"/>
-          <w:color w:val="333333"/>
-          <w:sz w:val="21"/>
-          <w:szCs w:val="21"/>
-        </w:rPr>
-        <w:t xml:space="preserve">Tipping after large multi-way pots: Dealers should have zero expectation of a tip after resolving a complex multi-way all-in. Some players will tip generously. Some will forget entirely because they are overwhelmed by the result. Some will never tip regardless. If you build a tip expectation into your mental model, you create what poker players call a ‘negative freeroll’ — you can only have a negative emotional outcome, never a positive one. Focus on doing the job correctly. If a tip comes, be genuinely appreciative. If it does not, move on to the next hand.</w:t>
-      </w:r>
-    </w:p>
-    <w:p>
-      <w:pPr>
-        <w:pStyle w:val="Heading2"/>
-        <w:spacing w:before="280" w:after="160"/>
-      </w:pPr>
-      <w:r>
-        <w:rPr>
-          <w:rFonts w:ascii="Arial" w:cs="Arial" w:eastAsia="Arial" w:hAnsi="Arial"/>
-          <w:b/>
-          <w:bCs/>
-          <w:color w:val="2C3E50"/>
-          <w:sz w:val="26"/>
-          <w:szCs w:val="26"/>
-        </w:rPr>
-        <w:t xml:space="preserve">6.13 Split Pots and Quartering</w:t>
-      </w:r>
-    </w:p>
-    <w:p>
-      <w:pPr>
-        <w:spacing w:after="160" w:line="276"/>
-      </w:pPr>
-      <w:r>
-        <w:rPr>
-          <w:rFonts w:ascii="Arial" w:cs="Arial" w:eastAsia="Arial" w:hAnsi="Arial"/>
-          <w:color w:val="333333"/>
-          <w:sz w:val="21"/>
-          <w:szCs w:val="21"/>
-        </w:rPr>
-        <w:t xml:space="preserve">When two or more players tie for the best hand, the pot is split equally between them. Splitting is straightforward in a two-way tie: the dealer divides the pot into two equal stacks. Odd chips are awarded to the player ‘closest to the button’ — meaning the player who will receive the button soonest (worst position, first to act). This is the universal tiebreaker in casino poker. However, the complexity escalates dramatically in games with high-low splits and multiple boards.</w:t>
-      </w:r>
-    </w:p>
-    <w:p>
-      <w:pPr>
-        <w:spacing w:after="160" w:line="276"/>
-      </w:pPr>
-      <w:r>
-        <w:rPr>
-          <w:rFonts w:ascii="Arial" w:cs="Arial" w:eastAsia="Arial" w:hAnsi="Arial"/>
-          <w:color w:val="333333"/>
-          <w:sz w:val="21"/>
-          <w:szCs w:val="21"/>
-        </w:rPr>
-        <w:t xml:space="preserve">Critical rule for multi-pot split scenarios: the odd chip distribution is handled independently for each pot. If a main pot is split four ways and has three extra chips, each extra chip goes to the next-worst-position player. If a side pot between two players also has an odd chip, that chip goes to the worst-position player among the two eligible players — regardless of who received odd chips from other pots. A player can receive an extra chip from the main pot and another extra chip from a side pot in the same hand. The dealer must never combine pots and then distribute — each pot is resolved and split separately with its own odd chip assignment.</w:t>
+        <w:t xml:space="preserve">Requesting a Floor Supervisor</w:t>
+      </w:r>
+    </w:p>
+    <w:p>
+      <w:pPr>
+        <w:spacing w:after="160" w:line="276"/>
+      </w:pPr>
+      <w:r>
+        <w:rPr>
+          <w:rFonts w:ascii="Arial" w:cs="Arial" w:eastAsia="Arial" w:hAnsi="Arial"/>
+          <w:color w:val="333333"/>
+          <w:sz w:val="21"/>
+          <w:szCs w:val="21"/>
+        </w:rPr>
+        <w:t xml:space="preserve">In any multi-way all-in involving four or more players, it is good practice to call a floor supervisor to the table proactively. Do not wait until you make a mistake — get the extra set of eyes there before you start building pots. Supervisors appreciate being called early. In the entire history of multi-way all-ins, a supervisor has never not come to the table for a nine-way all-in. They will be watching everything you do, which is a good thing — it protects you from errors and protects the players’ money.</w:t>
       </w:r>
     </w:p>
     <w:p>
@@ -5238,35 +4966,307 @@
           <w:sz w:val="22"/>
           <w:szCs w:val="22"/>
         </w:rPr>
-        <w:t xml:space="preserve">Quartering in PLO Double Board Bomb Pots</w:t>
-      </w:r>
-    </w:p>
-    <w:p>
-      <w:pPr>
-        <w:spacing w:after="160" w:line="276"/>
-      </w:pPr>
-      <w:r>
-        <w:rPr>
-          <w:rFonts w:ascii="Arial" w:cs="Arial" w:eastAsia="Arial" w:hAnsi="Arial"/>
-          <w:color w:val="333333"/>
-          <w:sz w:val="21"/>
-          <w:szCs w:val="21"/>
-        </w:rPr>
-        <w:t xml:space="preserve">In Pot-Limit Omaha double board bomb pots (an increasingly common format in casino cash games), each board receives exactly half the pot. If one player wins the top board outright and two players tie on the bottom board, the top board winner receives 50% of the pot, and the two bottom board winners each receive 25%. This is called quartering. The player who gets quartered ends up with significantly less than they may expect, which is a frequent source of confusion and disputes.</w:t>
-      </w:r>
-    </w:p>
-    <w:p>
-      <w:pPr>
-        <w:spacing w:after="160" w:line="276"/>
-      </w:pPr>
-      <w:r>
-        <w:rPr>
-          <w:rFonts w:ascii="Arial" w:cs="Arial" w:eastAsia="Arial" w:hAnsi="Arial"/>
-          <w:color w:val="333333"/>
-          <w:sz w:val="21"/>
-          <w:szCs w:val="21"/>
-        </w:rPr>
-        <w:t xml:space="preserve">The dealing procedure for quartering: First, the dealer separates the total pot into two equal halves, one for each board. The winning player on Board 1 receives their half immediately. Then the dealer takes the remaining half and splits it again into two equal portions for the tied players on Board 2. This means the dealer is performing nested pot division: split the total pot, then split half of that split. With odd chips, the same left-of-button rule applies at each level of division.</w:t>
+        <w:t xml:space="preserve">Players Showing Hands Prematurely</w:t>
+      </w:r>
+    </w:p>
+    <w:p>
+      <w:pPr>
+        <w:spacing w:after="160" w:line="276"/>
+      </w:pPr>
+      <w:r>
+        <w:rPr>
+          <w:rFonts w:ascii="Arial" w:cs="Arial" w:eastAsia="Arial" w:hAnsi="Arial"/>
+          <w:color w:val="333333"/>
+          <w:sz w:val="21"/>
+          <w:szCs w:val="21"/>
+        </w:rPr>
+        <w:t xml:space="preserve">When multiple players are all-in but there are still active players with chips, the all-in players may start flipping their cards face-up out of excitement. The dealer must be preventative: before running out the remaining board cards, announce ‘Do not show your hands yet, there is still action.’ Say this before it happens, not after. Players in multi-way all-in situations are excited and will instinctively want to reveal their hands. If all-in players do expose their hands before remaining action is complete, the dealer must manage the situation but cannot force the cards back face-down — the information is already public.</w:t>
+      </w:r>
+    </w:p>
+    <w:p>
+      <w:pPr>
+        <w:pStyle w:val="Heading2"/>
+        <w:spacing w:before="280" w:after="160"/>
+      </w:pPr>
+      <w:r>
+        <w:rPr>
+          <w:rFonts w:ascii="Arial" w:cs="Arial" w:eastAsia="Arial" w:hAnsi="Arial"/>
+          <w:b/>
+          <w:bCs/>
+          <w:color w:val="2C3E50"/>
+          <w:sz w:val="26"/>
+          <w:szCs w:val="26"/>
+        </w:rPr>
+        <w:t xml:space="preserve">6.11 Common Dealer Errors in Side Pot Scenarios</w:t>
+      </w:r>
+    </w:p>
+    <w:p>
+      <w:pPr>
+        <w:spacing w:after="160" w:line="276"/>
+      </w:pPr>
+      <w:r>
+        <w:rPr>
+          <w:rFonts w:ascii="Arial" w:cs="Arial" w:eastAsia="Arial" w:hAnsi="Arial"/>
+          <w:color w:val="333333"/>
+          <w:sz w:val="21"/>
+          <w:szCs w:val="21"/>
+        </w:rPr>
+        <w:t xml:space="preserve">Putting chips into the wrong pot. When action continues after one player is all-in, subsequent bets must go into the side pot, not the main pot. Dealers who lose track of which pot is which will misallocate chips, resulting in incorrect payouts.</w:t>
+      </w:r>
+    </w:p>
+    <w:p>
+      <w:pPr>
+        <w:spacing w:after="160" w:line="276"/>
+      </w:pPr>
+      <w:r>
+        <w:rPr>
+          <w:rFonts w:ascii="Arial" w:cs="Arial" w:eastAsia="Arial" w:hAnsi="Arial"/>
+          <w:color w:val="333333"/>
+          <w:sz w:val="21"/>
+          <w:szCs w:val="21"/>
+        </w:rPr>
+        <w:t xml:space="preserve">Forgetting the rake. With the mental load of building multiple pots, the rake falls out of the workflow. Before pushing the final pot, always check the rake drop slot. Train this as a reflex. The worst outcome is pushing a massive multi-way pot and having a supervisor realize you took zero dollars for the house.</w:t>
+      </w:r>
+    </w:p>
+    <w:p>
+      <w:pPr>
+        <w:spacing w:after="160" w:line="276"/>
+      </w:pPr>
+      <w:r>
+        <w:rPr>
+          <w:rFonts w:ascii="Arial" w:cs="Arial" w:eastAsia="Arial" w:hAnsi="Arial"/>
+          <w:color w:val="333333"/>
+          <w:sz w:val="21"/>
+          <w:szCs w:val="21"/>
+        </w:rPr>
+        <w:t xml:space="preserve">Incorrect payouts when running it twice. If the table agrees to run the board twice (deal two separate sets of community cards), and one player is already all-in and eligible only for the main pot, that player is playing for one board on the main pot while the remaining players split the side pot across two boards. Dealers frequently miscalculate which player gets what from which pot on which board.</w:t>
+      </w:r>
+    </w:p>
+    <w:p>
+      <w:pPr>
+        <w:spacing w:after="160" w:line="276"/>
+      </w:pPr>
+      <w:r>
+        <w:rPr>
+          <w:rFonts w:ascii="Arial" w:cs="Arial" w:eastAsia="Arial" w:hAnsi="Arial"/>
+          <w:color w:val="333333"/>
+          <w:sz w:val="21"/>
+          <w:szCs w:val="21"/>
+        </w:rPr>
+        <w:t xml:space="preserve">Stacking pots during construction. Do not build neat stacks during pot construction in normal hands — scoop chips into a spread pot. Stacking takes longer, reduces the visual excitement of a big pot (which affects tips), and in Omaha Hi-Lo games, stacked pots can topple and intermingle with side pots. However, during multi-way all-ins with many pots, temporary stacking while building and verifying pot amounts is acceptable and often necessary to keep things organized.</w:t>
+      </w:r>
+    </w:p>
+    <w:p>
+      <w:pPr>
+        <w:spacing w:after="160" w:line="276"/>
+      </w:pPr>
+      <w:r>
+        <w:rPr>
+          <w:rFonts w:ascii="Arial" w:cs="Arial" w:eastAsia="Arial" w:hAnsi="Arial"/>
+          <w:color w:val="333333"/>
+          <w:sz w:val="21"/>
+          <w:szCs w:val="21"/>
+        </w:rPr>
+        <w:t xml:space="preserve">Freezing under pressure. A four-way all-in with different stack sizes requires creating three side pots under the gaze of players with tens of thousands of dollars at stake. Many dealers visibly slow down, make arithmetic errors, and lose the confidence of the table. This single scenario is the strongest argument for robotic dealing in terms of accuracy improvement.</w:t>
+      </w:r>
+    </w:p>
+    <w:p>
+      <w:pPr>
+        <w:spacing w:after="160" w:line="276"/>
+      </w:pPr>
+      <w:r>
+        <w:rPr>
+          <w:rFonts w:ascii="Arial" w:cs="Arial" w:eastAsia="Arial" w:hAnsi="Arial"/>
+          <w:color w:val="333333"/>
+          <w:sz w:val="21"/>
+          <w:szCs w:val="21"/>
+        </w:rPr>
+        <w:t xml:space="preserve">Gathering hands to the center. Collecting all-in players’ hands to the center of the table or next to the board is a common bad habit from televised poker. It makes it nearly impossible to track which hand belongs to which player when pushing pots. Always leave hands in front of their respective players.</w:t>
+      </w:r>
+    </w:p>
+    <w:p>
+      <w:pPr>
+        <w:spacing w:after="160" w:line="276"/>
+      </w:pPr>
+      <w:r>
+        <w:rPr>
+          <w:rFonts w:ascii="Arial" w:cs="Arial" w:eastAsia="Arial" w:hAnsi="Arial"/>
+          <w:color w:val="333333"/>
+          <w:sz w:val="21"/>
+          <w:szCs w:val="21"/>
+        </w:rPr>
+        <w:t xml:space="preserve">Not having players push chips forward. When multiple players go all-in, the dealer must ask all players to push their stacks forward. If you do not verify that all chips are visible and forward, players can hide chips or pocket them. ‘All right, everybody’s all-in, I need you to push your chips forward please.’</w:t>
+      </w:r>
+    </w:p>
+    <w:p>
+      <w:pPr>
+        <w:spacing w:after="160" w:line="276"/>
+      </w:pPr>
+      <w:r>
+        <w:rPr>
+          <w:rFonts w:ascii="Arial" w:cs="Arial" w:eastAsia="Arial" w:hAnsi="Arial"/>
+          <w:color w:val="333333"/>
+          <w:sz w:val="21"/>
+          <w:szCs w:val="21"/>
+        </w:rPr>
+        <w:t xml:space="preserve">Miscounting when switching between pots. When going around the table taking amounts from multiple stacks, it is easy to lose track of which player you have already collected from. Clear your hands between each stack. If you get lost, count the chip stacks or markers — the number of red chips in a pot should match the number of players who contributed.</w:t>
+      </w:r>
+    </w:p>
+    <w:p>
+      <w:pPr>
+        <w:spacing w:after="160" w:line="276"/>
+      </w:pPr>
+      <w:r>
+        <w:rPr>
+          <w:rFonts w:ascii="Arial" w:cs="Arial" w:eastAsia="Arial" w:hAnsi="Arial"/>
+          <w:b/>
+          <w:bCs/>
+          <w:color w:val="2C3E50"/>
+          <w:sz w:val="21"/>
+          <w:szCs w:val="21"/>
+        </w:rPr>
+        <w:t xml:space="preserve">Robotic Requirement: </w:t>
+      </w:r>
+      <w:r>
+        <w:rPr>
+          <w:rFonts w:ascii="Arial" w:cs="Arial" w:eastAsia="Arial" w:hAnsi="Arial"/>
+          <w:color w:val="333333"/>
+          <w:sz w:val="21"/>
+          <w:szCs w:val="21"/>
+        </w:rPr>
+        <w:t xml:space="preserve">Must calculate side pots instantly and correctly for any number of all-in players with any stack sizes. Must physically separate pot amounts on the table and maintain tracking of which players are eligible for which pots. Must handle running-it-twice scenarios with multi-pot eligibility. Must display pot totals and eligibility either physically or on a digital display. Must never forget the rake regardless of pot complexity. Must track all player stacks via sensors to prevent chip hiding. This is a pure computational task that a robotic system would handle with zero errors, eliminating the single most common source of dealer mistakes in live poker.</w:t>
+      </w:r>
+    </w:p>
+    <w:p>
+      <w:pPr>
+        <w:pStyle w:val="Heading2"/>
+        <w:spacing w:before="280" w:after="160"/>
+      </w:pPr>
+      <w:r>
+        <w:rPr>
+          <w:rFonts w:ascii="Arial" w:cs="Arial" w:eastAsia="Arial" w:hAnsi="Arial"/>
+          <w:b/>
+          <w:bCs/>
+          <w:color w:val="2C3E50"/>
+          <w:sz w:val="26"/>
+          <w:szCs w:val="26"/>
+        </w:rPr>
+        <w:t xml:space="preserve">6.12 The Nine-Way All-In: Extreme Scenario</w:t>
+      </w:r>
+    </w:p>
+    <w:p>
+      <w:pPr>
+        <w:spacing w:after="160" w:line="276"/>
+      </w:pPr>
+      <w:r>
+        <w:rPr>
+          <w:rFonts w:ascii="Arial" w:cs="Arial" w:eastAsia="Arial" w:hAnsi="Arial"/>
+          <w:color w:val="333333"/>
+          <w:sz w:val="21"/>
+          <w:szCs w:val="21"/>
+        </w:rPr>
+        <w:t xml:space="preserve">A nine-way all-in — every player at the table all-in with different stack sizes — is the most extreme scenario a dealer can face. It produces up to eight side pots. While rare in cash games (it requires every player to believe they have a legitimate chance of winning, which is hard to come by), it does happen, and a dealer must be prepared for it. In tournaments, multi-way all-ins are more common because short stacks create frequent all-in situations.</w:t>
+      </w:r>
+    </w:p>
+    <w:p>
+      <w:pPr>
+        <w:spacing w:after="160" w:line="276"/>
+      </w:pPr>
+      <w:r>
+        <w:rPr>
+          <w:rFonts w:ascii="Arial" w:cs="Arial" w:eastAsia="Arial" w:hAnsi="Arial"/>
+          <w:color w:val="333333"/>
+          <w:sz w:val="21"/>
+          <w:szCs w:val="21"/>
+        </w:rPr>
+        <w:t xml:space="preserve">The procedure is the same as any multi-way all-in, just with more repetitions. Start with the smallest stack. Take that amount from all nine players. Build the main pot. Find the next smallest stack. Take the difference from the remaining eight players. Build Side Pot 1. Continue through all eight side pots. Use chip markers for each pot, angled toward the eligible player.</w:t>
+      </w:r>
+    </w:p>
+    <w:p>
+      <w:pPr>
+        <w:spacing w:after="160" w:line="276"/>
+      </w:pPr>
+      <w:r>
+        <w:rPr>
+          <w:rFonts w:ascii="Arial" w:cs="Arial" w:eastAsia="Arial" w:hAnsi="Arial"/>
+          <w:color w:val="333333"/>
+          <w:sz w:val="21"/>
+          <w:szCs w:val="21"/>
+        </w:rPr>
+        <w:t xml:space="preserve">Practical realities of a nine-way all-in: It can take 15 to 45 minutes to resolve. The next dealer will be standing behind you waiting. It does not matter — take the time you need. A supervisor will absolutely be at the table; they always come for situations like this. Your chip-handling skills are on full display: cutting chips accurately, making change quickly, and keeping organized under pressure. This is why chip mechanics matter — they pay off in the moments when it matters most.</w:t>
+      </w:r>
+    </w:p>
+    <w:p>
+      <w:pPr>
+        <w:spacing w:after="160" w:line="276"/>
+      </w:pPr>
+      <w:r>
+        <w:rPr>
+          <w:rFonts w:ascii="Arial" w:cs="Arial" w:eastAsia="Arial" w:hAnsi="Arial"/>
+          <w:color w:val="333333"/>
+          <w:sz w:val="21"/>
+          <w:szCs w:val="21"/>
+        </w:rPr>
+        <w:t xml:space="preserve">Color-up during construction: If pot building is creating unmanageable numbers of small-denomination chips, you can color up within a pot. Take five red $5 chips out of a side pot and replace them with one green $25 chip from the bank. Be explicit about what you are doing: ‘I’m coloring up this pot to make it easier to manage.’ This is perfectly acceptable and can prevent chip chaos in large multi-way pots.</w:t>
+      </w:r>
+    </w:p>
+    <w:p>
+      <w:pPr>
+        <w:spacing w:after="160" w:line="276"/>
+      </w:pPr>
+      <w:r>
+        <w:rPr>
+          <w:rFonts w:ascii="Arial" w:cs="Arial" w:eastAsia="Arial" w:hAnsi="Arial"/>
+          <w:color w:val="333333"/>
+          <w:sz w:val="21"/>
+          <w:szCs w:val="21"/>
+        </w:rPr>
+        <w:t xml:space="preserve">Tipping after large multi-way pots: Dealers should have zero expectation of a tip after resolving a complex multi-way all-in. Some players will tip generously. Some will forget entirely because they are overwhelmed by the result. Some will never tip regardless. If you build a tip expectation into your mental model, you create what poker players call a ‘negative freeroll’ — you can only have a negative emotional outcome, never a positive one. Focus on doing the job correctly. If a tip comes, be genuinely appreciative. If it does not, move on to the next hand.</w:t>
+      </w:r>
+    </w:p>
+    <w:p>
+      <w:pPr>
+        <w:pStyle w:val="Heading2"/>
+        <w:spacing w:before="280" w:after="160"/>
+      </w:pPr>
+      <w:r>
+        <w:rPr>
+          <w:rFonts w:ascii="Arial" w:cs="Arial" w:eastAsia="Arial" w:hAnsi="Arial"/>
+          <w:b/>
+          <w:bCs/>
+          <w:color w:val="2C3E50"/>
+          <w:sz w:val="26"/>
+          <w:szCs w:val="26"/>
+        </w:rPr>
+        <w:t xml:space="preserve">6.13 Split Pots and Quartering</w:t>
+      </w:r>
+    </w:p>
+    <w:p>
+      <w:pPr>
+        <w:spacing w:after="160" w:line="276"/>
+      </w:pPr>
+      <w:r>
+        <w:rPr>
+          <w:rFonts w:ascii="Arial" w:cs="Arial" w:eastAsia="Arial" w:hAnsi="Arial"/>
+          <w:color w:val="333333"/>
+          <w:sz w:val="21"/>
+          <w:szCs w:val="21"/>
+        </w:rPr>
+        <w:t xml:space="preserve">When two or more players tie for the best hand, the pot is split equally between them. Splitting is straightforward in a two-way tie: the dealer divides the pot into two equal stacks. Odd chips are awarded to the player ‘closest to the button’ — meaning the player who will receive the button soonest (worst position, first to act). This is the universal tiebreaker in casino poker. However, the complexity escalates dramatically in games with high-low splits and multiple boards.</w:t>
+      </w:r>
+    </w:p>
+    <w:p>
+      <w:pPr>
+        <w:spacing w:after="160" w:line="276"/>
+      </w:pPr>
+      <w:r>
+        <w:rPr>
+          <w:rFonts w:ascii="Arial" w:cs="Arial" w:eastAsia="Arial" w:hAnsi="Arial"/>
+          <w:color w:val="333333"/>
+          <w:sz w:val="21"/>
+          <w:szCs w:val="21"/>
+        </w:rPr>
+        <w:t xml:space="preserve">Critical rule for multi-pot split scenarios: the odd chip distribution is handled independently for each pot. If a main pot is split four ways and has three extra chips, each extra chip goes to the next-worst-position player. If a side pot between two players also has an odd chip, that chip goes to the worst-position player among the two eligible players — regardless of who received odd chips from other pots. A player can receive an extra chip from the main pot and another extra chip from a side pot in the same hand. The dealer must never combine pots and then distribute — each pot is resolved and split separately with its own odd chip assignment.</w:t>
       </w:r>
     </w:p>
     <w:p>
@@ -5282,35 +5282,35 @@
           <w:sz w:val="22"/>
           <w:szCs w:val="22"/>
         </w:rPr>
-        <w:t xml:space="preserve">River Bet Shortcut for Quartering</w:t>
-      </w:r>
-    </w:p>
-    <w:p>
-      <w:pPr>
-        <w:spacing w:after="160" w:line="276"/>
-      </w:pPr>
-      <w:r>
-        <w:rPr>
-          <w:rFonts w:ascii="Arial" w:cs="Arial" w:eastAsia="Arial" w:hAnsi="Arial"/>
-          <w:color w:val="333333"/>
-          <w:sz w:val="21"/>
-          <w:szCs w:val="21"/>
-        </w:rPr>
-        <w:t xml:space="preserve">When there are bets on the final street before a quartering situation, the standard method of collecting everything into a central pot and then performing the nested division is slow and error-prone. Experienced dealers use a shortcut: they push the river bets directly to the winner of one board, then split the remaining pre-river pot between the other board’s tied winners. This works because the river bets will mathematically end up in the same place regardless of whether you merge first or pay directly. The shortcut avoids combining and re-separating, which is the operation where chips most commonly end up in the wrong pile. Players get visibly nervous when a dealer has never handled a quartering situation before, and the confidence of the shortcut method matters for table trust.</w:t>
-      </w:r>
-    </w:p>
-    <w:p>
-      <w:pPr>
-        <w:spacing w:after="160" w:line="276"/>
-      </w:pPr>
-      <w:r>
-        <w:rPr>
-          <w:rFonts w:ascii="Arial" w:cs="Arial" w:eastAsia="Arial" w:hAnsi="Arial"/>
-          <w:color w:val="333333"/>
-          <w:sz w:val="21"/>
-          <w:szCs w:val="21"/>
-        </w:rPr>
-        <w:t xml:space="preserve">In PLO high-low split games (like Big O / PLO8), the complexity compounds further. Each board already splits between high and low winners. If two players tie for the low on one board while another player scoops the high, that board’s half is first split high/low, then the low half is split again between the tying players. A single pot can be divided four, six, or even eight ways in extreme scenarios. Dealers report that these multi-way split calculations are the single most stressful dealing situation they encounter, and errors are common even among experienced dealers.</w:t>
+        <w:t xml:space="preserve">Quartering in PLO Double Board Bomb Pots</w:t>
+      </w:r>
+    </w:p>
+    <w:p>
+      <w:pPr>
+        <w:spacing w:after="160" w:line="276"/>
+      </w:pPr>
+      <w:r>
+        <w:rPr>
+          <w:rFonts w:ascii="Arial" w:cs="Arial" w:eastAsia="Arial" w:hAnsi="Arial"/>
+          <w:color w:val="333333"/>
+          <w:sz w:val="21"/>
+          <w:szCs w:val="21"/>
+        </w:rPr>
+        <w:t xml:space="preserve">In Pot-Limit Omaha double board bomb pots (an increasingly common format in casino cash games), each board receives exactly half the pot. If one player wins the top board outright and two players tie on the bottom board, the top board winner receives 50% of the pot, and the two bottom board winners each receive 25%. This is called quartering. The player who gets quartered ends up with significantly less than they may expect, which is a frequent source of confusion and disputes.</w:t>
+      </w:r>
+    </w:p>
+    <w:p>
+      <w:pPr>
+        <w:spacing w:after="160" w:line="276"/>
+      </w:pPr>
+      <w:r>
+        <w:rPr>
+          <w:rFonts w:ascii="Arial" w:cs="Arial" w:eastAsia="Arial" w:hAnsi="Arial"/>
+          <w:color w:val="333333"/>
+          <w:sz w:val="21"/>
+          <w:szCs w:val="21"/>
+        </w:rPr>
+        <w:t xml:space="preserve">The dealing procedure for quartering: First, the dealer separates the total pot into two equal halves, one for each board. The winning player on Board 1 receives their half immediately. Then the dealer takes the remaining half and splits it again into two equal portions for the tied players on Board 2. This means the dealer is performing nested pot division: split the total pot, then split half of that split. With odd chips, the same left-of-button rule applies at each level of division.</w:t>
       </w:r>
     </w:p>
     <w:p>
@@ -5326,35 +5326,35 @@
           <w:sz w:val="22"/>
           <w:szCs w:val="22"/>
         </w:rPr>
-        <w:t xml:space="preserve">Odd Chip in Hi-Lo Split Games</w:t>
-      </w:r>
-    </w:p>
-    <w:p>
-      <w:pPr>
-        <w:spacing w:after="160" w:line="276"/>
-      </w:pPr>
-      <w:r>
-        <w:rPr>
-          <w:rFonts w:ascii="Arial" w:cs="Arial" w:eastAsia="Arial" w:hAnsi="Arial"/>
-          <w:color w:val="333333"/>
-          <w:sz w:val="21"/>
-          <w:szCs w:val="21"/>
-        </w:rPr>
-        <w:t xml:space="preserve">A frequently asked question: in a hi-lo game where the low portion uses lowball rankings (like Razz or the low side of Stud 8), does the odd chip go to the lowest card by lowest suit, or does it still go to the highest card by highest suit? The answer per WSOP rules: the odd chip always goes to the highest card by highest suit, even in Raz and even for the low portion of a hi-lo pot. Some individual tournament directors or poker room managers have adopted a ‘logical’ approach of using lowest card by lowest suit for the low half, but this is not the standard. The safest approach for a dealer is to use high card by suit universally. The odd chip is a trivial amount — the important thing is having a consistent, enforceable rule, not achieving perfect philosophical fairness.</w:t>
-      </w:r>
-    </w:p>
-    <w:p>
-      <w:pPr>
-        <w:spacing w:after="160" w:line="276"/>
-      </w:pPr>
-      <w:r>
-        <w:rPr>
-          <w:rFonts w:ascii="Arial" w:cs="Arial" w:eastAsia="Arial" w:hAnsi="Arial"/>
-          <w:color w:val="333333"/>
-          <w:sz w:val="21"/>
-          <w:szCs w:val="21"/>
-        </w:rPr>
-        <w:t xml:space="preserve">An important distinction: the suit-based tiebreaker above applies to odd chip decisions within the same half of a hi-lo pot (e.g., two players tie for the low). For the odd chip between the high and low halves themselves, a different and simpler rule applies: the high hand always receives the extra chip, regardless of seat position or suit. This is universal across WSOP, TDA, and virtually all house rules. The dealer first divides the pot into high and low halves; if a chip cannot be evenly split, it goes to the high side. Only after each half is established does the within-half odd chip rule (worst position for low ties, or high card by suit for high ties) apply to further tiebreakers within that half.</w:t>
+        <w:t xml:space="preserve">River Bet Shortcut for Quartering</w:t>
+      </w:r>
+    </w:p>
+    <w:p>
+      <w:pPr>
+        <w:spacing w:after="160" w:line="276"/>
+      </w:pPr>
+      <w:r>
+        <w:rPr>
+          <w:rFonts w:ascii="Arial" w:cs="Arial" w:eastAsia="Arial" w:hAnsi="Arial"/>
+          <w:color w:val="333333"/>
+          <w:sz w:val="21"/>
+          <w:szCs w:val="21"/>
+        </w:rPr>
+        <w:t xml:space="preserve">When there are bets on the final street before a quartering situation, the standard method of collecting everything into a central pot and then performing the nested division is slow and error-prone. Experienced dealers use a shortcut: they push the river bets directly to the winner of one board, then split the remaining pre-river pot between the other board’s tied winners. This works because the river bets will mathematically end up in the same place regardless of whether you merge first or pay directly. The shortcut avoids combining and re-separating, which is the operation where chips most commonly end up in the wrong pile. Players get visibly nervous when a dealer has never handled a quartering situation before, and the confidence of the shortcut method matters for table trust.</w:t>
+      </w:r>
+    </w:p>
+    <w:p>
+      <w:pPr>
+        <w:spacing w:after="160" w:line="276"/>
+      </w:pPr>
+      <w:r>
+        <w:rPr>
+          <w:rFonts w:ascii="Arial" w:cs="Arial" w:eastAsia="Arial" w:hAnsi="Arial"/>
+          <w:color w:val="333333"/>
+          <w:sz w:val="21"/>
+          <w:szCs w:val="21"/>
+        </w:rPr>
+        <w:t xml:space="preserve">In PLO high-low split games (like Big O / PLO8), the complexity compounds further. Each board already splits between high and low winners. If two players tie for the low on one board while another player scoops the high, that board’s half is first split high/low, then the low half is split again between the tying players. A single pot can be divided four, six, or even eight ways in extreme scenarios. Dealers report that these multi-way split calculations are the single most stressful dealing situation they encounter, and errors are common even among experienced dealers.</w:t>
       </w:r>
     </w:p>
     <w:p>
@@ -5370,6 +5370,50 @@
           <w:sz w:val="22"/>
           <w:szCs w:val="22"/>
         </w:rPr>
+        <w:t xml:space="preserve">Odd Chip in Hi-Lo Split Games</w:t>
+      </w:r>
+    </w:p>
+    <w:p>
+      <w:pPr>
+        <w:spacing w:after="160" w:line="276"/>
+      </w:pPr>
+      <w:r>
+        <w:rPr>
+          <w:rFonts w:ascii="Arial" w:cs="Arial" w:eastAsia="Arial" w:hAnsi="Arial"/>
+          <w:color w:val="333333"/>
+          <w:sz w:val="21"/>
+          <w:szCs w:val="21"/>
+        </w:rPr>
+        <w:t xml:space="preserve">A frequently asked question: in a hi-lo game where the low portion uses lowball rankings (like Razz or the low side of Stud 8), does the odd chip go to the lowest card by lowest suit, or does it still go to the highest card by highest suit? The answer per WSOP rules: the odd chip always goes to the highest card by highest suit, even in Raz and even for the low portion of a hi-lo pot. Some individual tournament directors or poker room managers have adopted a ‘logical’ approach of using lowest card by lowest suit for the low half, but this is not the standard. The safest approach for a dealer is to use high card by suit universally. The odd chip is a trivial amount — the important thing is having a consistent, enforceable rule, not achieving perfect philosophical fairness.</w:t>
+      </w:r>
+    </w:p>
+    <w:p>
+      <w:pPr>
+        <w:spacing w:after="160" w:line="276"/>
+      </w:pPr>
+      <w:r>
+        <w:rPr>
+          <w:rFonts w:ascii="Arial" w:cs="Arial" w:eastAsia="Arial" w:hAnsi="Arial"/>
+          <w:color w:val="333333"/>
+          <w:sz w:val="21"/>
+          <w:szCs w:val="21"/>
+        </w:rPr>
+        <w:t xml:space="preserve">An important distinction: the suit-based tiebreaker above applies to odd chip decisions within the same half of a hi-lo pot (e.g., two players tie for the low). For the odd chip between the high and low halves themselves, a different and simpler rule applies: the high hand always receives the extra chip, regardless of seat position or suit. This is universal across WSOP, TDA, and virtually all house rules. The dealer first divides the pot into high and low halves; if a chip cannot be evenly split, it goes to the high side. Only after each half is established does the within-half odd chip rule (worst position for low ties, or high card by suit for high ties) apply to further tiebreakers within that half.</w:t>
+      </w:r>
+    </w:p>
+    <w:p>
+      <w:pPr>
+        <w:spacing w:before="200" w:after="120"/>
+      </w:pPr>
+      <w:r>
+        <w:rPr>
+          <w:rFonts w:ascii="Arial" w:cs="Arial" w:eastAsia="Arial" w:hAnsi="Arial"/>
+          <w:b/>
+          <w:bCs/>
+          <w:color w:val="C0392B"/>
+          <w:sz w:val="22"/>
+          <w:szCs w:val="22"/>
+        </w:rPr>
         <w:t xml:space="preserve">Equal Split Shortcut in Hi-Lo</w:t>
       </w:r>
     </w:p>
@@ -6979,6 +7023,20 @@
           <w:sz w:val="21"/>
           <w:szCs w:val="21"/>
         </w:rPr>
+        <w:t xml:space="preserve">Critical framing protocol: only frame as you improve. The dealer reads the first tabled hand, frames it as the current best, and then moves to the next hand. If the next hand does not beat the current best, do not frame it — simply read it and muck it. Only frame a new hand when it displaces the current leader. This prevents unnecessary physical manipulation and speeds up the showdown process. In an audition, framing every hand (including losing ones) wastes time and signals inexperience. In a casino, it slows the game. The WSOP requires every tabled hand to be read by the dealer, but reading does not mean framing — only the winning hand (or the current leading hand as it improves) gets framed.</w:t>
+      </w:r>
+    </w:p>
+    <w:p>
+      <w:pPr>
+        <w:spacing w:after="160" w:line="276"/>
+      </w:pPr>
+      <w:r>
+        <w:rPr>
+          <w:rFonts w:ascii="Arial" w:cs="Arial" w:eastAsia="Arial" w:hAnsi="Arial"/>
+          <w:color w:val="333333"/>
+          <w:sz w:val="21"/>
+          <w:szCs w:val="21"/>
+        </w:rPr>
         <w:t xml:space="preserve">The math: with 4 hole cards, there are 6 possible 2-card combinations. With 5 community cards, there are 10 possible 3-card combinations. That yields 60 possible 5-card hands per player. At a full table of 10 players, the dealer must potentially evaluate up to 600 hand combinations at showdown. In practice, the dealer reads the board first to identify what hands are possible and then looks for the relevant cards in each player’s hand, but the cognitive load is still enormous compared to Hold’em.</w:t>
       </w:r>
     </w:p>
@@ -6995,35 +7053,21 @@
           <w:sz w:val="22"/>
           <w:szCs w:val="22"/>
         </w:rPr>
-        <w:t xml:space="preserve">Systematic Board Reading for Omaha Showdown</w:t>
-      </w:r>
-    </w:p>
-    <w:p>
-      <w:pPr>
-        <w:spacing w:after="160" w:line="276"/>
-      </w:pPr>
-      <w:r>
-        <w:rPr>
-          <w:rFonts w:ascii="Arial" w:cs="Arial" w:eastAsia="Arial" w:hAnsi="Arial"/>
-          <w:color w:val="333333"/>
-          <w:sz w:val="21"/>
-          <w:szCs w:val="21"/>
-        </w:rPr>
-        <w:t xml:space="preserve">The key to accurate Omaha hand reading is to read the board first, not the players’ hands. Before looking at any hole cards, the dealer classifies the board by what hands are possible, working from the highest possible hand downward. This top-down elimination approach is far more efficient than trying to evaluate each player’s 6 two-card combinations independently. The hierarchy: (1) Is the board paired? If yes, four of a kind and full houses are possible. (2) Are there three or more cards of one suit? If yes, flushes are possible. (3) Are there three or more connected or near-connected cards? If yes, straights are possible. (4) After eliminating the impossible, the dealer knows exactly which card combinations to look for in each player’s hand.</w:t>
-      </w:r>
-    </w:p>
-    <w:p>
-      <w:pPr>
-        <w:spacing w:after="160" w:line="276"/>
-      </w:pPr>
-      <w:r>
-        <w:rPr>
-          <w:rFonts w:ascii="Arial" w:cs="Arial" w:eastAsia="Arial" w:hAnsi="Arial"/>
-          <w:color w:val="333333"/>
-          <w:sz w:val="21"/>
-          <w:szCs w:val="21"/>
-        </w:rPr>
-        <w:t xml:space="preserve">The board reading hierarchy from highest to lowest: four of a kind (requires a paired board plus a player holding the matching pocket pair), full house (requires a paired board), flush (requires three or more suited board cards), straight (requires three or more connected board cards), three of a kind (set with unpaired board, or trips with paired board), two pair, one pair, high card. At each level, the dealer asks: ‘Is this hand possible given this board?’ If not, skip to the next level down. This is the same logical process a computer uses, and training dealers to think algorithmically — always starting from the top and working down — dramatically reduces showdown errors.</w:t>
+        <w:t xml:space="preserve">Four-Card Muck Verification</w:t>
+      </w:r>
+    </w:p>
+    <w:p>
+      <w:pPr>
+        <w:spacing w:after="160" w:line="276"/>
+      </w:pPr>
+      <w:r>
+        <w:rPr>
+          <w:rFonts w:ascii="Arial" w:cs="Arial" w:eastAsia="Arial" w:hAnsi="Arial"/>
+          <w:color w:val="333333"/>
+          <w:sz w:val="21"/>
+          <w:szCs w:val="21"/>
+        </w:rPr>
+        <w:t xml:space="preserve">Every time a player folds in Omaha, the dealer must verify that the muck contains exactly four cards. This is a fundamental Omaha-specific discipline that does not exist in Hold’em (where folded hands are almost always two cards). In Omaha, players can accidentally leave a card behind, retain a card, or receive the wrong number of cards due to a dealing error. A missing card corrupts the entire hand. In WSOP auditions, evaluators specifically watch for this verification — failing to check card counts when collecting mucked hands is a scoring deduction. The check should be quick and natural: as the dealer receives the folded cards, a brief thumb-fan or riffle confirms the count without slowing the game. In Big O (five-card Omaha), the same principle applies but the target count is five.</w:t>
       </w:r>
     </w:p>
     <w:p>
@@ -7039,77 +7083,35 @@
           <w:sz w:val="22"/>
           <w:szCs w:val="22"/>
         </w:rPr>
-        <w:t xml:space="preserve">Board Type Classification</w:t>
-      </w:r>
-    </w:p>
-    <w:p>
-      <w:pPr>
-        <w:spacing w:after="160" w:line="276"/>
-      </w:pPr>
-      <w:r>
-        <w:rPr>
-          <w:rFonts w:ascii="Arial" w:cs="Arial" w:eastAsia="Arial" w:hAnsi="Arial"/>
-          <w:color w:val="333333"/>
-          <w:sz w:val="21"/>
-          <w:szCs w:val="21"/>
-        </w:rPr>
-        <w:t xml:space="preserve">Unpaired board with no straight and no flush possible (e.g., K♠7♠Q♠9♣2): The best possible hand is two pair using two hole cards that match two board cards. No full houses, flushes, or straights are possible. The dealer only needs to check for two pair or a set if a player’s pocket pair matches a board card. These boards produce the simplest showdowns in Omaha.</w:t>
-      </w:r>
-    </w:p>
-    <w:p>
-      <w:pPr>
-        <w:spacing w:after="160" w:line="276"/>
-      </w:pPr>
-      <w:r>
-        <w:rPr>
-          <w:rFonts w:ascii="Arial" w:cs="Arial" w:eastAsia="Arial" w:hAnsi="Arial"/>
-          <w:color w:val="333333"/>
-          <w:sz w:val="21"/>
-          <w:szCs w:val="21"/>
-        </w:rPr>
-        <w:t xml:space="preserve">Possible straight boards: When three or more board cards can contribute to a straight, the dealer must identify which two-card combinations from a player’s hand would complete it. A four-straight board (four cards to a straight) means only one specific card value is needed from the hand, making straights very likely. A five-straight board (five consecutive cards on board) means any player with two cards that include a card above the top of the sequence has the best possible straight. The dealer must carefully verify that the player is using exactly two cards from their hand — a board of 5-6-7-8-9 does not give a straight to a player holding only a 10 with no other connector. They need two hand cards that work together with exactly three board cards.</w:t>
-      </w:r>
-    </w:p>
-    <w:p>
-      <w:pPr>
-        <w:spacing w:after="160" w:line="276"/>
-      </w:pPr>
-      <w:r>
-        <w:rPr>
-          <w:rFonts w:ascii="Arial" w:cs="Arial" w:eastAsia="Arial" w:hAnsi="Arial"/>
-          <w:color w:val="333333"/>
-          <w:sz w:val="21"/>
-          <w:szCs w:val="21"/>
-        </w:rPr>
-        <w:t xml:space="preserve">Flush boards: When three board cards share a suit, a flush is possible if a player holds two cards of that suit (using two from hand, three from board). With four suited board cards, a player needs only one card of that suit from their hand — but in Omaha, they still must use exactly two cards total, so the second card from their hand becomes a non-flush card paired with three suited board cards. With five suited board cards, every player with at least two cards of that suit has a flush; the winner is determined by who holds the highest card of that suit. The most common dealer error on flush boards: forgetting that the player must use TWO hand cards. A player with the ace of hearts and no other heart does NOT have a flush on a four-heart board in Omaha — they would need to use two hand cards and only three board cards, and they only have one heart.</w:t>
-      </w:r>
-    </w:p>
-    <w:p>
-      <w:pPr>
-        <w:spacing w:after="160" w:line="276"/>
-      </w:pPr>
-      <w:r>
-        <w:rPr>
-          <w:rFonts w:ascii="Arial" w:cs="Arial" w:eastAsia="Arial" w:hAnsi="Arial"/>
-          <w:color w:val="333333"/>
-          <w:sz w:val="21"/>
-          <w:szCs w:val="21"/>
-        </w:rPr>
-        <w:t xml:space="preserve">Paired boards: When the board contains a pair, full houses become possible. The dealer first checks for four of a kind (a player holding the other two cards matching the board pair — extremely rare but must be checked). Then checks for full houses: a player with a pocket pair matching any unpaired board card, or a player with one card matching the board pair and one matching another board card. On a paired board that also has flush possibilities, the dealer must check for the full house FIRST because it beats a flush. This ordering is critical — inexperienced dealers who spot a flush first and declare a winner before checking for a full house cause costly showdown errors.</w:t>
-      </w:r>
-    </w:p>
-    <w:p>
-      <w:pPr>
-        <w:spacing w:after="160" w:line="276"/>
-      </w:pPr>
-      <w:r>
-        <w:rPr>
-          <w:rFonts w:ascii="Arial" w:cs="Arial" w:eastAsia="Arial" w:hAnsi="Arial"/>
-          <w:color w:val="333333"/>
-          <w:sz w:val="21"/>
-          <w:szCs w:val="21"/>
-        </w:rPr>
-        <w:t xml:space="preserve">Two-pair boards (e.g., K-K-7-7-2): Full houses are very likely. Any player holding a king, a seven, or a deuce paired with another board card has a full house. Check for four of a kind first (pocket kings or pocket sevens), then evaluate full houses by rank. Three-of-a-kind boards (e.g., 9-9-9-K-3): Four of a kind is possible if a player holds the case nine. Otherwise, the best possible hand is a full house — the player uses all three nines from the board plus a pocket pair from their hand. The dealer must remember: exactly two cards from hand and three from board, so with trip nines on board, the player contributes a pocket pair and takes all three nines from the board for nines full.</w:t>
+        <w:t xml:space="preserve">Systematic Board Reading for Omaha Showdown</w:t>
+      </w:r>
+    </w:p>
+    <w:p>
+      <w:pPr>
+        <w:spacing w:after="160" w:line="276"/>
+      </w:pPr>
+      <w:r>
+        <w:rPr>
+          <w:rFonts w:ascii="Arial" w:cs="Arial" w:eastAsia="Arial" w:hAnsi="Arial"/>
+          <w:color w:val="333333"/>
+          <w:sz w:val="21"/>
+          <w:szCs w:val="21"/>
+        </w:rPr>
+        <w:t xml:space="preserve">The key to accurate Omaha hand reading is to read the board first, not the players’ hands. Before looking at any hole cards, the dealer classifies the board by what hands are possible, working from the highest possible hand downward. This top-down elimination approach is far more efficient than trying to evaluate each player’s 6 two-card combinations independently. The hierarchy: (1) Is the board paired? If yes, four of a kind and full houses are possible. (2) Are there three or more cards of one suit? If yes, flushes are possible. (3) Are there three or more connected or near-connected cards? If yes, straights are possible. (4) After eliminating the impossible, the dealer knows exactly which card combinations to look for in each player’s hand.</w:t>
+      </w:r>
+    </w:p>
+    <w:p>
+      <w:pPr>
+        <w:spacing w:after="160" w:line="276"/>
+      </w:pPr>
+      <w:r>
+        <w:rPr>
+          <w:rFonts w:ascii="Arial" w:cs="Arial" w:eastAsia="Arial" w:hAnsi="Arial"/>
+          <w:color w:val="333333"/>
+          <w:sz w:val="21"/>
+          <w:szCs w:val="21"/>
+        </w:rPr>
+        <w:t xml:space="preserve">The board reading hierarchy from highest to lowest: four of a kind (requires a paired board plus a player holding the matching pocket pair), full house (requires a paired board), flush (requires three or more suited board cards), straight (requires three or more connected board cards), three of a kind (set with unpaired board, or trips with paired board), two pair, one pair, high card. At each level, the dealer asks: ‘Is this hand possible given this board?’ If not, skip to the next level down. This is the same logical process a computer uses, and training dealers to think algorithmically — always starting from the top and working down — dramatically reduces showdown errors.</w:t>
       </w:r>
     </w:p>
     <w:p>
@@ -7125,21 +7127,77 @@
           <w:sz w:val="22"/>
           <w:szCs w:val="22"/>
         </w:rPr>
-        <w:t xml:space="preserve">Stub Counting in Omaha</w:t>
-      </w:r>
-    </w:p>
-    <w:p>
-      <w:pPr>
-        <w:spacing w:after="160" w:line="276"/>
-      </w:pPr>
-      <w:r>
-        <w:rPr>
-          <w:rFonts w:ascii="Arial" w:cs="Arial" w:eastAsia="Arial" w:hAnsi="Arial"/>
-          <w:color w:val="333333"/>
-          <w:sz w:val="21"/>
-          <w:szCs w:val="21"/>
-        </w:rPr>
-        <w:t xml:space="preserve">Stub counting — verifying the correct number of cards remain in the deck — must be adjusted for Omaha’s increased card distribution. In a full 10-player Omaha game: 4 cards per player × 10 players = 40 hole cards, plus 3 burn cards, plus 5 community cards = 48 cards dealt. That leaves only 4 cards in the stub. In a 9-player game, the stub has 8 cards. Compare this to Hold’em: 10 players × 2 cards = 20 + 3 burns + 5 board = 28 cards, leaving 24 in the stub. Dealers accustomed to Hold’em stub counts are often surprised by how thin the Omaha stub is. With only 4 cards remaining at a full table, any dealing error — double-dealing, forgetting to burn, dealing to a mucked seat — is immediately apparent because the stub will not have enough cards to complete the board. In Big O (5 cards per player, 7-max): 5 × 7 = 35 + 3 burns + 5 board = 43, leaving 9 in the stub.</w:t>
+        <w:t xml:space="preserve">Board Type Classification</w:t>
+      </w:r>
+    </w:p>
+    <w:p>
+      <w:pPr>
+        <w:spacing w:after="160" w:line="276"/>
+      </w:pPr>
+      <w:r>
+        <w:rPr>
+          <w:rFonts w:ascii="Arial" w:cs="Arial" w:eastAsia="Arial" w:hAnsi="Arial"/>
+          <w:color w:val="333333"/>
+          <w:sz w:val="21"/>
+          <w:szCs w:val="21"/>
+        </w:rPr>
+        <w:t xml:space="preserve">Unpaired board with no straight and no flush possible (e.g., K♠7♠Q♠9♣2): The best possible hand is two pair using two hole cards that match two board cards. No full houses, flushes, or straights are possible. The dealer only needs to check for two pair or a set if a player’s pocket pair matches a board card. These boards produce the simplest showdowns in Omaha.</w:t>
+      </w:r>
+    </w:p>
+    <w:p>
+      <w:pPr>
+        <w:spacing w:after="160" w:line="276"/>
+      </w:pPr>
+      <w:r>
+        <w:rPr>
+          <w:rFonts w:ascii="Arial" w:cs="Arial" w:eastAsia="Arial" w:hAnsi="Arial"/>
+          <w:color w:val="333333"/>
+          <w:sz w:val="21"/>
+          <w:szCs w:val="21"/>
+        </w:rPr>
+        <w:t xml:space="preserve">Possible straight boards: When three or more board cards can contribute to a straight, the dealer must identify which two-card combinations from a player’s hand would complete it. A four-straight board (four cards to a straight) means only one specific card value is needed from the hand, making straights very likely. A five-straight board (five consecutive cards on board) means any player with two cards that include a card above the top of the sequence has the best possible straight. The dealer must carefully verify that the player is using exactly two cards from their hand — a board of 5-6-7-8-9 does not give a straight to a player holding only a 10 with no other connector. They need two hand cards that work together with exactly three board cards.</w:t>
+      </w:r>
+    </w:p>
+    <w:p>
+      <w:pPr>
+        <w:spacing w:after="160" w:line="276"/>
+      </w:pPr>
+      <w:r>
+        <w:rPr>
+          <w:rFonts w:ascii="Arial" w:cs="Arial" w:eastAsia="Arial" w:hAnsi="Arial"/>
+          <w:color w:val="333333"/>
+          <w:sz w:val="21"/>
+          <w:szCs w:val="21"/>
+        </w:rPr>
+        <w:t xml:space="preserve">Flush boards: When three board cards share a suit, a flush is possible if a player holds two cards of that suit (using two from hand, three from board). With four suited board cards, a player needs only one card of that suit from their hand — but in Omaha, they still must use exactly two cards total, so the second card from their hand becomes a non-flush card paired with three suited board cards. With five suited board cards, every player with at least two cards of that suit has a flush; the winner is determined by who holds the highest card of that suit. The most common dealer error on flush boards: forgetting that the player must use TWO hand cards. A player with the ace of hearts and no other heart does NOT have a flush on a four-heart board in Omaha — they would need to use two hand cards and only three board cards, and they only have one heart.</w:t>
+      </w:r>
+    </w:p>
+    <w:p>
+      <w:pPr>
+        <w:spacing w:after="160" w:line="276"/>
+      </w:pPr>
+      <w:r>
+        <w:rPr>
+          <w:rFonts w:ascii="Arial" w:cs="Arial" w:eastAsia="Arial" w:hAnsi="Arial"/>
+          <w:color w:val="333333"/>
+          <w:sz w:val="21"/>
+          <w:szCs w:val="21"/>
+        </w:rPr>
+        <w:t xml:space="preserve">Paired boards: When the board contains a pair, full houses become possible. The dealer first checks for four of a kind (a player holding the other two cards matching the board pair — extremely rare but must be checked). Then checks for full houses: a player with a pocket pair matching any unpaired board card, or a player with one card matching the board pair and one matching another board card. On a paired board that also has flush possibilities, the dealer must check for the full house FIRST because it beats a flush. This ordering is critical — inexperienced dealers who spot a flush first and declare a winner before checking for a full house cause costly showdown errors.</w:t>
+      </w:r>
+    </w:p>
+    <w:p>
+      <w:pPr>
+        <w:spacing w:after="160" w:line="276"/>
+      </w:pPr>
+      <w:r>
+        <w:rPr>
+          <w:rFonts w:ascii="Arial" w:cs="Arial" w:eastAsia="Arial" w:hAnsi="Arial"/>
+          <w:color w:val="333333"/>
+          <w:sz w:val="21"/>
+          <w:szCs w:val="21"/>
+        </w:rPr>
+        <w:t xml:space="preserve">Two-pair boards (e.g., K-K-7-7-2): Full houses are very likely. Any player holding a king, a seven, or a deuce paired with another board card has a full house. Check for four of a kind first (pocket kings or pocket sevens), then evaluate full houses by rank. Three-of-a-kind boards (e.g., 9-9-9-K-3): Four of a kind is possible if a player holds the case nine. Otherwise, the best possible hand is a full house — the player uses all three nines from the board plus a pocket pair from their hand. The dealer must remember: exactly two cards from hand and three from board, so with trip nines on board, the player contributes a pocket pair and takes all three nines from the board for nines full.</w:t>
       </w:r>
     </w:p>
     <w:p>
@@ -7155,21 +7213,21 @@
           <w:sz w:val="22"/>
           <w:szCs w:val="22"/>
         </w:rPr>
-        <w:t xml:space="preserve">Cash vs Tournament Chip Handling in Omaha</w:t>
-      </w:r>
-    </w:p>
-    <w:p>
-      <w:pPr>
-        <w:spacing w:after="160" w:line="276"/>
-      </w:pPr>
-      <w:r>
-        <w:rPr>
-          <w:rFonts w:ascii="Arial" w:cs="Arial" w:eastAsia="Arial" w:hAnsi="Arial"/>
-          <w:color w:val="333333"/>
-          <w:sz w:val="21"/>
-          <w:szCs w:val="21"/>
-        </w:rPr>
-        <w:t xml:space="preserve">Chip handling rules differ between cash games and tournaments in ways that affect Omaha dealing specifically, because of the frequency of split pots and pot stacking in hi-lo variants. In cash games, the dealer must use fingertips only when touching chips in the tray or the pot — no palming, no cupping, no picking up full stacks with the hand wrapped around them. This is a security protocol to prevent chip theft: fingertips-only contact ensures surveillance cameras can always see the chips and the dealer’s hands. In tournaments, the dealer can pick up chips with a full grip because tournament chips have no cash value and the security concern is eliminated. This distinction matters most in Omaha Hi-Lo and Big O where the dealer is frequently stacking, splitting, and moving chips between multiple pot halves. Tournament dealing allows faster chip handling, while cash game dealing prioritizes visible security over speed.</w:t>
+        <w:t xml:space="preserve">Stub Counting in Omaha</w:t>
+      </w:r>
+    </w:p>
+    <w:p>
+      <w:pPr>
+        <w:spacing w:after="160" w:line="276"/>
+      </w:pPr>
+      <w:r>
+        <w:rPr>
+          <w:rFonts w:ascii="Arial" w:cs="Arial" w:eastAsia="Arial" w:hAnsi="Arial"/>
+          <w:color w:val="333333"/>
+          <w:sz w:val="21"/>
+          <w:szCs w:val="21"/>
+        </w:rPr>
+        <w:t xml:space="preserve">Stub counting — verifying the correct number of cards remain in the deck — must be adjusted for Omaha’s increased card distribution. In a full 10-player Omaha game: 4 cards per player × 10 players = 40 hole cards, plus 3 burn cards, plus 5 community cards = 48 cards dealt. That leaves only 4 cards in the stub. In a 9-player game, the stub has 8 cards. Compare this to Hold’em: 10 players × 2 cards = 20 + 3 burns + 5 board = 28 cards, leaving 24 in the stub. Dealers accustomed to Hold’em stub counts are often surprised by how thin the Omaha stub is. With only 4 cards remaining at a full table, any dealing error — double-dealing, forgetting to burn, dealing to a mucked seat — is immediately apparent because the stub will not have enough cards to complete the board. In Big O (5 cards per player, 7-max): 5 × 7 = 35 + 3 burns + 5 board = 43, leaving 9 in the stub.</w:t>
       </w:r>
     </w:p>
     <w:p>
@@ -7185,21 +7243,21 @@
           <w:sz w:val="22"/>
           <w:szCs w:val="22"/>
         </w:rPr>
-        <w:t xml:space="preserve">Pot-Limit Calculation</w:t>
-      </w:r>
-    </w:p>
-    <w:p>
-      <w:pPr>
-        <w:spacing w:after="160" w:line="276"/>
-      </w:pPr>
-      <w:r>
-        <w:rPr>
-          <w:rFonts w:ascii="Arial" w:cs="Arial" w:eastAsia="Arial" w:hAnsi="Arial"/>
-          <w:color w:val="333333"/>
-          <w:sz w:val="21"/>
-          <w:szCs w:val="21"/>
-        </w:rPr>
-        <w:t xml:space="preserve">In pot-limit games, the maximum bet is the current pot size plus the amount needed to call. This means the dealer must track the pot total continuously. After multiple raises in a single round, the pot-limit calculation becomes: pot before action + all previous bets in this round + the amount needed to call the current bet. Dealers are frequently asked “what’s the pot?” and must answer immediately. In round-up raking environments, odd amounts from previous pot calculations make tracking even harder. This is one of the most requested features for dealer assistance technology.</w:t>
+        <w:t xml:space="preserve">Cash vs Tournament Chip Handling in Omaha</w:t>
+      </w:r>
+    </w:p>
+    <w:p>
+      <w:pPr>
+        <w:spacing w:after="160" w:line="276"/>
+      </w:pPr>
+      <w:r>
+        <w:rPr>
+          <w:rFonts w:ascii="Arial" w:cs="Arial" w:eastAsia="Arial" w:hAnsi="Arial"/>
+          <w:color w:val="333333"/>
+          <w:sz w:val="21"/>
+          <w:szCs w:val="21"/>
+        </w:rPr>
+        <w:t xml:space="preserve">Chip handling rules differ between cash games and tournaments in ways that affect Omaha dealing specifically, because of the frequency of split pots and pot stacking in hi-lo variants. In cash games, the dealer must use fingertips only when touching chips in the tray or the pot — no palming, no cupping, no picking up full stacks with the hand wrapped around them. This is a security protocol to prevent chip theft: fingertips-only contact ensures surveillance cameras can always see the chips and the dealer’s hands. In tournaments, the dealer can pick up chips with a full grip because tournament chips have no cash value and the security concern is eliminated. This distinction matters most in Omaha Hi-Lo and Big O where the dealer is frequently stacking, splitting, and moving chips between multiple pot halves. Tournament dealing allows faster chip handling, while cash game dealing prioritizes visible security over speed.</w:t>
       </w:r>
     </w:p>
     <w:p>
@@ -7215,35 +7273,21 @@
           <w:sz w:val="22"/>
           <w:szCs w:val="22"/>
         </w:rPr>
-        <w:t xml:space="preserve">Pot Tracking Across Streets in PLO</w:t>
-      </w:r>
-    </w:p>
-    <w:p>
-      <w:pPr>
-        <w:spacing w:after="160" w:line="276"/>
-      </w:pPr>
-      <w:r>
-        <w:rPr>
-          <w:rFonts w:ascii="Arial" w:cs="Arial" w:eastAsia="Arial" w:hAnsi="Arial"/>
-          <w:color w:val="333333"/>
-          <w:sz w:val="21"/>
-          <w:szCs w:val="21"/>
-        </w:rPr>
-        <w:t xml:space="preserve">The most critical discipline for a PLO dealer is knowing the pot total at every moment without physically counting it. After each betting round, before bringing bets into the center, the dealer calculates the new pot total: count the number of players, multiply by their bet, add any dead money from folds, and add the existing pot. Example: 4 players at 75 each = 300, plus 20 dead from pre-flop folders = 320. That number (320) must be locked in memory before the bets are merged into the pot. On the next street, if two players bet 150 each, the new total is 320 + 300 = 620. This incremental tracking is the only reliable method — reconstructing the pot total from a pile of mixed chips is nearly impossible without a physical count.</w:t>
-      </w:r>
-    </w:p>
-    <w:p>
-      <w:pPr>
-        <w:spacing w:after="160" w:line="276"/>
-      </w:pPr>
-      <w:r>
-        <w:rPr>
-          <w:rFonts w:ascii="Arial" w:cs="Arial" w:eastAsia="Arial" w:hAnsi="Arial"/>
-          <w:color w:val="333333"/>
-          <w:sz w:val="21"/>
-          <w:szCs w:val="21"/>
-        </w:rPr>
-        <w:t xml:space="preserve">When pulling in bets that include dead money from folders, keep the dead money physically separate until you have computed the total. This is an acceptable practice: the dead money sits next to the pot rather than being immediately pushed in. Once the dealer has the number, everything merges. The key discipline: never bring a flop, turn, or river until you know the pot total. Taking 5 to 10 extra seconds to verify the math is always preferable to calling a floor supervisor to count down the pot mid-hand.</w:t>
+        <w:t xml:space="preserve">Pot-Limit Calculation</w:t>
+      </w:r>
+    </w:p>
+    <w:p>
+      <w:pPr>
+        <w:spacing w:after="160" w:line="276"/>
+      </w:pPr>
+      <w:r>
+        <w:rPr>
+          <w:rFonts w:ascii="Arial" w:cs="Arial" w:eastAsia="Arial" w:hAnsi="Arial"/>
+          <w:color w:val="333333"/>
+          <w:sz w:val="21"/>
+          <w:szCs w:val="21"/>
+        </w:rPr>
+        <w:t xml:space="preserve">In pot-limit games, the maximum bet is the current pot size plus the amount needed to call. This means the dealer must track the pot total continuously. After multiple raises in a single round, the pot-limit calculation becomes: pot before action + all previous bets in this round + the amount needed to call the current bet. Dealers are frequently asked “what’s the pot?” and must answer immediately. In round-up raking environments, odd amounts from previous pot calculations make tracking even harder. This is one of the most requested features for dealer assistance technology.</w:t>
       </w:r>
     </w:p>
     <w:p>
@@ -7259,21 +7303,35 @@
           <w:sz w:val="22"/>
           <w:szCs w:val="22"/>
         </w:rPr>
-        <w:t xml:space="preserve">PLO Time Rake and Game Pace</w:t>
-      </w:r>
-    </w:p>
-    <w:p>
-      <w:pPr>
-        <w:spacing w:after="160" w:line="276"/>
-      </w:pPr>
-      <w:r>
-        <w:rPr>
-          <w:rFonts w:ascii="Arial" w:cs="Arial" w:eastAsia="Arial" w:hAnsi="Arial"/>
-          <w:color w:val="333333"/>
-          <w:sz w:val="21"/>
-          <w:szCs w:val="21"/>
-        </w:rPr>
-        <w:t xml:space="preserve">Most PLO games use a time rake rather than a per-hand pot rake. The casino charges each player a fixed amount per half hour (or per hour) instead of taking a percentage of each pot. Time rake is used because PLO naturally plays slower than Hold’em: four cards to deal instead of two, more complex betting decisions, pot-limit calculations that take time, and larger pots that require more chip handling. Fewer hands per hour means fewer rake drops, making per-hand raking uneconomical for the casino. For the dealer, time rake eliminates one entire category of mental work — no calculating the rake, no making change for the rake, no dropping the rake at the correct threshold. This makes PLO paradoxically more relaxing to deal than Hold’em for experienced dealers, despite the more complex pot math.</w:t>
+        <w:t xml:space="preserve">Pot Tracking Across Streets in PLO</w:t>
+      </w:r>
+    </w:p>
+    <w:p>
+      <w:pPr>
+        <w:spacing w:after="160" w:line="276"/>
+      </w:pPr>
+      <w:r>
+        <w:rPr>
+          <w:rFonts w:ascii="Arial" w:cs="Arial" w:eastAsia="Arial" w:hAnsi="Arial"/>
+          <w:color w:val="333333"/>
+          <w:sz w:val="21"/>
+          <w:szCs w:val="21"/>
+        </w:rPr>
+        <w:t xml:space="preserve">The most critical discipline for a PLO dealer is knowing the pot total at every moment without physically counting it. After each betting round, before bringing bets into the center, the dealer calculates the new pot total: count the number of players, multiply by their bet, add any dead money from folds, and add the existing pot. Example: 4 players at 75 each = 300, plus 20 dead from pre-flop folders = 320. That number (320) must be locked in memory before the bets are merged into the pot. On the next street, if two players bet 150 each, the new total is 320 + 300 = 620. This incremental tracking is the only reliable method — reconstructing the pot total from a pile of mixed chips is nearly impossible without a physical count.</w:t>
+      </w:r>
+    </w:p>
+    <w:p>
+      <w:pPr>
+        <w:spacing w:after="160" w:line="276"/>
+      </w:pPr>
+      <w:r>
+        <w:rPr>
+          <w:rFonts w:ascii="Arial" w:cs="Arial" w:eastAsia="Arial" w:hAnsi="Arial"/>
+          <w:color w:val="333333"/>
+          <w:sz w:val="21"/>
+          <w:szCs w:val="21"/>
+        </w:rPr>
+        <w:t xml:space="preserve">When pulling in bets that include dead money from folders, keep the dead money physically separate until you have computed the total. This is an acceptable practice: the dead money sits next to the pot rather than being immediately pushed in. Once the dealer has the number, everything merges. The key discipline: never bring a flop, turn, or river until you know the pot total. Taking 5 to 10 extra seconds to verify the math is always preferable to calling a floor supervisor to count down the pot mid-hand.</w:t>
       </w:r>
     </w:p>
     <w:p>
@@ -7289,21 +7347,21 @@
           <w:sz w:val="22"/>
           <w:szCs w:val="22"/>
         </w:rPr>
-        <w:t xml:space="preserve">PLO Memorization and Pattern Recognition</w:t>
-      </w:r>
-    </w:p>
-    <w:p>
-      <w:pPr>
-        <w:spacing w:after="160" w:line="276"/>
-      </w:pPr>
-      <w:r>
-        <w:rPr>
-          <w:rFonts w:ascii="Arial" w:cs="Arial" w:eastAsia="Arial" w:hAnsi="Arial"/>
-          <w:color w:val="333333"/>
-          <w:sz w:val="21"/>
-          <w:szCs w:val="21"/>
-        </w:rPr>
-        <w:t xml:space="preserve">Pot-limit calculations that seem daunting at first become memorized through repetition. In a 5/5 game, the first pot-sized raise is always 20. The first re-pot is always 70 (or 90 with a caller). These numbers repeat hand after hand, and within a few sessions the dealer knows them without calculating. The process is similar to dealing craps, where dealers memorize payout formulas through repetition rather than computing them fresh each time. Common PLO sequences (open to 20, re-pot to 70, caller makes it 90, re-pot to 310) become as automatic as dealing Hold’em. The challenging moments come when unusual bet sizes, all-ins for less, or odd structures create amounts that break the memorized patterns — and that is when the formula (3× previous bet + trail + pot) must be computed fresh.</w:t>
+        <w:t xml:space="preserve">PLO Time Rake and Game Pace</w:t>
+      </w:r>
+    </w:p>
+    <w:p>
+      <w:pPr>
+        <w:spacing w:after="160" w:line="276"/>
+      </w:pPr>
+      <w:r>
+        <w:rPr>
+          <w:rFonts w:ascii="Arial" w:cs="Arial" w:eastAsia="Arial" w:hAnsi="Arial"/>
+          <w:color w:val="333333"/>
+          <w:sz w:val="21"/>
+          <w:szCs w:val="21"/>
+        </w:rPr>
+        <w:t xml:space="preserve">Most PLO games use a time rake rather than a per-hand pot rake. The casino charges each player a fixed amount per half hour (or per hour) instead of taking a percentage of each pot. Time rake is used because PLO naturally plays slower than Hold’em: four cards to deal instead of two, more complex betting decisions, pot-limit calculations that take time, and larger pots that require more chip handling. Fewer hands per hour means fewer rake drops, making per-hand raking uneconomical for the casino. For the dealer, time rake eliminates one entire category of mental work — no calculating the rake, no making change for the rake, no dropping the rake at the correct threshold. This makes PLO paradoxically more relaxing to deal than Hold’em for experienced dealers, despite the more complex pot math.</w:t>
       </w:r>
     </w:p>
     <w:p>
@@ -7319,144 +7377,21 @@
           <w:sz w:val="22"/>
           <w:szCs w:val="22"/>
         </w:rPr>
-        <w:t xml:space="preserve">Dealing with Difficult PLO Players</w:t>
-      </w:r>
-    </w:p>
-    <w:p>
-      <w:pPr>
-        <w:spacing w:after="160" w:line="276"/>
-      </w:pPr>
-      <w:r>
-        <w:rPr>
-          <w:rFonts w:ascii="Arial" w:cs="Arial" w:eastAsia="Arial" w:hAnsi="Arial"/>
-          <w:color w:val="333333"/>
-          <w:sz w:val="21"/>
-          <w:szCs w:val="21"/>
-        </w:rPr>
-        <w:t xml:space="preserve">Certain PLO players deliberately test dealers by putting out stacks of chips without verbal declaration, forcing the dealer to calculate whether the amount matches the pot, exceeds it, or represents a non-pot raise. Some players derive satisfaction from catching dealer errors. The dealer’s best defense: pre-calculate the pot amount during the player’s thinking time, so when chips hit the felt, the dealer already knows whether the amount is correct. When a player puts out a stack, the dealer silently counts it. If it matches pot, announce ‘pot’ and the amount. If it exceeds pot, announce ‘pot’ and the corrected amount, pushing back the excess. If it is under pot, announce ‘raise’ and the amount.</w:t>
-      </w:r>
-    </w:p>
-    <w:p>
-      <w:pPr>
-        <w:spacing w:after="160" w:line="276"/>
-      </w:pPr>
-      <w:r>
-        <w:rPr>
-          <w:rFonts w:ascii="Arial" w:cs="Arial" w:eastAsia="Arial" w:hAnsi="Arial"/>
-          <w:color w:val="333333"/>
-          <w:sz w:val="21"/>
-          <w:szCs w:val="21"/>
-        </w:rPr>
-        <w:t xml:space="preserve">When a dealer does make a mistake (saying the wrong pot amount, allowing an over-bet), the correct response is: ‘I made a mistake — I’m going to call the floor. They’ll fix it.’ Do not apologize excessively. Do not blame the player for putting out a confusing amount. Take ownership without being self-deprecating, because the implicit message is that mistakes are part of the game — including the player’s choice to put out an ambiguous bet. This framing allows other players at the table to apply social pressure to the difficult player, which is far more effective than any response from the dealer. The floor resolves the situation, the game continues, and the dealer maintains professionalism.</w:t>
-      </w:r>
-    </w:p>
-    <w:p>
-      <w:pPr>
-        <w:spacing w:after="160" w:line="276"/>
-      </w:pPr>
-      <w:r>
-        <w:rPr>
-          <w:rFonts w:ascii="Arial" w:cs="Arial" w:eastAsia="Arial" w:hAnsi="Arial"/>
-          <w:color w:val="333333"/>
-          <w:sz w:val="21"/>
-          <w:szCs w:val="21"/>
-        </w:rPr>
-        <w:t xml:space="preserve">Preparation is the best weapon: when sitting down at an unfamiliar PLO table, especially one with unusual blind structures or dead antes, ask the outgoing dealer or the players a few quick questions during the tap-out. ‘You’re playing 5/10/10 with a dead 100 — so the first raise is to 500?’ Players appreciate a dealer who takes 10 seconds to verify the structure before dealing, rather than a dealer who guesses wrong on the first hand. This is especially important for high-stakes PLO games where structures vary significantly between tables and casinos.</w:t>
-      </w:r>
-    </w:p>
-    <w:p>
-      <w:pPr>
-        <w:spacing w:after="160" w:line="276"/>
-      </w:pPr>
-      <w:r>
-        <w:rPr>
-          <w:rFonts w:ascii="Arial" w:cs="Arial" w:eastAsia="Arial" w:hAnsi="Arial"/>
-          <w:b/>
-          <w:bCs/>
-          <w:color w:val="2C3E50"/>
-          <w:sz w:val="21"/>
-          <w:szCs w:val="21"/>
-        </w:rPr>
-        <w:t xml:space="preserve">Robotic Requirement: </w:t>
-      </w:r>
-      <w:r>
-        <w:rPr>
-          <w:rFonts w:ascii="Arial" w:cs="Arial" w:eastAsia="Arial" w:hAnsi="Arial"/>
-          <w:color w:val="333333"/>
-          <w:sz w:val="21"/>
-          <w:szCs w:val="21"/>
-        </w:rPr>
-        <w:t xml:space="preserve">Must deal 4 cards per player (up to 40 cards for a full table). Must calculate pot-limit maximum bets in real time and announce them on request. Must track the running pot total across all streets without physical counting. Must correctly evaluate 4-card hands using exactly 2 hole cards and 3 community cards at showdown, which requires evaluating 60 possible 5-card combinations per player. Must implement systematic board reading: classify the board type (unpaired, paired, two-pair, trips, flush-possible, straight-possible) and evaluate hands from highest possible downward (four of a kind → full house → flush → straight → trips → two pair → pair → high card). Must never misapply the Omaha hand-reading rule. Must instantly detect when a player’s chip amount matches, exceeds, or falls short of the pot maximum. Must apply the all-in-for-less trail rule, the cash-game small-blind-equals-big-blind rule, and the trail-excludes-active-player rule simultaneously. Must perform stub count verification adjusted for Omaha card distribution (4 cards per player leaves only 4 remaining at a full 10-player table). Must differentiate chip handling protocols between cash (fingertips only) and tournament (full grip allowed) modes. Pot-limit calculation is perhaps the strongest single argument for robotic dealing accuracy over human dealing — a computer computes the pot instantly and never loses track of the running total.</w:t>
-      </w:r>
-    </w:p>
-    <w:p>
-      <w:pPr>
-        <w:pStyle w:val="Heading2"/>
-        <w:spacing w:before="280" w:after="160"/>
-      </w:pPr>
-      <w:r>
-        <w:rPr>
-          <w:rFonts w:ascii="Arial" w:cs="Arial" w:eastAsia="Arial" w:hAnsi="Arial"/>
-          <w:b/>
-          <w:bCs/>
-          <w:color w:val="2C3E50"/>
-          <w:sz w:val="26"/>
-          <w:szCs w:val="26"/>
-        </w:rPr>
-        <w:t xml:space="preserve">9.3 Omaha Hi-Lo and Big O (PLO8 / 5-Card PLO8)</w:t>
-      </w:r>
-    </w:p>
-    <w:p>
-      <w:pPr>
-        <w:spacing w:after="160" w:line="276"/>
-      </w:pPr>
-      <w:r>
-        <w:rPr>
-          <w:rFonts w:ascii="Arial" w:cs="Arial" w:eastAsia="Arial" w:hAnsi="Arial"/>
-          <w:color w:val="333333"/>
-          <w:sz w:val="21"/>
-          <w:szCs w:val="21"/>
-        </w:rPr>
-        <w:t xml:space="preserve">In Omaha Hi-Lo (8 or better), the pot is split between the best high hand and the best qualifying low hand (five unpaired cards 8 or below, using exactly 2 from hand and 3 from board for each direction independently). Big O is the 5-card variant, giving each player 5 hole cards instead of 4, further increasing the combinatorial complexity. These games are spreading rapidly in casino poker rooms and are among the most dealer-error-prone formats in existence.</w:t>
-      </w:r>
-    </w:p>
-    <w:p>
-      <w:pPr>
-        <w:spacing w:after="160" w:line="276"/>
-      </w:pPr>
-      <w:r>
-        <w:rPr>
-          <w:rFonts w:ascii="Arial" w:cs="Arial" w:eastAsia="Arial" w:hAnsi="Arial"/>
-          <w:color w:val="333333"/>
-          <w:sz w:val="21"/>
-          <w:szCs w:val="21"/>
-        </w:rPr>
-        <w:t xml:space="preserve">The dealer must evaluate each player’s hand twice: once for the high and once for the low. A player can use different 2-card combinations from their hand for each direction. If no player has a qualifying low (five unpaired cards 8 or below), the high hand scoops the entire pot. The dealer must determine whether a qualifying low exists before splitting, which requires checking every player’s possible low combinations against the board. With 5-card Big O, there are 10 possible 2-card combinations per player, yielding 100 possible 5-card hands per player per direction. At a full table, this is 2,000 hand evaluations at showdown.</w:t>
-      </w:r>
-    </w:p>
-    <w:p>
-      <w:pPr>
-        <w:spacing w:after="160" w:line="276"/>
-      </w:pPr>
-      <w:r>
-        <w:rPr>
-          <w:rFonts w:ascii="Arial" w:cs="Arial" w:eastAsia="Arial" w:hAnsi="Arial"/>
-          <w:b/>
-          <w:bCs/>
-          <w:color w:val="2C3E50"/>
-          <w:sz w:val="21"/>
-          <w:szCs w:val="21"/>
-        </w:rPr>
-        <w:t xml:space="preserve">Robotic Requirement: </w:t>
-      </w:r>
-      <w:r>
-        <w:rPr>
-          <w:rFonts w:ascii="Arial" w:cs="Arial" w:eastAsia="Arial" w:hAnsi="Arial"/>
-          <w:color w:val="333333"/>
-          <w:sz w:val="21"/>
-          <w:szCs w:val="21"/>
-        </w:rPr>
-        <w:t xml:space="preserve">Must evaluate high and low hands independently for every player using different two-card combinations for each direction. Must correctly determine low qualification (8 or better, five unpaired cards, exactly 2 from hand and 3 from board). Must first scan the board for three or more cards eight or below before attempting low evaluation. Must handle scoops (no qualifying low) and split pots. Must implement the kill sequence: push high first, muck high hand, then push low, muck low hand. Must enforce odd chip rules: high always gets the odd chip between halves; worst position gets the odd chip within tied lows. Must support both cash (stack during hand) and tournament (stack after river only) pot stacking modes. Must support 4-card and 5-card Omaha variants. Hand evaluation complexity makes this the game variant where robotic accuracy provides the most dramatic improvement over human dealing.</w:t>
+        <w:t xml:space="preserve">PLO Memorization and Pattern Recognition</w:t>
+      </w:r>
+    </w:p>
+    <w:p>
+      <w:pPr>
+        <w:spacing w:after="160" w:line="276"/>
+      </w:pPr>
+      <w:r>
+        <w:rPr>
+          <w:rFonts w:ascii="Arial" w:cs="Arial" w:eastAsia="Arial" w:hAnsi="Arial"/>
+          <w:color w:val="333333"/>
+          <w:sz w:val="21"/>
+          <w:szCs w:val="21"/>
+        </w:rPr>
+        <w:t xml:space="preserve">Pot-limit calculations that seem daunting at first become memorized through repetition. In a 5/5 game, the first pot-sized raise is always 20. The first re-pot is always 70 (or 90 with a caller). These numbers repeat hand after hand, and within a few sessions the dealer knows them without calculating. The process is similar to dealing craps, where dealers memorize payout formulas through repetition rather than computing them fresh each time. Common PLO sequences (open to 20, re-pot to 70, caller makes it 90, re-pot to 310) become as automatic as dealing Hold’em. The challenging moments come when unusual bet sizes, all-ins for less, or odd structures create amounts that break the memorized patterns — and that is when the formula (3× previous bet + trail + pot) must be computed fresh.</w:t>
       </w:r>
     </w:p>
     <w:p>
@@ -7472,49 +7407,158 @@
           <w:sz w:val="22"/>
           <w:szCs w:val="22"/>
         </w:rPr>
-        <w:t xml:space="preserve">Low Hand Reading Methodology</w:t>
-      </w:r>
-    </w:p>
-    <w:p>
-      <w:pPr>
-        <w:spacing w:after="160" w:line="276"/>
-      </w:pPr>
-      <w:r>
-        <w:rPr>
-          <w:rFonts w:ascii="Arial" w:cs="Arial" w:eastAsia="Arial" w:hAnsi="Arial"/>
-          <w:color w:val="333333"/>
-          <w:sz w:val="21"/>
-          <w:szCs w:val="21"/>
-        </w:rPr>
-        <w:t xml:space="preserve">Reading the low in Omaha Hi-Lo requires a fundamentally different mental process than reading the high. A qualifying low hand must consist of five unpaired cards, all ranked eight or below, using exactly two cards from the player’s hand and three from the board. The dealer’s first step is to examine the board: are there at least three cards ranked eight or below? If not, no qualifying low is possible, and the high hand scoops the entire pot — no splitting needed. If yes, identify which three board cards will be used for the low (the three lowest unpaired cards on the board). Then examine each player’s hand for two cards ranked eight or below that do not duplicate the board’s low cards. Aces always count as low for the low half.</w:t>
-      </w:r>
-    </w:p>
-    <w:p>
-      <w:pPr>
-        <w:spacing w:after="160" w:line="276"/>
-      </w:pPr>
-      <w:r>
-        <w:rPr>
-          <w:rFonts w:ascii="Arial" w:cs="Arial" w:eastAsia="Arial" w:hAnsi="Arial"/>
-          <w:color w:val="333333"/>
-          <w:sz w:val="21"/>
-          <w:szCs w:val="21"/>
-        </w:rPr>
-        <w:t xml:space="preserve">Identifying the nut low: the nut low is the lowest possible five-card combination given the three low board cards. On a board of 2-5-8-K-Q, the three qualifying board cards are 2-5-8. The nut low requires a player to hold A-3 (making A-2-3-5-8). The second nut low is A-4 (making A-2-4-5-8), then A-6 (making A-2-5-6-8), and so on. The dealer reads lows from the bottom up, starting with ace and working through the lowest available non-duplicating cards. Lows are compared starting from the highest card downward: 8-5-3-2-A beats 8-6-3-2-A because the second-highest card (5 vs 6) is lower. This ‘read from the top’ comparison is counterintuitive for dealers accustomed to high-hand evaluation and is a frequent source of errors.</w:t>
-      </w:r>
-    </w:p>
-    <w:p>
-      <w:pPr>
-        <w:spacing w:after="160" w:line="276"/>
-      </w:pPr>
-      <w:r>
-        <w:rPr>
-          <w:rFonts w:ascii="Arial" w:cs="Arial" w:eastAsia="Arial" w:hAnsi="Arial"/>
-          <w:color w:val="333333"/>
-          <w:sz w:val="21"/>
-          <w:szCs w:val="21"/>
-        </w:rPr>
-        <w:t xml:space="preserve">Four-to-a-low boards (four cards eight or below on the board) are deceptively tricky. The player still must contribute exactly two cards from their hand, and those two cards must not pair any of the board’s low cards. With four low board cards, the dealer selects the three lowest unpaired board cards and then needs the player to have two cards that improve the low below the fourth board card. Common dealer error: seeing four low cards on the board and assuming everyone with an ace has a low. The ace must be accompanied by a second qualifying low card that does not pair any board card. A player holding A-K on a board of 2-4-6-8-J does not have a qualifying low — the king does not qualify, and they need TWO low cards from their hand.</w:t>
+        <w:t xml:space="preserve">Dealing with Difficult PLO Players</w:t>
+      </w:r>
+    </w:p>
+    <w:p>
+      <w:pPr>
+        <w:spacing w:after="160" w:line="276"/>
+      </w:pPr>
+      <w:r>
+        <w:rPr>
+          <w:rFonts w:ascii="Arial" w:cs="Arial" w:eastAsia="Arial" w:hAnsi="Arial"/>
+          <w:color w:val="333333"/>
+          <w:sz w:val="21"/>
+          <w:szCs w:val="21"/>
+        </w:rPr>
+        <w:t xml:space="preserve">Certain PLO players deliberately test dealers by putting out stacks of chips without verbal declaration, forcing the dealer to calculate whether the amount matches the pot, exceeds it, or represents a non-pot raise. Some players derive satisfaction from catching dealer errors. The dealer’s best defense: pre-calculate the pot amount during the player’s thinking time, so when chips hit the felt, the dealer already knows whether the amount is correct. When a player puts out a stack, the dealer silently counts it. If it matches pot, announce ‘pot’ and the amount. If it exceeds pot, announce ‘pot’ and the corrected amount, pushing back the excess. If it is under pot, announce ‘raise’ and the amount.</w:t>
+      </w:r>
+    </w:p>
+    <w:p>
+      <w:pPr>
+        <w:spacing w:after="160" w:line="276"/>
+      </w:pPr>
+      <w:r>
+        <w:rPr>
+          <w:rFonts w:ascii="Arial" w:cs="Arial" w:eastAsia="Arial" w:hAnsi="Arial"/>
+          <w:color w:val="333333"/>
+          <w:sz w:val="21"/>
+          <w:szCs w:val="21"/>
+        </w:rPr>
+        <w:t xml:space="preserve">When a dealer does make a mistake (saying the wrong pot amount, allowing an over-bet), the correct response is: ‘I made a mistake — I’m going to call the floor. They’ll fix it.’ Do not apologize excessively. Do not blame the player for putting out a confusing amount. Take ownership without being self-deprecating, because the implicit message is that mistakes are part of the game — including the player’s choice to put out an ambiguous bet. This framing allows other players at the table to apply social pressure to the difficult player, which is far more effective than any response from the dealer. The floor resolves the situation, the game continues, and the dealer maintains professionalism.</w:t>
+      </w:r>
+    </w:p>
+    <w:p>
+      <w:pPr>
+        <w:spacing w:after="160" w:line="276"/>
+      </w:pPr>
+      <w:r>
+        <w:rPr>
+          <w:rFonts w:ascii="Arial" w:cs="Arial" w:eastAsia="Arial" w:hAnsi="Arial"/>
+          <w:color w:val="333333"/>
+          <w:sz w:val="21"/>
+          <w:szCs w:val="21"/>
+        </w:rPr>
+        <w:t xml:space="preserve">Preparation is the best weapon: when sitting down at an unfamiliar PLO table, especially one with unusual blind structures or dead antes, ask the outgoing dealer or the players a few quick questions during the tap-out. ‘You’re playing 5/10/10 with a dead 100 — so the first raise is to 500?’ Players appreciate a dealer who takes 10 seconds to verify the structure before dealing, rather than a dealer who guesses wrong on the first hand. This is especially important for high-stakes PLO games where structures vary significantly between tables and casinos.</w:t>
+      </w:r>
+    </w:p>
+    <w:p>
+      <w:pPr>
+        <w:spacing w:after="160" w:line="276"/>
+      </w:pPr>
+      <w:r>
+        <w:rPr>
+          <w:rFonts w:ascii="Arial" w:cs="Arial" w:eastAsia="Arial" w:hAnsi="Arial"/>
+          <w:b/>
+          <w:bCs/>
+          <w:color w:val="2C3E50"/>
+          <w:sz w:val="21"/>
+          <w:szCs w:val="21"/>
+        </w:rPr>
+        <w:t xml:space="preserve">Robotic Requirement: </w:t>
+      </w:r>
+      <w:r>
+        <w:rPr>
+          <w:rFonts w:ascii="Arial" w:cs="Arial" w:eastAsia="Arial" w:hAnsi="Arial"/>
+          <w:color w:val="333333"/>
+          <w:sz w:val="21"/>
+          <w:szCs w:val="21"/>
+        </w:rPr>
+        <w:t xml:space="preserve">Must deal 4 cards per player (up to 40 cards for a full table). Must calculate pot-limit maximum bets in real time and announce them on request. Must track the running pot total across all streets without physical counting. Must correctly evaluate 4-card hands using exactly 2 hole cards and 3 community cards at showdown, which requires evaluating 60 possible 5-card combinations per player. Must implement systematic board reading: classify the board type (unpaired, paired, two-pair, trips, flush-possible, straight-possible) and evaluate hands from highest possible downward (four of a kind → full house → flush → straight → trips → two pair → pair → high card). Must never misapply the Omaha hand-reading rule. Must instantly detect when a player’s chip amount matches, exceeds, or falls short of the pot maximum. Must apply the all-in-for-less trail rule, the cash-game small-blind-equals-big-blind rule, and the trail-excludes-active-player rule simultaneously. Must perform stub count verification adjusted for Omaha card distribution (4 cards per player leaves only 4 remaining at a full 10-player table). Must differentiate chip handling protocols between cash (fingertips only) and tournament (full grip allowed) modes. Pot-limit calculation is perhaps the strongest single argument for robotic dealing accuracy over human dealing — a computer computes the pot instantly and never loses track of the running total.</w:t>
+      </w:r>
+    </w:p>
+    <w:p>
+      <w:pPr>
+        <w:pStyle w:val="Heading2"/>
+        <w:spacing w:before="280" w:after="160"/>
+      </w:pPr>
+      <w:r>
+        <w:rPr>
+          <w:rFonts w:ascii="Arial" w:cs="Arial" w:eastAsia="Arial" w:hAnsi="Arial"/>
+          <w:b/>
+          <w:bCs/>
+          <w:color w:val="2C3E50"/>
+          <w:sz w:val="26"/>
+          <w:szCs w:val="26"/>
+        </w:rPr>
+        <w:t xml:space="preserve">9.3 Omaha Hi-Lo and Big O (PLO8 / 5-Card PLO8)</w:t>
+      </w:r>
+    </w:p>
+    <w:p>
+      <w:pPr>
+        <w:spacing w:after="160" w:line="276"/>
+      </w:pPr>
+      <w:r>
+        <w:rPr>
+          <w:rFonts w:ascii="Arial" w:cs="Arial" w:eastAsia="Arial" w:hAnsi="Arial"/>
+          <w:color w:val="333333"/>
+          <w:sz w:val="21"/>
+          <w:szCs w:val="21"/>
+        </w:rPr>
+        <w:t xml:space="preserve">In Omaha Hi-Lo (8 or better), the pot is split between the best high hand and the best qualifying low hand (five unpaired cards 8 or below, using exactly 2 from hand and 3 from board for each direction independently). Big O is the 5-card variant, giving each player 5 hole cards instead of 4, further increasing the combinatorial complexity. These games are spreading rapidly in casino poker rooms and are among the most dealer-error-prone formats in existence.</w:t>
+      </w:r>
+    </w:p>
+    <w:p>
+      <w:pPr>
+        <w:spacing w:after="160" w:line="276"/>
+      </w:pPr>
+      <w:r>
+        <w:rPr>
+          <w:rFonts w:ascii="Arial" w:cs="Arial" w:eastAsia="Arial" w:hAnsi="Arial"/>
+          <w:color w:val="333333"/>
+          <w:sz w:val="21"/>
+          <w:szCs w:val="21"/>
+        </w:rPr>
+        <w:t xml:space="preserve">The dealer must evaluate each player’s hand twice: once for the high and once for the low. A player can use different 2-card combinations from their hand for each direction. If no player has a qualifying low (five unpaired cards 8 or below), the high hand scoops the entire pot. The dealer must determine whether a qualifying low exists before splitting, which requires checking every player’s possible low combinations against the board. With 5-card Big O, there are 10 possible 2-card combinations per player, yielding 100 possible 5-card hands per player per direction. At a full table, this is 2,000 hand evaluations at showdown.</w:t>
+      </w:r>
+    </w:p>
+    <w:p>
+      <w:pPr>
+        <w:spacing w:after="160" w:line="276"/>
+      </w:pPr>
+      <w:r>
+        <w:rPr>
+          <w:rFonts w:ascii="Arial" w:cs="Arial" w:eastAsia="Arial" w:hAnsi="Arial"/>
+          <w:color w:val="333333"/>
+          <w:sz w:val="21"/>
+          <w:szCs w:val="21"/>
+        </w:rPr>
+        <w:t xml:space="preserve">Player expectations in limit Omaha Hi-Lo are notably higher than in other games. Limit Omaha players tend to be experienced, knowledgeable, and impatient with dealer errors. They expect the dealer to read hands quickly, evaluate lows correctly, stack and split pots accurately, and maintain game pace. This combination of game complexity and elevated player expectations makes limit Omaha Hi-Lo one of the most challenging games for human dealers. Any hesitation in reading hands, any error in low evaluation, or any delay in pot splitting will draw immediate criticism. The best preparation is extensive practice reading hands at home (using one deck to deal mock showdowns) before encountering real players.</w:t>
+      </w:r>
+    </w:p>
+    <w:p>
+      <w:pPr>
+        <w:spacing w:after="160" w:line="276"/>
+      </w:pPr>
+      <w:r>
+        <w:rPr>
+          <w:rFonts w:ascii="Arial" w:cs="Arial" w:eastAsia="Arial" w:hAnsi="Arial"/>
+          <w:b/>
+          <w:bCs/>
+          <w:color w:val="2C3E50"/>
+          <w:sz w:val="21"/>
+          <w:szCs w:val="21"/>
+        </w:rPr>
+        <w:t xml:space="preserve">Robotic Requirement: </w:t>
+      </w:r>
+      <w:r>
+        <w:rPr>
+          <w:rFonts w:ascii="Arial" w:cs="Arial" w:eastAsia="Arial" w:hAnsi="Arial"/>
+          <w:color w:val="333333"/>
+          <w:sz w:val="21"/>
+          <w:szCs w:val="21"/>
+        </w:rPr>
+        <w:t xml:space="preserve">Must evaluate high and low hands independently for every player using different two-card combinations for each direction. Must correctly determine low qualification (8 or better, five unpaired cards, exactly 2 from hand and 3 from board). Must first scan the board for three or more cards eight or below before attempting low evaluation. Must handle scoops (no qualifying low) and split pots. Must implement the kill sequence: push high first, muck high hand, then push low, muck low hand. Must enforce odd chip rules: high always gets the odd chip between halves; worst position gets the odd chip within tied lows. Must support both cash (stack during hand) and tournament (stack after river only) pot stacking modes. Must support 4-card and 5-card Omaha variants. Hand evaluation complexity makes this the game variant where robotic accuracy provides the most dramatic improvement over human dealing.</w:t>
       </w:r>
     </w:p>
     <w:p>
@@ -7530,35 +7574,49 @@
           <w:sz w:val="22"/>
           <w:szCs w:val="22"/>
         </w:rPr>
-        <w:t xml:space="preserve">Split Pot Showdown Procedure in Omaha Hi-Lo</w:t>
-      </w:r>
-    </w:p>
-    <w:p>
-      <w:pPr>
-        <w:spacing w:after="160" w:line="276"/>
-      </w:pPr>
-      <w:r>
-        <w:rPr>
-          <w:rFonts w:ascii="Arial" w:cs="Arial" w:eastAsia="Arial" w:hAnsi="Arial"/>
-          <w:color w:val="333333"/>
-          <w:sz w:val="21"/>
-          <w:szCs w:val="21"/>
-        </w:rPr>
-        <w:t xml:space="preserve">The standard showdown procedure for Omaha Hi-Lo split pots follows a strict kill sequence. After the river action is complete and the pot is stacked: (1) Evaluate all remaining hands for the high. Determine the high winner. Push half the pot to the high winner. Immediately kill (muck) the high winner’s hand. (2) Evaluate the remaining hands for the low. Determine the low winner. Push the other half to the low winner. Kill the low winner’s hand. The kill-after-push sequence is critical: once a hand’s pot portion is pushed, that hand is immediately mucked so it cannot be confused with hands still in contention for the other half. If the same player wins both high and low, they scoop the entire pot and no splitting is necessary.</w:t>
-      </w:r>
-    </w:p>
-    <w:p>
-      <w:pPr>
-        <w:spacing w:after="160" w:line="276"/>
-      </w:pPr>
-      <w:r>
-        <w:rPr>
-          <w:rFonts w:ascii="Arial" w:cs="Arial" w:eastAsia="Arial" w:hAnsi="Arial"/>
-          <w:color w:val="333333"/>
-          <w:sz w:val="21"/>
-          <w:szCs w:val="21"/>
-        </w:rPr>
-        <w:t xml:space="preserve">When two or more players tie for the low, the low half is further divided. Push the high half first, kill the high hand. Then split the low half equally among the tying low hands. In a three-way low chop, divide the low half into three equal portions. Any remainder chips follow the odd chip rule for the low portion. After pushing each low share, kill that player’s hand immediately before pushing the next share. This orderly kill sequence prevents any confusion about which hands have been paid and which are still pending. Never gather hands to the center — always leave cards in front of their respective players until that player’s portion is pushed.</w:t>
+        <w:t xml:space="preserve">Low Hand Reading Methodology</w:t>
+      </w:r>
+    </w:p>
+    <w:p>
+      <w:pPr>
+        <w:spacing w:after="160" w:line="276"/>
+      </w:pPr>
+      <w:r>
+        <w:rPr>
+          <w:rFonts w:ascii="Arial" w:cs="Arial" w:eastAsia="Arial" w:hAnsi="Arial"/>
+          <w:color w:val="333333"/>
+          <w:sz w:val="21"/>
+          <w:szCs w:val="21"/>
+        </w:rPr>
+        <w:t xml:space="preserve">Reading the low in Omaha Hi-Lo requires a fundamentally different mental process than reading the high. A qualifying low hand must consist of five unpaired cards, all ranked eight or below, using exactly two cards from the player’s hand and three from the board. The dealer’s first step is to examine the board: are there at least three cards ranked eight or below? If not, no qualifying low is possible, and the high hand scoops the entire pot — no splitting needed. If yes, identify which three board cards will be used for the low (the three lowest unpaired cards on the board). Then examine each player’s hand for two cards ranked eight or below that do not duplicate the board’s low cards. Aces always count as low for the low half.</w:t>
+      </w:r>
+    </w:p>
+    <w:p>
+      <w:pPr>
+        <w:spacing w:after="160" w:line="276"/>
+      </w:pPr>
+      <w:r>
+        <w:rPr>
+          <w:rFonts w:ascii="Arial" w:cs="Arial" w:eastAsia="Arial" w:hAnsi="Arial"/>
+          <w:color w:val="333333"/>
+          <w:sz w:val="21"/>
+          <w:szCs w:val="21"/>
+        </w:rPr>
+        <w:t xml:space="preserve">Identifying the nut low: the nut low is the lowest possible five-card combination given the three low board cards. On a board of 2-5-8-K-Q, the three qualifying board cards are 2-5-8. The nut low requires a player to hold A-3 (making A-2-3-5-8). The second nut low is A-4 (making A-2-4-5-8), then A-6 (making A-2-5-6-8), and so on. The dealer reads lows from the bottom up, starting with ace and working through the lowest available non-duplicating cards. Lows are compared starting from the highest card downward: 8-5-3-2-A beats 8-6-3-2-A because the second-highest card (5 vs 6) is lower. This ‘read from the top’ comparison is counterintuitive for dealers accustomed to high-hand evaluation and is a frequent source of errors.</w:t>
+      </w:r>
+    </w:p>
+    <w:p>
+      <w:pPr>
+        <w:spacing w:after="160" w:line="276"/>
+      </w:pPr>
+      <w:r>
+        <w:rPr>
+          <w:rFonts w:ascii="Arial" w:cs="Arial" w:eastAsia="Arial" w:hAnsi="Arial"/>
+          <w:color w:val="333333"/>
+          <w:sz w:val="21"/>
+          <w:szCs w:val="21"/>
+        </w:rPr>
+        <w:t xml:space="preserve">Four-to-a-low boards (four cards eight or below on the board) are deceptively tricky. The player still must contribute exactly two cards from their hand, and those two cards must not pair any of the board’s low cards. With four low board cards, the dealer selects the three lowest unpaired board cards and then needs the player to have two cards that improve the low below the fourth board card. Common dealer error: seeing four low cards on the board and assuming everyone with an ace has a low. The ace must be accompanied by a second qualifying low card that does not pair any board card. A player holding A-K on a board of 2-4-6-8-J does not have a qualifying low — the king does not qualify, and they need TWO low cards from their hand.</w:t>
       </w:r>
     </w:p>
     <w:p>
@@ -7574,21 +7632,49 @@
           <w:sz w:val="22"/>
           <w:szCs w:val="22"/>
         </w:rPr>
-        <w:t xml:space="preserve">Odd Chip Rules in Omaha Hi-Lo</w:t>
-      </w:r>
-    </w:p>
-    <w:p>
-      <w:pPr>
-        <w:spacing w:after="160" w:line="276"/>
-      </w:pPr>
-      <w:r>
-        <w:rPr>
-          <w:rFonts w:ascii="Arial" w:cs="Arial" w:eastAsia="Arial" w:hAnsi="Arial"/>
-          <w:color w:val="333333"/>
-          <w:sz w:val="21"/>
-          <w:szCs w:val="21"/>
-        </w:rPr>
-        <w:t xml:space="preserve">In Omaha Hi-Lo, the odd chip between the high and low halves of the pot ALWAYS goes to the high hand. This is not position-based like the odd chip rule in Hold’em ties — it is direction-based. The high hand receives the extra chip regardless of seat position. This rule is universal across WSOP, TDA, and virtually all house rules. If the low half is further split between two or more tying low hands and an odd chip remains within that low portion, that odd chip goes to the player in worst position (closest to receiving the button next, i.e., the first player to act post-flop among the tied low winners). If three players chop the low and two odd chips remain, the two worst-position players each receive one extra chip. The hierarchy is: (1) odd chip between high and low always goes to high, (2) odd chip within a tied low goes to worst position, (3) odd chip within a tied high follows standard high-card-by-suit tiebreaker rules.</w:t>
+        <w:t xml:space="preserve">Split Pot Showdown Procedure in Omaha Hi-Lo</w:t>
+      </w:r>
+    </w:p>
+    <w:p>
+      <w:pPr>
+        <w:spacing w:after="160" w:line="276"/>
+      </w:pPr>
+      <w:r>
+        <w:rPr>
+          <w:rFonts w:ascii="Arial" w:cs="Arial" w:eastAsia="Arial" w:hAnsi="Arial"/>
+          <w:color w:val="333333"/>
+          <w:sz w:val="21"/>
+          <w:szCs w:val="21"/>
+        </w:rPr>
+        <w:t xml:space="preserve">The standard showdown procedure for Omaha Hi-Lo split pots follows a strict kill sequence. After the river action is complete and the pot is stacked: (1) Evaluate all remaining hands for the high. Determine the high winner. Push half the pot to the high winner. Immediately kill (muck) the high winner’s hand. (2) Evaluate the remaining hands for the low. Determine the low winner. Push the other half to the low winner. Kill the low winner’s hand. The kill-after-push sequence is critical: once a hand’s pot portion is pushed, that hand is immediately mucked so it cannot be confused with hands still in contention for the other half. If the same player wins both high and low, they scoop the entire pot and no splitting is necessary.</w:t>
+      </w:r>
+    </w:p>
+    <w:p>
+      <w:pPr>
+        <w:spacing w:after="160" w:line="276"/>
+      </w:pPr>
+      <w:r>
+        <w:rPr>
+          <w:rFonts w:ascii="Arial" w:cs="Arial" w:eastAsia="Arial" w:hAnsi="Arial"/>
+          <w:color w:val="333333"/>
+          <w:sz w:val="21"/>
+          <w:szCs w:val="21"/>
+        </w:rPr>
+        <w:t xml:space="preserve">When two or more players tie for the low, the low half is further divided. Push the high half first, kill the high hand. Then split the low half equally among the tying low hands. In a three-way low chop, divide the low half into three equal portions. Any remainder chips follow the odd chip rule for the low portion. After pushing each low share, kill that player’s hand immediately before pushing the next share. This orderly kill sequence prevents any confusion about which hands have been paid and which are still pending. Never gather hands to the center — always leave cards in front of their respective players until that player’s portion is pushed.</w:t>
+      </w:r>
+    </w:p>
+    <w:p>
+      <w:pPr>
+        <w:spacing w:after="160" w:line="276"/>
+      </w:pPr>
+      <w:r>
+        <w:rPr>
+          <w:rFonts w:ascii="Arial" w:cs="Arial" w:eastAsia="Arial" w:hAnsi="Arial"/>
+          <w:color w:val="333333"/>
+          <w:sz w:val="21"/>
+          <w:szCs w:val="21"/>
+        </w:rPr>
+        <w:t xml:space="preserve">A common mistake for dealers new to hi-lo: focusing on the low hand first because low evaluation feels harder and more novel. This is backwards. Always evaluate high first, then low. The high hand determines who gets the extra chip, gets pushed first, and gets killed first. By establishing the high winner first, the dealer simplifies the remaining task — the low evaluation only involves the surviving hands. Dealers who attempt to read lows first often lose track of which hand wins which half and make splitting errors. The discipline is: scan every tabled hand for the high, determine the high winner, frame it, push the high half, kill the high hand, and only then evaluate the remaining hands for the low.</w:t>
       </w:r>
     </w:p>
     <w:p>
@@ -7604,6 +7690,36 @@
           <w:sz w:val="22"/>
           <w:szCs w:val="22"/>
         </w:rPr>
+        <w:t xml:space="preserve">Odd Chip Rules in Omaha Hi-Lo</w:t>
+      </w:r>
+    </w:p>
+    <w:p>
+      <w:pPr>
+        <w:spacing w:after="160" w:line="276"/>
+      </w:pPr>
+      <w:r>
+        <w:rPr>
+          <w:rFonts w:ascii="Arial" w:cs="Arial" w:eastAsia="Arial" w:hAnsi="Arial"/>
+          <w:color w:val="333333"/>
+          <w:sz w:val="21"/>
+          <w:szCs w:val="21"/>
+        </w:rPr>
+        <w:t xml:space="preserve">In Omaha Hi-Lo, the odd chip between the high and low halves of the pot ALWAYS goes to the high hand. This is not position-based like the odd chip rule in Hold’em ties — it is direction-based. The high hand receives the extra chip regardless of seat position. This rule is universal across WSOP, TDA, and virtually all house rules. If the low half is further split between two or more tying low hands and an odd chip remains within that low portion, that odd chip goes to the player in worst position (closest to receiving the button next, i.e., the first player to act post-flop among the tied low winners). If three players chop the low and two odd chips remain, the two worst-position players each receive one extra chip. The hierarchy is: (1) odd chip between high and low always goes to high, (2) odd chip within a tied low goes to worst position, (3) odd chip within a tied high follows standard high-card-by-suit tiebreaker rules.</w:t>
+      </w:r>
+    </w:p>
+    <w:p>
+      <w:pPr>
+        <w:spacing w:before="200" w:after="120"/>
+      </w:pPr>
+      <w:r>
+        <w:rPr>
+          <w:rFonts w:ascii="Arial" w:cs="Arial" w:eastAsia="Arial" w:hAnsi="Arial"/>
+          <w:b/>
+          <w:bCs/>
+          <w:color w:val="C0392B"/>
+          <w:sz w:val="22"/>
+          <w:szCs w:val="22"/>
+        </w:rPr>
         <w:t xml:space="preserve">Pot Stacking Timing: Cash vs Tournament</w:t>
       </w:r>
     </w:p>
@@ -7619,6 +7735,20 @@
           <w:szCs w:val="21"/>
         </w:rPr>
         <w:t xml:space="preserve">The timing of when to stack the pot differs between cash games and tournaments and is particularly important in hi-lo split games where stacking is a prerequisite for an accurate split. In cash games, the dealer may begin stacking the pot during the hand as action progresses — organizing chips by denomination while players are still betting on earlier streets. This saves time at showdown and is considered acceptable practice. In tournaments, particularly under WSOP rules, the dealer should not stack the pot until the river card is dealt. The rationale: stacking during the hand can slow down the action (players may hesitate while the dealer is handling chips), and visible pot organization can inadvertently communicate pot size information that influences betting decisions. Once the river is out and all action is complete, the dealer stacks by denomination with the largest denomination closest to the dealer, creating an organized display that can be quickly and accurately divided in half for the split.</w:t>
+      </w:r>
+    </w:p>
+    <w:p>
+      <w:pPr>
+        <w:spacing w:after="160" w:line="276"/>
+      </w:pPr>
+      <w:r>
+        <w:rPr>
+          <w:rFonts w:ascii="Arial" w:cs="Arial" w:eastAsia="Arial" w:hAnsi="Arial"/>
+          <w:color w:val="333333"/>
+          <w:sz w:val="21"/>
+          <w:szCs w:val="21"/>
+        </w:rPr>
+        <w:t xml:space="preserve">Important: the dealer must stack the pot in every hi-lo hand, even when the board makes a qualifying low impossible. If the dealer only stacks when a low is possible, this telegraphs board information to observant players — they can infer from the dealer’s stacking behavior whether a low is live. Consistent stacking on every hand eliminates this information leak. Whether or not a low is ultimately possible at showdown, the dealer’s preparation procedure should look identical from hand to hand.</w:t>
       </w:r>
     </w:p>
     <w:p>

</xml_diff>

<commit_message>
Expand Sections 5.6, 7.1, and 10 with audition and error recovery procedures
Incorporates TruePokerDealer "Marc Auditions Himself": adds hi-lo showdown
error recovery (mucking qualifying lows, snowball effect, prevention), active
button double-big-blind scenario when player busts, floor call discipline
as core dealing principle, audition mindset and scoring systems, and error
cascade recovery philosophy.

https://claude.ai/code/session_01LLEXfPXvBSATequm3rLG4v
</commit_message>
<xml_diff>
--- a/docs/Deployment_Bible.docx
+++ b/docs/Deployment_Bible.docx
@@ -3334,49 +3334,35 @@
           <w:sz w:val="22"/>
           <w:szCs w:val="22"/>
         </w:rPr>
-        <w:t xml:space="preserve">Missed Blind Procedures</w:t>
-      </w:r>
-    </w:p>
-    <w:p>
-      <w:pPr>
-        <w:spacing w:after="160" w:line="276"/>
-      </w:pPr>
-      <w:r>
-        <w:rPr>
-          <w:rFonts w:ascii="Arial" w:cs="Arial" w:eastAsia="Arial" w:hAnsi="Arial"/>
-          <w:color w:val="333333"/>
-          <w:sz w:val="21"/>
-          <w:szCs w:val="21"/>
-        </w:rPr>
-        <w:t xml:space="preserve">When a player leaves the table and misses their big blind, they receive a missed blind button (a physical marker placed at their seat). When they return, they must post a big blind plus a dead small blind to rejoin the game from any position (the dead small goes into the pot but does not count toward their bet). Exception: if the player returns when it is their natural big blind position, they simply post the big blind with no dead small. If a player only missed a small blind: they must post a dead small to rejoin. However, if they come back on their natural big blind, just the big blind with no dead small is sufficient.</w:t>
-      </w:r>
-    </w:p>
-    <w:p>
-      <w:pPr>
-        <w:spacing w:after="160" w:line="276"/>
-      </w:pPr>
-      <w:r>
-        <w:rPr>
-          <w:rFonts w:ascii="Arial" w:cs="Arial" w:eastAsia="Arial" w:hAnsi="Arial"/>
-          <w:color w:val="333333"/>
-          <w:sz w:val="21"/>
-          <w:szCs w:val="21"/>
-        </w:rPr>
-        <w:t xml:space="preserve">If a player misses the small blind and subsequent hands pass until they miss the big blind too, the small blind button is replaced with a big blind button — it is treated as if they only missed the big blind. The big blind miss always takes precedence. A missed small blind does NOT expire into a missed big blind on its own; the transition happens when the big blind position passes the absent player.</w:t>
-      </w:r>
-    </w:p>
-    <w:p>
-      <w:pPr>
-        <w:spacing w:after="160" w:line="276"/>
-      </w:pPr>
-      <w:r>
-        <w:rPr>
-          <w:rFonts w:ascii="Arial" w:cs="Arial" w:eastAsia="Arial" w:hAnsi="Arial"/>
-          <w:color w:val="333333"/>
-          <w:sz w:val="21"/>
-          <w:szCs w:val="21"/>
-        </w:rPr>
-        <w:t xml:space="preserve">Key rules: (1) A player can NEVER start on the small blind — they have not paid the big blind. (2) A player can NEVER start on the button — they have not paid both blinds. (3) Posting a blind or straddle is not considered action for any purpose other than getting dealt in. (4) New players to a table: in rooms that require posting, a new player must post a big blind before being dealt in (many players wait for their natural big blind to avoid the extra post). In rooms that do not require posting, the player is simply dealt in immediately for free hands until the big blind reaches them.</w:t>
+        <w:t xml:space="preserve">Active Button: Player Busts and Double Big Blinds</w:t>
+      </w:r>
+    </w:p>
+    <w:p>
+      <w:pPr>
+        <w:spacing w:after="160" w:line="276"/>
+      </w:pPr>
+      <w:r>
+        <w:rPr>
+          <w:rFonts w:ascii="Arial" w:cs="Arial" w:eastAsia="Arial" w:hAnsi="Arial"/>
+          <w:color w:val="333333"/>
+          <w:sz w:val="21"/>
+          <w:szCs w:val="21"/>
+        </w:rPr>
+        <w:t xml:space="preserve">In rooms using the active button system, when a player busts out (goes all-in and loses), the button movement can create unusual blind configurations. Example: six-handed, the big blind busts out. The button moves to the next active player (the former small blind’s seat or the next seat clockwise with a player). Because the player who was supposed to be the next small blind has not yet paid a big blind, and the player after them has also not paid a big blind, both players must post big blinds. This creates a hand with two big blinds and no small blind. The next hand: the button advances, one of the former big-blind players becomes the natural small blind, and normal rotation resumes.</w:t>
+      </w:r>
+    </w:p>
+    <w:p>
+      <w:pPr>
+        <w:spacing w:after="160" w:line="276"/>
+      </w:pPr>
+      <w:r>
+        <w:rPr>
+          <w:rFonts w:ascii="Arial" w:cs="Arial" w:eastAsia="Arial" w:hAnsi="Arial"/>
+          <w:color w:val="333333"/>
+          <w:sz w:val="21"/>
+          <w:szCs w:val="21"/>
+        </w:rPr>
+        <w:t xml:space="preserve">Similarly, if the small blind busts instead: the button skips the now-empty small blind seat and moves to where the big blind was (the next active player). The result is the same: two players post big blinds (because the normal small blind position has no player), and normal rotation resumes the following hand. The general principle in active-button rooms: every player must pay both a small blind and a big blind before receiving the button. When a bust-out disrupts the normal rotation, the room fills the gap with double big blinds rather than allowing any player to skip a blind payment. This is less common than dead button procedure and creates temporary confusion, but experienced dealers handle it by simply ensuring two blinds are always posted and the button always sits in front of an active player.</w:t>
       </w:r>
     </w:p>
     <w:p>
@@ -3392,35 +3378,49 @@
           <w:sz w:val="22"/>
           <w:szCs w:val="22"/>
         </w:rPr>
-        <w:t xml:space="preserve">Buying the Button</w:t>
-      </w:r>
-    </w:p>
-    <w:p>
-      <w:pPr>
-        <w:spacing w:after="160" w:line="276"/>
-      </w:pPr>
-      <w:r>
-        <w:rPr>
-          <w:rFonts w:ascii="Arial" w:cs="Arial" w:eastAsia="Arial" w:hAnsi="Arial"/>
-          <w:color w:val="333333"/>
-          <w:sz w:val="21"/>
-          <w:szCs w:val="21"/>
-        </w:rPr>
-        <w:t xml:space="preserve">Buying the button allows a player to pay both blinds (big blind live + dead small blind) on the current hand so that they receive the button on the next hand. This exists to let players play immediately rather than waiting for the button to pass. The rule for when buying the button is allowed: there must be a small blind to the player’s left and a button to their right. If there is a big blind to their left (e.g., because the natural small blind seat is empty), buying the button does NOT work — the next hand would leave the buyer without having paid a small blind, breaking the system. When buying the button: the existing small blind and big blind push their blinds back, the buyer posts a big blind and a dead small blind, and the existing blind players receive free action for that hand (the former small blind becomes first to act under the gun). Next hand: the button goes to the buyer, and the former blind players resume their normal small blind/big blind positions.</w:t>
-      </w:r>
-    </w:p>
-    <w:p>
-      <w:pPr>
-        <w:spacing w:after="160" w:line="276"/>
-      </w:pPr>
-      <w:r>
-        <w:rPr>
-          <w:rFonts w:ascii="Arial" w:cs="Arial" w:eastAsia="Arial" w:hAnsi="Arial"/>
-          <w:color w:val="333333"/>
-          <w:sz w:val="21"/>
-          <w:szCs w:val="21"/>
-        </w:rPr>
-        <w:t xml:space="preserve">If two new players sit down simultaneously adjacent to each other, only the one in worse position (closer to the blinds) is asked first about buying the button. If they buy it, the second player must wait one hand. If they decline, the second player is asked. Both cannot buy in the same hand.</w:t>
+        <w:t xml:space="preserve">Missed Blind Procedures</w:t>
+      </w:r>
+    </w:p>
+    <w:p>
+      <w:pPr>
+        <w:spacing w:after="160" w:line="276"/>
+      </w:pPr>
+      <w:r>
+        <w:rPr>
+          <w:rFonts w:ascii="Arial" w:cs="Arial" w:eastAsia="Arial" w:hAnsi="Arial"/>
+          <w:color w:val="333333"/>
+          <w:sz w:val="21"/>
+          <w:szCs w:val="21"/>
+        </w:rPr>
+        <w:t xml:space="preserve">When a player leaves the table and misses their big blind, they receive a missed blind button (a physical marker placed at their seat). When they return, they must post a big blind plus a dead small blind to rejoin the game from any position (the dead small goes into the pot but does not count toward their bet). Exception: if the player returns when it is their natural big blind position, they simply post the big blind with no dead small. If a player only missed a small blind: they must post a dead small to rejoin. However, if they come back on their natural big blind, just the big blind with no dead small is sufficient.</w:t>
+      </w:r>
+    </w:p>
+    <w:p>
+      <w:pPr>
+        <w:spacing w:after="160" w:line="276"/>
+      </w:pPr>
+      <w:r>
+        <w:rPr>
+          <w:rFonts w:ascii="Arial" w:cs="Arial" w:eastAsia="Arial" w:hAnsi="Arial"/>
+          <w:color w:val="333333"/>
+          <w:sz w:val="21"/>
+          <w:szCs w:val="21"/>
+        </w:rPr>
+        <w:t xml:space="preserve">If a player misses the small blind and subsequent hands pass until they miss the big blind too, the small blind button is replaced with a big blind button — it is treated as if they only missed the big blind. The big blind miss always takes precedence. A missed small blind does NOT expire into a missed big blind on its own; the transition happens when the big blind position passes the absent player.</w:t>
+      </w:r>
+    </w:p>
+    <w:p>
+      <w:pPr>
+        <w:spacing w:after="160" w:line="276"/>
+      </w:pPr>
+      <w:r>
+        <w:rPr>
+          <w:rFonts w:ascii="Arial" w:cs="Arial" w:eastAsia="Arial" w:hAnsi="Arial"/>
+          <w:color w:val="333333"/>
+          <w:sz w:val="21"/>
+          <w:szCs w:val="21"/>
+        </w:rPr>
+        <w:t xml:space="preserve">Key rules: (1) A player can NEVER start on the small blind — they have not paid the big blind. (2) A player can NEVER start on the button — they have not paid both blinds. (3) Posting a blind or straddle is not considered action for any purpose other than getting dealt in. (4) New players to a table: in rooms that require posting, a new player must post a big blind before being dealt in (many players wait for their natural big blind to avoid the extra post). In rooms that do not require posting, the player is simply dealt in immediately for free hands until the big blind reaches them.</w:t>
       </w:r>
     </w:p>
     <w:p>
@@ -3436,21 +3436,35 @@
           <w:sz w:val="22"/>
           <w:szCs w:val="22"/>
         </w:rPr>
-        <w:t xml:space="preserve">Heads-Up Button Rules</w:t>
-      </w:r>
-    </w:p>
-    <w:p>
-      <w:pPr>
-        <w:spacing w:after="160" w:line="276"/>
-      </w:pPr>
-      <w:r>
-        <w:rPr>
-          <w:rFonts w:ascii="Arial" w:cs="Arial" w:eastAsia="Arial" w:hAnsi="Arial"/>
-          <w:color w:val="333333"/>
-          <w:sz w:val="21"/>
-          <w:szCs w:val="21"/>
-        </w:rPr>
-        <w:t xml:space="preserve">When the table gets down to two players (heads-up), special rules apply. The button posts the small blind and acts first preflop but last on all subsequent streets. The first card is dealt to the big blind (non-button player), second card to the button. This is the opposite of the normal dealing order. When transitioning from three-handed to heads-up: determine which player was supposed to be the big blind next — that player remains the big blind. The button goes to the other player. This may mean a player gets the button twice in a row, which is unavoidable.</w:t>
+        <w:t xml:space="preserve">Buying the Button</w:t>
+      </w:r>
+    </w:p>
+    <w:p>
+      <w:pPr>
+        <w:spacing w:after="160" w:line="276"/>
+      </w:pPr>
+      <w:r>
+        <w:rPr>
+          <w:rFonts w:ascii="Arial" w:cs="Arial" w:eastAsia="Arial" w:hAnsi="Arial"/>
+          <w:color w:val="333333"/>
+          <w:sz w:val="21"/>
+          <w:szCs w:val="21"/>
+        </w:rPr>
+        <w:t xml:space="preserve">Buying the button allows a player to pay both blinds (big blind live + dead small blind) on the current hand so that they receive the button on the next hand. This exists to let players play immediately rather than waiting for the button to pass. The rule for when buying the button is allowed: there must be a small blind to the player’s left and a button to their right. If there is a big blind to their left (e.g., because the natural small blind seat is empty), buying the button does NOT work — the next hand would leave the buyer without having paid a small blind, breaking the system. When buying the button: the existing small blind and big blind push their blinds back, the buyer posts a big blind and a dead small blind, and the existing blind players receive free action for that hand (the former small blind becomes first to act under the gun). Next hand: the button goes to the buyer, and the former blind players resume their normal small blind/big blind positions.</w:t>
+      </w:r>
+    </w:p>
+    <w:p>
+      <w:pPr>
+        <w:spacing w:after="160" w:line="276"/>
+      </w:pPr>
+      <w:r>
+        <w:rPr>
+          <w:rFonts w:ascii="Arial" w:cs="Arial" w:eastAsia="Arial" w:hAnsi="Arial"/>
+          <w:color w:val="333333"/>
+          <w:sz w:val="21"/>
+          <w:szCs w:val="21"/>
+        </w:rPr>
+        <w:t xml:space="preserve">If two new players sit down simultaneously adjacent to each other, only the one in worse position (closer to the blinds) is asked first about buying the button. If they buy it, the second player must wait one hand. If they decline, the second player is asked. Both cannot buy in the same hand.</w:t>
       </w:r>
     </w:p>
     <w:p>
@@ -3466,6 +3480,36 @@
           <w:sz w:val="22"/>
           <w:szCs w:val="22"/>
         </w:rPr>
+        <w:t xml:space="preserve">Heads-Up Button Rules</w:t>
+      </w:r>
+    </w:p>
+    <w:p>
+      <w:pPr>
+        <w:spacing w:after="160" w:line="276"/>
+      </w:pPr>
+      <w:r>
+        <w:rPr>
+          <w:rFonts w:ascii="Arial" w:cs="Arial" w:eastAsia="Arial" w:hAnsi="Arial"/>
+          <w:color w:val="333333"/>
+          <w:sz w:val="21"/>
+          <w:szCs w:val="21"/>
+        </w:rPr>
+        <w:t xml:space="preserve">When the table gets down to two players (heads-up), special rules apply. The button posts the small blind and acts first preflop but last on all subsequent streets. The first card is dealt to the big blind (non-button player), second card to the button. This is the opposite of the normal dealing order. When transitioning from three-handed to heads-up: determine which player was supposed to be the big blind next — that player remains the big blind. The button goes to the other player. This may mean a player gets the button twice in a row, which is unavoidable.</w:t>
+      </w:r>
+    </w:p>
+    <w:p>
+      <w:pPr>
+        <w:spacing w:before="200" w:after="120"/>
+      </w:pPr>
+      <w:r>
+        <w:rPr>
+          <w:rFonts w:ascii="Arial" w:cs="Arial" w:eastAsia="Arial" w:hAnsi="Arial"/>
+          <w:b/>
+          <w:bCs/>
+          <w:color w:val="C0392B"/>
+          <w:sz w:val="22"/>
+          <w:szCs w:val="22"/>
+        </w:rPr>
         <w:t xml:space="preserve">Absent Player Management</w:t>
       </w:r>
     </w:p>
@@ -5774,6 +5818,64 @@
     </w:p>
     <w:p>
       <w:pPr>
+        <w:spacing w:before="200" w:after="120"/>
+      </w:pPr>
+      <w:r>
+        <w:rPr>
+          <w:rFonts w:ascii="Arial" w:cs="Arial" w:eastAsia="Arial" w:hAnsi="Arial"/>
+          <w:b/>
+          <w:bCs/>
+          <w:color w:val="C0392B"/>
+          <w:sz w:val="22"/>
+          <w:szCs w:val="22"/>
+        </w:rPr>
+        <w:t xml:space="preserve">Hi-Lo Showdown Errors: Mucking a Qualifying Low</w:t>
+      </w:r>
+    </w:p>
+    <w:p>
+      <w:pPr>
+        <w:spacing w:after="160" w:line="276"/>
+      </w:pPr>
+      <w:r>
+        <w:rPr>
+          <w:rFonts w:ascii="Arial" w:cs="Arial" w:eastAsia="Arial" w:hAnsi="Arial"/>
+          <w:color w:val="333333"/>
+          <w:sz w:val="21"/>
+          <w:szCs w:val="21"/>
+        </w:rPr>
+        <w:t xml:space="preserve">The most dangerous dealer error specific to hi-lo games: forgetting that the game is split-pot and mucking a hand that had a qualifying low. This occurs most often when a dealer has been dealing Hold’em or Omaha High for hours and then moves to a limit Omaha Hi-Lo table. The dealer reads all hands for the high, evaluates the winner, pushes the pot, and kills the losing hands — exactly the correct procedure for a high-only game, but catastrophically wrong in hi-lo. Once a hand with a qualifying low is mucked, the information about that hand is lost. In a game with live players, the players will immediately protest, and the dealer should call the floor rather than attempt to reconstruct the hand from memory.</w:t>
+      </w:r>
+    </w:p>
+    <w:p>
+      <w:pPr>
+        <w:spacing w:after="160" w:line="276"/>
+      </w:pPr>
+      <w:r>
+        <w:rPr>
+          <w:rFonts w:ascii="Arial" w:cs="Arial" w:eastAsia="Arial" w:hAnsi="Arial"/>
+          <w:color w:val="333333"/>
+          <w:sz w:val="21"/>
+          <w:szCs w:val="21"/>
+        </w:rPr>
+        <w:t xml:space="preserve">The snowball effect: one hi-lo showdown error tends to cascade into multiple errors. After mucking a qualifying low hand, the dealer realizes the mistake, panics, and then makes additional errors while trying to recover — such as pushing a full pot to the high hand instead of splitting, or forgetting which player was eligible for which side pot. The correct response at any point in the cascade is the same: stop, call the floor, explain what happened. Do not attempt to reverse chip movements or dig through the muck. The floor supervisor will reconstruct the situation using table information and, if necessary, surveillance footage. Players at the table will remember and report the mucked hand’s contents. The key discipline: one mistake does not have to become three mistakes. Each subsequent error during a panic recovery is avoidable simply by stopping and calling the floor.</w:t>
+      </w:r>
+    </w:p>
+    <w:p>
+      <w:pPr>
+        <w:spacing w:after="160" w:line="276"/>
+      </w:pPr>
+      <w:r>
+        <w:rPr>
+          <w:rFonts w:ascii="Arial" w:cs="Arial" w:eastAsia="Arial" w:hAnsi="Arial"/>
+          <w:color w:val="333333"/>
+          <w:sz w:val="21"/>
+          <w:szCs w:val="21"/>
+        </w:rPr>
+        <w:t xml:space="preserve">Prevention: when transitioning from a high-only game to a hi-lo game, the dealer should consciously remind themselves before the first showdown: ‘This is hi-lo — evaluate high first, then low.’ Some dealers place a small visual reminder near the pot (such as positioning the pot stacks in the split-ready formation) as a cue. In auditions, this error is particularly costly because it demonstrates unfamiliarity with the game variant. However, handling the error recovery well — immediately calling the floor, staying calm, not making excuses — can partially offset the damage to the audition score.</w:t>
+      </w:r>
+    </w:p>
+    <w:p>
+      <w:pPr>
         <w:pStyle w:val="Heading2"/>
         <w:spacing w:before="280" w:after="160"/>
       </w:pPr>
@@ -11292,6 +11394,65 @@
           <w:szCs w:val="21"/>
         </w:rPr>
         <w:t xml:space="preserve">The dealer’s role: as a general rule, if there is any confrontation between players at the table — any at all — the dealer should call the floor. Players will say ‘it’s fine, you don’t need to get the floor.’ Call the floor anyway. If the poker room can provide a less abusive experience, the statistics show that more women (and more recreational players generally) will come and spend money. This is not a moral argument — it is a business argument backed by participation data. Dealers who remember this and consistently enforce behavioral standards contribute directly to their room’s revenue and, by extension, their own tip income.</w:t>
+      </w:r>
+    </w:p>
+    <w:p>
+      <w:pPr>
+        <w:pStyle w:val="Heading2"/>
+        <w:spacing w:before="280" w:after="160"/>
+      </w:pPr>
+      <w:r>
+        <w:rPr>
+          <w:rFonts w:ascii="Arial" w:cs="Arial" w:eastAsia="Arial" w:hAnsi="Arial"/>
+          <w:b/>
+          <w:bCs/>
+          <w:color w:val="2C3E50"/>
+          <w:sz w:val="26"/>
+          <w:szCs w:val="26"/>
+        </w:rPr>
+        <w:t xml:space="preserve">10.26 The Floor Call Discipline</w:t>
+      </w:r>
+    </w:p>
+    <w:p>
+      <w:pPr>
+        <w:spacing w:after="160" w:line="276"/>
+      </w:pPr>
+      <w:r>
+        <w:rPr>
+          <w:rFonts w:ascii="Arial" w:cs="Arial" w:eastAsia="Arial" w:hAnsi="Arial"/>
+          <w:color w:val="333333"/>
+          <w:sz w:val="21"/>
+          <w:szCs w:val="21"/>
+        </w:rPr>
+        <w:t xml:space="preserve">The single most important habit for any dealer — experienced or novice — is the willingness to call the floor. When a dealer makes a mistake (mucking a live hand, pushing a pot incorrectly, miscounting a side pot, forgetting the game is hi-lo), the instinct is to fix it themselves. This instinct is wrong. The dealer should never attempt to reverse chip movements, reconstruct hands from memory, or make rulings on their own errors. The correct response at any point during an error cascade: stop what you are doing, protect the current state of the table (don’t touch anything else), call the floor, and explain exactly what happened. The floor supervisor has the authority to make rulings, consult surveillance, and reconstruct situations. The dealer does not.</w:t>
+      </w:r>
+    </w:p>
+    <w:p>
+      <w:pPr>
+        <w:spacing w:after="160" w:line="276"/>
+      </w:pPr>
+      <w:r>
+        <w:rPr>
+          <w:rFonts w:ascii="Arial" w:cs="Arial" w:eastAsia="Arial" w:hAnsi="Arial"/>
+          <w:color w:val="333333"/>
+          <w:sz w:val="21"/>
+          <w:szCs w:val="21"/>
+        </w:rPr>
+        <w:t xml:space="preserve">In auditions, this discipline is specifically evaluated. Auditioners deliberately create scenarios where the candidate will make errors — complex side pots, unusual all-in amounts, split-pot games with multiple eligible hands. They are not primarily testing whether the candidate makes zero mistakes. They are testing how the candidate handles mistakes: do they freeze? Do they panic? Do they try to fix it themselves and make it worse? Or do they calmly acknowledge the error, call the floor, and explain the situation clearly? A candidate who makes a mistake and handles the recovery professionally will often score higher than a candidate who deals perfectly but seems brittle under pressure. The audition is simulating real casino conditions, where mistakes are inevitable and recovery is what separates competent dealers from liabilities.</w:t>
+      </w:r>
+    </w:p>
+    <w:p>
+      <w:pPr>
+        <w:spacing w:after="160" w:line="276"/>
+      </w:pPr>
+      <w:r>
+        <w:rPr>
+          <w:rFonts w:ascii="Arial" w:cs="Arial" w:eastAsia="Arial" w:hAnsi="Arial"/>
+          <w:color w:val="333333"/>
+          <w:sz w:val="21"/>
+          <w:szCs w:val="21"/>
+        </w:rPr>
+        <w:t xml:space="preserve">Practical audition advice from experienced dealers: never give up on yourself during an audition. Each hand is a fresh opportunity to demonstrate skill. After a difficult hand, the next hand is a chance to show composure, accuracy, and game flow. Apologize briefly if appropriate (‘I made a mistake — I’m calling the floor’), but do not be excessively self-deprecating. Do not make excuses. Move forward. Casino hiring managers use scoring systems to evaluate auditions objectively — these systems exist partly as legal protection against discrimination claims, but they also mean that a strong performance across multiple hands can overcome a single error. One bad hand does not end an audition unless the candidate’s response to the error reveals deeper problems.</w:t>
       </w:r>
     </w:p>
     <w:p>

</xml_diff>